<commit_message>
Add Malawi extractor (IHPS v06, parcel-level) + provenance; enable in MASTER
</commit_message>
<xml_diff>
--- a/Reference/variable_provenance.docx
+++ b/Reference/variable_provenance.docx
@@ -6827,9 +6827,4133 @@
     </w:p>
     <w:p>
       <w:pPr>
+        <w:pStyle w:val="Heading2"/>
+      </w:pPr>
+      <w:bookmarkStart w:id="29" w:name="X58e7c7fc58aa400ad0a6aeef83d98534c48a47f"/>
+      <w:r>
+        <w:t xml:space="preserve">MALAWI — Integrated Household Panel Survey (IHPS)</w:t>
+      </w:r>
+      <w:bookmarkEnd w:id="29"/>
+    </w:p>
+    <w:p>
+      <w:pPr>
         <w:pStyle w:val="FirstParagraph"/>
       </w:pPr>
       <w:r>
+        <w:t xml:space="preserve">Source: the four-wave IHPS</w:t>
+      </w:r>
+      <w:r>
+        <w:t xml:space="preserve"> </w:t>
+      </w:r>
+      <w:r>
+        <w:rPr>
+          <w:b/>
+        </w:rPr>
+        <w:t xml:space="preserve">panel</w:t>
+      </w:r>
+      <w:r>
+        <w:t xml:space="preserve"> </w:t>
+      </w:r>
+      <w:r>
+        <w:t xml:space="preserve">release</w:t>
+      </w:r>
+      <w:r>
+        <w:t xml:space="preserve"> </w:t>
+      </w:r>
+      <w:r>
+        <w:rPr>
+          <w:rStyle w:val="VerbatimChar"/>
+        </w:rPr>
+        <w:t xml:space="preserve">MWI_2010-2019_IHPS_v06</w:t>
+      </w:r>
+      <w:r>
+        <w:t xml:space="preserve">, extracted</w:t>
+      </w:r>
+      <w:r>
+        <w:t xml:space="preserve"> </w:t>
+      </w:r>
+      <w:r>
+        <w:t xml:space="preserve">flat to</w:t>
+      </w:r>
+      <w:r>
+        <w:t xml:space="preserve"> </w:t>
+      </w:r>
+      <w:r>
+        <w:rPr>
+          <w:rStyle w:val="VerbatimChar"/>
+        </w:rPr>
+        <w:t xml:space="preserve">Malawi/IHPS_panel_v6/MWI_2010-2019_IHPS_v06_M_Stata/</w:t>
+      </w:r>
+      <w:r>
+        <w:t xml:space="preserve"> </w:t>
+      </w:r>
+      <w:r>
+        <w:t xml:space="preserve">(all waves point at</w:t>
+      </w:r>
+      <w:r>
+        <w:t xml:space="preserve"> </w:t>
+      </w:r>
+      <w:r>
+        <w:t xml:space="preserve">this one folder; filenames carry the year suffix).</w:t>
+      </w:r>
+    </w:p>
+    <w:p>
+      <w:pPr>
+        <w:pStyle w:val="BlockText"/>
+      </w:pPr>
+      <w:r>
+        <w:rPr>
+          <w:b/>
+        </w:rPr>
+        <w:t xml:space="preserve">Unit note.</w:t>
+      </w:r>
+      <w:r>
+        <w:t xml:space="preserve"> </w:t>
+      </w:r>
+      <w:r>
+        <w:t xml:space="preserve">The survey’s land unit changed: in 2010/2013 tenure is asked at the</w:t>
+      </w:r>
+      <w:r>
+        <w:t xml:space="preserve"> </w:t>
+      </w:r>
+      <w:r>
+        <w:rPr>
+          <w:b/>
+        </w:rPr>
+        <w:t xml:space="preserve">plot</w:t>
+      </w:r>
+      <w:r>
+        <w:t xml:space="preserve"> </w:t>
+      </w:r>
+      <w:r>
+        <w:t xml:space="preserve">level (no garden grouping), so</w:t>
+      </w:r>
+      <w:r>
+        <w:t xml:space="preserve"> </w:t>
+      </w:r>
+      <w:r>
+        <w:rPr>
+          <w:rStyle w:val="VerbatimChar"/>
+        </w:rPr>
+        <w:t xml:space="preserve">parcel</w:t>
+      </w:r>
+      <w:r>
+        <w:t xml:space="preserve"> </w:t>
+      </w:r>
+      <w:r>
+        <w:t xml:space="preserve">:= plot; in 2016/2019 tenure is</w:t>
+      </w:r>
+      <w:r>
+        <w:t xml:space="preserve"> </w:t>
+      </w:r>
+      <w:r>
+        <w:t xml:space="preserve">asked at the</w:t>
+      </w:r>
+      <w:r>
+        <w:t xml:space="preserve"> </w:t>
+      </w:r>
+      <w:r>
+        <w:rPr>
+          <w:b/>
+        </w:rPr>
+        <w:t xml:space="preserve">garden</w:t>
+      </w:r>
+      <w:r>
+        <w:t xml:space="preserve"> </w:t>
+      </w:r>
+      <w:r>
+        <w:t xml:space="preserve">level and</w:t>
+      </w:r>
+      <w:r>
+        <w:t xml:space="preserve"> </w:t>
+      </w:r>
+      <w:r>
+        <w:rPr>
+          <w:rStyle w:val="VerbatimChar"/>
+        </w:rPr>
+        <w:t xml:space="preserve">parcel</w:t>
+      </w:r>
+      <w:r>
+        <w:t xml:space="preserve"> </w:t>
+      </w:r>
+      <w:r>
+        <w:t xml:space="preserve">:= garden (area summed from its plots).</w:t>
+      </w:r>
+    </w:p>
+    <w:p>
+      <w:pPr>
+        <w:pStyle w:val="Heading3"/>
+      </w:pPr>
+      <w:bookmarkStart w:id="30" w:name="survey-wave-key-1"/>
+      <w:r>
+        <w:t xml:space="preserve">1. Survey &amp; wave key</w:t>
+      </w:r>
+      <w:bookmarkEnd w:id="30"/>
+    </w:p>
+    <w:tbl>
+      <w:tblPr>
+        <w:tblStyle w:val="Table"/>
+        <w:tblW w:type="pct" w:w="0.0"/>
+        <w:tblLook w:firstRow="1"/>
+      </w:tblPr>
+      <w:tblGrid/>
+      <w:tr>
+        <w:trPr>
+          <w:cnfStyle w:firstRow="1"/>
+        </w:trPr>
+        <w:tc>
+          <w:tcPr>
+            <w:tcBorders>
+              <w:bottom w:val="single"/>
+            </w:tcBorders>
+            <w:vAlign w:val="bottom"/>
+          </w:tcPr>
+          <w:p>
+            <w:pPr>
+              <w:pStyle w:val="Compact"/>
+              <w:jc w:val="left"/>
+            </w:pPr>
+            <w:r>
+              <w:t xml:space="preserve">Wave</w:t>
+            </w:r>
+          </w:p>
+        </w:tc>
+        <w:tc>
+          <w:tcPr>
+            <w:tcBorders>
+              <w:bottom w:val="single"/>
+            </w:tcBorders>
+            <w:vAlign w:val="bottom"/>
+          </w:tcPr>
+          <w:p>
+            <w:pPr>
+              <w:pStyle w:val="Compact"/>
+              <w:jc w:val="left"/>
+            </w:pPr>
+            <w:r>
+              <w:t xml:space="preserve">Round</w:t>
+            </w:r>
+          </w:p>
+        </w:tc>
+        <w:tc>
+          <w:tcPr>
+            <w:tcBorders>
+              <w:bottom w:val="single"/>
+            </w:tcBorders>
+            <w:vAlign w:val="bottom"/>
+          </w:tcPr>
+          <w:p>
+            <w:pPr>
+              <w:pStyle w:val="Compact"/>
+              <w:jc w:val="left"/>
+            </w:pPr>
+            <w:r>
+              <w:t xml:space="preserve">Year</w:t>
+            </w:r>
+          </w:p>
+        </w:tc>
+        <w:tc>
+          <w:tcPr>
+            <w:tcBorders>
+              <w:bottom w:val="single"/>
+            </w:tcBorders>
+            <w:vAlign w:val="bottom"/>
+          </w:tcPr>
+          <w:p>
+            <w:pPr>
+              <w:pStyle w:val="Compact"/>
+              <w:jc w:val="left"/>
+            </w:pPr>
+            <w:r>
+              <w:t xml:space="preserve">HH id</w:t>
+            </w:r>
+          </w:p>
+        </w:tc>
+        <w:tc>
+          <w:tcPr>
+            <w:tcBorders>
+              <w:bottom w:val="single"/>
+            </w:tcBorders>
+            <w:vAlign w:val="bottom"/>
+          </w:tcPr>
+          <w:p>
+            <w:pPr>
+              <w:pStyle w:val="Compact"/>
+              <w:jc w:val="left"/>
+            </w:pPr>
+            <w:r>
+              <w:t xml:space="preserve">Tenure module (unit)</w:t>
+            </w:r>
+          </w:p>
+        </w:tc>
+        <w:tc>
+          <w:tcPr>
+            <w:tcBorders>
+              <w:bottom w:val="single"/>
+            </w:tcBorders>
+            <w:vAlign w:val="bottom"/>
+          </w:tcPr>
+          <w:p>
+            <w:pPr>
+              <w:pStyle w:val="Compact"/>
+              <w:jc w:val="left"/>
+            </w:pPr>
+            <w:r>
+              <w:t xml:space="preserve">Area module</w:t>
+            </w:r>
+          </w:p>
+        </w:tc>
+      </w:tr>
+      <w:tr>
+        <w:tc>
+          <w:p>
+            <w:pPr>
+              <w:pStyle w:val="Compact"/>
+              <w:jc w:val="left"/>
+            </w:pPr>
+            <w:r>
+              <w:t xml:space="preserve">1</w:t>
+            </w:r>
+          </w:p>
+        </w:tc>
+        <w:tc>
+          <w:p>
+            <w:pPr>
+              <w:pStyle w:val="Compact"/>
+              <w:jc w:val="left"/>
+            </w:pPr>
+            <w:r>
+              <w:t xml:space="preserve">IHS3/IHPS</w:t>
+            </w:r>
+          </w:p>
+        </w:tc>
+        <w:tc>
+          <w:p>
+            <w:pPr>
+              <w:pStyle w:val="Compact"/>
+              <w:jc w:val="left"/>
+            </w:pPr>
+            <w:r>
+              <w:t xml:space="preserve">2010</w:t>
+            </w:r>
+          </w:p>
+        </w:tc>
+        <w:tc>
+          <w:p>
+            <w:pPr>
+              <w:pStyle w:val="Compact"/>
+              <w:jc w:val="left"/>
+            </w:pPr>
+            <w:r>
+              <w:rPr>
+                <w:rStyle w:val="VerbatimChar"/>
+              </w:rPr>
+              <w:t xml:space="preserve">case_id</w:t>
+            </w:r>
+          </w:p>
+        </w:tc>
+        <w:tc>
+          <w:p>
+            <w:pPr>
+              <w:pStyle w:val="Compact"/>
+              <w:jc w:val="left"/>
+            </w:pPr>
+            <w:r>
+              <w:rPr>
+                <w:rStyle w:val="VerbatimChar"/>
+              </w:rPr>
+              <w:t xml:space="preserve">ag_mod_d_10</w:t>
+            </w:r>
+            <w:r>
+              <w:t xml:space="preserve"> </w:t>
+            </w:r>
+            <w:r>
+              <w:t xml:space="preserve">(plot)</w:t>
+            </w:r>
+          </w:p>
+        </w:tc>
+        <w:tc>
+          <w:p>
+            <w:pPr>
+              <w:pStyle w:val="Compact"/>
+              <w:jc w:val="left"/>
+            </w:pPr>
+            <w:r>
+              <w:rPr>
+                <w:rStyle w:val="VerbatimChar"/>
+              </w:rPr>
+              <w:t xml:space="preserve">ag_mod_c_10</w:t>
+            </w:r>
+          </w:p>
+        </w:tc>
+      </w:tr>
+      <w:tr>
+        <w:tc>
+          <w:p>
+            <w:pPr>
+              <w:pStyle w:val="Compact"/>
+              <w:jc w:val="left"/>
+            </w:pPr>
+            <w:r>
+              <w:t xml:space="preserve">2</w:t>
+            </w:r>
+          </w:p>
+        </w:tc>
+        <w:tc>
+          <w:p>
+            <w:pPr>
+              <w:pStyle w:val="Compact"/>
+              <w:jc w:val="left"/>
+            </w:pPr>
+            <w:r>
+              <w:t xml:space="preserve">IHPS</w:t>
+            </w:r>
+          </w:p>
+        </w:tc>
+        <w:tc>
+          <w:p>
+            <w:pPr>
+              <w:pStyle w:val="Compact"/>
+              <w:jc w:val="left"/>
+            </w:pPr>
+            <w:r>
+              <w:t xml:space="preserve">2013</w:t>
+            </w:r>
+          </w:p>
+        </w:tc>
+        <w:tc>
+          <w:p>
+            <w:pPr>
+              <w:pStyle w:val="Compact"/>
+              <w:jc w:val="left"/>
+            </w:pPr>
+            <w:r>
+              <w:rPr>
+                <w:rStyle w:val="VerbatimChar"/>
+              </w:rPr>
+              <w:t xml:space="preserve">y2_hhid</w:t>
+            </w:r>
+          </w:p>
+        </w:tc>
+        <w:tc>
+          <w:p>
+            <w:pPr>
+              <w:pStyle w:val="Compact"/>
+              <w:jc w:val="left"/>
+            </w:pPr>
+            <w:r>
+              <w:rPr>
+                <w:rStyle w:val="VerbatimChar"/>
+              </w:rPr>
+              <w:t xml:space="preserve">ag_mod_d_13</w:t>
+            </w:r>
+            <w:r>
+              <w:t xml:space="preserve"> </w:t>
+            </w:r>
+            <w:r>
+              <w:t xml:space="preserve">(plot)</w:t>
+            </w:r>
+          </w:p>
+        </w:tc>
+        <w:tc>
+          <w:p>
+            <w:pPr>
+              <w:pStyle w:val="Compact"/>
+              <w:jc w:val="left"/>
+            </w:pPr>
+            <w:r>
+              <w:rPr>
+                <w:rStyle w:val="VerbatimChar"/>
+              </w:rPr>
+              <w:t xml:space="preserve">ag_mod_c_13</w:t>
+            </w:r>
+            <w:r>
+              <w:t xml:space="preserve"> </w:t>
+            </w:r>
+            <w:r>
+              <w:t xml:space="preserve">+</w:t>
+            </w:r>
+            <w:r>
+              <w:t xml:space="preserve"> </w:t>
+            </w:r>
+            <w:r>
+              <w:rPr>
+                <w:rStyle w:val="VerbatimChar"/>
+              </w:rPr>
+              <w:t xml:space="preserve">ag_mod_o2_13</w:t>
+            </w:r>
+          </w:p>
+        </w:tc>
+      </w:tr>
+      <w:tr>
+        <w:tc>
+          <w:p>
+            <w:pPr>
+              <w:pStyle w:val="Compact"/>
+              <w:jc w:val="left"/>
+            </w:pPr>
+            <w:r>
+              <w:t xml:space="preserve">3</w:t>
+            </w:r>
+          </w:p>
+        </w:tc>
+        <w:tc>
+          <w:p>
+            <w:pPr>
+              <w:pStyle w:val="Compact"/>
+              <w:jc w:val="left"/>
+            </w:pPr>
+            <w:r>
+              <w:t xml:space="preserve">IHPS</w:t>
+            </w:r>
+          </w:p>
+        </w:tc>
+        <w:tc>
+          <w:p>
+            <w:pPr>
+              <w:pStyle w:val="Compact"/>
+              <w:jc w:val="left"/>
+            </w:pPr>
+            <w:r>
+              <w:t xml:space="preserve">2016</w:t>
+            </w:r>
+          </w:p>
+        </w:tc>
+        <w:tc>
+          <w:p>
+            <w:pPr>
+              <w:pStyle w:val="Compact"/>
+              <w:jc w:val="left"/>
+            </w:pPr>
+            <w:r>
+              <w:rPr>
+                <w:rStyle w:val="VerbatimChar"/>
+              </w:rPr>
+              <w:t xml:space="preserve">y3_hhid</w:t>
+            </w:r>
+          </w:p>
+        </w:tc>
+        <w:tc>
+          <w:p>
+            <w:pPr>
+              <w:pStyle w:val="Compact"/>
+              <w:jc w:val="left"/>
+            </w:pPr>
+            <w:r>
+              <w:rPr>
+                <w:rStyle w:val="VerbatimChar"/>
+              </w:rPr>
+              <w:t xml:space="preserve">ag_mod_b2_16</w:t>
+            </w:r>
+            <w:r>
+              <w:t xml:space="preserve"> </w:t>
+            </w:r>
+            <w:r>
+              <w:t xml:space="preserve">(garden)</w:t>
+            </w:r>
+          </w:p>
+        </w:tc>
+        <w:tc>
+          <w:p>
+            <w:pPr>
+              <w:pStyle w:val="Compact"/>
+              <w:jc w:val="left"/>
+            </w:pPr>
+            <w:r>
+              <w:rPr>
+                <w:rStyle w:val="VerbatimChar"/>
+              </w:rPr>
+              <w:t xml:space="preserve">ag_mod_c_16</w:t>
+            </w:r>
+            <w:r>
+              <w:t xml:space="preserve"> </w:t>
+            </w:r>
+            <w:r>
+              <w:t xml:space="preserve">+</w:t>
+            </w:r>
+            <w:r>
+              <w:t xml:space="preserve"> </w:t>
+            </w:r>
+            <w:r>
+              <w:rPr>
+                <w:rStyle w:val="VerbatimChar"/>
+              </w:rPr>
+              <w:t xml:space="preserve">ag_mod_o2_16</w:t>
+            </w:r>
+          </w:p>
+        </w:tc>
+      </w:tr>
+      <w:tr>
+        <w:tc>
+          <w:p>
+            <w:pPr>
+              <w:pStyle w:val="Compact"/>
+              <w:jc w:val="left"/>
+            </w:pPr>
+            <w:r>
+              <w:t xml:space="preserve">4</w:t>
+            </w:r>
+          </w:p>
+        </w:tc>
+        <w:tc>
+          <w:p>
+            <w:pPr>
+              <w:pStyle w:val="Compact"/>
+              <w:jc w:val="left"/>
+            </w:pPr>
+            <w:r>
+              <w:t xml:space="preserve">IHPS</w:t>
+            </w:r>
+          </w:p>
+        </w:tc>
+        <w:tc>
+          <w:p>
+            <w:pPr>
+              <w:pStyle w:val="Compact"/>
+              <w:jc w:val="left"/>
+            </w:pPr>
+            <w:r>
+              <w:t xml:space="preserve">2019/20</w:t>
+            </w:r>
+          </w:p>
+        </w:tc>
+        <w:tc>
+          <w:p>
+            <w:pPr>
+              <w:pStyle w:val="Compact"/>
+              <w:jc w:val="left"/>
+            </w:pPr>
+            <w:r>
+              <w:rPr>
+                <w:rStyle w:val="VerbatimChar"/>
+              </w:rPr>
+              <w:t xml:space="preserve">y4_hhid</w:t>
+            </w:r>
+          </w:p>
+        </w:tc>
+        <w:tc>
+          <w:p>
+            <w:pPr>
+              <w:pStyle w:val="Compact"/>
+              <w:jc w:val="left"/>
+            </w:pPr>
+            <w:r>
+              <w:rPr>
+                <w:rStyle w:val="VerbatimChar"/>
+              </w:rPr>
+              <w:t xml:space="preserve">ag_mod_b2_19</w:t>
+            </w:r>
+            <w:r>
+              <w:t xml:space="preserve"> </w:t>
+            </w:r>
+            <w:r>
+              <w:t xml:space="preserve">(garden)</w:t>
+            </w:r>
+          </w:p>
+        </w:tc>
+        <w:tc>
+          <w:p>
+            <w:pPr>
+              <w:pStyle w:val="Compact"/>
+              <w:jc w:val="left"/>
+            </w:pPr>
+            <w:r>
+              <w:rPr>
+                <w:rStyle w:val="VerbatimChar"/>
+              </w:rPr>
+              <w:t xml:space="preserve">ag_mod_c_19</w:t>
+            </w:r>
+            <w:r>
+              <w:t xml:space="preserve"> </w:t>
+            </w:r>
+            <w:r>
+              <w:t xml:space="preserve">+</w:t>
+            </w:r>
+            <w:r>
+              <w:t xml:space="preserve"> </w:t>
+            </w:r>
+            <w:r>
+              <w:rPr>
+                <w:rStyle w:val="VerbatimChar"/>
+              </w:rPr>
+              <w:t xml:space="preserve">ag_mod_o2_19</w:t>
+            </w:r>
+          </w:p>
+        </w:tc>
+      </w:tr>
+    </w:tbl>
+    <w:p>
+      <w:pPr>
+        <w:pStyle w:val="BodyText"/>
+      </w:pPr>
+      <w:r>
+        <w:t xml:space="preserve">Household cover (weight,</w:t>
+      </w:r>
+      <w:r>
+        <w:t xml:space="preserve"> </w:t>
+      </w:r>
+      <w:r>
+        <w:rPr>
+          <w:rStyle w:val="VerbatimChar"/>
+        </w:rPr>
+        <w:t xml:space="preserve">ea_id</w:t>
+      </w:r>
+      <w:r>
+        <w:t xml:space="preserve">, strata):</w:t>
+      </w:r>
+      <w:r>
+        <w:t xml:space="preserve"> </w:t>
+      </w:r>
+      <w:r>
+        <w:rPr>
+          <w:rStyle w:val="VerbatimChar"/>
+        </w:rPr>
+        <w:t xml:space="preserve">hh_mod_a_filt_&lt;yy&gt;.dta</w:t>
+      </w:r>
+      <w:r>
+        <w:t xml:space="preserve">.</w:t>
+      </w:r>
+    </w:p>
+    <w:p>
+      <w:pPr>
+        <w:pStyle w:val="Heading3"/>
+      </w:pPr>
+      <w:bookmarkStart w:id="31" w:name="tenure-indicators-1"/>
+      <w:r>
+        <w:t xml:space="preserve">2. Tenure indicators</w:t>
+      </w:r>
+      <w:bookmarkEnd w:id="31"/>
+    </w:p>
+    <w:tbl>
+      <w:tblPr>
+        <w:tblStyle w:val="Table"/>
+        <w:tblW w:type="pct" w:w="5000.0"/>
+        <w:tblLook w:firstRow="1"/>
+      </w:tblPr>
+      <w:tblGrid>
+        <w:gridCol w:w="1657"/>
+        <w:gridCol w:w="552"/>
+        <w:gridCol w:w="1473"/>
+        <w:gridCol w:w="1289"/>
+        <w:gridCol w:w="2946"/>
+      </w:tblGrid>
+      <w:tr>
+        <w:trPr>
+          <w:cnfStyle w:firstRow="1"/>
+        </w:trPr>
+        <w:tc>
+          <w:tcPr>
+            <w:tcBorders>
+              <w:bottom w:val="single"/>
+            </w:tcBorders>
+            <w:vAlign w:val="bottom"/>
+          </w:tcPr>
+          <w:p>
+            <w:pPr>
+              <w:pStyle w:val="Compact"/>
+              <w:jc w:val="left"/>
+            </w:pPr>
+            <w:r>
+              <w:t xml:space="preserve">Variable</w:t>
+            </w:r>
+          </w:p>
+        </w:tc>
+        <w:tc>
+          <w:tcPr>
+            <w:tcBorders>
+              <w:bottom w:val="single"/>
+            </w:tcBorders>
+            <w:vAlign w:val="bottom"/>
+          </w:tcPr>
+          <w:p>
+            <w:pPr>
+              <w:pStyle w:val="Compact"/>
+              <w:jc w:val="left"/>
+            </w:pPr>
+            <w:r>
+              <w:t xml:space="preserve">Wave</w:t>
+            </w:r>
+          </w:p>
+        </w:tc>
+        <w:tc>
+          <w:tcPr>
+            <w:tcBorders>
+              <w:bottom w:val="single"/>
+            </w:tcBorders>
+            <w:vAlign w:val="bottom"/>
+          </w:tcPr>
+          <w:p>
+            <w:pPr>
+              <w:pStyle w:val="Compact"/>
+              <w:jc w:val="left"/>
+            </w:pPr>
+            <w:r>
+              <w:t xml:space="preserve">Source file</w:t>
+            </w:r>
+          </w:p>
+        </w:tc>
+        <w:tc>
+          <w:tcPr>
+            <w:tcBorders>
+              <w:bottom w:val="single"/>
+            </w:tcBorders>
+            <w:vAlign w:val="bottom"/>
+          </w:tcPr>
+          <w:p>
+            <w:pPr>
+              <w:pStyle w:val="Compact"/>
+              <w:jc w:val="left"/>
+            </w:pPr>
+            <w:r>
+              <w:t xml:space="preserve">Source var</w:t>
+            </w:r>
+          </w:p>
+        </w:tc>
+        <w:tc>
+          <w:tcPr>
+            <w:tcBorders>
+              <w:bottom w:val="single"/>
+            </w:tcBorders>
+            <w:vAlign w:val="bottom"/>
+          </w:tcPr>
+          <w:p>
+            <w:pPr>
+              <w:pStyle w:val="Compact"/>
+              <w:jc w:val="left"/>
+            </w:pPr>
+            <w:r>
+              <w:t xml:space="preserve">Construction</w:t>
+            </w:r>
+          </w:p>
+        </w:tc>
+      </w:tr>
+      <w:tr>
+        <w:tc>
+          <w:p>
+            <w:pPr>
+              <w:pStyle w:val="Compact"/>
+              <w:jc w:val="left"/>
+            </w:pPr>
+            <w:r>
+              <w:rPr>
+                <w:rStyle w:val="VerbatimChar"/>
+              </w:rPr>
+              <w:t xml:space="preserve">parcel_rentedin</w:t>
+            </w:r>
+          </w:p>
+        </w:tc>
+        <w:tc>
+          <w:p>
+            <w:pPr>
+              <w:pStyle w:val="Compact"/>
+              <w:jc w:val="left"/>
+            </w:pPr>
+            <w:r>
+              <w:t xml:space="preserve">1</w:t>
+            </w:r>
+          </w:p>
+        </w:tc>
+        <w:tc>
+          <w:p>
+            <w:pPr>
+              <w:pStyle w:val="Compact"/>
+              <w:jc w:val="left"/>
+            </w:pPr>
+            <w:r>
+              <w:rPr>
+                <w:rStyle w:val="VerbatimChar"/>
+              </w:rPr>
+              <w:t xml:space="preserve">ag_mod_d_10</w:t>
+            </w:r>
+          </w:p>
+        </w:tc>
+        <w:tc>
+          <w:p>
+            <w:pPr>
+              <w:pStyle w:val="Compact"/>
+              <w:jc w:val="left"/>
+            </w:pPr>
+            <w:r>
+              <w:rPr>
+                <w:rStyle w:val="VerbatimChar"/>
+              </w:rPr>
+              <w:t xml:space="preserve">ag_d03</w:t>
+            </w:r>
+          </w:p>
+        </w:tc>
+        <w:tc>
+          <w:p>
+            <w:pPr>
+              <w:pStyle w:val="Compact"/>
+              <w:jc w:val="left"/>
+            </w:pPr>
+            <w:r>
+              <w:rPr>
+                <w:rStyle w:val="VerbatimChar"/>
+              </w:rPr>
+              <w:t xml:space="preserve">inlist(ag_d03,6,7,8)</w:t>
+            </w:r>
+            <w:r>
+              <w:t xml:space="preserve"> </w:t>
+            </w:r>
+            <w:r>
+              <w:t xml:space="preserve">— leasehold/rent/tenant</w:t>
+            </w:r>
+          </w:p>
+        </w:tc>
+      </w:tr>
+      <w:tr>
+        <w:tc>
+          <w:p>
+            <w:pPr>
+              <w:pStyle w:val="Compact"/>
+              <w:jc w:val="left"/>
+            </w:pPr>
+            <w:r>
+              <w:rPr>
+                <w:rStyle w:val="VerbatimChar"/>
+              </w:rPr>
+              <w:t xml:space="preserve">parcel_rentedin</w:t>
+            </w:r>
+          </w:p>
+        </w:tc>
+        <w:tc>
+          <w:p>
+            <w:pPr>
+              <w:pStyle w:val="Compact"/>
+              <w:jc w:val="left"/>
+            </w:pPr>
+            <w:r>
+              <w:t xml:space="preserve">2</w:t>
+            </w:r>
+          </w:p>
+        </w:tc>
+        <w:tc>
+          <w:p>
+            <w:pPr>
+              <w:pStyle w:val="Compact"/>
+              <w:jc w:val="left"/>
+            </w:pPr>
+            <w:r>
+              <w:rPr>
+                <w:rStyle w:val="VerbatimChar"/>
+              </w:rPr>
+              <w:t xml:space="preserve">ag_mod_d_13</w:t>
+            </w:r>
+          </w:p>
+        </w:tc>
+        <w:tc>
+          <w:p>
+            <w:pPr>
+              <w:pStyle w:val="Compact"/>
+              <w:jc w:val="left"/>
+            </w:pPr>
+            <w:r>
+              <w:rPr>
+                <w:rStyle w:val="VerbatimChar"/>
+              </w:rPr>
+              <w:t xml:space="preserve">ag_d03</w:t>
+            </w:r>
+          </w:p>
+        </w:tc>
+        <w:tc>
+          <w:p>
+            <w:pPr>
+              <w:pStyle w:val="Compact"/>
+              <w:jc w:val="left"/>
+            </w:pPr>
+            <w:r>
+              <w:rPr>
+                <w:rStyle w:val="VerbatimChar"/>
+              </w:rPr>
+              <w:t xml:space="preserve">inlist(ag_d03,6,7,8)</w:t>
+            </w:r>
+          </w:p>
+        </w:tc>
+      </w:tr>
+      <w:tr>
+        <w:tc>
+          <w:p>
+            <w:pPr>
+              <w:pStyle w:val="Compact"/>
+              <w:jc w:val="left"/>
+            </w:pPr>
+            <w:r>
+              <w:rPr>
+                <w:rStyle w:val="VerbatimChar"/>
+              </w:rPr>
+              <w:t xml:space="preserve">parcel_rentedin</w:t>
+            </w:r>
+          </w:p>
+        </w:tc>
+        <w:tc>
+          <w:p>
+            <w:pPr>
+              <w:pStyle w:val="Compact"/>
+              <w:jc w:val="left"/>
+            </w:pPr>
+            <w:r>
+              <w:t xml:space="preserve">3</w:t>
+            </w:r>
+          </w:p>
+        </w:tc>
+        <w:tc>
+          <w:p>
+            <w:pPr>
+              <w:pStyle w:val="Compact"/>
+              <w:jc w:val="left"/>
+            </w:pPr>
+            <w:r>
+              <w:rPr>
+                <w:rStyle w:val="VerbatimChar"/>
+              </w:rPr>
+              <w:t xml:space="preserve">ag_mod_b2_16</w:t>
+            </w:r>
+          </w:p>
+        </w:tc>
+        <w:tc>
+          <w:p>
+            <w:pPr>
+              <w:pStyle w:val="Compact"/>
+              <w:jc w:val="left"/>
+            </w:pPr>
+            <w:r>
+              <w:rPr>
+                <w:rStyle w:val="VerbatimChar"/>
+              </w:rPr>
+              <w:t xml:space="preserve">ag_b203</w:t>
+            </w:r>
+          </w:p>
+        </w:tc>
+        <w:tc>
+          <w:p>
+            <w:pPr>
+              <w:pStyle w:val="Compact"/>
+              <w:jc w:val="left"/>
+            </w:pPr>
+            <w:r>
+              <w:rPr>
+                <w:rStyle w:val="VerbatimChar"/>
+              </w:rPr>
+              <w:t xml:space="preserve">inlist(ag_b203,6,7,8)</w:t>
+            </w:r>
+          </w:p>
+        </w:tc>
+      </w:tr>
+      <w:tr>
+        <w:tc>
+          <w:p>
+            <w:pPr>
+              <w:pStyle w:val="Compact"/>
+              <w:jc w:val="left"/>
+            </w:pPr>
+            <w:r>
+              <w:rPr>
+                <w:rStyle w:val="VerbatimChar"/>
+              </w:rPr>
+              <w:t xml:space="preserve">parcel_rentedin</w:t>
+            </w:r>
+          </w:p>
+        </w:tc>
+        <w:tc>
+          <w:p>
+            <w:pPr>
+              <w:pStyle w:val="Compact"/>
+              <w:jc w:val="left"/>
+            </w:pPr>
+            <w:r>
+              <w:t xml:space="preserve">4</w:t>
+            </w:r>
+          </w:p>
+        </w:tc>
+        <w:tc>
+          <w:p>
+            <w:pPr>
+              <w:pStyle w:val="Compact"/>
+              <w:jc w:val="left"/>
+            </w:pPr>
+            <w:r>
+              <w:rPr>
+                <w:rStyle w:val="VerbatimChar"/>
+              </w:rPr>
+              <w:t xml:space="preserve">ag_mod_b2_19</w:t>
+            </w:r>
+          </w:p>
+        </w:tc>
+        <w:tc>
+          <w:p>
+            <w:pPr>
+              <w:pStyle w:val="Compact"/>
+              <w:jc w:val="left"/>
+            </w:pPr>
+            <w:r>
+              <w:rPr>
+                <w:rStyle w:val="VerbatimChar"/>
+              </w:rPr>
+              <w:t xml:space="preserve">ag_brentedin</w:t>
+            </w:r>
+            <w:r>
+              <w:t xml:space="preserve">,</w:t>
+            </w:r>
+            <w:r>
+              <w:t xml:space="preserve"> </w:t>
+            </w:r>
+            <w:r>
+              <w:rPr>
+                <w:rStyle w:val="VerbatimChar"/>
+              </w:rPr>
+              <w:t xml:space="preserve">ag_b211a/b</w:t>
+            </w:r>
+          </w:p>
+        </w:tc>
+        <w:tc>
+          <w:p>
+            <w:pPr>
+              <w:pStyle w:val="Compact"/>
+              <w:jc w:val="left"/>
+            </w:pPr>
+            <w:r>
+              <w:rPr>
+                <w:rStyle w:val="VerbatimChar"/>
+              </w:rPr>
+              <w:t xml:space="preserve">ag_brentedin==1</w:t>
+            </w:r>
+            <w:r>
+              <w:t xml:space="preserve"> </w:t>
+            </w:r>
+            <w:r>
+              <w:t xml:space="preserve">OR paid owner</w:t>
+            </w:r>
+            <w:r>
+              <w:t xml:space="preserve"> </w:t>
+            </w:r>
+            <w:r>
+              <w:rPr>
+                <w:rStyle w:val="VerbatimChar"/>
+              </w:rPr>
+              <w:t xml:space="preserve">ag_b211a/b&gt;0</w:t>
+            </w:r>
+            <w:r>
+              <w:t xml:space="preserve"> </w:t>
+            </w:r>
+            <w:r>
+              <w:t xml:space="preserve">(no acq. question in 2019)</w:t>
+            </w:r>
+          </w:p>
+        </w:tc>
+      </w:tr>
+      <w:tr>
+        <w:tc>
+          <w:p>
+            <w:pPr>
+              <w:pStyle w:val="Compact"/>
+              <w:jc w:val="left"/>
+            </w:pPr>
+            <w:r>
+              <w:rPr>
+                <w:rStyle w:val="VerbatimChar"/>
+              </w:rPr>
+              <w:t xml:space="preserve">parcel_rentedout</w:t>
+            </w:r>
+          </w:p>
+        </w:tc>
+        <w:tc>
+          <w:p>
+            <w:pPr>
+              <w:pStyle w:val="Compact"/>
+              <w:jc w:val="left"/>
+            </w:pPr>
+            <w:r>
+              <w:t xml:space="preserve">1-2</w:t>
+            </w:r>
+          </w:p>
+        </w:tc>
+        <w:tc>
+          <w:p>
+            <w:pPr>
+              <w:pStyle w:val="Compact"/>
+              <w:jc w:val="left"/>
+            </w:pPr>
+            <w:r>
+              <w:rPr>
+                <w:rStyle w:val="VerbatimChar"/>
+              </w:rPr>
+              <w:t xml:space="preserve">ag_mod_d_&lt;yy&gt;</w:t>
+            </w:r>
+          </w:p>
+        </w:tc>
+        <w:tc>
+          <w:p>
+            <w:pPr>
+              <w:pStyle w:val="Compact"/>
+              <w:jc w:val="left"/>
+            </w:pPr>
+            <w:r>
+              <w:rPr>
+                <w:rStyle w:val="VerbatimChar"/>
+              </w:rPr>
+              <w:t xml:space="preserve">ag_d19a-d</w:t>
+            </w:r>
+          </w:p>
+        </w:tc>
+        <w:tc>
+          <w:p>
+            <w:pPr>
+              <w:pStyle w:val="Compact"/>
+              <w:jc w:val="left"/>
+            </w:pPr>
+            <w:r>
+              <w:t xml:space="preserve">rent received &gt;0 (cash/in-kind, already/still)</w:t>
+            </w:r>
+          </w:p>
+        </w:tc>
+      </w:tr>
+      <w:tr>
+        <w:tc>
+          <w:p>
+            <w:pPr>
+              <w:pStyle w:val="Compact"/>
+              <w:jc w:val="left"/>
+            </w:pPr>
+            <w:r>
+              <w:rPr>
+                <w:rStyle w:val="VerbatimChar"/>
+              </w:rPr>
+              <w:t xml:space="preserve">parcel_rentedout</w:t>
+            </w:r>
+          </w:p>
+        </w:tc>
+        <w:tc>
+          <w:p>
+            <w:pPr>
+              <w:pStyle w:val="Compact"/>
+              <w:jc w:val="left"/>
+            </w:pPr>
+            <w:r>
+              <w:t xml:space="preserve">3</w:t>
+            </w:r>
+          </w:p>
+        </w:tc>
+        <w:tc>
+          <w:p>
+            <w:pPr>
+              <w:pStyle w:val="Compact"/>
+              <w:jc w:val="left"/>
+            </w:pPr>
+            <w:r>
+              <w:rPr>
+                <w:rStyle w:val="VerbatimChar"/>
+              </w:rPr>
+              <w:t xml:space="preserve">ag_mod_b2_16</w:t>
+            </w:r>
+          </w:p>
+        </w:tc>
+        <w:tc>
+          <w:p>
+            <w:pPr>
+              <w:pStyle w:val="Compact"/>
+              <w:jc w:val="left"/>
+            </w:pPr>
+            <w:r>
+              <w:rPr>
+                <w:rStyle w:val="VerbatimChar"/>
+              </w:rPr>
+              <w:t xml:space="preserve">ag_b219a-d</w:t>
+            </w:r>
+          </w:p>
+        </w:tc>
+        <w:tc>
+          <w:p>
+            <w:pPr>
+              <w:pStyle w:val="Compact"/>
+              <w:jc w:val="left"/>
+            </w:pPr>
+            <w:r>
+              <w:t xml:space="preserve">rent received &gt;0</w:t>
+            </w:r>
+          </w:p>
+        </w:tc>
+      </w:tr>
+      <w:tr>
+        <w:tc>
+          <w:p>
+            <w:pPr>
+              <w:pStyle w:val="Compact"/>
+              <w:jc w:val="left"/>
+            </w:pPr>
+            <w:r>
+              <w:rPr>
+                <w:rStyle w:val="VerbatimChar"/>
+              </w:rPr>
+              <w:t xml:space="preserve">parcel_rentedout</w:t>
+            </w:r>
+          </w:p>
+        </w:tc>
+        <w:tc>
+          <w:p>
+            <w:pPr>
+              <w:pStyle w:val="Compact"/>
+              <w:jc w:val="left"/>
+            </w:pPr>
+            <w:r>
+              <w:t xml:space="preserve">4</w:t>
+            </w:r>
+          </w:p>
+        </w:tc>
+        <w:tc>
+          <w:p>
+            <w:pPr>
+              <w:pStyle w:val="Compact"/>
+              <w:jc w:val="left"/>
+            </w:pPr>
+            <w:r>
+              <w:rPr>
+                <w:rStyle w:val="VerbatimChar"/>
+              </w:rPr>
+              <w:t xml:space="preserve">ag_mod_b2_19</w:t>
+            </w:r>
+          </w:p>
+        </w:tc>
+        <w:tc>
+          <w:p>
+            <w:pPr>
+              <w:pStyle w:val="Compact"/>
+              <w:jc w:val="left"/>
+            </w:pPr>
+            <w:r>
+              <w:rPr>
+                <w:rStyle w:val="VerbatimChar"/>
+              </w:rPr>
+              <w:t xml:space="preserve">ag_brentedout</w:t>
+            </w:r>
+            <w:r>
+              <w:t xml:space="preserve">,</w:t>
+            </w:r>
+            <w:r>
+              <w:t xml:space="preserve"> </w:t>
+            </w:r>
+            <w:r>
+              <w:rPr>
+                <w:rStyle w:val="VerbatimChar"/>
+              </w:rPr>
+              <w:t xml:space="preserve">ag_b219a-d</w:t>
+            </w:r>
+          </w:p>
+        </w:tc>
+        <w:tc>
+          <w:p>
+            <w:pPr>
+              <w:pStyle w:val="Compact"/>
+              <w:jc w:val="left"/>
+            </w:pPr>
+            <w:r>
+              <w:rPr>
+                <w:rStyle w:val="VerbatimChar"/>
+              </w:rPr>
+              <w:t xml:space="preserve">ag_brentedout==1</w:t>
+            </w:r>
+            <w:r>
+              <w:t xml:space="preserve"> </w:t>
+            </w:r>
+            <w:r>
+              <w:t xml:space="preserve">OR</w:t>
+            </w:r>
+            <w:r>
+              <w:t xml:space="preserve"> </w:t>
+            </w:r>
+            <w:r>
+              <w:rPr>
+                <w:rStyle w:val="VerbatimChar"/>
+              </w:rPr>
+              <w:t xml:space="preserve">ag_b219a-d&gt;0</w:t>
+            </w:r>
+          </w:p>
+        </w:tc>
+      </w:tr>
+      <w:tr>
+        <w:tc>
+          <w:p>
+            <w:pPr>
+              <w:pStyle w:val="Compact"/>
+              <w:jc w:val="left"/>
+            </w:pPr>
+            <w:r>
+              <w:rPr>
+                <w:rStyle w:val="VerbatimChar"/>
+              </w:rPr>
+              <w:t xml:space="preserve">parcel_certificate</w:t>
+            </w:r>
+          </w:p>
+        </w:tc>
+        <w:tc>
+          <w:p>
+            <w:pPr>
+              <w:pStyle w:val="Compact"/>
+              <w:jc w:val="left"/>
+            </w:pPr>
+            <w:r>
+              <w:t xml:space="preserve">1</w:t>
+            </w:r>
+          </w:p>
+        </w:tc>
+        <w:tc>
+          <w:p>
+            <w:pPr>
+              <w:pStyle w:val="Compact"/>
+              <w:jc w:val="left"/>
+            </w:pPr>
+            <w:r>
+              <w:t xml:space="preserve">—</w:t>
+            </w:r>
+          </w:p>
+        </w:tc>
+        <w:tc>
+          <w:p>
+            <w:pPr>
+              <w:pStyle w:val="Compact"/>
+              <w:jc w:val="left"/>
+            </w:pPr>
+            <w:r>
+              <w:t xml:space="preserve">—</w:t>
+            </w:r>
+          </w:p>
+        </w:tc>
+        <w:tc>
+          <w:p>
+            <w:pPr>
+              <w:pStyle w:val="Compact"/>
+              <w:jc w:val="left"/>
+            </w:pPr>
+            <w:r>
+              <w:rPr>
+                <w:b/>
+              </w:rPr>
+              <w:t xml:space="preserve">missing</w:t>
+            </w:r>
+            <w:r>
+              <w:t xml:space="preserve"> </w:t>
+            </w:r>
+            <w:r>
+              <w:t xml:space="preserve">— not asked</w:t>
+            </w:r>
+          </w:p>
+        </w:tc>
+      </w:tr>
+      <w:tr>
+        <w:tc>
+          <w:p>
+            <w:pPr>
+              <w:pStyle w:val="Compact"/>
+              <w:jc w:val="left"/>
+            </w:pPr>
+            <w:r>
+              <w:rPr>
+                <w:rStyle w:val="VerbatimChar"/>
+              </w:rPr>
+              <w:t xml:space="preserve">parcel_certificate</w:t>
+            </w:r>
+          </w:p>
+        </w:tc>
+        <w:tc>
+          <w:p>
+            <w:pPr>
+              <w:pStyle w:val="Compact"/>
+              <w:jc w:val="left"/>
+            </w:pPr>
+            <w:r>
+              <w:t xml:space="preserve">2</w:t>
+            </w:r>
+          </w:p>
+        </w:tc>
+        <w:tc>
+          <w:p>
+            <w:pPr>
+              <w:pStyle w:val="Compact"/>
+              <w:jc w:val="left"/>
+            </w:pPr>
+            <w:r>
+              <w:rPr>
+                <w:rStyle w:val="VerbatimChar"/>
+              </w:rPr>
+              <w:t xml:space="preserve">ag_mod_d_13</w:t>
+            </w:r>
+          </w:p>
+        </w:tc>
+        <w:tc>
+          <w:p>
+            <w:pPr>
+              <w:pStyle w:val="Compact"/>
+              <w:jc w:val="left"/>
+            </w:pPr>
+            <w:r>
+              <w:rPr>
+                <w:rStyle w:val="VerbatimChar"/>
+              </w:rPr>
+              <w:t xml:space="preserve">ag_d03_1</w:t>
+            </w:r>
+          </w:p>
+        </w:tc>
+        <w:tc>
+          <w:p>
+            <w:pPr>
+              <w:pStyle w:val="Compact"/>
+              <w:jc w:val="left"/>
+            </w:pPr>
+            <w:r>
+              <w:rPr>
+                <w:rStyle w:val="VerbatimChar"/>
+              </w:rPr>
+              <w:t xml:space="preserve">ag_d03_1==1</w:t>
+            </w:r>
+            <w:r>
+              <w:t xml:space="preserve"> </w:t>
+            </w:r>
+            <w:r>
+              <w:t xml:space="preserve">(has title)</w:t>
+            </w:r>
+          </w:p>
+        </w:tc>
+      </w:tr>
+      <w:tr>
+        <w:tc>
+          <w:p>
+            <w:pPr>
+              <w:pStyle w:val="Compact"/>
+              <w:jc w:val="left"/>
+            </w:pPr>
+            <w:r>
+              <w:rPr>
+                <w:rStyle w:val="VerbatimChar"/>
+              </w:rPr>
+              <w:t xml:space="preserve">parcel_certificate</w:t>
+            </w:r>
+          </w:p>
+        </w:tc>
+        <w:tc>
+          <w:p>
+            <w:pPr>
+              <w:pStyle w:val="Compact"/>
+              <w:jc w:val="left"/>
+            </w:pPr>
+            <w:r>
+              <w:t xml:space="preserve">3</w:t>
+            </w:r>
+          </w:p>
+        </w:tc>
+        <w:tc>
+          <w:p>
+            <w:pPr>
+              <w:pStyle w:val="Compact"/>
+              <w:jc w:val="left"/>
+            </w:pPr>
+            <w:r>
+              <w:rPr>
+                <w:rStyle w:val="VerbatimChar"/>
+              </w:rPr>
+              <w:t xml:space="preserve">ag_mod_b2_16</w:t>
+            </w:r>
+          </w:p>
+        </w:tc>
+        <w:tc>
+          <w:p>
+            <w:pPr>
+              <w:pStyle w:val="Compact"/>
+              <w:jc w:val="left"/>
+            </w:pPr>
+            <w:r>
+              <w:rPr>
+                <w:rStyle w:val="VerbatimChar"/>
+              </w:rPr>
+              <w:t xml:space="preserve">ag_b204_1</w:t>
+            </w:r>
+          </w:p>
+        </w:tc>
+        <w:tc>
+          <w:p>
+            <w:pPr>
+              <w:pStyle w:val="Compact"/>
+              <w:jc w:val="left"/>
+            </w:pPr>
+            <w:r>
+              <w:rPr>
+                <w:rStyle w:val="VerbatimChar"/>
+              </w:rPr>
+              <w:t xml:space="preserve">inlist(ag_b204_1,1,2,3)</w:t>
+            </w:r>
+            <w:r>
+              <w:t xml:space="preserve"> </w:t>
+            </w:r>
+            <w:r>
+              <w:t xml:space="preserve">(lease offer / title deed / lease cert)</w:t>
+            </w:r>
+          </w:p>
+        </w:tc>
+      </w:tr>
+      <w:tr>
+        <w:tc>
+          <w:p>
+            <w:pPr>
+              <w:pStyle w:val="Compact"/>
+              <w:jc w:val="left"/>
+            </w:pPr>
+            <w:r>
+              <w:rPr>
+                <w:rStyle w:val="VerbatimChar"/>
+              </w:rPr>
+              <w:t xml:space="preserve">parcel_certificate</w:t>
+            </w:r>
+          </w:p>
+        </w:tc>
+        <w:tc>
+          <w:p>
+            <w:pPr>
+              <w:pStyle w:val="Compact"/>
+              <w:jc w:val="left"/>
+            </w:pPr>
+            <w:r>
+              <w:t xml:space="preserve">4</w:t>
+            </w:r>
+          </w:p>
+        </w:tc>
+        <w:tc>
+          <w:p>
+            <w:pPr>
+              <w:pStyle w:val="Compact"/>
+              <w:jc w:val="left"/>
+            </w:pPr>
+            <w:r>
+              <w:t xml:space="preserve">—</w:t>
+            </w:r>
+          </w:p>
+        </w:tc>
+        <w:tc>
+          <w:p>
+            <w:pPr>
+              <w:pStyle w:val="Compact"/>
+              <w:jc w:val="left"/>
+            </w:pPr>
+            <w:r>
+              <w:t xml:space="preserve">—</w:t>
+            </w:r>
+          </w:p>
+        </w:tc>
+        <w:tc>
+          <w:p>
+            <w:pPr>
+              <w:pStyle w:val="Compact"/>
+              <w:jc w:val="left"/>
+            </w:pPr>
+            <w:r>
+              <w:rPr>
+                <w:b/>
+              </w:rPr>
+              <w:t xml:space="preserve">missing</w:t>
+            </w:r>
+            <w:r>
+              <w:t xml:space="preserve"> </w:t>
+            </w:r>
+            <w:r>
+              <w:t xml:space="preserve">— not asked</w:t>
+            </w:r>
+          </w:p>
+        </w:tc>
+      </w:tr>
+      <w:tr>
+        <w:tc>
+          <w:p>
+            <w:pPr>
+              <w:pStyle w:val="Compact"/>
+              <w:jc w:val="left"/>
+            </w:pPr>
+            <w:r>
+              <w:rPr>
+                <w:rStyle w:val="VerbatimChar"/>
+              </w:rPr>
+              <w:t xml:space="preserve">parcel_purchased</w:t>
+            </w:r>
+          </w:p>
+        </w:tc>
+        <w:tc>
+          <w:p>
+            <w:pPr>
+              <w:pStyle w:val="Compact"/>
+              <w:jc w:val="left"/>
+            </w:pPr>
+            <w:r>
+              <w:t xml:space="preserve">1-2</w:t>
+            </w:r>
+          </w:p>
+        </w:tc>
+        <w:tc>
+          <w:p>
+            <w:pPr>
+              <w:pStyle w:val="Compact"/>
+              <w:jc w:val="left"/>
+            </w:pPr>
+            <w:r>
+              <w:rPr>
+                <w:rStyle w:val="VerbatimChar"/>
+              </w:rPr>
+              <w:t xml:space="preserve">ag_mod_d_&lt;yy&gt;</w:t>
+            </w:r>
+          </w:p>
+        </w:tc>
+        <w:tc>
+          <w:p>
+            <w:pPr>
+              <w:pStyle w:val="Compact"/>
+              <w:jc w:val="left"/>
+            </w:pPr>
+            <w:r>
+              <w:rPr>
+                <w:rStyle w:val="VerbatimChar"/>
+              </w:rPr>
+              <w:t xml:space="preserve">ag_d03</w:t>
+            </w:r>
+          </w:p>
+        </w:tc>
+        <w:tc>
+          <w:p>
+            <w:pPr>
+              <w:pStyle w:val="Compact"/>
+              <w:jc w:val="left"/>
+            </w:pPr>
+            <w:r>
+              <w:rPr>
+                <w:rStyle w:val="VerbatimChar"/>
+              </w:rPr>
+              <w:t xml:space="preserve">inlist(ag_d03,4,5)</w:t>
+            </w:r>
+            <w:r>
+              <w:t xml:space="preserve"> </w:t>
+            </w:r>
+            <w:r>
+              <w:t xml:space="preserve">— purchased w/ or w/o title</w:t>
+            </w:r>
+          </w:p>
+        </w:tc>
+      </w:tr>
+      <w:tr>
+        <w:tc>
+          <w:p>
+            <w:pPr>
+              <w:pStyle w:val="Compact"/>
+              <w:jc w:val="left"/>
+            </w:pPr>
+            <w:r>
+              <w:rPr>
+                <w:rStyle w:val="VerbatimChar"/>
+              </w:rPr>
+              <w:t xml:space="preserve">parcel_purchased</w:t>
+            </w:r>
+          </w:p>
+        </w:tc>
+        <w:tc>
+          <w:p>
+            <w:pPr>
+              <w:pStyle w:val="Compact"/>
+              <w:jc w:val="left"/>
+            </w:pPr>
+            <w:r>
+              <w:t xml:space="preserve">3</w:t>
+            </w:r>
+          </w:p>
+        </w:tc>
+        <w:tc>
+          <w:p>
+            <w:pPr>
+              <w:pStyle w:val="Compact"/>
+              <w:jc w:val="left"/>
+            </w:pPr>
+            <w:r>
+              <w:rPr>
+                <w:rStyle w:val="VerbatimChar"/>
+              </w:rPr>
+              <w:t xml:space="preserve">ag_mod_b2_16</w:t>
+            </w:r>
+          </w:p>
+        </w:tc>
+        <w:tc>
+          <w:p>
+            <w:pPr>
+              <w:pStyle w:val="Compact"/>
+              <w:jc w:val="left"/>
+            </w:pPr>
+            <w:r>
+              <w:rPr>
+                <w:rStyle w:val="VerbatimChar"/>
+              </w:rPr>
+              <w:t xml:space="preserve">ag_b203</w:t>
+            </w:r>
+          </w:p>
+        </w:tc>
+        <w:tc>
+          <w:p>
+            <w:pPr>
+              <w:pStyle w:val="Compact"/>
+              <w:jc w:val="left"/>
+            </w:pPr>
+            <w:r>
+              <w:rPr>
+                <w:rStyle w:val="VerbatimChar"/>
+              </w:rPr>
+              <w:t xml:space="preserve">ag_b203==4</w:t>
+            </w:r>
+            <w:r>
+              <w:t xml:space="preserve"> </w:t>
+            </w:r>
+            <w:r>
+              <w:t xml:space="preserve">— purchased</w:t>
+            </w:r>
+          </w:p>
+        </w:tc>
+      </w:tr>
+      <w:tr>
+        <w:tc>
+          <w:p>
+            <w:pPr>
+              <w:pStyle w:val="Compact"/>
+              <w:jc w:val="left"/>
+            </w:pPr>
+            <w:r>
+              <w:rPr>
+                <w:rStyle w:val="VerbatimChar"/>
+              </w:rPr>
+              <w:t xml:space="preserve">parcel_purchased</w:t>
+            </w:r>
+          </w:p>
+        </w:tc>
+        <w:tc>
+          <w:p>
+            <w:pPr>
+              <w:pStyle w:val="Compact"/>
+              <w:jc w:val="left"/>
+            </w:pPr>
+            <w:r>
+              <w:t xml:space="preserve">4</w:t>
+            </w:r>
+          </w:p>
+        </w:tc>
+        <w:tc>
+          <w:p>
+            <w:pPr>
+              <w:pStyle w:val="Compact"/>
+              <w:jc w:val="left"/>
+            </w:pPr>
+            <w:r>
+              <w:t xml:space="preserve">—</w:t>
+            </w:r>
+          </w:p>
+        </w:tc>
+        <w:tc>
+          <w:p>
+            <w:pPr>
+              <w:pStyle w:val="Compact"/>
+              <w:jc w:val="left"/>
+            </w:pPr>
+            <w:r>
+              <w:t xml:space="preserve">—</w:t>
+            </w:r>
+          </w:p>
+        </w:tc>
+        <w:tc>
+          <w:p>
+            <w:pPr>
+              <w:pStyle w:val="Compact"/>
+              <w:jc w:val="left"/>
+            </w:pPr>
+            <w:r>
+              <w:rPr>
+                <w:b/>
+              </w:rPr>
+              <w:t xml:space="preserve">missing</w:t>
+            </w:r>
+            <w:r>
+              <w:t xml:space="preserve"> </w:t>
+            </w:r>
+            <w:r>
+              <w:t xml:space="preserve">— acquisition question dropped in 2019</w:t>
+            </w:r>
+          </w:p>
+        </w:tc>
+      </w:tr>
+    </w:tbl>
+    <w:p>
+      <w:pPr>
+        <w:pStyle w:val="Heading3"/>
+      </w:pPr>
+      <w:bookmarkStart w:id="32" w:name="parcel-area-parcel_area_ha-1"/>
+      <w:r>
+        <w:t xml:space="preserve">3. Parcel area (</w:t>
+      </w:r>
+      <w:r>
+        <w:rPr>
+          <w:rStyle w:val="VerbatimChar"/>
+        </w:rPr>
+        <w:t xml:space="preserve">parcel_area_ha</w:t>
+      </w:r>
+      <w:r>
+        <w:t xml:space="preserve">)</w:t>
+      </w:r>
+      <w:bookmarkEnd w:id="32"/>
+    </w:p>
+    <w:p>
+      <w:pPr>
+        <w:pStyle w:val="FirstParagraph"/>
+      </w:pPr>
+      <w:r>
+        <w:t xml:space="preserve">Field roster</w:t>
+      </w:r>
+      <w:r>
+        <w:t xml:space="preserve"> </w:t>
+      </w:r>
+      <w:r>
+        <w:rPr>
+          <w:rStyle w:val="VerbatimChar"/>
+        </w:rPr>
+        <w:t xml:space="preserve">ag_mod_c_&lt;yy&gt;</w:t>
+      </w:r>
+      <w:r>
+        <w:t xml:space="preserve"> </w:t>
+      </w:r>
+      <w:r>
+        <w:t xml:space="preserve">(+ perennial</w:t>
+      </w:r>
+      <w:r>
+        <w:t xml:space="preserve"> </w:t>
+      </w:r>
+      <w:r>
+        <w:rPr>
+          <w:rStyle w:val="VerbatimChar"/>
+        </w:rPr>
+        <w:t xml:space="preserve">ag_mod_o2_&lt;yy&gt;</w:t>
+      </w:r>
+      <w:r>
+        <w:t xml:space="preserve"> </w:t>
+      </w:r>
+      <w:r>
+        <w:t xml:space="preserve">for w2-4). GPS area</w:t>
+      </w:r>
+      <w:r>
+        <w:t xml:space="preserve"> </w:t>
+      </w:r>
+      <w:r>
+        <w:rPr>
+          <w:rStyle w:val="VerbatimChar"/>
+        </w:rPr>
+        <w:t xml:space="preserve">ag_c04c</w:t>
+      </w:r>
+      <w:r>
+        <w:t xml:space="preserve"> </w:t>
+      </w:r>
+      <w:r>
+        <w:t xml:space="preserve">and self-reported</w:t>
+      </w:r>
+      <w:r>
+        <w:t xml:space="preserve"> </w:t>
+      </w:r>
+      <w:r>
+        <w:rPr>
+          <w:rStyle w:val="VerbatimChar"/>
+        </w:rPr>
+        <w:t xml:space="preserve">ag_c04a</w:t>
+      </w:r>
+      <w:r>
+        <w:t xml:space="preserve"> </w:t>
+      </w:r>
+      <w:r>
+        <w:t xml:space="preserve">(unit</w:t>
+      </w:r>
+      <w:r>
+        <w:t xml:space="preserve"> </w:t>
+      </w:r>
+      <w:r>
+        <w:rPr>
+          <w:rStyle w:val="VerbatimChar"/>
+        </w:rPr>
+        <w:t xml:space="preserve">ag_c04b</w:t>
+      </w:r>
+      <w:r>
+        <w:t xml:space="preserve">: 1=acre, 2=ha, 3=m²);</w:t>
+      </w:r>
+      <w:r>
+        <w:t xml:space="preserve"> </w:t>
+      </w:r>
+      <w:r>
+        <w:t xml:space="preserve">acres→ha via ×0.404686. Missing GPS imputed by</w:t>
+      </w:r>
+      <w:r>
+        <w:t xml:space="preserve"> </w:t>
+      </w:r>
+      <w:r>
+        <w:rPr>
+          <w:rStyle w:val="VerbatimChar"/>
+        </w:rPr>
+        <w:t xml:space="preserve">mi impute pmm … i.admin_3</w:t>
+      </w:r>
+      <w:r>
+        <w:t xml:space="preserve"> </w:t>
+      </w:r>
+      <w:r>
+        <w:t xml:space="preserve">(stratifier = district, built inline). Summed to the parcel: garden in w3-4;</w:t>
+      </w:r>
+      <w:r>
+        <w:t xml:space="preserve"> </w:t>
+      </w:r>
+      <w:r>
+        <w:t xml:space="preserve">in w1-2 each plot is its own parcel.</w:t>
+      </w:r>
+      <w:r>
+        <w:t xml:space="preserve"> </w:t>
+      </w:r>
+      <w:r>
+        <w:rPr>
+          <w:rStyle w:val="VerbatimChar"/>
+        </w:rPr>
+        <w:t xml:space="preserve">n_fields</w:t>
+      </w:r>
+      <w:r>
+        <w:t xml:space="preserve"> </w:t>
+      </w:r>
+      <w:r>
+        <w:t xml:space="preserve">= cultivated fields per parcel.</w:t>
+      </w:r>
+    </w:p>
+    <w:p>
+      <w:pPr>
+        <w:pStyle w:val="Heading3"/>
+      </w:pPr>
+      <w:bookmarkStart w:id="33" w:name="design-variables-identifiers-1"/>
+      <w:r>
+        <w:t xml:space="preserve">4. Design variables &amp; identifiers</w:t>
+      </w:r>
+      <w:bookmarkEnd w:id="33"/>
+    </w:p>
+    <w:tbl>
+      <w:tblPr>
+        <w:tblStyle w:val="Table"/>
+        <w:tblW w:type="pct" w:w="5000.0"/>
+        <w:tblLook w:firstRow="1"/>
+      </w:tblPr>
+      <w:tblGrid>
+        <w:gridCol w:w="1508"/>
+        <w:gridCol w:w="565"/>
+        <w:gridCol w:w="1508"/>
+        <w:gridCol w:w="1508"/>
+        <w:gridCol w:w="2828"/>
+      </w:tblGrid>
+      <w:tr>
+        <w:trPr>
+          <w:cnfStyle w:firstRow="1"/>
+        </w:trPr>
+        <w:tc>
+          <w:tcPr>
+            <w:tcBorders>
+              <w:bottom w:val="single"/>
+            </w:tcBorders>
+            <w:vAlign w:val="bottom"/>
+          </w:tcPr>
+          <w:p>
+            <w:pPr>
+              <w:pStyle w:val="Compact"/>
+              <w:jc w:val="left"/>
+            </w:pPr>
+            <w:r>
+              <w:t xml:space="preserve">Variable</w:t>
+            </w:r>
+          </w:p>
+        </w:tc>
+        <w:tc>
+          <w:tcPr>
+            <w:tcBorders>
+              <w:bottom w:val="single"/>
+            </w:tcBorders>
+            <w:vAlign w:val="bottom"/>
+          </w:tcPr>
+          <w:p>
+            <w:pPr>
+              <w:pStyle w:val="Compact"/>
+              <w:jc w:val="left"/>
+            </w:pPr>
+            <w:r>
+              <w:t xml:space="preserve">Wave</w:t>
+            </w:r>
+          </w:p>
+        </w:tc>
+        <w:tc>
+          <w:tcPr>
+            <w:tcBorders>
+              <w:bottom w:val="single"/>
+            </w:tcBorders>
+            <w:vAlign w:val="bottom"/>
+          </w:tcPr>
+          <w:p>
+            <w:pPr>
+              <w:pStyle w:val="Compact"/>
+              <w:jc w:val="left"/>
+            </w:pPr>
+            <w:r>
+              <w:t xml:space="preserve">Source file</w:t>
+            </w:r>
+          </w:p>
+        </w:tc>
+        <w:tc>
+          <w:tcPr>
+            <w:tcBorders>
+              <w:bottom w:val="single"/>
+            </w:tcBorders>
+            <w:vAlign w:val="bottom"/>
+          </w:tcPr>
+          <w:p>
+            <w:pPr>
+              <w:pStyle w:val="Compact"/>
+              <w:jc w:val="left"/>
+            </w:pPr>
+            <w:r>
+              <w:t xml:space="preserve">Source var(s)</w:t>
+            </w:r>
+          </w:p>
+        </w:tc>
+        <w:tc>
+          <w:tcPr>
+            <w:tcBorders>
+              <w:bottom w:val="single"/>
+            </w:tcBorders>
+            <w:vAlign w:val="bottom"/>
+          </w:tcPr>
+          <w:p>
+            <w:pPr>
+              <w:pStyle w:val="Compact"/>
+              <w:jc w:val="left"/>
+            </w:pPr>
+            <w:r>
+              <w:t xml:space="preserve">Construction</w:t>
+            </w:r>
+          </w:p>
+        </w:tc>
+      </w:tr>
+      <w:tr>
+        <w:tc>
+          <w:p>
+            <w:pPr>
+              <w:pStyle w:val="Compact"/>
+              <w:jc w:val="left"/>
+            </w:pPr>
+            <w:r>
+              <w:rPr>
+                <w:rStyle w:val="VerbatimChar"/>
+              </w:rPr>
+              <w:t xml:space="preserve">weight</w:t>
+            </w:r>
+          </w:p>
+        </w:tc>
+        <w:tc>
+          <w:p>
+            <w:pPr>
+              <w:pStyle w:val="Compact"/>
+              <w:jc w:val="left"/>
+            </w:pPr>
+            <w:r>
+              <w:t xml:space="preserve">1</w:t>
+            </w:r>
+          </w:p>
+        </w:tc>
+        <w:tc>
+          <w:p>
+            <w:pPr>
+              <w:pStyle w:val="Compact"/>
+              <w:jc w:val="left"/>
+            </w:pPr>
+            <w:r>
+              <w:rPr>
+                <w:rStyle w:val="VerbatimChar"/>
+              </w:rPr>
+              <w:t xml:space="preserve">hh_mod_a_filt_10</w:t>
+            </w:r>
+          </w:p>
+        </w:tc>
+        <w:tc>
+          <w:p>
+            <w:pPr>
+              <w:pStyle w:val="Compact"/>
+              <w:jc w:val="left"/>
+            </w:pPr>
+            <w:r>
+              <w:rPr>
+                <w:rStyle w:val="VerbatimChar"/>
+              </w:rPr>
+              <w:t xml:space="preserve">hh_wgt</w:t>
+            </w:r>
+          </w:p>
+        </w:tc>
+        <w:tc>
+          <w:p>
+            <w:pPr>
+              <w:pStyle w:val="Compact"/>
+              <w:jc w:val="left"/>
+            </w:pPr>
+            <w:r>
+              <w:t xml:space="preserve">baseline sampling weight</w:t>
+            </w:r>
+          </w:p>
+        </w:tc>
+      </w:tr>
+      <w:tr>
+        <w:tc>
+          <w:p>
+            <w:pPr>
+              <w:pStyle w:val="Compact"/>
+              <w:jc w:val="left"/>
+            </w:pPr>
+            <w:r>
+              <w:rPr>
+                <w:rStyle w:val="VerbatimChar"/>
+              </w:rPr>
+              <w:t xml:space="preserve">weight</w:t>
+            </w:r>
+          </w:p>
+        </w:tc>
+        <w:tc>
+          <w:p>
+            <w:pPr>
+              <w:pStyle w:val="Compact"/>
+              <w:jc w:val="left"/>
+            </w:pPr>
+            <w:r>
+              <w:t xml:space="preserve">2</w:t>
+            </w:r>
+          </w:p>
+        </w:tc>
+        <w:tc>
+          <w:p>
+            <w:pPr>
+              <w:pStyle w:val="Compact"/>
+              <w:jc w:val="left"/>
+            </w:pPr>
+            <w:r>
+              <w:rPr>
+                <w:rStyle w:val="VerbatimChar"/>
+              </w:rPr>
+              <w:t xml:space="preserve">hh_mod_a_filt_13</w:t>
+            </w:r>
+          </w:p>
+        </w:tc>
+        <w:tc>
+          <w:p>
+            <w:pPr>
+              <w:pStyle w:val="Compact"/>
+              <w:jc w:val="left"/>
+            </w:pPr>
+            <w:r>
+              <w:rPr>
+                <w:rStyle w:val="VerbatimChar"/>
+              </w:rPr>
+              <w:t xml:space="preserve">panelweight</w:t>
+            </w:r>
+          </w:p>
+        </w:tc>
+        <w:tc>
+          <w:p>
+            <w:pPr>
+              <w:pStyle w:val="Compact"/>
+              <w:jc w:val="left"/>
+            </w:pPr>
+            <w:r>
+              <w:t xml:space="preserve">panel weight 2013</w:t>
+            </w:r>
+          </w:p>
+        </w:tc>
+      </w:tr>
+      <w:tr>
+        <w:tc>
+          <w:p>
+            <w:pPr>
+              <w:pStyle w:val="Compact"/>
+              <w:jc w:val="left"/>
+            </w:pPr>
+            <w:r>
+              <w:rPr>
+                <w:rStyle w:val="VerbatimChar"/>
+              </w:rPr>
+              <w:t xml:space="preserve">weight</w:t>
+            </w:r>
+          </w:p>
+        </w:tc>
+        <w:tc>
+          <w:p>
+            <w:pPr>
+              <w:pStyle w:val="Compact"/>
+              <w:jc w:val="left"/>
+            </w:pPr>
+            <w:r>
+              <w:t xml:space="preserve">3</w:t>
+            </w:r>
+          </w:p>
+        </w:tc>
+        <w:tc>
+          <w:p>
+            <w:pPr>
+              <w:pStyle w:val="Compact"/>
+              <w:jc w:val="left"/>
+            </w:pPr>
+            <w:r>
+              <w:rPr>
+                <w:rStyle w:val="VerbatimChar"/>
+              </w:rPr>
+              <w:t xml:space="preserve">hh_mod_a_filt_16</w:t>
+            </w:r>
+          </w:p>
+        </w:tc>
+        <w:tc>
+          <w:p>
+            <w:pPr>
+              <w:pStyle w:val="Compact"/>
+              <w:jc w:val="left"/>
+            </w:pPr>
+            <w:r>
+              <w:rPr>
+                <w:rStyle w:val="VerbatimChar"/>
+              </w:rPr>
+              <w:t xml:space="preserve">panelweight_2016</w:t>
+            </w:r>
+          </w:p>
+        </w:tc>
+        <w:tc>
+          <w:p>
+            <w:pPr>
+              <w:pStyle w:val="Compact"/>
+              <w:jc w:val="left"/>
+            </w:pPr>
+            <w:r>
+              <w:t xml:space="preserve">panel weight 2016</w:t>
+            </w:r>
+          </w:p>
+        </w:tc>
+      </w:tr>
+      <w:tr>
+        <w:tc>
+          <w:p>
+            <w:pPr>
+              <w:pStyle w:val="Compact"/>
+              <w:jc w:val="left"/>
+            </w:pPr>
+            <w:r>
+              <w:rPr>
+                <w:rStyle w:val="VerbatimChar"/>
+              </w:rPr>
+              <w:t xml:space="preserve">weight</w:t>
+            </w:r>
+          </w:p>
+        </w:tc>
+        <w:tc>
+          <w:p>
+            <w:pPr>
+              <w:pStyle w:val="Compact"/>
+              <w:jc w:val="left"/>
+            </w:pPr>
+            <w:r>
+              <w:t xml:space="preserve">4</w:t>
+            </w:r>
+          </w:p>
+        </w:tc>
+        <w:tc>
+          <w:p>
+            <w:pPr>
+              <w:pStyle w:val="Compact"/>
+              <w:jc w:val="left"/>
+            </w:pPr>
+            <w:r>
+              <w:rPr>
+                <w:rStyle w:val="VerbatimChar"/>
+              </w:rPr>
+              <w:t xml:space="preserve">hh_mod_a_filt_19</w:t>
+            </w:r>
+          </w:p>
+        </w:tc>
+        <w:tc>
+          <w:p>
+            <w:pPr>
+              <w:pStyle w:val="Compact"/>
+              <w:jc w:val="left"/>
+            </w:pPr>
+            <w:r>
+              <w:rPr>
+                <w:rStyle w:val="VerbatimChar"/>
+              </w:rPr>
+              <w:t xml:space="preserve">panelweight_2019</w:t>
+            </w:r>
+          </w:p>
+        </w:tc>
+        <w:tc>
+          <w:p>
+            <w:pPr>
+              <w:pStyle w:val="Compact"/>
+              <w:jc w:val="left"/>
+            </w:pPr>
+            <w:r>
+              <w:t xml:space="preserve">panel weight 2019</w:t>
+            </w:r>
+          </w:p>
+        </w:tc>
+      </w:tr>
+      <w:tr>
+        <w:tc>
+          <w:p>
+            <w:pPr>
+              <w:pStyle w:val="Compact"/>
+              <w:jc w:val="left"/>
+            </w:pPr>
+            <w:r>
+              <w:rPr>
+                <w:rStyle w:val="VerbatimChar"/>
+              </w:rPr>
+              <w:t xml:space="preserve">ea_id</w:t>
+            </w:r>
+          </w:p>
+        </w:tc>
+        <w:tc>
+          <w:p>
+            <w:pPr>
+              <w:pStyle w:val="Compact"/>
+              <w:jc w:val="left"/>
+            </w:pPr>
+            <w:r>
+              <w:t xml:space="preserve">1-4</w:t>
+            </w:r>
+          </w:p>
+        </w:tc>
+        <w:tc>
+          <w:p>
+            <w:pPr>
+              <w:pStyle w:val="Compact"/>
+              <w:jc w:val="left"/>
+            </w:pPr>
+            <w:r>
+              <w:rPr>
+                <w:rStyle w:val="VerbatimChar"/>
+              </w:rPr>
+              <w:t xml:space="preserve">hh_mod_a_filt_&lt;yy&gt;</w:t>
+            </w:r>
+          </w:p>
+        </w:tc>
+        <w:tc>
+          <w:p>
+            <w:pPr>
+              <w:pStyle w:val="Compact"/>
+              <w:jc w:val="left"/>
+            </w:pPr>
+            <w:r>
+              <w:rPr>
+                <w:rStyle w:val="VerbatimChar"/>
+              </w:rPr>
+              <w:t xml:space="preserve">ea_id</w:t>
+            </w:r>
+          </w:p>
+        </w:tc>
+        <w:tc>
+          <w:p>
+            <w:pPr>
+              <w:pStyle w:val="Compact"/>
+              <w:jc w:val="left"/>
+            </w:pPr>
+            <w:r>
+              <w:t xml:space="preserve">enumeration area (PSU)</w:t>
+            </w:r>
+          </w:p>
+        </w:tc>
+      </w:tr>
+      <w:tr>
+        <w:tc>
+          <w:p>
+            <w:pPr>
+              <w:pStyle w:val="Compact"/>
+              <w:jc w:val="left"/>
+            </w:pPr>
+            <w:r>
+              <w:rPr>
+                <w:rStyle w:val="VerbatimChar"/>
+              </w:rPr>
+              <w:t xml:space="preserve">strataid</w:t>
+            </w:r>
+          </w:p>
+        </w:tc>
+        <w:tc>
+          <w:p>
+            <w:pPr>
+              <w:pStyle w:val="Compact"/>
+              <w:jc w:val="left"/>
+            </w:pPr>
+            <w:r>
+              <w:t xml:space="preserve">1-2</w:t>
+            </w:r>
+          </w:p>
+        </w:tc>
+        <w:tc>
+          <w:p>
+            <w:pPr>
+              <w:pStyle w:val="Compact"/>
+              <w:jc w:val="left"/>
+            </w:pPr>
+            <w:r>
+              <w:rPr>
+                <w:rStyle w:val="VerbatimChar"/>
+              </w:rPr>
+              <w:t xml:space="preserve">hh_mod_a_filt_&lt;yy&gt;</w:t>
+            </w:r>
+          </w:p>
+        </w:tc>
+        <w:tc>
+          <w:p>
+            <w:pPr>
+              <w:pStyle w:val="Compact"/>
+              <w:jc w:val="left"/>
+            </w:pPr>
+            <w:r>
+              <w:rPr>
+                <w:rStyle w:val="VerbatimChar"/>
+              </w:rPr>
+              <w:t xml:space="preserve">stratum</w:t>
+            </w:r>
+          </w:p>
+        </w:tc>
+        <w:tc>
+          <w:p>
+            <w:pPr>
+              <w:pStyle w:val="Compact"/>
+              <w:jc w:val="left"/>
+            </w:pPr>
+            <w:r>
+              <w:t xml:space="preserve">baseline stratum (region × urban/rural)</w:t>
+            </w:r>
+          </w:p>
+        </w:tc>
+      </w:tr>
+      <w:tr>
+        <w:tc>
+          <w:p>
+            <w:pPr>
+              <w:pStyle w:val="Compact"/>
+              <w:jc w:val="left"/>
+            </w:pPr>
+            <w:r>
+              <w:rPr>
+                <w:rStyle w:val="VerbatimChar"/>
+              </w:rPr>
+              <w:t xml:space="preserve">strataid</w:t>
+            </w:r>
+          </w:p>
+        </w:tc>
+        <w:tc>
+          <w:p>
+            <w:pPr>
+              <w:pStyle w:val="Compact"/>
+              <w:jc w:val="left"/>
+            </w:pPr>
+            <w:r>
+              <w:t xml:space="preserve">3-4</w:t>
+            </w:r>
+          </w:p>
+        </w:tc>
+        <w:tc>
+          <w:p>
+            <w:pPr>
+              <w:pStyle w:val="Compact"/>
+              <w:jc w:val="left"/>
+            </w:pPr>
+            <w:r>
+              <w:rPr>
+                <w:rStyle w:val="VerbatimChar"/>
+              </w:rPr>
+              <w:t xml:space="preserve">hh_mod_a_filt_&lt;yy&gt;</w:t>
+            </w:r>
+          </w:p>
+        </w:tc>
+        <w:tc>
+          <w:p>
+            <w:pPr>
+              <w:pStyle w:val="Compact"/>
+              <w:jc w:val="left"/>
+            </w:pPr>
+            <w:r>
+              <w:rPr>
+                <w:rStyle w:val="VerbatimChar"/>
+              </w:rPr>
+              <w:t xml:space="preserve">region</w:t>
+            </w:r>
+            <w:r>
+              <w:t xml:space="preserve">,</w:t>
+            </w:r>
+            <w:r>
+              <w:t xml:space="preserve"> </w:t>
+            </w:r>
+            <w:r>
+              <w:rPr>
+                <w:rStyle w:val="VerbatimChar"/>
+              </w:rPr>
+              <w:t xml:space="preserve">reside</w:t>
+            </w:r>
+          </w:p>
+        </w:tc>
+        <w:tc>
+          <w:p>
+            <w:pPr>
+              <w:pStyle w:val="Compact"/>
+              <w:jc w:val="left"/>
+            </w:pPr>
+            <w:r>
+              <w:rPr>
+                <w:rStyle w:val="VerbatimChar"/>
+              </w:rPr>
+              <w:t xml:space="preserve">group(region reside)</w:t>
+            </w:r>
+            <w:r>
+              <w:t xml:space="preserve"> </w:t>
+            </w:r>
+            <w:r>
+              <w:t xml:space="preserve">(no</w:t>
+            </w:r>
+            <w:r>
+              <w:t xml:space="preserve"> </w:t>
+            </w:r>
+            <w:r>
+              <w:rPr>
+                <w:rStyle w:val="VerbatimChar"/>
+              </w:rPr>
+              <w:t xml:space="preserve">stratum</w:t>
+            </w:r>
+            <w:r>
+              <w:t xml:space="preserve"> </w:t>
+            </w:r>
+            <w:r>
+              <w:t xml:space="preserve">in cover)</w:t>
+            </w:r>
+          </w:p>
+        </w:tc>
+      </w:tr>
+      <w:tr>
+        <w:tc>
+          <w:p>
+            <w:pPr>
+              <w:pStyle w:val="Compact"/>
+              <w:jc w:val="left"/>
+            </w:pPr>
+            <w:r>
+              <w:rPr>
+                <w:rStyle w:val="VerbatimChar"/>
+              </w:rPr>
+              <w:t xml:space="preserve">parcel_id</w:t>
+            </w:r>
+          </w:p>
+        </w:tc>
+        <w:tc>
+          <w:p>
+            <w:pPr>
+              <w:pStyle w:val="Compact"/>
+              <w:jc w:val="left"/>
+            </w:pPr>
+            <w:r>
+              <w:t xml:space="preserve">1-2</w:t>
+            </w:r>
+          </w:p>
+        </w:tc>
+        <w:tc>
+          <w:p>
+            <w:pPr>
+              <w:pStyle w:val="Compact"/>
+              <w:jc w:val="left"/>
+            </w:pPr>
+            <w:r>
+              <w:t xml:space="preserve">tenure module</w:t>
+            </w:r>
+          </w:p>
+        </w:tc>
+        <w:tc>
+          <w:p>
+            <w:pPr>
+              <w:pStyle w:val="Compact"/>
+              <w:jc w:val="left"/>
+            </w:pPr>
+            <w:r>
+              <w:rPr>
+                <w:rStyle w:val="VerbatimChar"/>
+              </w:rPr>
+              <w:t xml:space="preserve">hh_id</w:t>
+            </w:r>
+            <w:r>
+              <w:t xml:space="preserve"> </w:t>
+            </w:r>
+            <w:r>
+              <w:t xml:space="preserve">+ plot no. (</w:t>
+            </w:r>
+            <w:r>
+              <w:rPr>
+                <w:rStyle w:val="VerbatimChar"/>
+              </w:rPr>
+              <w:t xml:space="preserve">ag_d00</w:t>
+            </w:r>
+            <w:r>
+              <w:t xml:space="preserve">)</w:t>
+            </w:r>
+          </w:p>
+        </w:tc>
+        <w:tc>
+          <w:p>
+            <w:pPr>
+              <w:pStyle w:val="Compact"/>
+              <w:jc w:val="left"/>
+            </w:pPr>
+            <w:r>
+              <w:t xml:space="preserve">concatenated</w:t>
+            </w:r>
+          </w:p>
+        </w:tc>
+      </w:tr>
+      <w:tr>
+        <w:tc>
+          <w:p>
+            <w:pPr>
+              <w:pStyle w:val="Compact"/>
+              <w:jc w:val="left"/>
+            </w:pPr>
+            <w:r>
+              <w:rPr>
+                <w:rStyle w:val="VerbatimChar"/>
+              </w:rPr>
+              <w:t xml:space="preserve">parcel_id</w:t>
+            </w:r>
+          </w:p>
+        </w:tc>
+        <w:tc>
+          <w:p>
+            <w:pPr>
+              <w:pStyle w:val="Compact"/>
+              <w:jc w:val="left"/>
+            </w:pPr>
+            <w:r>
+              <w:t xml:space="preserve">3-4</w:t>
+            </w:r>
+          </w:p>
+        </w:tc>
+        <w:tc>
+          <w:p>
+            <w:pPr>
+              <w:pStyle w:val="Compact"/>
+              <w:jc w:val="left"/>
+            </w:pPr>
+            <w:r>
+              <w:t xml:space="preserve">tenure module</w:t>
+            </w:r>
+          </w:p>
+        </w:tc>
+        <w:tc>
+          <w:p>
+            <w:pPr>
+              <w:pStyle w:val="Compact"/>
+              <w:jc w:val="left"/>
+            </w:pPr>
+            <w:r>
+              <w:rPr>
+                <w:rStyle w:val="VerbatimChar"/>
+              </w:rPr>
+              <w:t xml:space="preserve">hh_id</w:t>
+            </w:r>
+            <w:r>
+              <w:t xml:space="preserve"> </w:t>
+            </w:r>
+            <w:r>
+              <w:t xml:space="preserve">+</w:t>
+            </w:r>
+            <w:r>
+              <w:t xml:space="preserve"> </w:t>
+            </w:r>
+            <w:r>
+              <w:rPr>
+                <w:rStyle w:val="VerbatimChar"/>
+              </w:rPr>
+              <w:t xml:space="preserve">gardenid</w:t>
+            </w:r>
+          </w:p>
+        </w:tc>
+        <w:tc>
+          <w:p>
+            <w:pPr>
+              <w:pStyle w:val="Compact"/>
+              <w:jc w:val="left"/>
+            </w:pPr>
+            <w:r>
+              <w:t xml:space="preserve">concatenated</w:t>
+            </w:r>
+          </w:p>
+        </w:tc>
+      </w:tr>
+      <w:tr>
+        <w:tc>
+          <w:p>
+            <w:pPr>
+              <w:pStyle w:val="Compact"/>
+              <w:jc w:val="left"/>
+            </w:pPr>
+            <w:r>
+              <w:rPr>
+                <w:rStyle w:val="VerbatimChar"/>
+              </w:rPr>
+              <w:t xml:space="preserve">year</w:t>
+            </w:r>
+          </w:p>
+        </w:tc>
+        <w:tc>
+          <w:p>
+            <w:pPr>
+              <w:pStyle w:val="Compact"/>
+              <w:jc w:val="left"/>
+            </w:pPr>
+            <w:r>
+              <w:t xml:space="preserve">1-4</w:t>
+            </w:r>
+          </w:p>
+        </w:tc>
+        <w:tc>
+          <w:p>
+            <w:pPr>
+              <w:pStyle w:val="Compact"/>
+              <w:jc w:val="left"/>
+            </w:pPr>
+            <w:r>
+              <w:t xml:space="preserve">—</w:t>
+            </w:r>
+          </w:p>
+        </w:tc>
+        <w:tc>
+          <w:p>
+            <w:pPr>
+              <w:pStyle w:val="Compact"/>
+              <w:jc w:val="left"/>
+            </w:pPr>
+            <w:r>
+              <w:t xml:space="preserve">—</w:t>
+            </w:r>
+          </w:p>
+        </w:tc>
+        <w:tc>
+          <w:p>
+            <w:pPr>
+              <w:pStyle w:val="Compact"/>
+              <w:jc w:val="left"/>
+            </w:pPr>
+            <w:r>
+              <w:t xml:space="preserve">2010 / 2013 / 2016 / 2019</w:t>
+            </w:r>
+          </w:p>
+        </w:tc>
+      </w:tr>
+    </w:tbl>
+    <w:p>
+      <w:pPr>
+        <w:pStyle w:val="Heading3"/>
+      </w:pPr>
+      <w:bookmarkStart w:id="34" w:name="X3c195f35add181f24126d1dac89a38fd1df1287"/>
+      <w:r>
+        <w:t xml:space="preserve">5. Value labels of key source variables (verified)</w:t>
+      </w:r>
+      <w:bookmarkEnd w:id="34"/>
+    </w:p>
+    <w:p>
+      <w:pPr>
+        <w:pStyle w:val="FirstParagraph"/>
+      </w:pPr>
+      <w:r>
+        <w:rPr>
+          <w:b/>
+        </w:rPr>
+        <w:t xml:space="preserve">Acquisition</w:t>
+      </w:r>
+      <w:r>
+        <w:t xml:space="preserve"> </w:t>
+      </w:r>
+      <w:r>
+        <w:t xml:space="preserve">—</w:t>
+      </w:r>
+      <w:r>
+        <w:t xml:space="preserve"> </w:t>
+      </w:r>
+      <w:r>
+        <w:rPr>
+          <w:rStyle w:val="VerbatimChar"/>
+        </w:rPr>
+        <w:t xml:space="preserve">ag_d03</w:t>
+      </w:r>
+      <w:r>
+        <w:t xml:space="preserve"> </w:t>
+      </w:r>
+      <w:r>
+        <w:t xml:space="preserve">(w1-2) /</w:t>
+      </w:r>
+      <w:r>
+        <w:t xml:space="preserve"> </w:t>
+      </w:r>
+      <w:r>
+        <w:rPr>
+          <w:rStyle w:val="VerbatimChar"/>
+        </w:rPr>
+        <w:t xml:space="preserve">ag_b203</w:t>
+      </w:r>
+      <w:r>
+        <w:t xml:space="preserve"> </w:t>
+      </w:r>
+      <w:r>
+        <w:t xml:space="preserve">(w3):</w:t>
+      </w:r>
+      <w:r>
+        <w:t xml:space="preserve"> </w:t>
+      </w:r>
+      <w:r>
+        <w:rPr>
+          <w:i/>
+        </w:rPr>
+        <w:t xml:space="preserve">“</w:t>
+      </w:r>
+      <w:r>
+        <w:rPr>
+          <w:i/>
+        </w:rPr>
+        <w:t xml:space="preserve">How did your household acquire this [plot/garden]?</w:t>
+      </w:r>
+      <w:r>
+        <w:rPr>
+          <w:i/>
+        </w:rPr>
+        <w:t xml:space="preserve">”</w:t>
+      </w:r>
+    </w:p>
+    <w:tbl>
+      <w:tblPr>
+        <w:tblStyle w:val="Table"/>
+        <w:tblW w:type="pct" w:w="0.0"/>
+        <w:tblLook w:firstRow="1"/>
+      </w:tblPr>
+      <w:tblGrid/>
+      <w:tr>
+        <w:trPr>
+          <w:cnfStyle w:firstRow="1"/>
+        </w:trPr>
+        <w:tc>
+          <w:tcPr>
+            <w:tcBorders>
+              <w:bottom w:val="single"/>
+            </w:tcBorders>
+            <w:vAlign w:val="bottom"/>
+          </w:tcPr>
+          <w:p>
+            <w:pPr>
+              <w:pStyle w:val="Compact"/>
+              <w:jc w:val="left"/>
+            </w:pPr>
+            <w:r>
+              <w:t xml:space="preserve">Code</w:t>
+            </w:r>
+          </w:p>
+        </w:tc>
+        <w:tc>
+          <w:tcPr>
+            <w:tcBorders>
+              <w:bottom w:val="single"/>
+            </w:tcBorders>
+            <w:vAlign w:val="bottom"/>
+          </w:tcPr>
+          <w:p>
+            <w:pPr>
+              <w:pStyle w:val="Compact"/>
+              <w:jc w:val="left"/>
+            </w:pPr>
+            <w:r>
+              <w:t xml:space="preserve">w1-2 (ag_d03)</w:t>
+            </w:r>
+          </w:p>
+        </w:tc>
+        <w:tc>
+          <w:tcPr>
+            <w:tcBorders>
+              <w:bottom w:val="single"/>
+            </w:tcBorders>
+            <w:vAlign w:val="bottom"/>
+          </w:tcPr>
+          <w:p>
+            <w:pPr>
+              <w:pStyle w:val="Compact"/>
+              <w:jc w:val="left"/>
+            </w:pPr>
+            <w:r>
+              <w:t xml:space="preserve">w3 (ag_b203)</w:t>
+            </w:r>
+          </w:p>
+        </w:tc>
+      </w:tr>
+      <w:tr>
+        <w:tc>
+          <w:p>
+            <w:pPr>
+              <w:pStyle w:val="Compact"/>
+              <w:jc w:val="left"/>
+            </w:pPr>
+            <w:r>
+              <w:t xml:space="preserve">1</w:t>
+            </w:r>
+          </w:p>
+        </w:tc>
+        <w:tc>
+          <w:p>
+            <w:pPr>
+              <w:pStyle w:val="Compact"/>
+              <w:jc w:val="left"/>
+            </w:pPr>
+            <w:r>
+              <w:t xml:space="preserve">Granted by local leaders</w:t>
+            </w:r>
+          </w:p>
+        </w:tc>
+        <w:tc>
+          <w:p>
+            <w:pPr>
+              <w:pStyle w:val="Compact"/>
+              <w:jc w:val="left"/>
+            </w:pPr>
+            <w:r>
+              <w:t xml:space="preserve">Granted by local leaders</w:t>
+            </w:r>
+          </w:p>
+        </w:tc>
+      </w:tr>
+      <w:tr>
+        <w:tc>
+          <w:p>
+            <w:pPr>
+              <w:pStyle w:val="Compact"/>
+              <w:jc w:val="left"/>
+            </w:pPr>
+            <w:r>
+              <w:t xml:space="preserve">2</w:t>
+            </w:r>
+          </w:p>
+        </w:tc>
+        <w:tc>
+          <w:p>
+            <w:pPr>
+              <w:pStyle w:val="Compact"/>
+              <w:jc w:val="left"/>
+            </w:pPr>
+            <w:r>
+              <w:t xml:space="preserve">Inherited</w:t>
+            </w:r>
+          </w:p>
+        </w:tc>
+        <w:tc>
+          <w:p>
+            <w:pPr>
+              <w:pStyle w:val="Compact"/>
+              <w:jc w:val="left"/>
+            </w:pPr>
+            <w:r>
+              <w:t xml:space="preserve">Inherited</w:t>
+            </w:r>
+          </w:p>
+        </w:tc>
+      </w:tr>
+      <w:tr>
+        <w:tc>
+          <w:p>
+            <w:pPr>
+              <w:pStyle w:val="Compact"/>
+              <w:jc w:val="left"/>
+            </w:pPr>
+            <w:r>
+              <w:t xml:space="preserve">3</w:t>
+            </w:r>
+          </w:p>
+        </w:tc>
+        <w:tc>
+          <w:p>
+            <w:pPr>
+              <w:pStyle w:val="Compact"/>
+              <w:jc w:val="left"/>
+            </w:pPr>
+            <w:r>
+              <w:t xml:space="preserve">Bride price</w:t>
+            </w:r>
+          </w:p>
+        </w:tc>
+        <w:tc>
+          <w:p>
+            <w:pPr>
+              <w:pStyle w:val="Compact"/>
+              <w:jc w:val="left"/>
+            </w:pPr>
+            <w:r>
+              <w:t xml:space="preserve">Bride price</w:t>
+            </w:r>
+          </w:p>
+        </w:tc>
+      </w:tr>
+      <w:tr>
+        <w:tc>
+          <w:p>
+            <w:pPr>
+              <w:pStyle w:val="Compact"/>
+              <w:jc w:val="left"/>
+            </w:pPr>
+            <w:r>
+              <w:t xml:space="preserve">4</w:t>
+            </w:r>
+          </w:p>
+        </w:tc>
+        <w:tc>
+          <w:p>
+            <w:pPr>
+              <w:pStyle w:val="Compact"/>
+              <w:jc w:val="left"/>
+            </w:pPr>
+            <w:r>
+              <w:rPr>
+                <w:b/>
+              </w:rPr>
+              <w:t xml:space="preserve">Purchased (with title)</w:t>
+            </w:r>
+          </w:p>
+        </w:tc>
+        <w:tc>
+          <w:p>
+            <w:pPr>
+              <w:pStyle w:val="Compact"/>
+              <w:jc w:val="left"/>
+            </w:pPr>
+            <w:r>
+              <w:rPr>
+                <w:b/>
+              </w:rPr>
+              <w:t xml:space="preserve">Purchased</w:t>
+            </w:r>
+          </w:p>
+        </w:tc>
+      </w:tr>
+      <w:tr>
+        <w:tc>
+          <w:p>
+            <w:pPr>
+              <w:pStyle w:val="Compact"/>
+              <w:jc w:val="left"/>
+            </w:pPr>
+            <w:r>
+              <w:t xml:space="preserve">5</w:t>
+            </w:r>
+          </w:p>
+        </w:tc>
+        <w:tc>
+          <w:p>
+            <w:pPr>
+              <w:pStyle w:val="Compact"/>
+              <w:jc w:val="left"/>
+            </w:pPr>
+            <w:r>
+              <w:rPr>
+                <w:b/>
+              </w:rPr>
+              <w:t xml:space="preserve">Purchased (no title)</w:t>
+            </w:r>
+          </w:p>
+        </w:tc>
+        <w:tc>
+          <w:p>
+            <w:pPr>
+              <w:pStyle w:val="Compact"/>
+              <w:jc w:val="left"/>
+            </w:pPr>
+            <w:r>
+              <w:t xml:space="preserve">—</w:t>
+            </w:r>
+          </w:p>
+        </w:tc>
+      </w:tr>
+      <w:tr>
+        <w:tc>
+          <w:p>
+            <w:pPr>
+              <w:pStyle w:val="Compact"/>
+              <w:jc w:val="left"/>
+            </w:pPr>
+            <w:r>
+              <w:t xml:space="preserve">6</w:t>
+            </w:r>
+          </w:p>
+        </w:tc>
+        <w:tc>
+          <w:p>
+            <w:pPr>
+              <w:pStyle w:val="Compact"/>
+              <w:jc w:val="left"/>
+            </w:pPr>
+            <w:r>
+              <w:t xml:space="preserve">Leasehold</w:t>
+            </w:r>
+          </w:p>
+        </w:tc>
+        <w:tc>
+          <w:p>
+            <w:pPr>
+              <w:pStyle w:val="Compact"/>
+              <w:jc w:val="left"/>
+            </w:pPr>
+            <w:r>
+              <w:t xml:space="preserve">Leasehold</w:t>
+            </w:r>
+          </w:p>
+        </w:tc>
+      </w:tr>
+      <w:tr>
+        <w:tc>
+          <w:p>
+            <w:pPr>
+              <w:pStyle w:val="Compact"/>
+              <w:jc w:val="left"/>
+            </w:pPr>
+            <w:r>
+              <w:t xml:space="preserve">7</w:t>
+            </w:r>
+          </w:p>
+        </w:tc>
+        <w:tc>
+          <w:p>
+            <w:pPr>
+              <w:pStyle w:val="Compact"/>
+              <w:jc w:val="left"/>
+            </w:pPr>
+            <w:r>
+              <w:t xml:space="preserve">Rent short-term</w:t>
+            </w:r>
+          </w:p>
+        </w:tc>
+        <w:tc>
+          <w:p>
+            <w:pPr>
+              <w:pStyle w:val="Compact"/>
+              <w:jc w:val="left"/>
+            </w:pPr>
+            <w:r>
+              <w:t xml:space="preserve">Rent short-term</w:t>
+            </w:r>
+          </w:p>
+        </w:tc>
+      </w:tr>
+      <w:tr>
+        <w:tc>
+          <w:p>
+            <w:pPr>
+              <w:pStyle w:val="Compact"/>
+              <w:jc w:val="left"/>
+            </w:pPr>
+            <w:r>
+              <w:t xml:space="preserve">8</w:t>
+            </w:r>
+          </w:p>
+        </w:tc>
+        <w:tc>
+          <w:p>
+            <w:pPr>
+              <w:pStyle w:val="Compact"/>
+              <w:jc w:val="left"/>
+            </w:pPr>
+            <w:r>
+              <w:t xml:space="preserve">Farming as a tenant</w:t>
+            </w:r>
+          </w:p>
+        </w:tc>
+        <w:tc>
+          <w:p>
+            <w:pPr>
+              <w:pStyle w:val="Compact"/>
+              <w:jc w:val="left"/>
+            </w:pPr>
+            <w:r>
+              <w:t xml:space="preserve">Farming as a tenant</w:t>
+            </w:r>
+          </w:p>
+        </w:tc>
+      </w:tr>
+      <w:tr>
+        <w:tc>
+          <w:p>
+            <w:pPr>
+              <w:pStyle w:val="Compact"/>
+              <w:jc w:val="left"/>
+            </w:pPr>
+            <w:r>
+              <w:t xml:space="preserve">9</w:t>
+            </w:r>
+          </w:p>
+        </w:tc>
+        <w:tc>
+          <w:p>
+            <w:pPr>
+              <w:pStyle w:val="Compact"/>
+              <w:jc w:val="left"/>
+            </w:pPr>
+            <w:r>
+              <w:t xml:space="preserve">Borrowed for free</w:t>
+            </w:r>
+          </w:p>
+        </w:tc>
+        <w:tc>
+          <w:p>
+            <w:pPr>
+              <w:pStyle w:val="Compact"/>
+              <w:jc w:val="left"/>
+            </w:pPr>
+            <w:r>
+              <w:t xml:space="preserve">Borrowed for free</w:t>
+            </w:r>
+          </w:p>
+        </w:tc>
+      </w:tr>
+      <w:tr>
+        <w:tc>
+          <w:p>
+            <w:pPr>
+              <w:pStyle w:val="Compact"/>
+              <w:jc w:val="left"/>
+            </w:pPr>
+            <w:r>
+              <w:t xml:space="preserve">10</w:t>
+            </w:r>
+          </w:p>
+        </w:tc>
+        <w:tc>
+          <w:p>
+            <w:pPr>
+              <w:pStyle w:val="Compact"/>
+              <w:jc w:val="left"/>
+            </w:pPr>
+            <w:r>
+              <w:t xml:space="preserve">Moved in w/o permission</w:t>
+            </w:r>
+          </w:p>
+        </w:tc>
+        <w:tc>
+          <w:p>
+            <w:pPr>
+              <w:pStyle w:val="Compact"/>
+              <w:jc w:val="left"/>
+            </w:pPr>
+            <w:r>
+              <w:t xml:space="preserve">Moved in w/o permission</w:t>
+            </w:r>
+          </w:p>
+        </w:tc>
+      </w:tr>
+      <w:tr>
+        <w:tc>
+          <w:p>
+            <w:pPr>
+              <w:pStyle w:val="Compact"/>
+              <w:jc w:val="left"/>
+            </w:pPr>
+            <w:r>
+              <w:t xml:space="preserve">11</w:t>
+            </w:r>
+          </w:p>
+        </w:tc>
+        <w:tc>
+          <w:p>
+            <w:pPr>
+              <w:pStyle w:val="Compact"/>
+              <w:jc w:val="left"/>
+            </w:pPr>
+            <w:r>
+              <w:t xml:space="preserve">Other</w:t>
+            </w:r>
+          </w:p>
+        </w:tc>
+        <w:tc>
+          <w:p>
+            <w:pPr>
+              <w:pStyle w:val="Compact"/>
+              <w:jc w:val="left"/>
+            </w:pPr>
+            <w:r>
+              <w:t xml:space="preserve">Other</w:t>
+            </w:r>
+          </w:p>
+        </w:tc>
+      </w:tr>
+      <w:tr>
+        <w:tc>
+          <w:p>
+            <w:pPr>
+              <w:pStyle w:val="Compact"/>
+              <w:jc w:val="left"/>
+            </w:pPr>
+            <w:r>
+              <w:t xml:space="preserve">12 / 13</w:t>
+            </w:r>
+          </w:p>
+        </w:tc>
+        <w:tc>
+          <w:p>
+            <w:pPr>
+              <w:pStyle w:val="Compact"/>
+              <w:jc w:val="left"/>
+            </w:pPr>
+            <w:r>
+              <w:t xml:space="preserve">—</w:t>
+            </w:r>
+          </w:p>
+        </w:tc>
+        <w:tc>
+          <w:p>
+            <w:pPr>
+              <w:pStyle w:val="Compact"/>
+              <w:jc w:val="left"/>
+            </w:pPr>
+            <w:r>
+              <w:t xml:space="preserve">Allocated by family / Gift from non-HH</w:t>
+            </w:r>
+          </w:p>
+        </w:tc>
+      </w:tr>
+    </w:tbl>
+    <w:p>
+      <w:pPr>
+        <w:pStyle w:val="BodyText"/>
+      </w:pPr>
+      <w:r>
+        <w:rPr>
+          <w:i/>
+        </w:rPr>
+        <w:t xml:space="preserve">(Wave 4 has no acquisition-method question — only</w:t>
+      </w:r>
+      <w:r>
+        <w:rPr>
+          <w:i/>
+        </w:rPr>
+        <w:t xml:space="preserve"> </w:t>
+      </w:r>
+      <w:r>
+        <w:rPr>
+          <w:i/>
+        </w:rPr>
+        <w:t xml:space="preserve">“</w:t>
+      </w:r>
+      <w:r>
+        <w:rPr>
+          <w:i/>
+        </w:rPr>
+        <w:t xml:space="preserve">from whom</w:t>
+      </w:r>
+      <w:r>
+        <w:rPr>
+          <w:i/>
+        </w:rPr>
+        <w:t xml:space="preserve">”</w:t>
+      </w:r>
+      <w:r>
+        <w:rPr>
+          <w:i/>
+        </w:rPr>
+        <w:t xml:space="preserve"> </w:t>
+      </w:r>
+      <w:r>
+        <w:rPr>
+          <w:i/>
+        </w:rPr>
+        <w:t xml:space="preserve">and</w:t>
+      </w:r>
+      <w:r>
+        <w:rPr>
+          <w:i/>
+        </w:rPr>
+        <w:t xml:space="preserve"> </w:t>
+      </w:r>
+      <w:r>
+        <w:rPr>
+          <w:i/>
+        </w:rPr>
+        <w:t xml:space="preserve">“</w:t>
+      </w:r>
+      <w:r>
+        <w:rPr>
+          <w:i/>
+        </w:rPr>
+        <w:t xml:space="preserve">year acquired</w:t>
+      </w:r>
+      <w:r>
+        <w:rPr>
+          <w:i/>
+        </w:rPr>
+        <w:t xml:space="preserve">”</w:t>
+      </w:r>
+      <w:r>
+        <w:rPr>
+          <w:i/>
+        </w:rPr>
+        <w:t xml:space="preserve">.)</w:t>
+      </w:r>
+    </w:p>
+    <w:p>
+      <w:pPr>
+        <w:pStyle w:val="BodyText"/>
+      </w:pPr>
+      <w:r>
+        <w:rPr>
+          <w:b/>
+        </w:rPr>
+        <w:t xml:space="preserve">Rented out / in (w4 flags)</w:t>
+      </w:r>
+      <w:r>
+        <w:t xml:space="preserve"> </w:t>
+      </w:r>
+      <w:r>
+        <w:t xml:space="preserve">—</w:t>
+      </w:r>
+      <w:r>
+        <w:t xml:space="preserve"> </w:t>
+      </w:r>
+      <w:r>
+        <w:rPr>
+          <w:rStyle w:val="VerbatimChar"/>
+        </w:rPr>
+        <w:t xml:space="preserve">ag_brentedin</w:t>
+      </w:r>
+      <w:r>
+        <w:t xml:space="preserve"> </w:t>
+      </w:r>
+      <w:r>
+        <w:t xml:space="preserve">(</w:t>
+      </w:r>
+      <w:r>
+        <w:t xml:space="preserve">“</w:t>
+      </w:r>
+      <w:r>
+        <w:t xml:space="preserve">gave output as rent</w:t>
+      </w:r>
+      <w:r>
+        <w:t xml:space="preserve">”</w:t>
+      </w:r>
+      <w:r>
+        <w:t xml:space="preserve"> </w:t>
+      </w:r>
+      <w:r>
+        <w:t xml:space="preserve">→ rented in),</w:t>
+      </w:r>
+      <w:r>
+        <w:t xml:space="preserve"> </w:t>
+      </w:r>
+      <w:r>
+        <w:rPr>
+          <w:rStyle w:val="VerbatimChar"/>
+        </w:rPr>
+        <w:t xml:space="preserve">ag_brentedout</w:t>
+      </w:r>
+      <w:r>
+        <w:t xml:space="preserve"> </w:t>
+      </w:r>
+      <w:r>
+        <w:t xml:space="preserve">(</w:t>
+      </w:r>
+      <w:r>
+        <w:t xml:space="preserve">“</w:t>
+      </w:r>
+      <w:r>
+        <w:t xml:space="preserve">received output as rent</w:t>
+      </w:r>
+      <w:r>
+        <w:t xml:space="preserve">”</w:t>
+      </w:r>
+      <w:r>
+        <w:t xml:space="preserve"> </w:t>
+      </w:r>
+      <w:r>
+        <w:t xml:space="preserve">→ rented out):</w:t>
+      </w:r>
+      <w:r>
+        <w:t xml:space="preserve"> </w:t>
+      </w:r>
+      <w:r>
+        <w:rPr>
+          <w:rStyle w:val="VerbatimChar"/>
+        </w:rPr>
+        <w:t xml:space="preserve">1 = Yes</w:t>
+      </w:r>
+      <w:r>
+        <w:t xml:space="preserve">,</w:t>
+      </w:r>
+      <w:r>
+        <w:t xml:space="preserve"> </w:t>
+      </w:r>
+      <w:r>
+        <w:rPr>
+          <w:rStyle w:val="VerbatimChar"/>
+        </w:rPr>
+        <w:t xml:space="preserve">2 = No</w:t>
+      </w:r>
+      <w:r>
+        <w:t xml:space="preserve">.</w:t>
+      </w:r>
+      <w:r>
+        <w:t xml:space="preserve"> </w:t>
+      </w:r>
+      <w:r>
+        <w:t xml:space="preserve">Rent amounts</w:t>
+      </w:r>
+      <w:r>
+        <w:t xml:space="preserve"> </w:t>
+      </w:r>
+      <w:r>
+        <w:rPr>
+          <w:rStyle w:val="VerbatimChar"/>
+        </w:rPr>
+        <w:t xml:space="preserve">ag_d19a-d</w:t>
+      </w:r>
+      <w:r>
+        <w:t xml:space="preserve"> </w:t>
+      </w:r>
+      <w:r>
+        <w:t xml:space="preserve">/</w:t>
+      </w:r>
+      <w:r>
+        <w:t xml:space="preserve"> </w:t>
+      </w:r>
+      <w:r>
+        <w:rPr>
+          <w:rStyle w:val="VerbatimChar"/>
+        </w:rPr>
+        <w:t xml:space="preserve">ag_b219a-d</w:t>
+      </w:r>
+      <w:r>
+        <w:t xml:space="preserve"> </w:t>
+      </w:r>
+      <w:r>
+        <w:t xml:space="preserve">= cash/in-kind received (already / still due).</w:t>
+      </w:r>
+    </w:p>
+    <w:p>
+      <w:pPr>
+        <w:pStyle w:val="BodyText"/>
+      </w:pPr>
+      <w:r>
+        <w:rPr>
+          <w:b/>
+        </w:rPr>
+        <w:t xml:space="preserve">Certificate</w:t>
+      </w:r>
+      <w:r>
+        <w:t xml:space="preserve"> </w:t>
+      </w:r>
+      <w:r>
+        <w:t xml:space="preserve">—</w:t>
+      </w:r>
+      <w:r>
+        <w:t xml:space="preserve"> </w:t>
+      </w:r>
+      <w:r>
+        <w:rPr>
+          <w:rStyle w:val="VerbatimChar"/>
+        </w:rPr>
+        <w:t xml:space="preserve">ag_d03_1</w:t>
+      </w:r>
+      <w:r>
+        <w:t xml:space="preserve"> </w:t>
+      </w:r>
+      <w:r>
+        <w:t xml:space="preserve">(w2, has title):</w:t>
+      </w:r>
+      <w:r>
+        <w:t xml:space="preserve"> </w:t>
+      </w:r>
+      <w:r>
+        <w:rPr>
+          <w:rStyle w:val="VerbatimChar"/>
+        </w:rPr>
+        <w:t xml:space="preserve">1 = Yes</w:t>
+      </w:r>
+      <w:r>
+        <w:t xml:space="preserve">,</w:t>
+      </w:r>
+      <w:r>
+        <w:t xml:space="preserve"> </w:t>
+      </w:r>
+      <w:r>
+        <w:rPr>
+          <w:rStyle w:val="VerbatimChar"/>
+        </w:rPr>
+        <w:t xml:space="preserve">2 = No</w:t>
+      </w:r>
+      <w:r>
+        <w:t xml:space="preserve">.</w:t>
+      </w:r>
+      <w:r>
+        <w:t xml:space="preserve"> </w:t>
+      </w:r>
+      <w:r>
+        <w:rPr>
+          <w:rStyle w:val="VerbatimChar"/>
+        </w:rPr>
+        <w:t xml:space="preserve">ag_b204_1</w:t>
+      </w:r>
+      <w:r>
+        <w:t xml:space="preserve"> </w:t>
+      </w:r>
+      <w:r>
+        <w:t xml:space="preserve">(w3):</w:t>
+      </w:r>
+      <w:r>
+        <w:t xml:space="preserve"> </w:t>
+      </w:r>
+      <w:r>
+        <w:rPr>
+          <w:rStyle w:val="VerbatimChar"/>
+        </w:rPr>
+        <w:t xml:space="preserve">1</w:t>
+      </w:r>
+      <w:r>
+        <w:t xml:space="preserve"> </w:t>
+      </w:r>
+      <w:r>
+        <w:t xml:space="preserve">offer of lease ·</w:t>
+      </w:r>
+      <w:r>
+        <w:t xml:space="preserve"> </w:t>
+      </w:r>
+      <w:r>
+        <w:rPr>
+          <w:rStyle w:val="VerbatimChar"/>
+        </w:rPr>
+        <w:t xml:space="preserve">2</w:t>
+      </w:r>
+      <w:r>
+        <w:t xml:space="preserve"> </w:t>
+      </w:r>
+      <w:r>
+        <w:t xml:space="preserve">title deed ·</w:t>
+      </w:r>
+      <w:r>
+        <w:t xml:space="preserve"> </w:t>
+      </w:r>
+      <w:r>
+        <w:rPr>
+          <w:rStyle w:val="VerbatimChar"/>
+        </w:rPr>
+        <w:t xml:space="preserve">3</w:t>
+      </w:r>
+      <w:r>
+        <w:t xml:space="preserve"> </w:t>
+      </w:r>
+      <w:r>
+        <w:t xml:space="preserve">certificate of lease ·</w:t>
+      </w:r>
+      <w:r>
+        <w:t xml:space="preserve"> </w:t>
+      </w:r>
+      <w:r>
+        <w:rPr>
+          <w:rStyle w:val="VerbatimChar"/>
+        </w:rPr>
+        <w:t xml:space="preserve">4</w:t>
+      </w:r>
+      <w:r>
+        <w:t xml:space="preserve"> </w:t>
+      </w:r>
+      <w:r>
+        <w:t xml:space="preserve">no ·</w:t>
+      </w:r>
+      <w:r>
+        <w:t xml:space="preserve"> </w:t>
+      </w:r>
+      <w:r>
+        <w:rPr>
+          <w:rStyle w:val="VerbatimChar"/>
+        </w:rPr>
+        <w:t xml:space="preserve">96</w:t>
+      </w:r>
+      <w:r>
+        <w:t xml:space="preserve"> </w:t>
+      </w:r>
+      <w:r>
+        <w:t xml:space="preserve">other.</w:t>
+      </w:r>
+    </w:p>
+    <w:p>
+      <w:pPr>
+        <w:pStyle w:val="Heading3"/>
+      </w:pPr>
+      <w:bookmarkStart w:id="35" w:name="harmonization-decisions-caveats-malawi"/>
+      <w:r>
+        <w:t xml:space="preserve">6. Harmonization decisions &amp; caveats (Malawi)</w:t>
+      </w:r>
+      <w:bookmarkEnd w:id="35"/>
+    </w:p>
+    <w:p>
+      <w:pPr>
+        <w:numPr>
+          <w:ilvl w:val="0"/>
+          <w:numId w:val="1002"/>
+        </w:numPr>
+        <w:pStyle w:val="Compact"/>
+      </w:pPr>
+      <w:r>
+        <w:rPr>
+          <w:b/>
+        </w:rPr>
+        <w:t xml:space="preserve">Rental variables were derived here, not inherited</w:t>
+      </w:r>
+      <w:r>
+        <w:t xml:space="preserve"> </w:t>
+      </w:r>
+      <w:r>
+        <w:t xml:space="preserve">— the upstream pipeline never</w:t>
+      </w:r>
+      <w:r>
+        <w:t xml:space="preserve"> </w:t>
+      </w:r>
+      <w:r>
+        <w:t xml:space="preserve">built</w:t>
+      </w:r>
+      <w:r>
+        <w:t xml:space="preserve"> </w:t>
+      </w:r>
+      <w:r>
+        <w:rPr>
+          <w:rStyle w:val="VerbatimChar"/>
+        </w:rPr>
+        <w:t xml:space="preserve">plot_rentedin/out</w:t>
+      </w:r>
+      <w:r>
+        <w:t xml:space="preserve"> </w:t>
+      </w:r>
+      <w:r>
+        <w:t xml:space="preserve">for Malawi. They are constructed from the acquisition</w:t>
+      </w:r>
+      <w:r>
+        <w:t xml:space="preserve"> </w:t>
+      </w:r>
+      <w:r>
+        <w:t xml:space="preserve">question (rented-in) and the rent-received variables (rented-out).</w:t>
+      </w:r>
+    </w:p>
+    <w:p>
+      <w:pPr>
+        <w:numPr>
+          <w:ilvl w:val="0"/>
+          <w:numId w:val="1002"/>
+        </w:numPr>
+        <w:pStyle w:val="Compact"/>
+      </w:pPr>
+      <w:r>
+        <w:rPr>
+          <w:b/>
+        </w:rPr>
+        <w:t xml:space="preserve">Land unit changes across waves</w:t>
+      </w:r>
+      <w:r>
+        <w:t xml:space="preserve"> </w:t>
+      </w:r>
+      <w:r>
+        <w:t xml:space="preserve">— plot (2010/2013) vs garden (2016/2019). Counts</w:t>
+      </w:r>
+      <w:r>
+        <w:t xml:space="preserve"> </w:t>
+      </w:r>
+      <w:r>
+        <w:t xml:space="preserve">and mean areas are not strictly unit-comparable across that break.</w:t>
+      </w:r>
+    </w:p>
+    <w:p>
+      <w:pPr>
+        <w:numPr>
+          <w:ilvl w:val="0"/>
+          <w:numId w:val="1002"/>
+        </w:numPr>
+        <w:pStyle w:val="Compact"/>
+      </w:pPr>
+      <w:r>
+        <w:rPr>
+          <w:b/>
+        </w:rPr>
+        <w:t xml:space="preserve">Wave 4 (2019)</w:t>
+      </w:r>
+      <w:r>
+        <w:t xml:space="preserve">: the categorical acquisition question was dropped, so</w:t>
+      </w:r>
+      <w:r>
+        <w:t xml:space="preserve"> </w:t>
+      </w:r>
+      <w:r>
+        <w:rPr>
+          <w:rStyle w:val="VerbatimChar"/>
+        </w:rPr>
+        <w:t xml:space="preserve">parcel_purchased</w:t>
+      </w:r>
+      <w:r>
+        <w:t xml:space="preserve"> </w:t>
+      </w:r>
+      <w:r>
+        <w:t xml:space="preserve">and</w:t>
+      </w:r>
+      <w:r>
+        <w:t xml:space="preserve"> </w:t>
+      </w:r>
+      <w:r>
+        <w:rPr>
+          <w:rStyle w:val="VerbatimChar"/>
+        </w:rPr>
+        <w:t xml:space="preserve">parcel_certificate</w:t>
+      </w:r>
+      <w:r>
+        <w:t xml:space="preserve"> </w:t>
+      </w:r>
+      <w:r>
+        <w:t xml:space="preserve">are</w:t>
+      </w:r>
+      <w:r>
+        <w:t xml:space="preserve"> </w:t>
+      </w:r>
+      <w:r>
+        <w:rPr>
+          <w:b/>
+        </w:rPr>
+        <w:t xml:space="preserve">missing</w:t>
+      </w:r>
+      <w:r>
+        <w:t xml:space="preserve"> </w:t>
+      </w:r>
+      <w:r>
+        <w:t xml:space="preserve">in 2019, and rented-in</w:t>
+      </w:r>
+      <w:r>
+        <w:t xml:space="preserve"> </w:t>
+      </w:r>
+      <w:r>
+        <w:t xml:space="preserve">uses a payment-based proxy (</w:t>
+      </w:r>
+      <w:r>
+        <w:rPr>
+          <w:rStyle w:val="VerbatimChar"/>
+        </w:rPr>
+        <w:t xml:space="preserve">ag_brentedin</w:t>
+      </w:r>
+      <w:r>
+        <w:t xml:space="preserve"> </w:t>
+      </w:r>
+      <w:r>
+        <w:t xml:space="preserve">/ paid-owner) rather than an acquisition code.</w:t>
+      </w:r>
+    </w:p>
+    <w:p>
+      <w:pPr>
+        <w:numPr>
+          <w:ilvl w:val="0"/>
+          <w:numId w:val="1002"/>
+        </w:numPr>
+        <w:pStyle w:val="Compact"/>
+      </w:pPr>
+      <w:r>
+        <w:rPr>
+          <w:b/>
+        </w:rPr>
+        <w:t xml:space="preserve">Rented-in</w:t>
+      </w:r>
+      <w:r>
+        <w:t xml:space="preserve"> </w:t>
+      </w:r>
+      <w:r>
+        <w:t xml:space="preserve">= leasehold/rent/tenant (codes 6,7,8);</w:t>
+      </w:r>
+      <w:r>
+        <w:t xml:space="preserve"> </w:t>
+      </w:r>
+      <w:r>
+        <w:t xml:space="preserve">“</w:t>
+      </w:r>
+      <w:r>
+        <w:t xml:space="preserve">borrowed for free</w:t>
+      </w:r>
+      <w:r>
+        <w:t xml:space="preserve">”</w:t>
+      </w:r>
+      <w:r>
+        <w:t xml:space="preserve"> </w:t>
+      </w:r>
+      <w:r>
+        <w:t xml:space="preserve">(9) is</w:t>
+      </w:r>
+      <w:r>
+        <w:t xml:space="preserve"> </w:t>
+      </w:r>
+      <w:r>
+        <w:t xml:space="preserve">excluded as non-market access.</w:t>
+      </w:r>
+    </w:p>
+    <w:p>
+      <w:pPr>
+        <w:numPr>
+          <w:ilvl w:val="0"/>
+          <w:numId w:val="1002"/>
+        </w:numPr>
+        <w:pStyle w:val="Compact"/>
+      </w:pPr>
+      <w:r>
+        <w:rPr>
+          <w:b/>
+        </w:rPr>
+        <w:t xml:space="preserve">Rented-out</w:t>
+      </w:r>
+      <w:r>
+        <w:t xml:space="preserve"> </w:t>
+      </w:r>
+      <w:r>
+        <w:t xml:space="preserve">relies on positive rent received (no clean yes/no gate in w1-3); the</w:t>
+      </w:r>
+      <w:r>
+        <w:t xml:space="preserve"> </w:t>
+      </w:r>
+      <w:r>
+        <w:t xml:space="preserve">2010 rate is very low and likely undercounts (heavy skip/missing on the amount items).</w:t>
+      </w:r>
+    </w:p>
+    <w:p>
+      <w:pPr>
+        <w:numPr>
+          <w:ilvl w:val="0"/>
+          <w:numId w:val="1002"/>
+        </w:numPr>
+        <w:pStyle w:val="Compact"/>
+      </w:pPr>
+      <w:r>
+        <w:rPr>
+          <w:b/>
+        </w:rPr>
+        <w:t xml:space="preserve">Purchase</w:t>
+      </w:r>
+      <w:r>
+        <w:t xml:space="preserve"> </w:t>
+      </w:r>
+      <w:r>
+        <w:t xml:space="preserve">is genuinely measurable here (codes 4-5), unlike Ethiopia w1-2.</w:t>
+      </w:r>
+    </w:p>
+    <w:p>
+      <w:pPr>
+        <w:numPr>
+          <w:ilvl w:val="0"/>
+          <w:numId w:val="1002"/>
+        </w:numPr>
+        <w:pStyle w:val="Compact"/>
+      </w:pPr>
+      <w:r>
+        <w:rPr>
+          <w:b/>
+        </w:rPr>
+        <w:t xml:space="preserve">Strata</w:t>
+      </w:r>
+      <w:r>
+        <w:t xml:space="preserve">: baseline</w:t>
+      </w:r>
+      <w:r>
+        <w:t xml:space="preserve"> </w:t>
+      </w:r>
+      <w:r>
+        <w:rPr>
+          <w:rStyle w:val="VerbatimChar"/>
+        </w:rPr>
+        <w:t xml:space="preserve">stratum</w:t>
+      </w:r>
+      <w:r>
+        <w:t xml:space="preserve"> </w:t>
+      </w:r>
+      <w:r>
+        <w:t xml:space="preserve">(w1-2) vs</w:t>
+      </w:r>
+      <w:r>
+        <w:t xml:space="preserve"> </w:t>
+      </w:r>
+      <w:r>
+        <w:rPr>
+          <w:rStyle w:val="VerbatimChar"/>
+        </w:rPr>
+        <w:t xml:space="preserve">group(region reside)</w:t>
+      </w:r>
+      <w:r>
+        <w:t xml:space="preserve"> </w:t>
+      </w:r>
+      <w:r>
+        <w:t xml:space="preserve">(w3-4).</w:t>
+      </w:r>
+    </w:p>
+    <w:p>
+      <w:pPr>
+        <w:numPr>
+          <w:ilvl w:val="0"/>
+          <w:numId w:val="1002"/>
+        </w:numPr>
+        <w:pStyle w:val="Compact"/>
+      </w:pPr>
+      <w:r>
+        <w:rPr>
+          <w:b/>
+        </w:rPr>
+        <w:t xml:space="preserve">Year map</w:t>
+      </w:r>
+      <w:r>
+        <w:t xml:space="preserve"> </w:t>
+      </w:r>
+      <w:r>
+        <w:t xml:space="preserve">follows the IHPS rounds (2010/2013/2016/2019); the shocks do-file used</w:t>
+      </w:r>
+      <w:r>
+        <w:t xml:space="preserve"> </w:t>
+      </w:r>
+      <w:r>
+        <w:t xml:space="preserve">2017/2020 for w3/w4 — change</w:t>
+      </w:r>
+      <w:r>
+        <w:t xml:space="preserve"> </w:t>
+      </w:r>
+      <w:r>
+        <w:rPr>
+          <w:rStyle w:val="VerbatimChar"/>
+        </w:rPr>
+        <w:t xml:space="preserve">year</w:t>
+      </w:r>
+      <w:r>
+        <w:t xml:space="preserve"> </w:t>
+      </w:r>
+      <w:r>
+        <w:t xml:space="preserve">in</w:t>
+      </w:r>
+      <w:r>
+        <w:t xml:space="preserve"> </w:t>
+      </w:r>
+      <w:r>
+        <w:rPr>
+          <w:rStyle w:val="VerbatimChar"/>
+        </w:rPr>
+        <w:t xml:space="preserve">extract_MWI.do</w:t>
+      </w:r>
+      <w:r>
+        <w:t xml:space="preserve"> </w:t>
+      </w:r>
+      <w:r>
+        <w:t xml:space="preserve">if you prefer that labeling.</w:t>
+      </w:r>
+    </w:p>
+    <w:p>
+      <w:r>
+        <w:pict>
+          <v:rect style="width:0;height:1.5pt" o:hralign="center" o:hrstd="t" o:hr="t"/>
+        </w:pict>
+      </w:r>
+    </w:p>
+    <w:p>
+      <w:pPr>
+        <w:pStyle w:val="FirstParagraph"/>
+      </w:pPr>
+      <w:r>
         <w:rPr>
           <w:i/>
         </w:rPr>
@@ -6852,31 +10976,37 @@
         <w:rPr>
           <w:i/>
         </w:rPr>
-        <w:t xml:space="preserve">, with all source</w:t>
+        <w:t xml:space="preserve"> </w:t>
       </w:r>
       <w:r>
         <w:rPr>
           <w:i/>
         </w:rPr>
-        <w:t xml:space="preserve"> </w:t>
+        <w:t xml:space="preserve">and the IHPS v06 raw</w:t>
       </w:r>
       <w:r>
         <w:rPr>
           <w:i/>
         </w:rPr>
-        <w:t xml:space="preserve">variables, codes, and value labels verified against the raw rosters.</w:t>
+        <w:t xml:space="preserve"> </w:t>
       </w:r>
       <w:r>
         <w:rPr>
           <w:i/>
         </w:rPr>
-        <w:t xml:space="preserve"> </w:t>
+        <w:t xml:space="preserve">modules (Malawi), with all source variables, codes, and value labels verified against</w:t>
       </w:r>
       <w:r>
         <w:rPr>
           <w:i/>
         </w:rPr>
-        <w:t xml:space="preserve">Extend with one new country section (1–6) per country as the workflow grows.</w:t>
+        <w:t xml:space="preserve"> </w:t>
+      </w:r>
+      <w:r>
+        <w:rPr>
+          <w:i/>
+        </w:rPr>
+        <w:t xml:space="preserve">the raw data. Extend with one new country section (1–6) per country as the workflow grows.</w:t>
       </w:r>
     </w:p>
     <w:sectPr/>
@@ -7119,6 +11249,9 @@
     <w:abstractNumId w:val="990"/>
   </w:num>
   <w:num w:numId="1001">
+    <w:abstractNumId w:val="991"/>
+  </w:num>
+  <w:num w:numId="1002">
     <w:abstractNumId w:val="991"/>
   </w:num>
 </w:numbering>

</xml_diff>

<commit_message>
Provenance: document ETH rental scope (rent+sharecrop, exclusions) and MWI rented-out non-comparability
</commit_message>
<xml_diff>
--- a/Reference/variable_provenance.docx
+++ b/Reference/variable_provenance.docx
@@ -6548,13 +6548,25 @@
         <w:rPr>
           <w:b/>
         </w:rPr>
-        <w:t xml:space="preserve">Rented-in / rented-out definitions widen over time.</w:t>
-      </w:r>
-      <w:r>
-        <w:t xml:space="preserve"> </w:t>
-      </w:r>
-      <w:r>
-        <w:t xml:space="preserve">Rented-in =</w:t>
+        <w:t xml:space="preserve">Rental scope: both cash/fixed rental AND sharecropping are counted - read with</w:t>
+      </w:r>
+      <w:r>
+        <w:rPr>
+          <w:b/>
+        </w:rPr>
+        <w:t xml:space="preserve"> </w:t>
+      </w:r>
+      <w:r>
+        <w:rPr>
+          <w:b/>
+        </w:rPr>
+        <w:t xml:space="preserve">care across waves.</w:t>
+      </w:r>
+      <w:r>
+        <w:t xml:space="preserve"> </w:t>
+      </w:r>
+      <w:r>
+        <w:t xml:space="preserve">Rented-in is built from the parcel-acquisition question, where</w:t>
       </w:r>
       <w:r>
         <w:t xml:space="preserve"> </w:t>
@@ -6563,7 +6575,7 @@
         <w:t xml:space="preserve">“</w:t>
       </w:r>
       <w:r>
-        <w:t xml:space="preserve">rent</w:t>
+        <w:t xml:space="preserve">Rent</w:t>
       </w:r>
       <w:r>
         <w:t xml:space="preserve">”</w:t>
@@ -6572,13 +6584,7 @@
         <w:t xml:space="preserve"> </w:t>
       </w:r>
       <w:r>
-        <w:t xml:space="preserve">in w1–2</w:t>
-      </w:r>
-      <w:r>
-        <w:t xml:space="preserve"> </w:t>
-      </w:r>
-      <w:r>
-        <w:t xml:space="preserve">vs</w:t>
+        <w:t xml:space="preserve">(code 3) and</w:t>
       </w:r>
       <w:r>
         <w:t xml:space="preserve"> </w:t>
@@ -6587,7 +6593,7 @@
         <w:t xml:space="preserve">“</w:t>
       </w:r>
       <w:r>
-        <w:t xml:space="preserve">rent + sharecrop-in</w:t>
+        <w:t xml:space="preserve">Shared crop in</w:t>
       </w:r>
       <w:r>
         <w:t xml:space="preserve">”</w:t>
@@ -6596,7 +6602,13 @@
         <w:t xml:space="preserve"> </w:t>
       </w:r>
       <w:r>
-        <w:t xml:space="preserve">in w3–5; rented-out = a yes/no</w:t>
+        <w:t xml:space="preserve">(code 6) are separate categories; we include</w:t>
+      </w:r>
+      <w:r>
+        <w:t xml:space="preserve"> </w:t>
+      </w:r>
+      <w:r>
+        <w:t xml:space="preserve">both. But the</w:t>
       </w:r>
       <w:r>
         <w:t xml:space="preserve"> </w:t>
@@ -6605,7 +6617,7 @@
         <w:t xml:space="preserve">“</w:t>
       </w:r>
       <w:r>
-        <w:t xml:space="preserve">any fields</w:t>
+        <w:t xml:space="preserve">shared crop in</w:t>
       </w:r>
       <w:r>
         <w:t xml:space="preserve">”</w:t>
@@ -6614,31 +6626,229 @@
         <w:t xml:space="preserve"> </w:t>
       </w:r>
       <w:r>
-        <w:t xml:space="preserve">item in w1–3 vs</w:t>
-      </w:r>
-      <w:r>
-        <w:t xml:space="preserve"> </w:t>
-      </w:r>
-      <w:r>
-        <w:t xml:space="preserve">whole-parcel disposal (</w:t>
+        <w:t xml:space="preserve">category only existed from wave 3 (2016) onward - in</w:t>
+      </w:r>
+      <w:r>
+        <w:t xml:space="preserve"> </w:t>
+      </w:r>
+      <w:r>
+        <w:t xml:space="preserve">waves 1-2 (2012, 2014) the questionnaire had no separate sharecropping-in option, so</w:t>
+      </w:r>
+      <w:r>
+        <w:t xml:space="preserve"> </w:t>
+      </w:r>
+      <w:r>
+        <w:t xml:space="preserve">those years capture rent only (any sharecropping-in fell under</w:t>
+      </w:r>
+      <w:r>
+        <w:t xml:space="preserve"> </w:t>
       </w:r>
       <w:r>
         <w:t xml:space="preserve">“</w:t>
       </w:r>
       <w:r>
-        <w:t xml:space="preserve">all rented / all sharecropped out</w:t>
+        <w:t xml:space="preserve">Other</w:t>
       </w:r>
       <w:r>
         <w:t xml:space="preserve">”</w:t>
       </w:r>
       <w:r>
-        <w:t xml:space="preserve">) in w4–5. Mind cross-wave</w:t>
-      </w:r>
-      <w:r>
-        <w:t xml:space="preserve"> </w:t>
-      </w:r>
-      <w:r>
-        <w:t xml:space="preserve">level comparisons.</w:t>
+        <w:t xml:space="preserve">). This is part</w:t>
+      </w:r>
+      <w:r>
+        <w:t xml:space="preserve"> </w:t>
+      </w:r>
+      <w:r>
+        <w:t xml:space="preserve">of why rented-in ticks up from 2014 to 2016.</w:t>
+      </w:r>
+      <w:r>
+        <w:t xml:space="preserve"> </w:t>
+      </w:r>
+      <w:r>
+        <w:t xml:space="preserve">Rented-out also includes both, but the explicit split appears only from wave 4 (2019):</w:t>
+      </w:r>
+      <w:r>
+        <w:t xml:space="preserve"> </w:t>
+      </w:r>
+      <w:r>
+        <w:rPr>
+          <w:rStyle w:val="VerbatimChar"/>
+        </w:rPr>
+        <w:t xml:space="preserve">s2q13</w:t>
+      </w:r>
+      <w:r>
+        <w:t xml:space="preserve"> </w:t>
+      </w:r>
+      <w:r>
+        <w:t xml:space="preserve">distinguishes</w:t>
+      </w:r>
+      <w:r>
+        <w:t xml:space="preserve"> </w:t>
+      </w:r>
+      <w:r>
+        <w:t xml:space="preserve">“</w:t>
+      </w:r>
+      <w:r>
+        <w:t xml:space="preserve">all rented out</w:t>
+      </w:r>
+      <w:r>
+        <w:t xml:space="preserve">”</w:t>
+      </w:r>
+      <w:r>
+        <w:t xml:space="preserve"> </w:t>
+      </w:r>
+      <w:r>
+        <w:t xml:space="preserve">(1) vs</w:t>
+      </w:r>
+      <w:r>
+        <w:t xml:space="preserve"> </w:t>
+      </w:r>
+      <w:r>
+        <w:t xml:space="preserve">“</w:t>
+      </w:r>
+      <w:r>
+        <w:t xml:space="preserve">all sharecropped out</w:t>
+      </w:r>
+      <w:r>
+        <w:t xml:space="preserve">”</w:t>
+      </w:r>
+      <w:r>
+        <w:t xml:space="preserve"> </w:t>
+      </w:r>
+      <w:r>
+        <w:t xml:space="preserve">(2), and we count</w:t>
+      </w:r>
+      <w:r>
+        <w:t xml:space="preserve"> </w:t>
+      </w:r>
+      <w:r>
+        <w:t xml:space="preserve">both. In waves 1-3 (2012-2016) rented-out comes from a single yes/no item (</w:t>
+      </w:r>
+      <w:r>
+        <w:t xml:space="preserve">“</w:t>
+      </w:r>
+      <w:r>
+        <w:t xml:space="preserve">were any</w:t>
+      </w:r>
+      <w:r>
+        <w:t xml:space="preserve"> </w:t>
+      </w:r>
+      <w:r>
+        <w:t xml:space="preserve">fields rented out?</w:t>
+      </w:r>
+      <w:r>
+        <w:t xml:space="preserve">”</w:t>
+      </w:r>
+      <w:r>
+        <w:t xml:space="preserve">) that does not separately label sharecropping, so it is captured</w:t>
+      </w:r>
+      <w:r>
+        <w:t xml:space="preserve"> </w:t>
+      </w:r>
+      <w:r>
+        <w:t xml:space="preserve">broadly rather than itemized.</w:t>
+      </w:r>
+      <w:r>
+        <w:t xml:space="preserve"> </w:t>
+      </w:r>
+      <w:r>
+        <w:t xml:space="preserve">Excluded on both sides:</w:t>
+      </w:r>
+      <w:r>
+        <w:t xml:space="preserve"> </w:t>
+      </w:r>
+      <w:r>
+        <w:t xml:space="preserve">“</w:t>
+      </w:r>
+      <w:r>
+        <w:t xml:space="preserve">borrowed for free</w:t>
+      </w:r>
+      <w:r>
+        <w:t xml:space="preserve">”</w:t>
+      </w:r>
+      <w:r>
+        <w:t xml:space="preserve"> </w:t>
+      </w:r>
+      <w:r>
+        <w:t xml:space="preserve">(acquisition code 4) and</w:t>
+      </w:r>
+      <w:r>
+        <w:t xml:space="preserve"> </w:t>
+      </w:r>
+      <w:r>
+        <w:t xml:space="preserve">“</w:t>
+      </w:r>
+      <w:r>
+        <w:t xml:space="preserve">given out for</w:t>
+      </w:r>
+      <w:r>
+        <w:t xml:space="preserve"> </w:t>
+      </w:r>
+      <w:r>
+        <w:t xml:space="preserve">free</w:t>
+      </w:r>
+      <w:r>
+        <w:t xml:space="preserve">”</w:t>
+      </w:r>
+      <w:r>
+        <w:t xml:space="preserve"> </w:t>
+      </w:r>
+      <w:r>
+        <w:t xml:space="preserve">(disposal code 3 in 2019/2022) - i.e., free / non-market transfers are not</w:t>
+      </w:r>
+      <w:r>
+        <w:t xml:space="preserve"> </w:t>
+      </w:r>
+      <w:r>
+        <w:t xml:space="preserve">counted as renting. And because</w:t>
+      </w:r>
+      <w:r>
+        <w:t xml:space="preserve"> </w:t>
+      </w:r>
+      <w:r>
+        <w:t xml:space="preserve">“</w:t>
+      </w:r>
+      <w:r>
+        <w:t xml:space="preserve">Rent</w:t>
+      </w:r>
+      <w:r>
+        <w:t xml:space="preserve">”</w:t>
+      </w:r>
+      <w:r>
+        <w:t xml:space="preserve"> </w:t>
+      </w:r>
+      <w:r>
+        <w:t xml:space="preserve">(code 3) is not itself split into cash vs fixed</w:t>
+      </w:r>
+      <w:r>
+        <w:t xml:space="preserve"> </w:t>
+      </w:r>
+      <w:r>
+        <w:t xml:space="preserve">in-kind rent,</w:t>
+      </w:r>
+      <w:r>
+        <w:t xml:space="preserve"> </w:t>
+      </w:r>
+      <w:r>
+        <w:t xml:space="preserve">“</w:t>
+      </w:r>
+      <w:r>
+        <w:t xml:space="preserve">rented in/out</w:t>
+      </w:r>
+      <w:r>
+        <w:t xml:space="preserve">”</w:t>
+      </w:r>
+      <w:r>
+        <w:t xml:space="preserve"> </w:t>
+      </w:r>
+      <w:r>
+        <w:t xml:space="preserve">here means cash-or-fixed rental plus sharecropping, not</w:t>
+      </w:r>
+      <w:r>
+        <w:t xml:space="preserve"> </w:t>
+      </w:r>
+      <w:r>
+        <w:t xml:space="preserve">cash-only.</w:t>
       </w:r>
     </w:p>
     <w:p>
@@ -10801,19 +11011,76 @@
         <w:rPr>
           <w:b/>
         </w:rPr>
-        <w:t xml:space="preserve">Rented-out</w:t>
-      </w:r>
-      <w:r>
-        <w:t xml:space="preserve"> </w:t>
-      </w:r>
-      <w:r>
-        <w:t xml:space="preserve">relies on positive rent received (no clean yes/no gate in w1-3); the</w:t>
-      </w:r>
-      <w:r>
-        <w:t xml:space="preserve"> </w:t>
-      </w:r>
-      <w:r>
-        <w:t xml:space="preserve">2010 rate is very low and likely undercounts (heavy skip/missing on the amount items).</w:t>
+        <w:t xml:space="preserve">Rented-out is NOT comparable across waves - do not read the trend.</w:t>
+      </w:r>
+      <w:r>
+        <w:t xml:space="preserve"> </w:t>
+      </w:r>
+      <w:r>
+        <w:t xml:space="preserve">It is captured</w:t>
+      </w:r>
+      <w:r>
+        <w:t xml:space="preserve"> </w:t>
+      </w:r>
+      <w:r>
+        <w:t xml:space="preserve">differently by wave: 2010 and 2013 identify rented-out only via positive rent</w:t>
+      </w:r>
+      <w:r>
+        <w:t xml:space="preserve"> </w:t>
+      </w:r>
+      <w:r>
+        <w:rPr>
+          <w:i/>
+        </w:rPr>
+        <w:t xml:space="preserve">received</w:t>
+      </w:r>
+      <w:r>
+        <w:t xml:space="preserve"> </w:t>
+      </w:r>
+      <w:r>
+        <w:t xml:space="preserve">(</w:t>
+      </w:r>
+      <w:r>
+        <w:rPr>
+          <w:rStyle w:val="VerbatimChar"/>
+        </w:rPr>
+        <w:t xml:space="preserve">ag_d19a-d</w:t>
+      </w:r>
+      <w:r>
+        <w:t xml:space="preserve">), with heavy skip/missing on those amount items, whereas 2019</w:t>
+      </w:r>
+      <w:r>
+        <w:t xml:space="preserve"> </w:t>
+      </w:r>
+      <w:r>
+        <w:t xml:space="preserve">has an explicit yes/no flag (</w:t>
+      </w:r>
+      <w:r>
+        <w:rPr>
+          <w:rStyle w:val="VerbatimChar"/>
+        </w:rPr>
+        <w:t xml:space="preserve">ag_brentedout</w:t>
+      </w:r>
+      <w:r>
+        <w:t xml:space="preserve">). As a result the weighted rate is ~0.2%</w:t>
+      </w:r>
+      <w:r>
+        <w:t xml:space="preserve"> </w:t>
+      </w:r>
+      <w:r>
+        <w:t xml:space="preserve">in 2010 versus ~1.3-1.5% in 2016/2019. The early levels almost certainly understate</w:t>
+      </w:r>
+      <w:r>
+        <w:t xml:space="preserve"> </w:t>
+      </w:r>
+      <w:r>
+        <w:t xml:space="preserve">rented-out, so the apparent increase over time is largely a measurement artifact</w:t>
+      </w:r>
+      <w:r>
+        <w:t xml:space="preserve"> </w:t>
+      </w:r>
+      <w:r>
+        <w:t xml:space="preserve">rather than a real change in behavior.</w:t>
       </w:r>
     </w:p>
     <w:p>

</xml_diff>

<commit_message>
Switch plot area to deterministic GPS-else-self-reported (drop pmm imputation); update docs
</commit_message>
<xml_diff>
--- a/Reference/variable_provenance.docx
+++ b/Reference/variable_provenance.docx
@@ -201,10 +201,14 @@
     <w:tbl>
       <w:tblPr>
         <w:tblStyle w:val="Table"/>
-        <w:tblW w:type="pct" w:w="0.0"/>
+        <w:tblW w:type="pct" w:w="5000.0"/>
         <w:tblLook w:firstRow="1"/>
       </w:tblPr>
-      <w:tblGrid/>
+      <w:tblGrid>
+        <w:gridCol w:w="2640"/>
+        <w:gridCol w:w="2640"/>
+        <w:gridCol w:w="2640"/>
+      </w:tblGrid>
       <w:tr>
         <w:trPr>
           <w:cnfStyle w:firstRow="1"/>
@@ -447,7 +451,7 @@
               <w:jc w:val="left"/>
             </w:pPr>
             <w:r>
-              <w:t xml:space="preserve">Cultivated parcel area (Σ field GPS, pmm-imputed)</w:t>
+              <w:t xml:space="preserve">Cultivated parcel area (Σ field GPS, else self-reported)</w:t>
             </w:r>
           </w:p>
         </w:tc>
@@ -3146,7 +3150,40 @@
         <w:t xml:space="preserve">collapse (sum) … by(holder_id parcel_id)</w:t>
       </w:r>
       <w:r>
-        <w:t xml:space="preserve">).</w:t>
+        <w:t xml:space="preserve">). Field area =</w:t>
+      </w:r>
+      <w:r>
+        <w:t xml:space="preserve"> </w:t>
+      </w:r>
+      <w:r>
+        <w:rPr>
+          <w:b/>
+        </w:rPr>
+        <w:t xml:space="preserve">GPS where</w:t>
+      </w:r>
+      <w:r>
+        <w:rPr>
+          <w:b/>
+        </w:rPr>
+        <w:t xml:space="preserve"> </w:t>
+      </w:r>
+      <w:r>
+        <w:rPr>
+          <w:b/>
+        </w:rPr>
+        <w:t xml:space="preserve">measured, else self-reported</w:t>
+      </w:r>
+      <w:r>
+        <w:t xml:space="preserve"> </w:t>
+      </w:r>
+      <w:r>
+        <w:t xml:space="preserve">(both in ha); no model-based imputation, so the measure</w:t>
+      </w:r>
+      <w:r>
+        <w:t xml:space="preserve"> </w:t>
+      </w:r>
+      <w:r>
+        <w:t xml:space="preserve">is deterministic and reproducible across languages.</w:t>
       </w:r>
       <w:r>
         <w:t xml:space="preserve"> </w:t>
@@ -3161,19 +3198,19 @@
         <w:t xml:space="preserve"> </w:t>
       </w:r>
       <w:r>
-        <w:t xml:space="preserve">= count of fields with</w:t>
-      </w:r>
-      <w:r>
-        <w:t xml:space="preserve"> </w:t>
-      </w:r>
-      <w:r>
-        <w:t xml:space="preserve">a (possibly imputed) area. Parcels with no cultivated field (e.g. fully rented out)</w:t>
-      </w:r>
-      <w:r>
-        <w:t xml:space="preserve"> </w:t>
-      </w:r>
-      <w:r>
-        <w:t xml:space="preserve">have missing area and</w:t>
+        <w:t xml:space="preserve">= count of fields with a</w:t>
+      </w:r>
+      <w:r>
+        <w:t xml:space="preserve"> </w:t>
+      </w:r>
+      <w:r>
+        <w:t xml:space="preserve">non-missing area. Parcels with no cultivated field (e.g. fully rented out) have missing</w:t>
+      </w:r>
+      <w:r>
+        <w:t xml:space="preserve"> </w:t>
+      </w:r>
+      <w:r>
+        <w:t xml:space="preserve">area and</w:t>
       </w:r>
       <w:r>
         <w:t xml:space="preserve"> </w:t>
@@ -3299,7 +3336,7 @@
               <w:jc w:val="left"/>
             </w:pPr>
             <w:r>
-              <w:t xml:space="preserve">GPS area</w:t>
+              <w:t xml:space="preserve">GPS area (primary)</w:t>
             </w:r>
           </w:p>
         </w:tc>
@@ -3362,7 +3399,7 @@
               <w:jc w:val="left"/>
             </w:pPr>
             <w:r>
-              <w:t xml:space="preserve">GPS area</w:t>
+              <w:t xml:space="preserve">GPS area (primary)</w:t>
             </w:r>
           </w:p>
         </w:tc>
@@ -3425,7 +3462,7 @@
               <w:jc w:val="left"/>
             </w:pPr>
             <w:r>
-              <w:t xml:space="preserve">GPS area</w:t>
+              <w:t xml:space="preserve">GPS area (primary)</w:t>
             </w:r>
           </w:p>
         </w:tc>
@@ -3488,7 +3525,7 @@
               <w:jc w:val="left"/>
             </w:pPr>
             <w:r>
-              <w:t xml:space="preserve">GPS area</w:t>
+              <w:t xml:space="preserve">GPS area (primary)</w:t>
             </w:r>
           </w:p>
         </w:tc>
@@ -3578,7 +3615,7 @@
               <w:jc w:val="left"/>
             </w:pPr>
             <w:r>
-              <w:t xml:space="preserve">GPS area</w:t>
+              <w:t xml:space="preserve">GPS area (primary)</w:t>
             </w:r>
           </w:p>
         </w:tc>
@@ -3668,7 +3705,7 @@
               <w:jc w:val="left"/>
             </w:pPr>
             <w:r>
-              <w:t xml:space="preserve">Self-reported area (imputation input)</w:t>
+              <w:t xml:space="preserve">Self-reported area (fallback when GPS missing)</w:t>
             </w:r>
           </w:p>
         </w:tc>
@@ -3752,7 +3789,7 @@
               <w:jc w:val="left"/>
             </w:pPr>
             <w:r>
-              <w:t xml:space="preserve">Self-reported area (imputation input)</w:t>
+              <w:t xml:space="preserve">Self-reported area (fallback when GPS missing)</w:t>
             </w:r>
           </w:p>
         </w:tc>
@@ -3815,111 +3852,6 @@
             </w:pPr>
             <w:r>
               <w:t xml:space="preserve">converted to ha (w5 uses ESS 18 conversion file)</w:t>
-            </w:r>
-          </w:p>
-        </w:tc>
-      </w:tr>
-      <w:tr>
-        <w:tc>
-          <w:p>
-            <w:pPr>
-              <w:pStyle w:val="Compact"/>
-              <w:jc w:val="left"/>
-            </w:pPr>
-            <w:r>
-              <w:t xml:space="preserve">Imputation stratifier</w:t>
-            </w:r>
-          </w:p>
-        </w:tc>
-        <w:tc>
-          <w:p>
-            <w:pPr>
-              <w:pStyle w:val="Compact"/>
-              <w:jc w:val="left"/>
-            </w:pPr>
-            <w:r>
-              <w:t xml:space="preserve">1–5</w:t>
-            </w:r>
-          </w:p>
-        </w:tc>
-        <w:tc>
-          <w:p>
-            <w:pPr>
-              <w:pStyle w:val="Compact"/>
-              <w:jc w:val="left"/>
-            </w:pPr>
-            <w:r>
-              <w:rPr>
-                <w:rStyle w:val="VerbatimChar"/>
-              </w:rPr>
-              <w:t xml:space="preserve">sect3_pp_w*.dta</w:t>
-            </w:r>
-          </w:p>
-        </w:tc>
-        <w:tc>
-          <w:p>
-            <w:pPr>
-              <w:pStyle w:val="Compact"/>
-              <w:jc w:val="left"/>
-            </w:pPr>
-            <w:r>
-              <w:rPr>
-                <w:rStyle w:val="VerbatimChar"/>
-              </w:rPr>
-              <w:t xml:space="preserve">saq01</w:t>
-            </w:r>
-            <w:r>
-              <w:t xml:space="preserve"> </w:t>
-            </w:r>
-            <w:r>
-              <w:rPr>
-                <w:rStyle w:val="VerbatimChar"/>
-              </w:rPr>
-              <w:t xml:space="preserve">saq02</w:t>
-            </w:r>
-            <w:r>
-              <w:t xml:space="preserve"> </w:t>
-            </w:r>
-            <w:r>
-              <w:rPr>
-                <w:rStyle w:val="VerbatimChar"/>
-              </w:rPr>
-              <w:t xml:space="preserve">saq03</w:t>
-            </w:r>
-            <w:r>
-              <w:t xml:space="preserve"> </w:t>
-            </w:r>
-            <w:r>
-              <w:t xml:space="preserve">(region/zone/woreda)</w:t>
-            </w:r>
-          </w:p>
-        </w:tc>
-        <w:tc>
-          <w:p>
-            <w:pPr>
-              <w:pStyle w:val="Compact"/>
-              <w:jc w:val="left"/>
-            </w:pPr>
-            <w:r>
-              <w:rPr>
-                <w:rStyle w:val="VerbatimChar"/>
-              </w:rPr>
-              <w:t xml:space="preserve">admin_3</w:t>
-            </w:r>
-            <w:r>
-              <w:t xml:space="preserve"> </w:t>
-            </w:r>
-            <w:r>
-              <w:t xml:space="preserve">built inline;</w:t>
-            </w:r>
-            <w:r>
-              <w:t xml:space="preserve"> </w:t>
-            </w:r>
-            <w:r>
-              <w:rPr>
-                <w:rStyle w:val="VerbatimChar"/>
-              </w:rPr>
-              <w:t xml:space="preserve">mi impute pmm plot_area_GPS area_self_reported i.admin_3_num</w:t>
             </w:r>
           </w:p>
         </w:tc>
@@ -6869,61 +6801,25 @@
         <w:t xml:space="preserve"> </w:t>
       </w:r>
       <w:r>
-        <w:t xml:space="preserve">is cultivated GPS area summed from fields, with missing GPS imputed by</w:t>
-      </w:r>
-      <w:r>
-        <w:t xml:space="preserve"> </w:t>
-      </w:r>
-      <w:r>
-        <w:t xml:space="preserve">predictive-mean matching from self-reported area within</w:t>
-      </w:r>
-      <w:r>
-        <w:t xml:space="preserve"> </w:t>
-      </w:r>
-      <w:r>
-        <w:rPr>
-          <w:rStyle w:val="VerbatimChar"/>
-        </w:rPr>
-        <w:t xml:space="preserve">admin_3</w:t>
-      </w:r>
-      <w:r>
-        <w:t xml:space="preserve"> </w:t>
-      </w:r>
-      <w:r>
-        <w:t xml:space="preserve">(region×zone×woreda).</w:t>
-      </w:r>
-      <w:r>
-        <w:t xml:space="preserve"> </w:t>
-      </w:r>
-      <w:r>
-        <w:t xml:space="preserve">The</w:t>
-      </w:r>
-      <w:r>
-        <w:t xml:space="preserve"> </w:t>
-      </w:r>
-      <w:r>
-        <w:rPr>
-          <w:rStyle w:val="VerbatimChar"/>
-        </w:rPr>
-        <w:t xml:space="preserve">admin_3</w:t>
-      </w:r>
-      <w:r>
-        <w:t xml:space="preserve"> </w:t>
-      </w:r>
-      <w:r>
-        <w:t xml:space="preserve">stratifier is built inline rather than from the pipeline’s</w:t>
-      </w:r>
-      <w:r>
-        <w:t xml:space="preserve"> </w:t>
-      </w:r>
-      <w:r>
-        <w:rPr>
-          <w:rStyle w:val="VerbatimChar"/>
-        </w:rPr>
-        <w:t xml:space="preserve">admin3.dta</w:t>
-      </w:r>
-      <w:r>
-        <w:t xml:space="preserve">.</w:t>
+        <w:t xml:space="preserve">is cultivated field area summed to the parcel, using GPS where measured and</w:t>
+      </w:r>
+      <w:r>
+        <w:t xml:space="preserve"> </w:t>
+      </w:r>
+      <w:r>
+        <w:t xml:space="preserve">self-reported area as a fallback where GPS is missing. The published pipeline instead</w:t>
+      </w:r>
+      <w:r>
+        <w:t xml:space="preserve"> </w:t>
+      </w:r>
+      <w:r>
+        <w:t xml:space="preserve">model-imputes missing GPS (pmm); we use the deterministic GPS-else-self-reported</w:t>
+      </w:r>
+      <w:r>
+        <w:t xml:space="preserve"> </w:t>
+      </w:r>
+      <w:r>
+        <w:t xml:space="preserve">measure so area reproduces exactly across Stata/R/Python. Tenure variables are unaffected.</w:t>
       </w:r>
     </w:p>
     <w:p>
@@ -6989,7 +6885,7 @@
         <w:t xml:space="preserve">holder_id+parcel_id+field_id</w:t>
       </w:r>
       <w:r>
-        <w:t xml:space="preserve">). w5 area uses the field-roster GPS+SR imputation.</w:t>
+        <w:t xml:space="preserve">). w5 area uses the field-roster GPS-else-self-reported measure.</w:t>
       </w:r>
     </w:p>
     <w:p>
@@ -8942,10 +8838,13 @@
         <w:t xml:space="preserve"> </w:t>
       </w:r>
       <w:r>
-        <w:t xml:space="preserve">for w2-4). GPS area</w:t>
-      </w:r>
-      <w:r>
-        <w:t xml:space="preserve"> </w:t>
+        <w:t xml:space="preserve">for w2-4). Field area =</w:t>
+      </w:r>
+      <w:r>
+        <w:t xml:space="preserve"> </w:t>
+      </w:r>
+      <w:r>
+        <w:t xml:space="preserve">GPS (</w:t>
       </w:r>
       <w:r>
         <w:rPr>
@@ -8954,13 +8853,7 @@
         <w:t xml:space="preserve">ag_c04c</w:t>
       </w:r>
       <w:r>
-        <w:t xml:space="preserve"> </w:t>
-      </w:r>
-      <w:r>
-        <w:t xml:space="preserve">and self-reported</w:t>
-      </w:r>
-      <w:r>
-        <w:t xml:space="preserve"> </w:t>
+        <w:t xml:space="preserve">) where measured, else self-reported (</w:t>
       </w:r>
       <w:r>
         <w:rPr>
@@ -8969,10 +8862,7 @@
         <w:t xml:space="preserve">ag_c04a</w:t>
       </w:r>
       <w:r>
-        <w:t xml:space="preserve"> </w:t>
-      </w:r>
-      <w:r>
-        <w:t xml:space="preserve">(unit</w:t>
+        <w:t xml:space="preserve">, unit</w:t>
       </w:r>
       <w:r>
         <w:t xml:space="preserve"> </w:t>
@@ -8984,28 +8874,25 @@
         <w:t xml:space="preserve">ag_c04b</w:t>
       </w:r>
       <w:r>
-        <w:t xml:space="preserve">: 1=acre, 2=ha, 3=m²);</w:t>
-      </w:r>
-      <w:r>
-        <w:t xml:space="preserve"> </w:t>
-      </w:r>
-      <w:r>
-        <w:t xml:space="preserve">acres→ha via ×0.404686. Missing GPS imputed by</w:t>
-      </w:r>
-      <w:r>
-        <w:t xml:space="preserve"> </w:t>
-      </w:r>
-      <w:r>
-        <w:rPr>
-          <w:rStyle w:val="VerbatimChar"/>
-        </w:rPr>
-        <w:t xml:space="preserve">mi impute pmm … i.admin_3</w:t>
-      </w:r>
-      <w:r>
-        <w:t xml:space="preserve"> </w:t>
-      </w:r>
-      <w:r>
-        <w:t xml:space="preserve">(stratifier = district, built inline). Summed to the parcel: garden in w3-4;</w:t>
+        <w:t xml:space="preserve">:</w:t>
+      </w:r>
+      <w:r>
+        <w:t xml:space="preserve"> </w:t>
+      </w:r>
+      <w:r>
+        <w:t xml:space="preserve">1=acre, 2=ha, 3=m²); acres→ha via ×0.404686. No model-based imputation (the published</w:t>
+      </w:r>
+      <w:r>
+        <w:t xml:space="preserve"> </w:t>
+      </w:r>
+      <w:r>
+        <w:t xml:space="preserve">pipeline pmm-imputes missing GPS; we use the deterministic GPS-else-self-reported</w:t>
+      </w:r>
+      <w:r>
+        <w:t xml:space="preserve"> </w:t>
+      </w:r>
+      <w:r>
+        <w:t xml:space="preserve">measure for cross-language reproducibility). Summed to the parcel: garden in w3-4;</w:t>
       </w:r>
       <w:r>
         <w:t xml:space="preserve"> </w:t>

</xml_diff>

<commit_message>
Document structural (by-design) missingness: provenance section + QC legend
</commit_message>
<xml_diff>
--- a/Reference/variable_provenance.docx
+++ b/Reference/variable_provenance.docx
@@ -714,21 +714,703 @@
       <w:pPr>
         <w:pStyle w:val="Heading2"/>
       </w:pPr>
-      <w:bookmarkStart w:id="22" w:name="X00728ba8d2160b74857f05f98b30c703885711f"/>
+      <w:bookmarkStart w:id="22" w:name="X82cce94c6d7ebfb6410e6e2cbd31d857430c34f"/>
+      <w:r>
+        <w:t xml:space="preserve">Missing by design (read this before interpreting the tables)</w:t>
+      </w:r>
+      <w:bookmarkEnd w:id="22"/>
+    </w:p>
+    <w:p>
+      <w:pPr>
+        <w:pStyle w:val="FirstParagraph"/>
+      </w:pPr>
+      <w:r>
+        <w:t xml:space="preserve">Some variables are</w:t>
+      </w:r>
+      <w:r>
+        <w:t xml:space="preserve"> </w:t>
+      </w:r>
+      <w:r>
+        <w:rPr>
+          <w:b/>
+        </w:rPr>
+        <w:t xml:space="preserve">missing (</w:t>
+      </w:r>
+      <w:r>
+        <w:rPr>
+          <w:rStyle w:val="VerbatimChar"/>
+          <w:b/>
+        </w:rPr>
+        <w:t xml:space="preserve">.</w:t>
+      </w:r>
+      <w:r>
+        <w:rPr>
+          <w:b/>
+        </w:rPr>
+        <w:t xml:space="preserve">) for entire country-years</w:t>
+      </w:r>
+      <w:r>
+        <w:t xml:space="preserve">. These are</w:t>
+      </w:r>
+      <w:r>
+        <w:t xml:space="preserve"> </w:t>
+      </w:r>
+      <w:r>
+        <w:rPr>
+          <w:b/>
+        </w:rPr>
+        <w:t xml:space="preserve">structural</w:t>
+      </w:r>
+      <w:r>
+        <w:t xml:space="preserve"> </w:t>
+      </w:r>
+      <w:r>
+        <w:t xml:space="preserve">missings: the survey simply did not ask the relevant question that</w:t>
+      </w:r>
+      <w:r>
+        <w:t xml:space="preserve"> </w:t>
+      </w:r>
+      <w:r>
+        <w:t xml:space="preserve">round, so the concept is</w:t>
+      </w:r>
+      <w:r>
+        <w:t xml:space="preserve"> </w:t>
+      </w:r>
+      <w:r>
+        <w:rPr>
+          <w:i/>
+        </w:rPr>
+        <w:t xml:space="preserve">unmeasured</w:t>
+      </w:r>
+      <w:r>
+        <w:t xml:space="preserve">, not zero and not item non-response. A</w:t>
+      </w:r>
+      <w:r>
+        <w:t xml:space="preserve"> </w:t>
+      </w:r>
+      <w:r>
+        <w:rPr>
+          <w:rStyle w:val="VerbatimChar"/>
+        </w:rPr>
+        <w:t xml:space="preserve">.</w:t>
+      </w:r>
+      <w:r>
+        <w:t xml:space="preserve"> </w:t>
+      </w:r>
+      <w:r>
+        <w:t xml:space="preserve">here means</w:t>
+      </w:r>
+      <w:r>
+        <w:t xml:space="preserve"> </w:t>
+      </w:r>
+      <w:r>
+        <w:t xml:space="preserve">“</w:t>
+      </w:r>
+      <w:r>
+        <w:t xml:space="preserve">not collected this wave,</w:t>
+      </w:r>
+      <w:r>
+        <w:t xml:space="preserve">”</w:t>
+      </w:r>
+      <w:r>
+        <w:t xml:space="preserve"> </w:t>
+      </w:r>
+      <w:r>
+        <w:t xml:space="preserve">and these country-years must be</w:t>
+      </w:r>
+      <w:r>
+        <w:t xml:space="preserve"> </w:t>
+      </w:r>
+      <w:r>
+        <w:rPr>
+          <w:b/>
+        </w:rPr>
+        <w:t xml:space="preserve">excluded</w:t>
+      </w:r>
+      <w:r>
+        <w:t xml:space="preserve"> </w:t>
+      </w:r>
+      <w:r>
+        <w:t xml:space="preserve">(not treated as 0) when computing rates or trends. This is why the QC estimates one</w:t>
+      </w:r>
+      <w:r>
+        <w:t xml:space="preserve"> </w:t>
+      </w:r>
+      <w:r>
+        <w:t xml:space="preserve">variable at a time - a joint</w:t>
+      </w:r>
+      <w:r>
+        <w:t xml:space="preserve"> </w:t>
+      </w:r>
+      <w:r>
+        <w:rPr>
+          <w:rStyle w:val="VerbatimChar"/>
+        </w:rPr>
+        <w:t xml:space="preserve">mean</w:t>
+      </w:r>
+      <w:r>
+        <w:t xml:space="preserve">/</w:t>
+      </w:r>
+      <w:r>
+        <w:rPr>
+          <w:rStyle w:val="VerbatimChar"/>
+        </w:rPr>
+        <w:t xml:space="preserve">svy: mean</w:t>
+      </w:r>
+      <w:r>
+        <w:t xml:space="preserve"> </w:t>
+      </w:r>
+      <w:r>
+        <w:t xml:space="preserve">would casewise-drop these whole</w:t>
+      </w:r>
+      <w:r>
+        <w:t xml:space="preserve"> </w:t>
+      </w:r>
+      <w:r>
+        <w:t xml:space="preserve">country-years from the</w:t>
+      </w:r>
+      <w:r>
+        <w:t xml:space="preserve"> </w:t>
+      </w:r>
+      <w:r>
+        <w:rPr>
+          <w:i/>
+        </w:rPr>
+        <w:t xml:space="preserve">other</w:t>
+      </w:r>
+      <w:r>
+        <w:t xml:space="preserve"> </w:t>
+      </w:r>
+      <w:r>
+        <w:t xml:space="preserve">variables too.</w:t>
+      </w:r>
+    </w:p>
+    <w:tbl>
+      <w:tblPr>
+        <w:tblStyle w:val="Table"/>
+        <w:tblW w:type="pct" w:w="5000.0"/>
+        <w:tblLook w:firstRow="1"/>
+      </w:tblPr>
+      <w:tblGrid>
+        <w:gridCol w:w="742"/>
+        <w:gridCol w:w="1650"/>
+        <w:gridCol w:w="1402"/>
+        <w:gridCol w:w="4125"/>
+      </w:tblGrid>
+      <w:tr>
+        <w:trPr>
+          <w:cnfStyle w:firstRow="1"/>
+        </w:trPr>
+        <w:tc>
+          <w:tcPr>
+            <w:tcBorders>
+              <w:bottom w:val="single"/>
+            </w:tcBorders>
+            <w:vAlign w:val="bottom"/>
+          </w:tcPr>
+          <w:p>
+            <w:pPr>
+              <w:pStyle w:val="Compact"/>
+              <w:jc w:val="left"/>
+            </w:pPr>
+            <w:r>
+              <w:t xml:space="preserve">Country</w:t>
+            </w:r>
+          </w:p>
+        </w:tc>
+        <w:tc>
+          <w:tcPr>
+            <w:tcBorders>
+              <w:bottom w:val="single"/>
+            </w:tcBorders>
+            <w:vAlign w:val="bottom"/>
+          </w:tcPr>
+          <w:p>
+            <w:pPr>
+              <w:pStyle w:val="Compact"/>
+              <w:jc w:val="left"/>
+            </w:pPr>
+            <w:r>
+              <w:t xml:space="preserve">Variable</w:t>
+            </w:r>
+          </w:p>
+        </w:tc>
+        <w:tc>
+          <w:tcPr>
+            <w:tcBorders>
+              <w:bottom w:val="single"/>
+            </w:tcBorders>
+            <w:vAlign w:val="bottom"/>
+          </w:tcPr>
+          <w:p>
+            <w:pPr>
+              <w:pStyle w:val="Compact"/>
+              <w:jc w:val="left"/>
+            </w:pPr>
+            <w:r>
+              <w:t xml:space="preserve">Missing year(s)</w:t>
+            </w:r>
+          </w:p>
+        </w:tc>
+        <w:tc>
+          <w:tcPr>
+            <w:tcBorders>
+              <w:bottom w:val="single"/>
+            </w:tcBorders>
+            <w:vAlign w:val="bottom"/>
+          </w:tcPr>
+          <w:p>
+            <w:pPr>
+              <w:pStyle w:val="Compact"/>
+              <w:jc w:val="left"/>
+            </w:pPr>
+            <w:r>
+              <w:t xml:space="preserve">Why</w:t>
+            </w:r>
+          </w:p>
+        </w:tc>
+      </w:tr>
+      <w:tr>
+        <w:tc>
+          <w:p>
+            <w:pPr>
+              <w:pStyle w:val="Compact"/>
+              <w:jc w:val="left"/>
+            </w:pPr>
+            <w:r>
+              <w:t xml:space="preserve">Ethiopia</w:t>
+            </w:r>
+          </w:p>
+        </w:tc>
+        <w:tc>
+          <w:p>
+            <w:pPr>
+              <w:pStyle w:val="Compact"/>
+              <w:jc w:val="left"/>
+            </w:pPr>
+            <w:r>
+              <w:rPr>
+                <w:rStyle w:val="VerbatimChar"/>
+              </w:rPr>
+              <w:t xml:space="preserve">parcel_purchased</w:t>
+            </w:r>
+          </w:p>
+        </w:tc>
+        <w:tc>
+          <w:p>
+            <w:pPr>
+              <w:pStyle w:val="Compact"/>
+              <w:jc w:val="left"/>
+            </w:pPr>
+            <w:r>
+              <w:t xml:space="preserve">2012, 2014</w:t>
+            </w:r>
+          </w:p>
+        </w:tc>
+        <w:tc>
+          <w:p>
+            <w:pPr>
+              <w:pStyle w:val="Compact"/>
+              <w:jc w:val="left"/>
+            </w:pPr>
+            <w:r>
+              <w:t xml:space="preserve">ESS11/ESS13 acquisition question had</w:t>
+            </w:r>
+            <w:r>
+              <w:t xml:space="preserve"> </w:t>
+            </w:r>
+            <w:r>
+              <w:rPr>
+                <w:b/>
+              </w:rPr>
+              <w:t xml:space="preserve">no</w:t>
+            </w:r>
+            <w:r>
+              <w:rPr>
+                <w:b/>
+              </w:rPr>
+              <w:t xml:space="preserve"> </w:t>
+            </w:r>
+            <w:r>
+              <w:rPr>
+                <w:b/>
+              </w:rPr>
+              <w:t xml:space="preserve">“</w:t>
+            </w:r>
+            <w:r>
+              <w:rPr>
+                <w:b/>
+              </w:rPr>
+              <w:t xml:space="preserve">purchased</w:t>
+            </w:r>
+            <w:r>
+              <w:rPr>
+                <w:b/>
+              </w:rPr>
+              <w:t xml:space="preserve">”</w:t>
+            </w:r>
+            <w:r>
+              <w:rPr>
+                <w:b/>
+              </w:rPr>
+              <w:t xml:space="preserve"> </w:t>
+            </w:r>
+            <w:r>
+              <w:rPr>
+                <w:b/>
+              </w:rPr>
+              <w:t xml:space="preserve">category</w:t>
+            </w:r>
+            <w:r>
+              <w:t xml:space="preserve">;</w:t>
+            </w:r>
+            <w:r>
+              <w:t xml:space="preserve"> </w:t>
+            </w:r>
+            <w:r>
+              <w:t xml:space="preserve">“</w:t>
+            </w:r>
+            <w:r>
+              <w:t xml:space="preserve">Purchased</w:t>
+            </w:r>
+            <w:r>
+              <w:t xml:space="preserve">”</w:t>
+            </w:r>
+            <w:r>
+              <w:t xml:space="preserve"> </w:t>
+            </w:r>
+            <w:r>
+              <w:t xml:space="preserve">(code 7) is first offered in wave 3 (2016).</w:t>
+            </w:r>
+          </w:p>
+        </w:tc>
+      </w:tr>
+      <w:tr>
+        <w:tc>
+          <w:p>
+            <w:pPr>
+              <w:pStyle w:val="Compact"/>
+              <w:jc w:val="left"/>
+            </w:pPr>
+            <w:r>
+              <w:t xml:space="preserve">Malawi</w:t>
+            </w:r>
+          </w:p>
+        </w:tc>
+        <w:tc>
+          <w:p>
+            <w:pPr>
+              <w:pStyle w:val="Compact"/>
+              <w:jc w:val="left"/>
+            </w:pPr>
+            <w:r>
+              <w:rPr>
+                <w:rStyle w:val="VerbatimChar"/>
+              </w:rPr>
+              <w:t xml:space="preserve">parcel_certificate</w:t>
+            </w:r>
+          </w:p>
+        </w:tc>
+        <w:tc>
+          <w:p>
+            <w:pPr>
+              <w:pStyle w:val="Compact"/>
+              <w:jc w:val="left"/>
+            </w:pPr>
+            <w:r>
+              <w:t xml:space="preserve">2010</w:t>
+            </w:r>
+          </w:p>
+        </w:tc>
+        <w:tc>
+          <w:p>
+            <w:pPr>
+              <w:pStyle w:val="Compact"/>
+              <w:jc w:val="left"/>
+            </w:pPr>
+            <w:r>
+              <w:t xml:space="preserve">IHPS 2010 has</w:t>
+            </w:r>
+            <w:r>
+              <w:t xml:space="preserve"> </w:t>
+            </w:r>
+            <w:r>
+              <w:rPr>
+                <w:b/>
+              </w:rPr>
+              <w:t xml:space="preserve">no title/ownership-document question</w:t>
+            </w:r>
+            <w:r>
+              <w:t xml:space="preserve"> </w:t>
+            </w:r>
+            <w:r>
+              <w:t xml:space="preserve">for the plot.</w:t>
+            </w:r>
+          </w:p>
+        </w:tc>
+      </w:tr>
+      <w:tr>
+        <w:tc>
+          <w:p>
+            <w:pPr>
+              <w:pStyle w:val="Compact"/>
+              <w:jc w:val="left"/>
+            </w:pPr>
+            <w:r>
+              <w:t xml:space="preserve">Malawi</w:t>
+            </w:r>
+          </w:p>
+        </w:tc>
+        <w:tc>
+          <w:p>
+            <w:pPr>
+              <w:pStyle w:val="Compact"/>
+              <w:jc w:val="left"/>
+            </w:pPr>
+            <w:r>
+              <w:rPr>
+                <w:rStyle w:val="VerbatimChar"/>
+              </w:rPr>
+              <w:t xml:space="preserve">parcel_certificate</w:t>
+            </w:r>
+          </w:p>
+        </w:tc>
+        <w:tc>
+          <w:p>
+            <w:pPr>
+              <w:pStyle w:val="Compact"/>
+              <w:jc w:val="left"/>
+            </w:pPr>
+            <w:r>
+              <w:t xml:space="preserve">2019</w:t>
+            </w:r>
+          </w:p>
+        </w:tc>
+        <w:tc>
+          <w:p>
+            <w:pPr>
+              <w:pStyle w:val="Compact"/>
+              <w:jc w:val="left"/>
+            </w:pPr>
+            <w:r>
+              <w:t xml:space="preserve">The 2019 round</w:t>
+            </w:r>
+            <w:r>
+              <w:t xml:space="preserve"> </w:t>
+            </w:r>
+            <w:r>
+              <w:rPr>
+                <w:b/>
+              </w:rPr>
+              <w:t xml:space="preserve">dropped</w:t>
+            </w:r>
+            <w:r>
+              <w:t xml:space="preserve"> </w:t>
+            </w:r>
+            <w:r>
+              <w:t xml:space="preserve">the title/document question.</w:t>
+            </w:r>
+          </w:p>
+        </w:tc>
+      </w:tr>
+      <w:tr>
+        <w:tc>
+          <w:p>
+            <w:pPr>
+              <w:pStyle w:val="Compact"/>
+              <w:jc w:val="left"/>
+            </w:pPr>
+            <w:r>
+              <w:t xml:space="preserve">Malawi</w:t>
+            </w:r>
+          </w:p>
+        </w:tc>
+        <w:tc>
+          <w:p>
+            <w:pPr>
+              <w:pStyle w:val="Compact"/>
+              <w:jc w:val="left"/>
+            </w:pPr>
+            <w:r>
+              <w:rPr>
+                <w:rStyle w:val="VerbatimChar"/>
+              </w:rPr>
+              <w:t xml:space="preserve">parcel_purchased</w:t>
+            </w:r>
+          </w:p>
+        </w:tc>
+        <w:tc>
+          <w:p>
+            <w:pPr>
+              <w:pStyle w:val="Compact"/>
+              <w:jc w:val="left"/>
+            </w:pPr>
+            <w:r>
+              <w:t xml:space="preserve">2019</w:t>
+            </w:r>
+          </w:p>
+        </w:tc>
+        <w:tc>
+          <w:p>
+            <w:pPr>
+              <w:pStyle w:val="Compact"/>
+              <w:jc w:val="left"/>
+            </w:pPr>
+            <w:r>
+              <w:t xml:space="preserve">The 2019 round</w:t>
+            </w:r>
+            <w:r>
+              <w:t xml:space="preserve"> </w:t>
+            </w:r>
+            <w:r>
+              <w:rPr>
+                <w:b/>
+              </w:rPr>
+              <w:t xml:space="preserve">dropped the categorical</w:t>
+            </w:r>
+            <w:r>
+              <w:rPr>
+                <w:b/>
+              </w:rPr>
+              <w:t xml:space="preserve"> </w:t>
+            </w:r>
+            <w:r>
+              <w:rPr>
+                <w:b/>
+              </w:rPr>
+              <w:t xml:space="preserve">“</w:t>
+            </w:r>
+            <w:r>
+              <w:rPr>
+                <w:b/>
+              </w:rPr>
+              <w:t xml:space="preserve">how acquired</w:t>
+            </w:r>
+            <w:r>
+              <w:rPr>
+                <w:b/>
+              </w:rPr>
+              <w:t xml:space="preserve">”</w:t>
+            </w:r>
+            <w:r>
+              <w:rPr>
+                <w:b/>
+              </w:rPr>
+              <w:t xml:space="preserve"> </w:t>
+            </w:r>
+            <w:r>
+              <w:rPr>
+                <w:b/>
+              </w:rPr>
+              <w:t xml:space="preserve">question</w:t>
+            </w:r>
+            <w:r>
+              <w:t xml:space="preserve"> </w:t>
+            </w:r>
+            <w:r>
+              <w:t xml:space="preserve">entirely (only</w:t>
+            </w:r>
+            <w:r>
+              <w:t xml:space="preserve"> </w:t>
+            </w:r>
+            <w:r>
+              <w:t xml:space="preserve">“</w:t>
+            </w:r>
+            <w:r>
+              <w:t xml:space="preserve">from whom</w:t>
+            </w:r>
+            <w:r>
+              <w:t xml:space="preserve">”</w:t>
+            </w:r>
+            <w:r>
+              <w:t xml:space="preserve"> </w:t>
+            </w:r>
+            <w:r>
+              <w:t xml:space="preserve">and</w:t>
+            </w:r>
+            <w:r>
+              <w:t xml:space="preserve"> </w:t>
+            </w:r>
+            <w:r>
+              <w:t xml:space="preserve">“</w:t>
+            </w:r>
+            <w:r>
+              <w:t xml:space="preserve">year acquired</w:t>
+            </w:r>
+            <w:r>
+              <w:t xml:space="preserve">”</w:t>
+            </w:r>
+            <w:r>
+              <w:t xml:space="preserve"> </w:t>
+            </w:r>
+            <w:r>
+              <w:t xml:space="preserve">remain), so acquisition mode - including purchase - is not identifiable.</w:t>
+            </w:r>
+          </w:p>
+        </w:tc>
+      </w:tr>
+    </w:tbl>
+    <w:p>
+      <w:pPr>
+        <w:pStyle w:val="BodyText"/>
+      </w:pPr>
+      <w:r>
+        <w:t xml:space="preserve">All other variables are populated in every country-year shown. (Within a populated</w:t>
+      </w:r>
+      <w:r>
+        <w:t xml:space="preserve"> </w:t>
+      </w:r>
+      <w:r>
+        <w:t xml:space="preserve">country-year, ordinary item non-response is handled the usual way - e.g. a parcel</w:t>
+      </w:r>
+      <w:r>
+        <w:t xml:space="preserve"> </w:t>
+      </w:r>
+      <w:r>
+        <w:t xml:space="preserve">with no usable area is missing on</w:t>
+      </w:r>
+      <w:r>
+        <w:t xml:space="preserve"> </w:t>
+      </w:r>
+      <w:r>
+        <w:rPr>
+          <w:rStyle w:val="VerbatimChar"/>
+        </w:rPr>
+        <w:t xml:space="preserve">parcel_area_ha</w:t>
+      </w:r>
+      <w:r>
+        <w:t xml:space="preserve"> </w:t>
+      </w:r>
+      <w:r>
+        <w:t xml:space="preserve">only.)</w:t>
+      </w:r>
+    </w:p>
+    <w:p>
+      <w:r>
+        <w:pict>
+          <v:rect style="width:0;height:1.5pt" o:hralign="center" o:hrstd="t" o:hr="t"/>
+        </w:pict>
+      </w:r>
+    </w:p>
+    <w:p>
+      <w:pPr>
+        <w:pStyle w:val="Heading2"/>
+      </w:pPr>
+      <w:bookmarkStart w:id="23" w:name="X00728ba8d2160b74857f05f98b30c703885711f"/>
       <w:r>
         <w:t xml:space="preserve">ETHIOPIA — Ethiopia Socioeconomic Survey (ESS)</w:t>
       </w:r>
-      <w:bookmarkEnd w:id="22"/>
+      <w:bookmarkEnd w:id="23"/>
     </w:p>
     <w:p>
       <w:pPr>
         <w:pStyle w:val="Heading3"/>
       </w:pPr>
-      <w:bookmarkStart w:id="23" w:name="survey-wave-key"/>
+      <w:bookmarkStart w:id="24" w:name="survey-wave-key"/>
       <w:r>
         <w:t xml:space="preserve">1. Survey &amp; wave key</w:t>
       </w:r>
-      <w:bookmarkEnd w:id="23"/>
+      <w:bookmarkEnd w:id="24"/>
     </w:p>
     <w:tbl>
       <w:tblPr>
@@ -1370,11 +2052,11 @@
       <w:pPr>
         <w:pStyle w:val="Heading3"/>
       </w:pPr>
-      <w:bookmarkStart w:id="24" w:name="tenure-indicators"/>
+      <w:bookmarkStart w:id="25" w:name="tenure-indicators"/>
       <w:r>
         <w:t xml:space="preserve">2. Tenure indicators</w:t>
       </w:r>
-      <w:bookmarkEnd w:id="24"/>
+      <w:bookmarkEnd w:id="25"/>
     </w:p>
     <w:p>
       <w:pPr>
@@ -3091,7 +3773,7 @@
       <w:pPr>
         <w:pStyle w:val="Heading3"/>
       </w:pPr>
-      <w:bookmarkStart w:id="25" w:name="parcel-area-parcel_area_ha"/>
+      <w:bookmarkStart w:id="26" w:name="parcel-area-parcel_area_ha"/>
       <w:r>
         <w:t xml:space="preserve">3. Parcel area (</w:t>
       </w:r>
@@ -3104,7 +3786,7 @@
       <w:r>
         <w:t xml:space="preserve">)</w:t>
       </w:r>
-      <w:bookmarkEnd w:id="25"/>
+      <w:bookmarkEnd w:id="26"/>
     </w:p>
     <w:p>
       <w:pPr>
@@ -3861,11 +4543,11 @@
       <w:pPr>
         <w:pStyle w:val="Heading3"/>
       </w:pPr>
-      <w:bookmarkStart w:id="26" w:name="design-variables-identifiers"/>
+      <w:bookmarkStart w:id="27" w:name="design-variables-identifiers"/>
       <w:r>
         <w:t xml:space="preserve">4. Design variables &amp; identifiers</w:t>
       </w:r>
-      <w:bookmarkEnd w:id="26"/>
+      <w:bookmarkEnd w:id="27"/>
     </w:p>
     <w:tbl>
       <w:tblPr>
@@ -5184,11 +5866,11 @@
       <w:pPr>
         <w:pStyle w:val="Heading3"/>
       </w:pPr>
-      <w:bookmarkStart w:id="27" w:name="Xd42d4af8211bb53ced3c89549c738c863b0b1f0"/>
+      <w:bookmarkStart w:id="28" w:name="Xd42d4af8211bb53ced3c89549c738c863b0b1f0"/>
       <w:r>
         <w:t xml:space="preserve">5. Value labels of key source variables (verified against the raw rosters)</w:t>
       </w:r>
-      <w:bookmarkEnd w:id="27"/>
+      <w:bookmarkEnd w:id="28"/>
     </w:p>
     <w:p>
       <w:pPr>
@@ -6323,11 +7005,11 @@
       <w:pPr>
         <w:pStyle w:val="Heading3"/>
       </w:pPr>
-      <w:bookmarkStart w:id="28" w:name="harmonization-decisions-caveats-ethiopia"/>
+      <w:bookmarkStart w:id="29" w:name="harmonization-decisions-caveats-ethiopia"/>
       <w:r>
         <w:t xml:space="preserve">6. Harmonization decisions &amp; caveats (Ethiopia)</w:t>
       </w:r>
-      <w:bookmarkEnd w:id="28"/>
+      <w:bookmarkEnd w:id="29"/>
     </w:p>
     <w:p>
       <w:pPr>
@@ -6935,11 +7617,11 @@
       <w:pPr>
         <w:pStyle w:val="Heading2"/>
       </w:pPr>
-      <w:bookmarkStart w:id="29" w:name="X58e7c7fc58aa400ad0a6aeef83d98534c48a47f"/>
+      <w:bookmarkStart w:id="30" w:name="X58e7c7fc58aa400ad0a6aeef83d98534c48a47f"/>
       <w:r>
         <w:t xml:space="preserve">MALAWI — Integrated Household Panel Survey (IHPS)</w:t>
       </w:r>
-      <w:bookmarkEnd w:id="29"/>
+      <w:bookmarkEnd w:id="30"/>
     </w:p>
     <w:p>
       <w:pPr>
@@ -7090,11 +7772,11 @@
       <w:pPr>
         <w:pStyle w:val="Heading3"/>
       </w:pPr>
-      <w:bookmarkStart w:id="30" w:name="survey-wave-key-1"/>
+      <w:bookmarkStart w:id="31" w:name="survey-wave-key-1"/>
       <w:r>
         <w:t xml:space="preserve">1. Survey &amp; wave key</w:t>
       </w:r>
-      <w:bookmarkEnd w:id="30"/>
+      <w:bookmarkEnd w:id="31"/>
     </w:p>
     <w:tbl>
       <w:tblPr>
@@ -7624,11 +8306,11 @@
       <w:pPr>
         <w:pStyle w:val="Heading3"/>
       </w:pPr>
-      <w:bookmarkStart w:id="31" w:name="tenure-indicators-1"/>
+      <w:bookmarkStart w:id="32" w:name="tenure-indicators-1"/>
       <w:r>
         <w:t xml:space="preserve">2. Tenure indicators</w:t>
       </w:r>
-      <w:bookmarkEnd w:id="31"/>
+      <w:bookmarkEnd w:id="32"/>
     </w:p>
     <w:tbl>
       <w:tblPr>
@@ -8788,7 +9470,7 @@
       <w:pPr>
         <w:pStyle w:val="Heading3"/>
       </w:pPr>
-      <w:bookmarkStart w:id="32" w:name="parcel-area-parcel_area_ha-1"/>
+      <w:bookmarkStart w:id="33" w:name="parcel-area-parcel_area_ha-1"/>
       <w:r>
         <w:t xml:space="preserve">3. Parcel area (</w:t>
       </w:r>
@@ -8801,7 +9483,7 @@
       <w:r>
         <w:t xml:space="preserve">)</w:t>
       </w:r>
-      <w:bookmarkEnd w:id="32"/>
+      <w:bookmarkEnd w:id="33"/>
     </w:p>
     <w:p>
       <w:pPr>
@@ -8920,11 +9602,11 @@
       <w:pPr>
         <w:pStyle w:val="Heading3"/>
       </w:pPr>
-      <w:bookmarkStart w:id="33" w:name="design-variables-identifiers-1"/>
+      <w:bookmarkStart w:id="34" w:name="design-variables-identifiers-1"/>
       <w:r>
         <w:t xml:space="preserve">4. Design variables &amp; identifiers</w:t>
       </w:r>
-      <w:bookmarkEnd w:id="33"/>
+      <w:bookmarkEnd w:id="34"/>
     </w:p>
     <w:tbl>
       <w:tblPr>
@@ -9748,11 +10430,11 @@
       <w:pPr>
         <w:pStyle w:val="Heading3"/>
       </w:pPr>
-      <w:bookmarkStart w:id="34" w:name="X3c195f35add181f24126d1dac89a38fd1df1287"/>
+      <w:bookmarkStart w:id="35" w:name="X3c195f35add181f24126d1dac89a38fd1df1287"/>
       <w:r>
         <w:t xml:space="preserve">5. Value labels of key source variables (verified)</w:t>
       </w:r>
-      <w:bookmarkEnd w:id="34"/>
+      <w:bookmarkEnd w:id="35"/>
     </w:p>
     <w:p>
       <w:pPr>
@@ -10679,11 +11361,11 @@
       <w:pPr>
         <w:pStyle w:val="Heading3"/>
       </w:pPr>
-      <w:bookmarkStart w:id="35" w:name="harmonization-decisions-caveats-malawi"/>
+      <w:bookmarkStart w:id="36" w:name="harmonization-decisions-caveats-malawi"/>
       <w:r>
         <w:t xml:space="preserve">6. Harmonization decisions &amp; caveats (Malawi)</w:t>
       </w:r>
-      <w:bookmarkEnd w:id="35"/>
+      <w:bookmarkEnd w:id="36"/>
     </w:p>
     <w:p>
       <w:pPr>

</xml_diff>

<commit_message>
Add Mali extractor (EACI 2014/2017, parcel-level) + provenance; enable in MASTER
</commit_message>
<xml_diff>
--- a/Reference/variable_provenance.docx
+++ b/Reference/variable_provenance.docx
@@ -1349,6 +1349,100 @@
           </w:p>
         </w:tc>
       </w:tr>
+      <w:tr>
+        <w:tc>
+          <w:p>
+            <w:pPr>
+              <w:pStyle w:val="Compact"/>
+              <w:jc w:val="left"/>
+            </w:pPr>
+            <w:r>
+              <w:t xml:space="preserve">Mali</w:t>
+            </w:r>
+          </w:p>
+        </w:tc>
+        <w:tc>
+          <w:p>
+            <w:pPr>
+              <w:pStyle w:val="Compact"/>
+              <w:jc w:val="left"/>
+            </w:pPr>
+            <w:r>
+              <w:rPr>
+                <w:rStyle w:val="VerbatimChar"/>
+              </w:rPr>
+              <w:t xml:space="preserve">parcel_rentedout</w:t>
+            </w:r>
+          </w:p>
+        </w:tc>
+        <w:tc>
+          <w:p>
+            <w:pPr>
+              <w:pStyle w:val="Compact"/>
+              <w:jc w:val="left"/>
+            </w:pPr>
+            <w:r>
+              <w:t xml:space="preserve">2014, 2017</w:t>
+            </w:r>
+          </w:p>
+        </w:tc>
+        <w:tc>
+          <w:p>
+            <w:pPr>
+              <w:pStyle w:val="Compact"/>
+              <w:jc w:val="left"/>
+            </w:pPr>
+            <w:r>
+              <w:t xml:space="preserve">EACI surveys only the parcels a household</w:t>
+            </w:r>
+            <w:r>
+              <w:t xml:space="preserve"> </w:t>
+            </w:r>
+            <w:r>
+              <w:rPr>
+                <w:b/>
+              </w:rPr>
+              <w:t xml:space="preserve">operates</w:t>
+            </w:r>
+            <w:r>
+              <w:t xml:space="preserve">, so land rented/lent</w:t>
+            </w:r>
+            <w:r>
+              <w:t xml:space="preserve"> </w:t>
+            </w:r>
+            <w:r>
+              <w:rPr>
+                <w:b/>
+              </w:rPr>
+              <w:t xml:space="preserve">out</w:t>
+            </w:r>
+            <w:r>
+              <w:t xml:space="preserve"> </w:t>
+            </w:r>
+            <w:r>
+              <w:t xml:space="preserve">is out of frame (no rented-out code in 2014; the 2017</w:t>
+            </w:r>
+            <w:r>
+              <w:t xml:space="preserve"> </w:t>
+            </w:r>
+            <w:r>
+              <w:t xml:space="preserve">“</w:t>
+            </w:r>
+            <w:r>
+              <w:t xml:space="preserve">Louee/Pretee</w:t>
+            </w:r>
+            <w:r>
+              <w:t xml:space="preserve">”</w:t>
+            </w:r>
+            <w:r>
+              <w:t xml:space="preserve"> </w:t>
+            </w:r>
+            <w:r>
+              <w:t xml:space="preserve">code flags only 5 of ~24,250 parcels).</w:t>
+            </w:r>
+          </w:p>
+        </w:tc>
+      </w:tr>
     </w:tbl>
     <w:p>
       <w:pPr>
@@ -11787,9 +11881,2307 @@
     </w:p>
     <w:p>
       <w:pPr>
+        <w:pStyle w:val="Heading2"/>
+      </w:pPr>
+      <w:bookmarkStart w:id="37" w:name="X3efb4428047162bb7c872e735728bee0a77b27e"/>
+      <w:r>
+        <w:t xml:space="preserve">MALI — Enquete Agricole de Conjoncture Integree (EACI)</w:t>
+      </w:r>
+      <w:bookmarkEnd w:id="37"/>
+    </w:p>
+    <w:p>
+      <w:pPr>
         <w:pStyle w:val="FirstParagraph"/>
       </w:pPr>
       <w:r>
+        <w:t xml:space="preserve">Two separate cross-sectional rounds (not a panel): EACI 2014 and EACI 2017.</w:t>
+      </w:r>
+      <w:r>
+        <w:t xml:space="preserve"> </w:t>
+      </w:r>
+      <w:r>
+        <w:t xml:space="preserve">The 2017 files use a different naming scheme (</w:t>
+      </w:r>
+      <w:r>
+        <w:rPr>
+          <w:rStyle w:val="VerbatimChar"/>
+        </w:rPr>
+        <w:t xml:space="preserve">eaci17_sNNpY</w:t>
+      </w:r>
+      <w:r>
+        <w:t xml:space="preserve">) and variable prefix</w:t>
+      </w:r>
+      <w:r>
+        <w:t xml:space="preserve"> </w:t>
+      </w:r>
+      <w:r>
+        <w:t xml:space="preserve">(</w:t>
+      </w:r>
+      <w:r>
+        <w:rPr>
+          <w:rStyle w:val="VerbatimChar"/>
+        </w:rPr>
+        <w:t xml:space="preserve">s11b…</w:t>
+      </w:r>
+      <w:r>
+        <w:t xml:space="preserve">) than 2014 (</w:t>
+      </w:r>
+      <w:r>
+        <w:rPr>
+          <w:rStyle w:val="VerbatimChar"/>
+        </w:rPr>
+        <w:t xml:space="preserve">EACI…_p1</w:t>
+      </w:r>
+      <w:r>
+        <w:t xml:space="preserve">,</w:t>
+      </w:r>
+      <w:r>
+        <w:t xml:space="preserve"> </w:t>
+      </w:r>
+      <w:r>
+        <w:rPr>
+          <w:rStyle w:val="VerbatimChar"/>
+        </w:rPr>
+        <w:t xml:space="preserve">s1b…</w:t>
+      </w:r>
+      <w:r>
+        <w:t xml:space="preserve">).</w:t>
+      </w:r>
+    </w:p>
+    <w:p>
+      <w:pPr>
+        <w:pStyle w:val="BlockText"/>
+      </w:pPr>
+      <w:r>
+        <w:rPr>
+          <w:b/>
+        </w:rPr>
+        <w:t xml:space="preserve">Unit note.</w:t>
+      </w:r>
+      <w:r>
+        <w:t xml:space="preserve"> </w:t>
+      </w:r>
+      <w:r>
+        <w:t xml:space="preserve">Everything we use - tenure, acquisition, disposition, and area -</w:t>
+      </w:r>
+      <w:r>
+        <w:t xml:space="preserve"> </w:t>
+      </w:r>
+      <w:r>
+        <w:t xml:space="preserve">sits in the single parcel/exploitation roster, so the</w:t>
+      </w:r>
+      <w:r>
+        <w:t xml:space="preserve"> </w:t>
+      </w:r>
+      <w:r>
+        <w:rPr>
+          <w:rStyle w:val="VerbatimChar"/>
+        </w:rPr>
+        <w:t xml:space="preserve">parcel</w:t>
+      </w:r>
+      <w:r>
+        <w:t xml:space="preserve"> </w:t>
+      </w:r>
+      <w:r>
+        <w:t xml:space="preserve">is that roster</w:t>
+      </w:r>
+      <w:r>
+        <w:t xml:space="preserve"> </w:t>
+      </w:r>
+      <w:r>
+        <w:t xml:space="preserve">record and no cross-module merge is needed.</w:t>
+      </w:r>
+    </w:p>
+    <w:p>
+      <w:pPr>
+        <w:pStyle w:val="Heading3"/>
+      </w:pPr>
+      <w:bookmarkStart w:id="38" w:name="survey-wave-key-2"/>
+      <w:r>
+        <w:t xml:space="preserve">1. Survey &amp; wave key</w:t>
+      </w:r>
+      <w:bookmarkEnd w:id="38"/>
+    </w:p>
+    <w:tbl>
+      <w:tblPr>
+        <w:tblStyle w:val="Table"/>
+        <w:tblW w:type="pct" w:w="0.0"/>
+        <w:tblLook w:firstRow="1"/>
+      </w:tblPr>
+      <w:tblGrid/>
+      <w:tr>
+        <w:trPr>
+          <w:cnfStyle w:firstRow="1"/>
+        </w:trPr>
+        <w:tc>
+          <w:tcPr>
+            <w:tcBorders>
+              <w:bottom w:val="single"/>
+            </w:tcBorders>
+            <w:vAlign w:val="bottom"/>
+          </w:tcPr>
+          <w:p>
+            <w:pPr>
+              <w:pStyle w:val="Compact"/>
+              <w:jc w:val="left"/>
+            </w:pPr>
+            <w:r>
+              <w:t xml:space="preserve">Wave</w:t>
+            </w:r>
+          </w:p>
+        </w:tc>
+        <w:tc>
+          <w:tcPr>
+            <w:tcBorders>
+              <w:bottom w:val="single"/>
+            </w:tcBorders>
+            <w:vAlign w:val="bottom"/>
+          </w:tcPr>
+          <w:p>
+            <w:pPr>
+              <w:pStyle w:val="Compact"/>
+              <w:jc w:val="left"/>
+            </w:pPr>
+            <w:r>
+              <w:t xml:space="preserve">Round folder</w:t>
+            </w:r>
+          </w:p>
+        </w:tc>
+        <w:tc>
+          <w:tcPr>
+            <w:tcBorders>
+              <w:bottom w:val="single"/>
+            </w:tcBorders>
+            <w:vAlign w:val="bottom"/>
+          </w:tcPr>
+          <w:p>
+            <w:pPr>
+              <w:pStyle w:val="Compact"/>
+              <w:jc w:val="left"/>
+            </w:pPr>
+            <w:r>
+              <w:t xml:space="preserve">Year</w:t>
+            </w:r>
+          </w:p>
+        </w:tc>
+        <w:tc>
+          <w:tcPr>
+            <w:tcBorders>
+              <w:bottom w:val="single"/>
+            </w:tcBorders>
+            <w:vAlign w:val="bottom"/>
+          </w:tcPr>
+          <w:p>
+            <w:pPr>
+              <w:pStyle w:val="Compact"/>
+              <w:jc w:val="left"/>
+            </w:pPr>
+            <w:r>
+              <w:t xml:space="preserve">HH id</w:t>
+            </w:r>
+          </w:p>
+        </w:tc>
+        <w:tc>
+          <w:tcPr>
+            <w:tcBorders>
+              <w:bottom w:val="single"/>
+            </w:tcBorders>
+            <w:vAlign w:val="bottom"/>
+          </w:tcPr>
+          <w:p>
+            <w:pPr>
+              <w:pStyle w:val="Compact"/>
+              <w:jc w:val="left"/>
+            </w:pPr>
+            <w:r>
+              <w:t xml:space="preserve">Parcel roster</w:t>
+            </w:r>
+          </w:p>
+        </w:tc>
+      </w:tr>
+      <w:tr>
+        <w:tc>
+          <w:p>
+            <w:pPr>
+              <w:pStyle w:val="Compact"/>
+              <w:jc w:val="left"/>
+            </w:pPr>
+            <w:r>
+              <w:t xml:space="preserve">1</w:t>
+            </w:r>
+          </w:p>
+        </w:tc>
+        <w:tc>
+          <w:p>
+            <w:pPr>
+              <w:pStyle w:val="Compact"/>
+              <w:jc w:val="left"/>
+            </w:pPr>
+            <w:r>
+              <w:rPr>
+                <w:rStyle w:val="VerbatimChar"/>
+              </w:rPr>
+              <w:t xml:space="preserve">Mali/EACI 14</w:t>
+            </w:r>
+          </w:p>
+        </w:tc>
+        <w:tc>
+          <w:p>
+            <w:pPr>
+              <w:pStyle w:val="Compact"/>
+              <w:jc w:val="left"/>
+            </w:pPr>
+            <w:r>
+              <w:t xml:space="preserve">2014</w:t>
+            </w:r>
+          </w:p>
+        </w:tc>
+        <w:tc>
+          <w:p>
+            <w:pPr>
+              <w:pStyle w:val="Compact"/>
+              <w:jc w:val="left"/>
+            </w:pPr>
+            <w:r>
+              <w:rPr>
+                <w:rStyle w:val="VerbatimChar"/>
+              </w:rPr>
+              <w:t xml:space="preserve">grappe</w:t>
+            </w:r>
+            <w:r>
+              <w:t xml:space="preserve">-</w:t>
+            </w:r>
+            <w:r>
+              <w:rPr>
+                <w:rStyle w:val="VerbatimChar"/>
+              </w:rPr>
+              <w:t xml:space="preserve">menage</w:t>
+            </w:r>
+          </w:p>
+        </w:tc>
+        <w:tc>
+          <w:p>
+            <w:pPr>
+              <w:pStyle w:val="Compact"/>
+              <w:jc w:val="left"/>
+            </w:pPr>
+            <w:r>
+              <w:rPr>
+                <w:rStyle w:val="VerbatimChar"/>
+              </w:rPr>
+              <w:t xml:space="preserve">EACIEXPLOI_p1.dta</w:t>
+            </w:r>
+            <w:r>
+              <w:t xml:space="preserve"> </w:t>
+            </w:r>
+            <w:r>
+              <w:t xml:space="preserve">(</w:t>
+            </w:r>
+            <w:r>
+              <w:rPr>
+                <w:rStyle w:val="VerbatimChar"/>
+              </w:rPr>
+              <w:t xml:space="preserve">s1b…</w:t>
+            </w:r>
+            <w:r>
+              <w:t xml:space="preserve">)</w:t>
+            </w:r>
+          </w:p>
+        </w:tc>
+      </w:tr>
+      <w:tr>
+        <w:tc>
+          <w:p>
+            <w:pPr>
+              <w:pStyle w:val="Compact"/>
+              <w:jc w:val="left"/>
+            </w:pPr>
+            <w:r>
+              <w:t xml:space="preserve">2</w:t>
+            </w:r>
+          </w:p>
+        </w:tc>
+        <w:tc>
+          <w:p>
+            <w:pPr>
+              <w:pStyle w:val="Compact"/>
+              <w:jc w:val="left"/>
+            </w:pPr>
+            <w:r>
+              <w:rPr>
+                <w:rStyle w:val="VerbatimChar"/>
+              </w:rPr>
+              <w:t xml:space="preserve">Mali/EACI 17</w:t>
+            </w:r>
+          </w:p>
+        </w:tc>
+        <w:tc>
+          <w:p>
+            <w:pPr>
+              <w:pStyle w:val="Compact"/>
+              <w:jc w:val="left"/>
+            </w:pPr>
+            <w:r>
+              <w:t xml:space="preserve">2017</w:t>
+            </w:r>
+          </w:p>
+        </w:tc>
+        <w:tc>
+          <w:p>
+            <w:pPr>
+              <w:pStyle w:val="Compact"/>
+              <w:jc w:val="left"/>
+            </w:pPr>
+            <w:r>
+              <w:rPr>
+                <w:rStyle w:val="VerbatimChar"/>
+              </w:rPr>
+              <w:t xml:space="preserve">grappe</w:t>
+            </w:r>
+            <w:r>
+              <w:t xml:space="preserve">-</w:t>
+            </w:r>
+            <w:r>
+              <w:rPr>
+                <w:rStyle w:val="VerbatimChar"/>
+              </w:rPr>
+              <w:t xml:space="preserve">exploitation</w:t>
+            </w:r>
+          </w:p>
+        </w:tc>
+        <w:tc>
+          <w:p>
+            <w:pPr>
+              <w:pStyle w:val="Compact"/>
+              <w:jc w:val="left"/>
+            </w:pPr>
+            <w:r>
+              <w:rPr>
+                <w:rStyle w:val="VerbatimChar"/>
+              </w:rPr>
+              <w:t xml:space="preserve">eaci17_s11bp1.dta</w:t>
+            </w:r>
+            <w:r>
+              <w:t xml:space="preserve"> </w:t>
+            </w:r>
+            <w:r>
+              <w:t xml:space="preserve">(</w:t>
+            </w:r>
+            <w:r>
+              <w:rPr>
+                <w:rStyle w:val="VerbatimChar"/>
+              </w:rPr>
+              <w:t xml:space="preserve">s11b…</w:t>
+            </w:r>
+            <w:r>
+              <w:t xml:space="preserve">)</w:t>
+            </w:r>
+          </w:p>
+        </w:tc>
+      </w:tr>
+    </w:tbl>
+    <w:p>
+      <w:pPr>
+        <w:pStyle w:val="BodyText"/>
+      </w:pPr>
+      <w:r>
+        <w:t xml:space="preserve">Weights: 2014</w:t>
+      </w:r>
+      <w:r>
+        <w:t xml:space="preserve"> </w:t>
+      </w:r>
+      <w:r>
+        <w:rPr>
+          <w:rStyle w:val="VerbatimChar"/>
+        </w:rPr>
+        <w:t xml:space="preserve">EACIPOIDS.dta</w:t>
+      </w:r>
+      <w:r>
+        <w:t xml:space="preserve"> </w:t>
+      </w:r>
+      <w:r>
+        <w:t xml:space="preserve">(</w:t>
+      </w:r>
+      <w:r>
+        <w:rPr>
+          <w:rStyle w:val="VerbatimChar"/>
+        </w:rPr>
+        <w:t xml:space="preserve">poids_menage</w:t>
+      </w:r>
+      <w:r>
+        <w:t xml:space="preserve">); 2017</w:t>
+      </w:r>
+      <w:r>
+        <w:t xml:space="preserve"> </w:t>
+      </w:r>
+      <w:r>
+        <w:rPr>
+          <w:rStyle w:val="VerbatimChar"/>
+        </w:rPr>
+        <w:t xml:space="preserve">EACI17_ECHANTILLON.dta</w:t>
+      </w:r>
+      <w:r>
+        <w:t xml:space="preserve"> </w:t>
+      </w:r>
+      <w:r>
+        <w:t xml:space="preserve">(</w:t>
+      </w:r>
+      <w:r>
+        <w:rPr>
+          <w:rStyle w:val="VerbatimChar"/>
+        </w:rPr>
+        <w:t xml:space="preserve">poids_leger</w:t>
+      </w:r>
+      <w:r>
+        <w:t xml:space="preserve">, and the official</w:t>
+      </w:r>
+      <w:r>
+        <w:t xml:space="preserve"> </w:t>
+      </w:r>
+      <w:r>
+        <w:rPr>
+          <w:rStyle w:val="VerbatimChar"/>
+        </w:rPr>
+        <w:t xml:space="preserve">strate</w:t>
+      </w:r>
+      <w:r>
+        <w:t xml:space="preserve">). Cover (2014 strata):</w:t>
+      </w:r>
+      <w:r>
+        <w:t xml:space="preserve"> </w:t>
+      </w:r>
+      <w:r>
+        <w:rPr>
+          <w:rStyle w:val="VerbatimChar"/>
+        </w:rPr>
+        <w:t xml:space="preserve">EACICONTROLE_p1.dta</w:t>
+      </w:r>
+      <w:r>
+        <w:t xml:space="preserve">.</w:t>
+      </w:r>
+    </w:p>
+    <w:p>
+      <w:pPr>
+        <w:pStyle w:val="Heading3"/>
+      </w:pPr>
+      <w:bookmarkStart w:id="39" w:name="tenure-indicators-2"/>
+      <w:r>
+        <w:t xml:space="preserve">2. Tenure indicators</w:t>
+      </w:r>
+      <w:bookmarkEnd w:id="39"/>
+    </w:p>
+    <w:tbl>
+      <w:tblPr>
+        <w:tblStyle w:val="Table"/>
+        <w:tblW w:type="pct" w:w="0.0"/>
+        <w:tblLook w:firstRow="1"/>
+      </w:tblPr>
+      <w:tblGrid/>
+      <w:tr>
+        <w:trPr>
+          <w:cnfStyle w:firstRow="1"/>
+        </w:trPr>
+        <w:tc>
+          <w:tcPr>
+            <w:tcBorders>
+              <w:bottom w:val="single"/>
+            </w:tcBorders>
+            <w:vAlign w:val="bottom"/>
+          </w:tcPr>
+          <w:p>
+            <w:pPr>
+              <w:pStyle w:val="Compact"/>
+              <w:jc w:val="left"/>
+            </w:pPr>
+            <w:r>
+              <w:t xml:space="preserve">Variable</w:t>
+            </w:r>
+          </w:p>
+        </w:tc>
+        <w:tc>
+          <w:tcPr>
+            <w:tcBorders>
+              <w:bottom w:val="single"/>
+            </w:tcBorders>
+            <w:vAlign w:val="bottom"/>
+          </w:tcPr>
+          <w:p>
+            <w:pPr>
+              <w:pStyle w:val="Compact"/>
+              <w:jc w:val="left"/>
+            </w:pPr>
+            <w:r>
+              <w:t xml:space="preserve">Wave</w:t>
+            </w:r>
+          </w:p>
+        </w:tc>
+        <w:tc>
+          <w:tcPr>
+            <w:tcBorders>
+              <w:bottom w:val="single"/>
+            </w:tcBorders>
+            <w:vAlign w:val="bottom"/>
+          </w:tcPr>
+          <w:p>
+            <w:pPr>
+              <w:pStyle w:val="Compact"/>
+              <w:jc w:val="left"/>
+            </w:pPr>
+            <w:r>
+              <w:t xml:space="preserve">Source var</w:t>
+            </w:r>
+          </w:p>
+        </w:tc>
+        <w:tc>
+          <w:tcPr>
+            <w:tcBorders>
+              <w:bottom w:val="single"/>
+            </w:tcBorders>
+            <w:vAlign w:val="bottom"/>
+          </w:tcPr>
+          <w:p>
+            <w:pPr>
+              <w:pStyle w:val="Compact"/>
+              <w:jc w:val="left"/>
+            </w:pPr>
+            <w:r>
+              <w:t xml:space="preserve">Construction</w:t>
+            </w:r>
+          </w:p>
+        </w:tc>
+      </w:tr>
+      <w:tr>
+        <w:tc>
+          <w:p>
+            <w:pPr>
+              <w:pStyle w:val="Compact"/>
+              <w:jc w:val="left"/>
+            </w:pPr>
+            <w:r>
+              <w:rPr>
+                <w:rStyle w:val="VerbatimChar"/>
+              </w:rPr>
+              <w:t xml:space="preserve">parcel_rentedin</w:t>
+            </w:r>
+          </w:p>
+        </w:tc>
+        <w:tc>
+          <w:p>
+            <w:pPr>
+              <w:pStyle w:val="Compact"/>
+              <w:jc w:val="left"/>
+            </w:pPr>
+            <w:r>
+              <w:t xml:space="preserve">1</w:t>
+            </w:r>
+          </w:p>
+        </w:tc>
+        <w:tc>
+          <w:p>
+            <w:pPr>
+              <w:pStyle w:val="Compact"/>
+              <w:jc w:val="left"/>
+            </w:pPr>
+            <w:r>
+              <w:rPr>
+                <w:rStyle w:val="VerbatimChar"/>
+              </w:rPr>
+              <w:t xml:space="preserve">s1bq17</w:t>
+            </w:r>
+          </w:p>
+        </w:tc>
+        <w:tc>
+          <w:p>
+            <w:pPr>
+              <w:pStyle w:val="Compact"/>
+              <w:jc w:val="left"/>
+            </w:pPr>
+            <w:r>
+              <w:rPr>
+                <w:rStyle w:val="VerbatimChar"/>
+              </w:rPr>
+              <w:t xml:space="preserve">inlist(s1bq17,4,5)</w:t>
+            </w:r>
+            <w:r>
+              <w:t xml:space="preserve"> </w:t>
+            </w:r>
+            <w:r>
+              <w:t xml:space="preserve">- Location + Metayage</w:t>
+            </w:r>
+          </w:p>
+        </w:tc>
+      </w:tr>
+      <w:tr>
+        <w:tc>
+          <w:p>
+            <w:pPr>
+              <w:pStyle w:val="Compact"/>
+              <w:jc w:val="left"/>
+            </w:pPr>
+            <w:r>
+              <w:rPr>
+                <w:rStyle w:val="VerbatimChar"/>
+              </w:rPr>
+              <w:t xml:space="preserve">parcel_rentedin</w:t>
+            </w:r>
+          </w:p>
+        </w:tc>
+        <w:tc>
+          <w:p>
+            <w:pPr>
+              <w:pStyle w:val="Compact"/>
+              <w:jc w:val="left"/>
+            </w:pPr>
+            <w:r>
+              <w:t xml:space="preserve">2</w:t>
+            </w:r>
+          </w:p>
+        </w:tc>
+        <w:tc>
+          <w:p>
+            <w:pPr>
+              <w:pStyle w:val="Compact"/>
+              <w:jc w:val="left"/>
+            </w:pPr>
+            <w:r>
+              <w:rPr>
+                <w:rStyle w:val="VerbatimChar"/>
+              </w:rPr>
+              <w:t xml:space="preserve">s11bq17</w:t>
+            </w:r>
+          </w:p>
+        </w:tc>
+        <w:tc>
+          <w:p>
+            <w:pPr>
+              <w:pStyle w:val="Compact"/>
+              <w:jc w:val="left"/>
+            </w:pPr>
+            <w:r>
+              <w:rPr>
+                <w:rStyle w:val="VerbatimChar"/>
+              </w:rPr>
+              <w:t xml:space="preserve">inlist(s11bq17,4,5)</w:t>
+            </w:r>
+            <w:r>
+              <w:t xml:space="preserve"> </w:t>
+            </w:r>
+            <w:r>
+              <w:t xml:space="preserve">- Location + Metayage</w:t>
+            </w:r>
+          </w:p>
+        </w:tc>
+      </w:tr>
+      <w:tr>
+        <w:tc>
+          <w:p>
+            <w:pPr>
+              <w:pStyle w:val="Compact"/>
+              <w:jc w:val="left"/>
+            </w:pPr>
+            <w:r>
+              <w:rPr>
+                <w:rStyle w:val="VerbatimChar"/>
+              </w:rPr>
+              <w:t xml:space="preserve">parcel_certificate</w:t>
+            </w:r>
+          </w:p>
+        </w:tc>
+        <w:tc>
+          <w:p>
+            <w:pPr>
+              <w:pStyle w:val="Compact"/>
+              <w:jc w:val="left"/>
+            </w:pPr>
+            <w:r>
+              <w:t xml:space="preserve">1</w:t>
+            </w:r>
+          </w:p>
+        </w:tc>
+        <w:tc>
+          <w:p>
+            <w:pPr>
+              <w:pStyle w:val="Compact"/>
+              <w:jc w:val="left"/>
+            </w:pPr>
+            <w:r>
+              <w:rPr>
+                <w:rStyle w:val="VerbatimChar"/>
+              </w:rPr>
+              <w:t xml:space="preserve">s1bq17</w:t>
+            </w:r>
+          </w:p>
+        </w:tc>
+        <w:tc>
+          <w:p>
+            <w:pPr>
+              <w:pStyle w:val="Compact"/>
+              <w:jc w:val="left"/>
+            </w:pPr>
+            <w:r>
+              <w:rPr>
+                <w:rStyle w:val="VerbatimChar"/>
+              </w:rPr>
+              <w:t xml:space="preserve">s1bq17==1</w:t>
+            </w:r>
+            <w:r>
+              <w:t xml:space="preserve"> </w:t>
+            </w:r>
+            <w:r>
+              <w:t xml:space="preserve">- owned with formal title</w:t>
+            </w:r>
+          </w:p>
+        </w:tc>
+      </w:tr>
+      <w:tr>
+        <w:tc>
+          <w:p>
+            <w:pPr>
+              <w:pStyle w:val="Compact"/>
+              <w:jc w:val="left"/>
+            </w:pPr>
+            <w:r>
+              <w:rPr>
+                <w:rStyle w:val="VerbatimChar"/>
+              </w:rPr>
+              <w:t xml:space="preserve">parcel_certificate</w:t>
+            </w:r>
+          </w:p>
+        </w:tc>
+        <w:tc>
+          <w:p>
+            <w:pPr>
+              <w:pStyle w:val="Compact"/>
+              <w:jc w:val="left"/>
+            </w:pPr>
+            <w:r>
+              <w:t xml:space="preserve">2</w:t>
+            </w:r>
+          </w:p>
+        </w:tc>
+        <w:tc>
+          <w:p>
+            <w:pPr>
+              <w:pStyle w:val="Compact"/>
+              <w:jc w:val="left"/>
+            </w:pPr>
+            <w:r>
+              <w:rPr>
+                <w:rStyle w:val="VerbatimChar"/>
+              </w:rPr>
+              <w:t xml:space="preserve">s11bq17</w:t>
+            </w:r>
+          </w:p>
+        </w:tc>
+        <w:tc>
+          <w:p>
+            <w:pPr>
+              <w:pStyle w:val="Compact"/>
+              <w:jc w:val="left"/>
+            </w:pPr>
+            <w:r>
+              <w:rPr>
+                <w:rStyle w:val="VerbatimChar"/>
+              </w:rPr>
+              <w:t xml:space="preserve">s11bq17==1</w:t>
+            </w:r>
+            <w:r>
+              <w:t xml:space="preserve"> </w:t>
+            </w:r>
+            <w:r>
+              <w:t xml:space="preserve">- owned with formal title</w:t>
+            </w:r>
+          </w:p>
+        </w:tc>
+      </w:tr>
+      <w:tr>
+        <w:tc>
+          <w:p>
+            <w:pPr>
+              <w:pStyle w:val="Compact"/>
+              <w:jc w:val="left"/>
+            </w:pPr>
+            <w:r>
+              <w:rPr>
+                <w:rStyle w:val="VerbatimChar"/>
+              </w:rPr>
+              <w:t xml:space="preserve">parcel_purchased</w:t>
+            </w:r>
+          </w:p>
+        </w:tc>
+        <w:tc>
+          <w:p>
+            <w:pPr>
+              <w:pStyle w:val="Compact"/>
+              <w:jc w:val="left"/>
+            </w:pPr>
+            <w:r>
+              <w:t xml:space="preserve">1</w:t>
+            </w:r>
+          </w:p>
+        </w:tc>
+        <w:tc>
+          <w:p>
+            <w:pPr>
+              <w:pStyle w:val="Compact"/>
+              <w:jc w:val="left"/>
+            </w:pPr>
+            <w:r>
+              <w:rPr>
+                <w:rStyle w:val="VerbatimChar"/>
+              </w:rPr>
+              <w:t xml:space="preserve">s1bq22</w:t>
+            </w:r>
+          </w:p>
+        </w:tc>
+        <w:tc>
+          <w:p>
+            <w:pPr>
+              <w:pStyle w:val="Compact"/>
+              <w:jc w:val="left"/>
+            </w:pPr>
+            <w:r>
+              <w:rPr>
+                <w:rStyle w:val="VerbatimChar"/>
+              </w:rPr>
+              <w:t xml:space="preserve">s1bq22==7</w:t>
+            </w:r>
+            <w:r>
+              <w:t xml:space="preserve"> </w:t>
+            </w:r>
+            <w:r>
+              <w:t xml:space="preserve">- Achat</w:t>
+            </w:r>
+          </w:p>
+        </w:tc>
+      </w:tr>
+      <w:tr>
+        <w:tc>
+          <w:p>
+            <w:pPr>
+              <w:pStyle w:val="Compact"/>
+              <w:jc w:val="left"/>
+            </w:pPr>
+            <w:r>
+              <w:rPr>
+                <w:rStyle w:val="VerbatimChar"/>
+              </w:rPr>
+              <w:t xml:space="preserve">parcel_purchased</w:t>
+            </w:r>
+          </w:p>
+        </w:tc>
+        <w:tc>
+          <w:p>
+            <w:pPr>
+              <w:pStyle w:val="Compact"/>
+              <w:jc w:val="left"/>
+            </w:pPr>
+            <w:r>
+              <w:t xml:space="preserve">2</w:t>
+            </w:r>
+          </w:p>
+        </w:tc>
+        <w:tc>
+          <w:p>
+            <w:pPr>
+              <w:pStyle w:val="Compact"/>
+              <w:jc w:val="left"/>
+            </w:pPr>
+            <w:r>
+              <w:rPr>
+                <w:rStyle w:val="VerbatimChar"/>
+              </w:rPr>
+              <w:t xml:space="preserve">s11bq22</w:t>
+            </w:r>
+          </w:p>
+        </w:tc>
+        <w:tc>
+          <w:p>
+            <w:pPr>
+              <w:pStyle w:val="Compact"/>
+              <w:jc w:val="left"/>
+            </w:pPr>
+            <w:r>
+              <w:rPr>
+                <w:rStyle w:val="VerbatimChar"/>
+              </w:rPr>
+              <w:t xml:space="preserve">s11bq22==7</w:t>
+            </w:r>
+            <w:r>
+              <w:t xml:space="preserve"> </w:t>
+            </w:r>
+            <w:r>
+              <w:t xml:space="preserve">- Achat</w:t>
+            </w:r>
+          </w:p>
+        </w:tc>
+      </w:tr>
+      <w:tr>
+        <w:tc>
+          <w:p>
+            <w:pPr>
+              <w:pStyle w:val="Compact"/>
+              <w:jc w:val="left"/>
+            </w:pPr>
+            <w:r>
+              <w:rPr>
+                <w:rStyle w:val="VerbatimChar"/>
+              </w:rPr>
+              <w:t xml:space="preserve">parcel_rentedout</w:t>
+            </w:r>
+          </w:p>
+        </w:tc>
+        <w:tc>
+          <w:p>
+            <w:pPr>
+              <w:pStyle w:val="Compact"/>
+              <w:jc w:val="left"/>
+            </w:pPr>
+            <w:r>
+              <w:t xml:space="preserve">1-2</w:t>
+            </w:r>
+          </w:p>
+        </w:tc>
+        <w:tc>
+          <w:p>
+            <w:pPr>
+              <w:pStyle w:val="Compact"/>
+              <w:jc w:val="left"/>
+            </w:pPr>
+            <w:r>
+              <w:t xml:space="preserve">—</w:t>
+            </w:r>
+          </w:p>
+        </w:tc>
+        <w:tc>
+          <w:p>
+            <w:pPr>
+              <w:pStyle w:val="Compact"/>
+              <w:jc w:val="left"/>
+            </w:pPr>
+            <w:r>
+              <w:rPr>
+                <w:b/>
+              </w:rPr>
+              <w:t xml:space="preserve">missing</w:t>
+            </w:r>
+            <w:r>
+              <w:t xml:space="preserve"> </w:t>
+            </w:r>
+            <w:r>
+              <w:t xml:space="preserve">- not measurable (see §6)</w:t>
+            </w:r>
+          </w:p>
+        </w:tc>
+      </w:tr>
+    </w:tbl>
+    <w:p>
+      <w:pPr>
+        <w:pStyle w:val="Heading3"/>
+      </w:pPr>
+      <w:bookmarkStart w:id="40" w:name="parcel-area-parcel_area_ha-2"/>
+      <w:r>
+        <w:t xml:space="preserve">3. Parcel area (</w:t>
+      </w:r>
+      <w:r>
+        <w:rPr>
+          <w:rStyle w:val="VerbatimChar"/>
+        </w:rPr>
+        <w:t xml:space="preserve">parcel_area_ha</w:t>
+      </w:r>
+      <w:r>
+        <w:t xml:space="preserve">)</w:t>
+      </w:r>
+      <w:bookmarkEnd w:id="40"/>
+    </w:p>
+    <w:p>
+      <w:pPr>
+        <w:pStyle w:val="FirstParagraph"/>
+      </w:pPr>
+      <w:r>
+        <w:t xml:space="preserve">GPS where measured, else self-reported (deterministic; no imputation). 2014: GPS</w:t>
+      </w:r>
+      <w:r>
+        <w:t xml:space="preserve"> </w:t>
+      </w:r>
+      <w:r>
+        <w:rPr>
+          <w:rStyle w:val="VerbatimChar"/>
+        </w:rPr>
+        <w:t xml:space="preserve">s1bq05a</w:t>
+      </w:r>
+      <w:r>
+        <w:t xml:space="preserve">, self-reported</w:t>
+      </w:r>
+      <w:r>
+        <w:t xml:space="preserve"> </w:t>
+      </w:r>
+      <w:r>
+        <w:rPr>
+          <w:rStyle w:val="VerbatimChar"/>
+        </w:rPr>
+        <w:t xml:space="preserve">s1bq10</w:t>
+      </w:r>
+      <w:r>
+        <w:t xml:space="preserve"> </w:t>
+      </w:r>
+      <w:r>
+        <w:t xml:space="preserve">(both treated as ha; value 99 = missing). 2017:</w:t>
+      </w:r>
+      <w:r>
+        <w:t xml:space="preserve"> </w:t>
+      </w:r>
+      <w:r>
+        <w:t xml:space="preserve">GPS</w:t>
+      </w:r>
+      <w:r>
+        <w:t xml:space="preserve"> </w:t>
+      </w:r>
+      <w:r>
+        <w:rPr>
+          <w:rStyle w:val="VerbatimChar"/>
+        </w:rPr>
+        <w:t xml:space="preserve">s11bq07</w:t>
+      </w:r>
+      <w:r>
+        <w:t xml:space="preserve">, self-reported</w:t>
+      </w:r>
+      <w:r>
+        <w:t xml:space="preserve"> </w:t>
+      </w:r>
+      <w:r>
+        <w:rPr>
+          <w:rStyle w:val="VerbatimChar"/>
+        </w:rPr>
+        <w:t xml:space="preserve">s11bq11a</w:t>
+      </w:r>
+      <w:r>
+        <w:t xml:space="preserve"> </w:t>
+      </w:r>
+      <w:r>
+        <w:t xml:space="preserve">(× 0.0001 where unit</w:t>
+      </w:r>
+      <w:r>
+        <w:t xml:space="preserve"> </w:t>
+      </w:r>
+      <w:r>
+        <w:rPr>
+          <w:rStyle w:val="VerbatimChar"/>
+        </w:rPr>
+        <w:t xml:space="preserve">s11bq11b==2</w:t>
+      </w:r>
+      <w:r>
+        <w:t xml:space="preserve">).</w:t>
+      </w:r>
+      <w:r>
+        <w:t xml:space="preserve"> </w:t>
+      </w:r>
+      <w:r>
+        <w:rPr>
+          <w:rStyle w:val="VerbatimChar"/>
+        </w:rPr>
+        <w:t xml:space="preserve">n_fields</w:t>
+      </w:r>
+      <w:r>
+        <w:t xml:space="preserve"> </w:t>
+      </w:r>
+      <w:r>
+        <w:t xml:space="preserve">= parcel records aggregated to the parcel id (typically 1).</w:t>
+      </w:r>
+    </w:p>
+    <w:p>
+      <w:pPr>
+        <w:pStyle w:val="Heading3"/>
+      </w:pPr>
+      <w:bookmarkStart w:id="41" w:name="design-variables-identifiers-2"/>
+      <w:r>
+        <w:t xml:space="preserve">4. Design variables &amp; identifiers</w:t>
+      </w:r>
+      <w:bookmarkEnd w:id="41"/>
+    </w:p>
+    <w:tbl>
+      <w:tblPr>
+        <w:tblStyle w:val="Table"/>
+        <w:tblW w:type="pct" w:w="0.0"/>
+        <w:tblLook w:firstRow="1"/>
+      </w:tblPr>
+      <w:tblGrid/>
+      <w:tr>
+        <w:trPr>
+          <w:cnfStyle w:firstRow="1"/>
+        </w:trPr>
+        <w:tc>
+          <w:tcPr>
+            <w:tcBorders>
+              <w:bottom w:val="single"/>
+            </w:tcBorders>
+            <w:vAlign w:val="bottom"/>
+          </w:tcPr>
+          <w:p>
+            <w:pPr>
+              <w:pStyle w:val="Compact"/>
+              <w:jc w:val="left"/>
+            </w:pPr>
+            <w:r>
+              <w:t xml:space="preserve">Variable</w:t>
+            </w:r>
+          </w:p>
+        </w:tc>
+        <w:tc>
+          <w:tcPr>
+            <w:tcBorders>
+              <w:bottom w:val="single"/>
+            </w:tcBorders>
+            <w:vAlign w:val="bottom"/>
+          </w:tcPr>
+          <w:p>
+            <w:pPr>
+              <w:pStyle w:val="Compact"/>
+              <w:jc w:val="left"/>
+            </w:pPr>
+            <w:r>
+              <w:t xml:space="preserve">Wave</w:t>
+            </w:r>
+          </w:p>
+        </w:tc>
+        <w:tc>
+          <w:tcPr>
+            <w:tcBorders>
+              <w:bottom w:val="single"/>
+            </w:tcBorders>
+            <w:vAlign w:val="bottom"/>
+          </w:tcPr>
+          <w:p>
+            <w:pPr>
+              <w:pStyle w:val="Compact"/>
+              <w:jc w:val="left"/>
+            </w:pPr>
+            <w:r>
+              <w:t xml:space="preserve">Source</w:t>
+            </w:r>
+          </w:p>
+        </w:tc>
+        <w:tc>
+          <w:tcPr>
+            <w:tcBorders>
+              <w:bottom w:val="single"/>
+            </w:tcBorders>
+            <w:vAlign w:val="bottom"/>
+          </w:tcPr>
+          <w:p>
+            <w:pPr>
+              <w:pStyle w:val="Compact"/>
+              <w:jc w:val="left"/>
+            </w:pPr>
+            <w:r>
+              <w:t xml:space="preserve">Construction</w:t>
+            </w:r>
+          </w:p>
+        </w:tc>
+      </w:tr>
+      <w:tr>
+        <w:tc>
+          <w:p>
+            <w:pPr>
+              <w:pStyle w:val="Compact"/>
+              <w:jc w:val="left"/>
+            </w:pPr>
+            <w:r>
+              <w:rPr>
+                <w:rStyle w:val="VerbatimChar"/>
+              </w:rPr>
+              <w:t xml:space="preserve">weight</w:t>
+            </w:r>
+          </w:p>
+        </w:tc>
+        <w:tc>
+          <w:p>
+            <w:pPr>
+              <w:pStyle w:val="Compact"/>
+              <w:jc w:val="left"/>
+            </w:pPr>
+            <w:r>
+              <w:t xml:space="preserve">1</w:t>
+            </w:r>
+          </w:p>
+        </w:tc>
+        <w:tc>
+          <w:p>
+            <w:pPr>
+              <w:pStyle w:val="Compact"/>
+              <w:jc w:val="left"/>
+            </w:pPr>
+            <w:r>
+              <w:rPr>
+                <w:rStyle w:val="VerbatimChar"/>
+              </w:rPr>
+              <w:t xml:space="preserve">EACIPOIDS.dta</w:t>
+            </w:r>
+          </w:p>
+        </w:tc>
+        <w:tc>
+          <w:p>
+            <w:pPr>
+              <w:pStyle w:val="Compact"/>
+              <w:jc w:val="left"/>
+            </w:pPr>
+            <w:r>
+              <w:rPr>
+                <w:rStyle w:val="VerbatimChar"/>
+              </w:rPr>
+              <w:t xml:space="preserve">poids_menage</w:t>
+            </w:r>
+          </w:p>
+        </w:tc>
+      </w:tr>
+      <w:tr>
+        <w:tc>
+          <w:p>
+            <w:pPr>
+              <w:pStyle w:val="Compact"/>
+              <w:jc w:val="left"/>
+            </w:pPr>
+            <w:r>
+              <w:rPr>
+                <w:rStyle w:val="VerbatimChar"/>
+              </w:rPr>
+              <w:t xml:space="preserve">weight</w:t>
+            </w:r>
+          </w:p>
+        </w:tc>
+        <w:tc>
+          <w:p>
+            <w:pPr>
+              <w:pStyle w:val="Compact"/>
+              <w:jc w:val="left"/>
+            </w:pPr>
+            <w:r>
+              <w:t xml:space="preserve">2</w:t>
+            </w:r>
+          </w:p>
+        </w:tc>
+        <w:tc>
+          <w:p>
+            <w:pPr>
+              <w:pStyle w:val="Compact"/>
+              <w:jc w:val="left"/>
+            </w:pPr>
+            <w:r>
+              <w:rPr>
+                <w:rStyle w:val="VerbatimChar"/>
+              </w:rPr>
+              <w:t xml:space="preserve">EACI17_ECHANTILLON.dta</w:t>
+            </w:r>
+          </w:p>
+        </w:tc>
+        <w:tc>
+          <w:p>
+            <w:pPr>
+              <w:pStyle w:val="Compact"/>
+              <w:jc w:val="left"/>
+            </w:pPr>
+            <w:r>
+              <w:rPr>
+                <w:rStyle w:val="VerbatimChar"/>
+              </w:rPr>
+              <w:t xml:space="preserve">poids_leger</w:t>
+            </w:r>
+          </w:p>
+        </w:tc>
+      </w:tr>
+      <w:tr>
+        <w:tc>
+          <w:p>
+            <w:pPr>
+              <w:pStyle w:val="Compact"/>
+              <w:jc w:val="left"/>
+            </w:pPr>
+            <w:r>
+              <w:rPr>
+                <w:rStyle w:val="VerbatimChar"/>
+              </w:rPr>
+              <w:t xml:space="preserve">ea_id</w:t>
+            </w:r>
+          </w:p>
+        </w:tc>
+        <w:tc>
+          <w:p>
+            <w:pPr>
+              <w:pStyle w:val="Compact"/>
+              <w:jc w:val="left"/>
+            </w:pPr>
+            <w:r>
+              <w:t xml:space="preserve">1-2</w:t>
+            </w:r>
+          </w:p>
+        </w:tc>
+        <w:tc>
+          <w:p>
+            <w:pPr>
+              <w:pStyle w:val="Compact"/>
+              <w:jc w:val="left"/>
+            </w:pPr>
+            <w:r>
+              <w:t xml:space="preserve">parcel roster</w:t>
+            </w:r>
+          </w:p>
+        </w:tc>
+        <w:tc>
+          <w:p>
+            <w:pPr>
+              <w:pStyle w:val="Compact"/>
+              <w:jc w:val="left"/>
+            </w:pPr>
+            <w:r>
+              <w:rPr>
+                <w:rStyle w:val="VerbatimChar"/>
+              </w:rPr>
+              <w:t xml:space="preserve">grappe</w:t>
+            </w:r>
+            <w:r>
+              <w:t xml:space="preserve"> </w:t>
+            </w:r>
+            <w:r>
+              <w:t xml:space="preserve">(cluster / PSU)</w:t>
+            </w:r>
+          </w:p>
+        </w:tc>
+      </w:tr>
+      <w:tr>
+        <w:tc>
+          <w:p>
+            <w:pPr>
+              <w:pStyle w:val="Compact"/>
+              <w:jc w:val="left"/>
+            </w:pPr>
+            <w:r>
+              <w:rPr>
+                <w:rStyle w:val="VerbatimChar"/>
+              </w:rPr>
+              <w:t xml:space="preserve">strataid</w:t>
+            </w:r>
+          </w:p>
+        </w:tc>
+        <w:tc>
+          <w:p>
+            <w:pPr>
+              <w:pStyle w:val="Compact"/>
+              <w:jc w:val="left"/>
+            </w:pPr>
+            <w:r>
+              <w:t xml:space="preserve">1</w:t>
+            </w:r>
+          </w:p>
+        </w:tc>
+        <w:tc>
+          <w:p>
+            <w:pPr>
+              <w:pStyle w:val="Compact"/>
+              <w:jc w:val="left"/>
+            </w:pPr>
+            <w:r>
+              <w:rPr>
+                <w:rStyle w:val="VerbatimChar"/>
+              </w:rPr>
+              <w:t xml:space="preserve">EACICONTROLE_p1.dta</w:t>
+            </w:r>
+          </w:p>
+        </w:tc>
+        <w:tc>
+          <w:p>
+            <w:pPr>
+              <w:pStyle w:val="Compact"/>
+              <w:jc w:val="left"/>
+            </w:pPr>
+            <w:r>
+              <w:rPr>
+                <w:rStyle w:val="VerbatimChar"/>
+              </w:rPr>
+              <w:t xml:space="preserve">group(s00q01 s00q04)</w:t>
+            </w:r>
+            <w:r>
+              <w:t xml:space="preserve"> </w:t>
+            </w:r>
+            <w:r>
+              <w:t xml:space="preserve">(region × milieu)</w:t>
+            </w:r>
+          </w:p>
+        </w:tc>
+      </w:tr>
+      <w:tr>
+        <w:tc>
+          <w:p>
+            <w:pPr>
+              <w:pStyle w:val="Compact"/>
+              <w:jc w:val="left"/>
+            </w:pPr>
+            <w:r>
+              <w:rPr>
+                <w:rStyle w:val="VerbatimChar"/>
+              </w:rPr>
+              <w:t xml:space="preserve">strataid</w:t>
+            </w:r>
+          </w:p>
+        </w:tc>
+        <w:tc>
+          <w:p>
+            <w:pPr>
+              <w:pStyle w:val="Compact"/>
+              <w:jc w:val="left"/>
+            </w:pPr>
+            <w:r>
+              <w:t xml:space="preserve">2</w:t>
+            </w:r>
+          </w:p>
+        </w:tc>
+        <w:tc>
+          <w:p>
+            <w:pPr>
+              <w:pStyle w:val="Compact"/>
+              <w:jc w:val="left"/>
+            </w:pPr>
+            <w:r>
+              <w:rPr>
+                <w:rStyle w:val="VerbatimChar"/>
+              </w:rPr>
+              <w:t xml:space="preserve">EACI17_ECHANTILLON.dta</w:t>
+            </w:r>
+          </w:p>
+        </w:tc>
+        <w:tc>
+          <w:p>
+            <w:pPr>
+              <w:pStyle w:val="Compact"/>
+              <w:jc w:val="left"/>
+            </w:pPr>
+            <w:r>
+              <w:t xml:space="preserve">official</w:t>
+            </w:r>
+            <w:r>
+              <w:t xml:space="preserve"> </w:t>
+            </w:r>
+            <w:r>
+              <w:rPr>
+                <w:rStyle w:val="VerbatimChar"/>
+              </w:rPr>
+              <w:t xml:space="preserve">strate</w:t>
+            </w:r>
+          </w:p>
+        </w:tc>
+      </w:tr>
+      <w:tr>
+        <w:tc>
+          <w:p>
+            <w:pPr>
+              <w:pStyle w:val="Compact"/>
+              <w:jc w:val="left"/>
+            </w:pPr>
+            <w:r>
+              <w:rPr>
+                <w:rStyle w:val="VerbatimChar"/>
+              </w:rPr>
+              <w:t xml:space="preserve">parcel_id</w:t>
+            </w:r>
+          </w:p>
+        </w:tc>
+        <w:tc>
+          <w:p>
+            <w:pPr>
+              <w:pStyle w:val="Compact"/>
+              <w:jc w:val="left"/>
+            </w:pPr>
+            <w:r>
+              <w:t xml:space="preserve">1</w:t>
+            </w:r>
+          </w:p>
+        </w:tc>
+        <w:tc>
+          <w:p>
+            <w:pPr>
+              <w:pStyle w:val="Compact"/>
+              <w:jc w:val="left"/>
+            </w:pPr>
+            <w:r>
+              <w:t xml:space="preserve">parcel roster</w:t>
+            </w:r>
+          </w:p>
+        </w:tc>
+        <w:tc>
+          <w:p>
+            <w:pPr>
+              <w:pStyle w:val="Compact"/>
+              <w:jc w:val="left"/>
+            </w:pPr>
+            <w:r>
+              <w:rPr>
+                <w:rStyle w:val="VerbatimChar"/>
+              </w:rPr>
+              <w:t xml:space="preserve">grappe-menage-s1bq01-s1bq02</w:t>
+            </w:r>
+          </w:p>
+        </w:tc>
+      </w:tr>
+      <w:tr>
+        <w:tc>
+          <w:p>
+            <w:pPr>
+              <w:pStyle w:val="Compact"/>
+              <w:jc w:val="left"/>
+            </w:pPr>
+            <w:r>
+              <w:rPr>
+                <w:rStyle w:val="VerbatimChar"/>
+              </w:rPr>
+              <w:t xml:space="preserve">parcel_id</w:t>
+            </w:r>
+          </w:p>
+        </w:tc>
+        <w:tc>
+          <w:p>
+            <w:pPr>
+              <w:pStyle w:val="Compact"/>
+              <w:jc w:val="left"/>
+            </w:pPr>
+            <w:r>
+              <w:t xml:space="preserve">2</w:t>
+            </w:r>
+          </w:p>
+        </w:tc>
+        <w:tc>
+          <w:p>
+            <w:pPr>
+              <w:pStyle w:val="Compact"/>
+              <w:jc w:val="left"/>
+            </w:pPr>
+            <w:r>
+              <w:t xml:space="preserve">parcel roster</w:t>
+            </w:r>
+          </w:p>
+        </w:tc>
+        <w:tc>
+          <w:p>
+            <w:pPr>
+              <w:pStyle w:val="Compact"/>
+              <w:jc w:val="left"/>
+            </w:pPr>
+            <w:r>
+              <w:rPr>
+                <w:rStyle w:val="VerbatimChar"/>
+              </w:rPr>
+              <w:t xml:space="preserve">grappe-exploitation-s11bq01-s11bq02</w:t>
+            </w:r>
+          </w:p>
+        </w:tc>
+      </w:tr>
+      <w:tr>
+        <w:tc>
+          <w:p>
+            <w:pPr>
+              <w:pStyle w:val="Compact"/>
+              <w:jc w:val="left"/>
+            </w:pPr>
+            <w:r>
+              <w:rPr>
+                <w:rStyle w:val="VerbatimChar"/>
+              </w:rPr>
+              <w:t xml:space="preserve">year</w:t>
+            </w:r>
+          </w:p>
+        </w:tc>
+        <w:tc>
+          <w:p>
+            <w:pPr>
+              <w:pStyle w:val="Compact"/>
+              <w:jc w:val="left"/>
+            </w:pPr>
+            <w:r>
+              <w:t xml:space="preserve">1-2</w:t>
+            </w:r>
+          </w:p>
+        </w:tc>
+        <w:tc>
+          <w:p>
+            <w:pPr>
+              <w:pStyle w:val="Compact"/>
+              <w:jc w:val="left"/>
+            </w:pPr>
+            <w:r>
+              <w:t xml:space="preserve">—</w:t>
+            </w:r>
+          </w:p>
+        </w:tc>
+        <w:tc>
+          <w:p>
+            <w:pPr>
+              <w:pStyle w:val="Compact"/>
+              <w:jc w:val="left"/>
+            </w:pPr>
+            <w:r>
+              <w:t xml:space="preserve">2014 / 2017</w:t>
+            </w:r>
+          </w:p>
+        </w:tc>
+      </w:tr>
+    </w:tbl>
+    <w:p>
+      <w:pPr>
+        <w:pStyle w:val="Heading3"/>
+      </w:pPr>
+      <w:bookmarkStart w:id="42" w:name="Xd7b0f06d6741a457572b51c32edd9b036aaa263"/>
+      <w:r>
+        <w:t xml:space="preserve">5. Value labels of key source variables (verified)</w:t>
+      </w:r>
+      <w:bookmarkEnd w:id="42"/>
+    </w:p>
+    <w:p>
+      <w:pPr>
+        <w:pStyle w:val="FirstParagraph"/>
+      </w:pPr>
+      <w:r>
+        <w:rPr>
+          <w:b/>
+        </w:rPr>
+        <w:t xml:space="preserve">Occupation mode</w:t>
+      </w:r>
+      <w:r>
+        <w:t xml:space="preserve"> </w:t>
+      </w:r>
+      <w:r>
+        <w:t xml:space="preserve">-</w:t>
+      </w:r>
+      <w:r>
+        <w:t xml:space="preserve"> </w:t>
+      </w:r>
+      <w:r>
+        <w:rPr>
+          <w:rStyle w:val="VerbatimChar"/>
+        </w:rPr>
+        <w:t xml:space="preserve">s1bq17</w:t>
+      </w:r>
+      <w:r>
+        <w:t xml:space="preserve"> </w:t>
+      </w:r>
+      <w:r>
+        <w:t xml:space="preserve">(2014) /</w:t>
+      </w:r>
+      <w:r>
+        <w:t xml:space="preserve"> </w:t>
+      </w:r>
+      <w:r>
+        <w:rPr>
+          <w:rStyle w:val="VerbatimChar"/>
+        </w:rPr>
+        <w:t xml:space="preserve">s11bq17</w:t>
+      </w:r>
+      <w:r>
+        <w:t xml:space="preserve"> </w:t>
+      </w:r>
+      <w:r>
+        <w:t xml:space="preserve">(2017),</w:t>
+      </w:r>
+      <w:r>
+        <w:t xml:space="preserve"> </w:t>
+      </w:r>
+      <w:r>
+        <w:rPr>
+          <w:i/>
+        </w:rPr>
+        <w:t xml:space="preserve">“</w:t>
+      </w:r>
+      <w:r>
+        <w:rPr>
+          <w:i/>
+        </w:rPr>
+        <w:t xml:space="preserve">Mode d’occupation / propriete de la parcelle</w:t>
+      </w:r>
+      <w:r>
+        <w:rPr>
+          <w:i/>
+        </w:rPr>
+        <w:t xml:space="preserve">”</w:t>
+      </w:r>
+      <w:r>
+        <w:t xml:space="preserve">:</w:t>
+      </w:r>
+      <w:r>
+        <w:t xml:space="preserve"> </w:t>
+      </w:r>
+      <w:r>
+        <w:t xml:space="preserve">1 Propriete avec titre · 2 Propriete sans titre · 3 Pret gratuit ·</w:t>
+      </w:r>
+      <w:r>
+        <w:t xml:space="preserve"> </w:t>
+      </w:r>
+      <w:r>
+        <w:rPr>
+          <w:b/>
+        </w:rPr>
+        <w:t xml:space="preserve">4 Location</w:t>
+      </w:r>
+      <w:r>
+        <w:t xml:space="preserve"> </w:t>
+      </w:r>
+      <w:r>
+        <w:t xml:space="preserve">·</w:t>
+      </w:r>
+      <w:r>
+        <w:t xml:space="preserve"> </w:t>
+      </w:r>
+      <w:r>
+        <w:rPr>
+          <w:b/>
+        </w:rPr>
+        <w:t xml:space="preserve">5 Metayage</w:t>
+      </w:r>
+      <w:r>
+        <w:t xml:space="preserve"> </w:t>
+      </w:r>
+      <w:r>
+        <w:t xml:space="preserve">· 6 Gage · 7 Autre · (9 / 99 = missing).</w:t>
+      </w:r>
+    </w:p>
+    <w:p>
+      <w:pPr>
+        <w:pStyle w:val="BodyText"/>
+      </w:pPr>
+      <w:r>
+        <w:rPr>
+          <w:b/>
+        </w:rPr>
+        <w:t xml:space="preserve">Acquisition mode</w:t>
+      </w:r>
+      <w:r>
+        <w:t xml:space="preserve"> </w:t>
+      </w:r>
+      <w:r>
+        <w:t xml:space="preserve">-</w:t>
+      </w:r>
+      <w:r>
+        <w:t xml:space="preserve"> </w:t>
+      </w:r>
+      <w:r>
+        <w:rPr>
+          <w:rStyle w:val="VerbatimChar"/>
+        </w:rPr>
+        <w:t xml:space="preserve">s1bq22</w:t>
+      </w:r>
+      <w:r>
+        <w:t xml:space="preserve"> </w:t>
+      </w:r>
+      <w:r>
+        <w:t xml:space="preserve">(2014) /</w:t>
+      </w:r>
+      <w:r>
+        <w:t xml:space="preserve"> </w:t>
+      </w:r>
+      <w:r>
+        <w:rPr>
+          <w:rStyle w:val="VerbatimChar"/>
+        </w:rPr>
+        <w:t xml:space="preserve">s11bq22</w:t>
+      </w:r>
+      <w:r>
+        <w:t xml:space="preserve"> </w:t>
+      </w:r>
+      <w:r>
+        <w:t xml:space="preserve">(2017),</w:t>
+      </w:r>
+      <w:r>
+        <w:t xml:space="preserve"> </w:t>
+      </w:r>
+      <w:r>
+        <w:rPr>
+          <w:i/>
+        </w:rPr>
+        <w:t xml:space="preserve">“</w:t>
+      </w:r>
+      <w:r>
+        <w:rPr>
+          <w:i/>
+        </w:rPr>
+        <w:t xml:space="preserve">Mode d’acquisition de la parcelle</w:t>
+      </w:r>
+      <w:r>
+        <w:rPr>
+          <w:i/>
+        </w:rPr>
+        <w:t xml:space="preserve">”</w:t>
+      </w:r>
+      <w:r>
+        <w:t xml:space="preserve">:</w:t>
+      </w:r>
+      <w:r>
+        <w:t xml:space="preserve"> </w:t>
+      </w:r>
+      <w:r>
+        <w:t xml:space="preserve">1 Heritage · 2 Par mariage · 3 Attribution coutumiere · 4 Don · 5 Attribution ODR ·</w:t>
+      </w:r>
+      <w:r>
+        <w:t xml:space="preserve"> </w:t>
+      </w:r>
+      <w:r>
+        <w:t xml:space="preserve">6 Appropriation ·</w:t>
+      </w:r>
+      <w:r>
+        <w:t xml:space="preserve"> </w:t>
+      </w:r>
+      <w:r>
+        <w:rPr>
+          <w:b/>
+        </w:rPr>
+        <w:t xml:space="preserve">7 Achat</w:t>
+      </w:r>
+      <w:r>
+        <w:t xml:space="preserve"> </w:t>
+      </w:r>
+      <w:r>
+        <w:t xml:space="preserve">· 8 Autre.</w:t>
+      </w:r>
+    </w:p>
+    <w:p>
+      <w:pPr>
+        <w:pStyle w:val="BodyText"/>
+      </w:pPr>
+      <w:r>
+        <w:rPr>
+          <w:b/>
+        </w:rPr>
+        <w:t xml:space="preserve">Disposition</w:t>
+      </w:r>
+      <w:r>
+        <w:t xml:space="preserve"> </w:t>
+      </w:r>
+      <w:r>
+        <w:t xml:space="preserve">-</w:t>
+      </w:r>
+      <w:r>
+        <w:t xml:space="preserve"> </w:t>
+      </w:r>
+      <w:r>
+        <w:rPr>
+          <w:rStyle w:val="VerbatimChar"/>
+        </w:rPr>
+        <w:t xml:space="preserve">s1bq32</w:t>
+      </w:r>
+      <w:r>
+        <w:t xml:space="preserve"> </w:t>
+      </w:r>
+      <w:r>
+        <w:t xml:space="preserve">(2014): 1 En jachere, 2 Exploitee, 9 missing (no rented-out code).</w:t>
+      </w:r>
+      <w:r>
+        <w:t xml:space="preserve"> </w:t>
+      </w:r>
+      <w:r>
+        <w:rPr>
+          <w:rStyle w:val="VerbatimChar"/>
+        </w:rPr>
+        <w:t xml:space="preserve">s11bq32</w:t>
+      </w:r>
+      <w:r>
+        <w:t xml:space="preserve"> </w:t>
+      </w:r>
+      <w:r>
+        <w:t xml:space="preserve">(2017): 1 Jachere, 2 Louee/Pretee, 3 Exploitee.</w:t>
+      </w:r>
+    </w:p>
+    <w:p>
+      <w:pPr>
+        <w:pStyle w:val="Heading3"/>
+      </w:pPr>
+      <w:bookmarkStart w:id="43" w:name="harmonization-decisions-caveats-mali"/>
+      <w:r>
+        <w:t xml:space="preserve">6. Harmonization decisions &amp; caveats (Mali)</w:t>
+      </w:r>
+      <w:bookmarkEnd w:id="43"/>
+    </w:p>
+    <w:p>
+      <w:pPr>
+        <w:numPr>
+          <w:ilvl w:val="0"/>
+          <w:numId w:val="1003"/>
+        </w:numPr>
+        <w:pStyle w:val="Compact"/>
+      </w:pPr>
+      <w:r>
+        <w:rPr>
+          <w:b/>
+        </w:rPr>
+        <w:t xml:space="preserve">Rental variables derived here, not inherited</w:t>
+      </w:r>
+      <w:r>
+        <w:t xml:space="preserve"> </w:t>
+      </w:r>
+      <w:r>
+        <w:t xml:space="preserve">- the upstream pipeline built only</w:t>
+      </w:r>
+      <w:r>
+        <w:t xml:space="preserve"> </w:t>
+      </w:r>
+      <w:r>
+        <w:rPr>
+          <w:rStyle w:val="VerbatimChar"/>
+        </w:rPr>
+        <w:t xml:space="preserve">plot_owned</w:t>
+      </w:r>
+      <w:r>
+        <w:t xml:space="preserve">/</w:t>
+      </w:r>
+      <w:r>
+        <w:rPr>
+          <w:rStyle w:val="VerbatimChar"/>
+        </w:rPr>
+        <w:t xml:space="preserve">plot_certificate</w:t>
+      </w:r>
+      <w:r>
+        <w:t xml:space="preserve"> </w:t>
+      </w:r>
+      <w:r>
+        <w:t xml:space="preserve">for Mali. Rented-in and purchased are constructed</w:t>
+      </w:r>
+      <w:r>
+        <w:t xml:space="preserve"> </w:t>
+      </w:r>
+      <w:r>
+        <w:t xml:space="preserve">from the occupation (</w:t>
+      </w:r>
+      <w:r>
+        <w:rPr>
+          <w:rStyle w:val="VerbatimChar"/>
+        </w:rPr>
+        <w:t xml:space="preserve">*q17</w:t>
+      </w:r>
+      <w:r>
+        <w:t xml:space="preserve">) and acquisition (</w:t>
+      </w:r>
+      <w:r>
+        <w:rPr>
+          <w:rStyle w:val="VerbatimChar"/>
+        </w:rPr>
+        <w:t xml:space="preserve">*q22</w:t>
+      </w:r>
+      <w:r>
+        <w:t xml:space="preserve">) questions.</w:t>
+      </w:r>
+    </w:p>
+    <w:p>
+      <w:pPr>
+        <w:numPr>
+          <w:ilvl w:val="0"/>
+          <w:numId w:val="1003"/>
+        </w:numPr>
+        <w:pStyle w:val="Compact"/>
+      </w:pPr>
+      <w:r>
+        <w:rPr>
+          <w:b/>
+        </w:rPr>
+        <w:t xml:space="preserve">Rented-out is NOT measurable in EACI (missing both waves).</w:t>
+      </w:r>
+      <w:r>
+        <w:t xml:space="preserve"> </w:t>
+      </w:r>
+      <w:r>
+        <w:t xml:space="preserve">The roster covers the</w:t>
+      </w:r>
+      <w:r>
+        <w:t xml:space="preserve"> </w:t>
+      </w:r>
+      <w:r>
+        <w:t xml:space="preserve">parcels a household</w:t>
+      </w:r>
+      <w:r>
+        <w:t xml:space="preserve"> </w:t>
+      </w:r>
+      <w:r>
+        <w:rPr>
+          <w:i/>
+        </w:rPr>
+        <w:t xml:space="preserve">operates</w:t>
+      </w:r>
+      <w:r>
+        <w:t xml:space="preserve"> </w:t>
+      </w:r>
+      <w:r>
+        <w:t xml:space="preserve">(its exploitation), so land rented/lent OUT is out of</w:t>
+      </w:r>
+      <w:r>
+        <w:t xml:space="preserve"> </w:t>
+      </w:r>
+      <w:r>
+        <w:t xml:space="preserve">frame. 2014 has no rented-out code in the disposition item; 2017’s</w:t>
+      </w:r>
+      <w:r>
+        <w:t xml:space="preserve"> </w:t>
+      </w:r>
+      <w:r>
+        <w:t xml:space="preserve">“</w:t>
+      </w:r>
+      <w:r>
+        <w:t xml:space="preserve">Louee/Pretee</w:t>
+      </w:r>
+      <w:r>
+        <w:t xml:space="preserve">”</w:t>
+      </w:r>
+      <w:r>
+        <w:t xml:space="preserve"> </w:t>
+      </w:r>
+      <w:r>
+        <w:t xml:space="preserve">code flags only 5 of ~24,250 parcels - a structural undercount, not a real ~0% rate.</w:t>
+      </w:r>
+    </w:p>
+    <w:p>
+      <w:pPr>
+        <w:numPr>
+          <w:ilvl w:val="0"/>
+          <w:numId w:val="1003"/>
+        </w:numPr>
+        <w:pStyle w:val="Compact"/>
+      </w:pPr>
+      <w:r>
+        <w:rPr>
+          <w:b/>
+        </w:rPr>
+        <w:t xml:space="preserve">Rented-in</w:t>
+      </w:r>
+      <w:r>
+        <w:t xml:space="preserve"> </w:t>
+      </w:r>
+      <w:r>
+        <w:t xml:space="preserve">= Location (4) + Metayage (5);</w:t>
+      </w:r>
+      <w:r>
+        <w:t xml:space="preserve"> </w:t>
+      </w:r>
+      <w:r>
+        <w:t xml:space="preserve">“</w:t>
+      </w:r>
+      <w:r>
+        <w:t xml:space="preserve">Pret gratuit</w:t>
+      </w:r>
+      <w:r>
+        <w:t xml:space="preserve">”</w:t>
+      </w:r>
+      <w:r>
+        <w:t xml:space="preserve"> </w:t>
+      </w:r>
+      <w:r>
+        <w:t xml:space="preserve">(3, borrowed free) and</w:t>
+      </w:r>
+      <w:r>
+        <w:t xml:space="preserve"> </w:t>
+      </w:r>
+      <w:r>
+        <w:t xml:space="preserve">“</w:t>
+      </w:r>
+      <w:r>
+        <w:t xml:space="preserve">Gage</w:t>
+      </w:r>
+      <w:r>
+        <w:t xml:space="preserve">”</w:t>
+      </w:r>
+      <w:r>
+        <w:t xml:space="preserve"> </w:t>
+      </w:r>
+      <w:r>
+        <w:t xml:space="preserve">(6, pledge/collateral) are excluded as non-market arrangements.</w:t>
+      </w:r>
+    </w:p>
+    <w:p>
+      <w:pPr>
+        <w:numPr>
+          <w:ilvl w:val="0"/>
+          <w:numId w:val="1003"/>
+        </w:numPr>
+        <w:pStyle w:val="Compact"/>
+      </w:pPr>
+      <w:r>
+        <w:rPr>
+          <w:b/>
+        </w:rPr>
+        <w:t xml:space="preserve">Certificate</w:t>
+      </w:r>
+      <w:r>
+        <w:t xml:space="preserve"> </w:t>
+      </w:r>
+      <w:r>
+        <w:t xml:space="preserve">here means</w:t>
+      </w:r>
+      <w:r>
+        <w:t xml:space="preserve"> </w:t>
+      </w:r>
+      <w:r>
+        <w:rPr>
+          <w:i/>
+        </w:rPr>
+        <w:t xml:space="preserve">owned with a formal title</w:t>
+      </w:r>
+      <w:r>
+        <w:t xml:space="preserve"> </w:t>
+      </w:r>
+      <w:r>
+        <w:t xml:space="preserve">(</w:t>
+      </w:r>
+      <w:r>
+        <w:rPr>
+          <w:rStyle w:val="VerbatimChar"/>
+        </w:rPr>
+        <w:t xml:space="preserve">*q17==1</w:t>
+      </w:r>
+      <w:r>
+        <w:t xml:space="preserve">), the closest EACI</w:t>
+      </w:r>
+      <w:r>
+        <w:t xml:space="preserve"> </w:t>
+      </w:r>
+      <w:r>
+        <w:t xml:space="preserve">analog; a non-owned parcel cannot carry a household title.</w:t>
+      </w:r>
+    </w:p>
+    <w:p>
+      <w:pPr>
+        <w:numPr>
+          <w:ilvl w:val="0"/>
+          <w:numId w:val="1003"/>
+        </w:numPr>
+        <w:pStyle w:val="Compact"/>
+      </w:pPr>
+      <w:r>
+        <w:rPr>
+          <w:b/>
+        </w:rPr>
+        <w:t xml:space="preserve">Purchase is measurable in both waves</w:t>
+      </w:r>
+      <w:r>
+        <w:t xml:space="preserve"> </w:t>
+      </w:r>
+      <w:r>
+        <w:t xml:space="preserve">(acquisition code 7 = Achat) - unlike Ethiopia</w:t>
+      </w:r>
+      <w:r>
+        <w:t xml:space="preserve"> </w:t>
+      </w:r>
+      <w:r>
+        <w:t xml:space="preserve">(w1-2) and Malawi (2019).</w:t>
+      </w:r>
+    </w:p>
+    <w:p>
+      <w:pPr>
+        <w:numPr>
+          <w:ilvl w:val="0"/>
+          <w:numId w:val="1003"/>
+        </w:numPr>
+        <w:pStyle w:val="Compact"/>
+      </w:pPr>
+      <w:r>
+        <w:rPr>
+          <w:b/>
+        </w:rPr>
+        <w:t xml:space="preserve">Strata</w:t>
+      </w:r>
+      <w:r>
+        <w:t xml:space="preserve">: 2017 uses the official</w:t>
+      </w:r>
+      <w:r>
+        <w:t xml:space="preserve"> </w:t>
+      </w:r>
+      <w:r>
+        <w:rPr>
+          <w:rStyle w:val="VerbatimChar"/>
+        </w:rPr>
+        <w:t xml:space="preserve">strate</w:t>
+      </w:r>
+      <w:r>
+        <w:t xml:space="preserve">; 2014 has none in its own files, so we</w:t>
+      </w:r>
+      <w:r>
+        <w:t xml:space="preserve"> </w:t>
+      </w:r>
+      <w:r>
+        <w:t xml:space="preserve">build</w:t>
+      </w:r>
+      <w:r>
+        <w:t xml:space="preserve"> </w:t>
+      </w:r>
+      <w:r>
+        <w:rPr>
+          <w:rStyle w:val="VerbatimChar"/>
+        </w:rPr>
+        <w:t xml:space="preserve">group(region milieu)</w:t>
+      </w:r>
+      <w:r>
+        <w:t xml:space="preserve"> </w:t>
+      </w:r>
+      <w:r>
+        <w:t xml:space="preserve">=</w:t>
+      </w:r>
+      <w:r>
+        <w:t xml:space="preserve"> </w:t>
+      </w:r>
+      <w:r>
+        <w:rPr>
+          <w:rStyle w:val="VerbatimChar"/>
+        </w:rPr>
+        <w:t xml:space="preserve">group(s00q01 s00q04)</w:t>
+      </w:r>
+      <w:r>
+        <w:t xml:space="preserve"> </w:t>
+      </w:r>
+      <w:r>
+        <w:t xml:space="preserve">from the cover as a self-contained</w:t>
+      </w:r>
+      <w:r>
+        <w:t xml:space="preserve"> </w:t>
+      </w:r>
+      <w:r>
+        <w:t xml:space="preserve">design-stratum proxy.</w:t>
+      </w:r>
+    </w:p>
+    <w:p>
+      <w:pPr>
+        <w:numPr>
+          <w:ilvl w:val="0"/>
+          <w:numId w:val="1003"/>
+        </w:numPr>
+        <w:pStyle w:val="Compact"/>
+      </w:pPr>
+      <w:r>
+        <w:rPr>
+          <w:b/>
+        </w:rPr>
+        <w:t xml:space="preserve">Encoding</w:t>
+      </w:r>
+      <w:r>
+        <w:t xml:space="preserve">: the 2017 files are Latin-1 (French accents); numeric codes are</w:t>
+      </w:r>
+      <w:r>
+        <w:t xml:space="preserve"> </w:t>
+      </w:r>
+      <w:r>
+        <w:t xml:space="preserve">unaffected, but read with the right encoding outside Stata (e.g. </w:t>
+      </w:r>
+      <w:r>
+        <w:rPr>
+          <w:rStyle w:val="VerbatimChar"/>
+        </w:rPr>
+        <w:t xml:space="preserve">encoding="latin1"</w:t>
+      </w:r>
+      <w:r>
+        <w:t xml:space="preserve">).</w:t>
+      </w:r>
+    </w:p>
+    <w:p>
+      <w:r>
+        <w:pict>
+          <v:rect style="width:0;height:1.5pt" o:hralign="center" o:hrstd="t" o:hr="t"/>
+        </w:pict>
+      </w:r>
+    </w:p>
+    <w:p>
+      <w:pPr>
+        <w:pStyle w:val="FirstParagraph"/>
+      </w:pPr>
+      <w:r>
         <w:rPr>
           <w:i/>
         </w:rPr>
@@ -11806,7 +14198,7 @@
           <w:rStyle w:val="VerbatimChar"/>
           <w:i/>
         </w:rPr>
-        <w:t xml:space="preserve">Reproduction_v2/Code/Cleaning_code/ETH_ESS1–5.do</w:t>
+        <w:t xml:space="preserve">Reproduction_v2/Code/Cleaning_code/</w:t>
       </w:r>
       <w:r>
         <w:rPr>
@@ -11818,7 +14210,7 @@
         <w:rPr>
           <w:i/>
         </w:rPr>
-        <w:t xml:space="preserve">and the IHPS v06 raw</w:t>
+        <w:t xml:space="preserve">(ETH ESS1-5, MWI IHPS1-4, MLI EACI1-2)</w:t>
       </w:r>
       <w:r>
         <w:rPr>
@@ -11830,7 +14222,7 @@
         <w:rPr>
           <w:i/>
         </w:rPr>
-        <w:t xml:space="preserve">modules (Malawi), with all source variables, codes, and value labels verified against</w:t>
+        <w:t xml:space="preserve">and the raw survey modules, with all source variables, codes, and value labels verified</w:t>
       </w:r>
       <w:r>
         <w:rPr>
@@ -11842,7 +14234,7 @@
         <w:rPr>
           <w:i/>
         </w:rPr>
-        <w:t xml:space="preserve">the raw data. Extend with one new country section (1–6) per country as the workflow grows.</w:t>
+        <w:t xml:space="preserve">against the data. Extend with one new country section (1-6) per country as the workflow grows.</w:t>
       </w:r>
     </w:p>
     <w:sectPr/>
@@ -12088,6 +14480,9 @@
     <w:abstractNumId w:val="991"/>
   </w:num>
   <w:num w:numId="1002">
+    <w:abstractNumId w:val="991"/>
+  </w:num>
+  <w:num w:numId="1003">
     <w:abstractNumId w:val="991"/>
   </w:num>
 </w:numbering>

</xml_diff>

<commit_message>
Mali: add cross-wave comparability caveat (independent cross-sections, rare-event)
</commit_message>
<xml_diff>
--- a/Reference/variable_provenance.docx
+++ b/Reference/variable_provenance.docx
@@ -14135,6 +14135,126 @@
       </w:r>
       <w:r>
         <w:t xml:space="preserve">design-stratum proxy.</w:t>
+      </w:r>
+    </w:p>
+    <w:p>
+      <w:pPr>
+        <w:numPr>
+          <w:ilvl w:val="0"/>
+          <w:numId w:val="1003"/>
+        </w:numPr>
+        <w:pStyle w:val="Compact"/>
+      </w:pPr>
+      <w:r>
+        <w:rPr>
+          <w:b/>
+        </w:rPr>
+        <w:t xml:space="preserve">Cross-wave comparability - read levels, not the 2014-&gt;2017 change.</w:t>
+      </w:r>
+      <w:r>
+        <w:t xml:space="preserve"> </w:t>
+      </w:r>
+      <w:r>
+        <w:t xml:space="preserve">EACI 2014 and</w:t>
+      </w:r>
+      <w:r>
+        <w:t xml:space="preserve"> </w:t>
+      </w:r>
+      <w:r>
+        <w:t xml:space="preserve">2017 are</w:t>
+      </w:r>
+      <w:r>
+        <w:t xml:space="preserve"> </w:t>
+      </w:r>
+      <w:r>
+        <w:rPr>
+          <w:i/>
+        </w:rPr>
+        <w:t xml:space="preserve">independent cross-sections</w:t>
+      </w:r>
+      <w:r>
+        <w:t xml:space="preserve"> </w:t>
+      </w:r>
+      <w:r>
+        <w:t xml:space="preserve">(not a panel) with very different sample sizes</w:t>
+      </w:r>
+      <w:r>
+        <w:t xml:space="preserve"> </w:t>
+      </w:r>
+      <w:r>
+        <w:t xml:space="preserve">and frames: 2,299 households / 9,658 parcels in 2014 vs 6,293 / 24,250 in 2017, the</w:t>
+      </w:r>
+      <w:r>
+        <w:t xml:space="preserve"> </w:t>
+      </w:r>
+      <w:r>
+        <w:t xml:space="preserve">latter even more dominated by owner-cultivators (untitled ownership 87% -&gt; 93% of</w:t>
+      </w:r>
+      <w:r>
+        <w:t xml:space="preserve"> </w:t>
+      </w:r>
+      <w:r>
+        <w:t xml:space="preserve">parcels). The</w:t>
+      </w:r>
+      <w:r>
+        <w:t xml:space="preserve"> </w:t>
+      </w:r>
+      <w:r>
+        <w:rPr>
+          <w:i/>
+        </w:rPr>
+        <w:t xml:space="preserve">absolute</w:t>
+      </w:r>
+      <w:r>
+        <w:t xml:space="preserve"> </w:t>
+      </w:r>
+      <w:r>
+        <w:t xml:space="preserve">count of rented-in parcels is essentially unchanged</w:t>
+      </w:r>
+      <w:r>
+        <w:t xml:space="preserve"> </w:t>
+      </w:r>
+      <w:r>
+        <w:t xml:space="preserve">(116 -&gt; 106), so the fall in the rented-in</w:t>
+      </w:r>
+      <w:r>
+        <w:t xml:space="preserve"> </w:t>
+      </w:r>
+      <w:r>
+        <w:rPr>
+          <w:i/>
+        </w:rPr>
+        <w:t xml:space="preserve">rate</w:t>
+      </w:r>
+      <w:r>
+        <w:t xml:space="preserve"> </w:t>
+      </w:r>
+      <w:r>
+        <w:t xml:space="preserve">(1.3% -&gt; 0.4%) is mechanical dilution</w:t>
+      </w:r>
+      <w:r>
+        <w:t xml:space="preserve"> </w:t>
+      </w:r>
+      <w:r>
+        <w:t xml:space="preserve">by a larger, more owner-heavy denominator, not a behavioral decline. Rental is also a</w:t>
+      </w:r>
+      <w:r>
+        <w:t xml:space="preserve"> </w:t>
+      </w:r>
+      <w:r>
+        <w:t xml:space="preserve">rare event (~100 parcels/wave), so the estimates carry wide confidence intervals -</w:t>
+      </w:r>
+      <w:r>
+        <w:t xml:space="preserve"> </w:t>
+      </w:r>
+      <w:r>
+        <w:t xml:space="preserve">check CI overlap before interpreting any cross-wave difference. The robust takeaway is</w:t>
+      </w:r>
+      <w:r>
+        <w:t xml:space="preserve"> </w:t>
+      </w:r>
+      <w:r>
+        <w:t xml:space="preserve">that Mali’s land-rental market is thin (&lt;2% of parcels), consistent with customary tenure.</w:t>
       </w:r>
     </w:p>
     <w:p>

</xml_diff>

<commit_message>
Add Niger extractor (ECVMA 2011/2014, parcel-level) + provenance; enable in MASTER
</commit_message>
<xml_diff>
--- a/Reference/variable_provenance.docx
+++ b/Reference/variable_provenance.docx
@@ -14299,9 +14299,2460 @@
     </w:p>
     <w:p>
       <w:pPr>
+        <w:pStyle w:val="Heading2"/>
+      </w:pPr>
+      <w:bookmarkStart w:id="44" w:name="X14eb90961d7c4eda69428154c7d8401e18ed92a"/>
+      <w:r>
+        <w:t xml:space="preserve">NIGER — Enquete Nationale sur les Conditions de Vie (ECVMA)</w:t>
+      </w:r>
+      <w:bookmarkEnd w:id="44"/>
+    </w:p>
+    <w:p>
+      <w:pPr>
         <w:pStyle w:val="FirstParagraph"/>
       </w:pPr>
       <w:r>
+        <w:t xml:space="preserve">Two ECVMA rounds (2011, 2014). The 2014 round uses</w:t>
+      </w:r>
+      <w:r>
+        <w:t xml:space="preserve"> </w:t>
+      </w:r>
+      <w:r>
+        <w:rPr>
+          <w:b/>
+        </w:rPr>
+        <w:t xml:space="preserve">uppercase</w:t>
+      </w:r>
+      <w:r>
+        <w:t xml:space="preserve"> </w:t>
+      </w:r>
+      <w:r>
+        <w:t xml:space="preserve">variable names</w:t>
+      </w:r>
+      <w:r>
+        <w:t xml:space="preserve"> </w:t>
+      </w:r>
+      <w:r>
+        <w:t xml:space="preserve">(</w:t>
+      </w:r>
+      <w:r>
+        <w:rPr>
+          <w:rStyle w:val="VerbatimChar"/>
+        </w:rPr>
+        <w:t xml:space="preserve">AS01Q*</w:t>
+      </w:r>
+      <w:r>
+        <w:t xml:space="preserve">) and a 3-part household id; 2011 uses lowercase (</w:t>
+      </w:r>
+      <w:r>
+        <w:rPr>
+          <w:rStyle w:val="VerbatimChar"/>
+        </w:rPr>
+        <w:t xml:space="preserve">as01q*</w:t>
+      </w:r>
+      <w:r>
+        <w:t xml:space="preserve">) and a single</w:t>
+      </w:r>
+      <w:r>
+        <w:t xml:space="preserve"> </w:t>
+      </w:r>
+      <w:r>
+        <w:rPr>
+          <w:rStyle w:val="VerbatimChar"/>
+        </w:rPr>
+        <w:t xml:space="preserve">hid</w:t>
+      </w:r>
+      <w:r>
+        <w:t xml:space="preserve">. Some files are Latin-1 encoded.</w:t>
+      </w:r>
+    </w:p>
+    <w:p>
+      <w:pPr>
+        <w:pStyle w:val="BlockText"/>
+      </w:pPr>
+      <w:r>
+        <w:rPr>
+          <w:b/>
+        </w:rPr>
+        <w:t xml:space="preserve">Unit note.</w:t>
+      </w:r>
+      <w:r>
+        <w:t xml:space="preserve"> </w:t>
+      </w:r>
+      <w:r>
+        <w:t xml:space="preserve">Tenure, acquisition, title, disposition, and area all sit in the one</w:t>
+      </w:r>
+      <w:r>
+        <w:t xml:space="preserve"> </w:t>
+      </w:r>
+      <w:r>
+        <w:t xml:space="preserve">parcel roster, so the</w:t>
+      </w:r>
+      <w:r>
+        <w:t xml:space="preserve"> </w:t>
+      </w:r>
+      <w:r>
+        <w:rPr>
+          <w:rStyle w:val="VerbatimChar"/>
+        </w:rPr>
+        <w:t xml:space="preserve">parcel</w:t>
+      </w:r>
+      <w:r>
+        <w:t xml:space="preserve"> </w:t>
+      </w:r>
+      <w:r>
+        <w:t xml:space="preserve">is that roster record and no cross-module merge is needed.</w:t>
+      </w:r>
+    </w:p>
+    <w:p>
+      <w:pPr>
+        <w:pStyle w:val="Heading3"/>
+      </w:pPr>
+      <w:bookmarkStart w:id="45" w:name="survey-wave-key-3"/>
+      <w:r>
+        <w:t xml:space="preserve">1. Survey &amp; wave key</w:t>
+      </w:r>
+      <w:bookmarkEnd w:id="45"/>
+    </w:p>
+    <w:tbl>
+      <w:tblPr>
+        <w:tblStyle w:val="Table"/>
+        <w:tblW w:type="pct" w:w="0.0"/>
+        <w:tblLook w:firstRow="1"/>
+      </w:tblPr>
+      <w:tblGrid/>
+      <w:tr>
+        <w:trPr>
+          <w:cnfStyle w:firstRow="1"/>
+        </w:trPr>
+        <w:tc>
+          <w:tcPr>
+            <w:tcBorders>
+              <w:bottom w:val="single"/>
+            </w:tcBorders>
+            <w:vAlign w:val="bottom"/>
+          </w:tcPr>
+          <w:p>
+            <w:pPr>
+              <w:pStyle w:val="Compact"/>
+              <w:jc w:val="left"/>
+            </w:pPr>
+            <w:r>
+              <w:t xml:space="preserve">Wave</w:t>
+            </w:r>
+          </w:p>
+        </w:tc>
+        <w:tc>
+          <w:tcPr>
+            <w:tcBorders>
+              <w:bottom w:val="single"/>
+            </w:tcBorders>
+            <w:vAlign w:val="bottom"/>
+          </w:tcPr>
+          <w:p>
+            <w:pPr>
+              <w:pStyle w:val="Compact"/>
+              <w:jc w:val="left"/>
+            </w:pPr>
+            <w:r>
+              <w:t xml:space="preserve">Round folder</w:t>
+            </w:r>
+          </w:p>
+        </w:tc>
+        <w:tc>
+          <w:tcPr>
+            <w:tcBorders>
+              <w:bottom w:val="single"/>
+            </w:tcBorders>
+            <w:vAlign w:val="bottom"/>
+          </w:tcPr>
+          <w:p>
+            <w:pPr>
+              <w:pStyle w:val="Compact"/>
+              <w:jc w:val="left"/>
+            </w:pPr>
+            <w:r>
+              <w:t xml:space="preserve">Year</w:t>
+            </w:r>
+          </w:p>
+        </w:tc>
+        <w:tc>
+          <w:tcPr>
+            <w:tcBorders>
+              <w:bottom w:val="single"/>
+            </w:tcBorders>
+            <w:vAlign w:val="bottom"/>
+          </w:tcPr>
+          <w:p>
+            <w:pPr>
+              <w:pStyle w:val="Compact"/>
+              <w:jc w:val="left"/>
+            </w:pPr>
+            <w:r>
+              <w:t xml:space="preserve">HH id</w:t>
+            </w:r>
+          </w:p>
+        </w:tc>
+        <w:tc>
+          <w:tcPr>
+            <w:tcBorders>
+              <w:bottom w:val="single"/>
+            </w:tcBorders>
+            <w:vAlign w:val="bottom"/>
+          </w:tcPr>
+          <w:p>
+            <w:pPr>
+              <w:pStyle w:val="Compact"/>
+              <w:jc w:val="left"/>
+            </w:pPr>
+            <w:r>
+              <w:t xml:space="preserve">Parcel roster</w:t>
+            </w:r>
+          </w:p>
+        </w:tc>
+      </w:tr>
+      <w:tr>
+        <w:tc>
+          <w:p>
+            <w:pPr>
+              <w:pStyle w:val="Compact"/>
+              <w:jc w:val="left"/>
+            </w:pPr>
+            <w:r>
+              <w:t xml:space="preserve">1</w:t>
+            </w:r>
+          </w:p>
+        </w:tc>
+        <w:tc>
+          <w:p>
+            <w:pPr>
+              <w:pStyle w:val="Compact"/>
+              <w:jc w:val="left"/>
+            </w:pPr>
+            <w:r>
+              <w:rPr>
+                <w:rStyle w:val="VerbatimChar"/>
+              </w:rPr>
+              <w:t xml:space="preserve">Niger/ECVMA 11</w:t>
+            </w:r>
+          </w:p>
+        </w:tc>
+        <w:tc>
+          <w:p>
+            <w:pPr>
+              <w:pStyle w:val="Compact"/>
+              <w:jc w:val="left"/>
+            </w:pPr>
+            <w:r>
+              <w:t xml:space="preserve">2011</w:t>
+            </w:r>
+          </w:p>
+        </w:tc>
+        <w:tc>
+          <w:p>
+            <w:pPr>
+              <w:pStyle w:val="Compact"/>
+              <w:jc w:val="left"/>
+            </w:pPr>
+            <w:r>
+              <w:rPr>
+                <w:rStyle w:val="VerbatimChar"/>
+              </w:rPr>
+              <w:t xml:space="preserve">hid</w:t>
+            </w:r>
+          </w:p>
+        </w:tc>
+        <w:tc>
+          <w:p>
+            <w:pPr>
+              <w:pStyle w:val="Compact"/>
+              <w:jc w:val="left"/>
+            </w:pPr>
+            <w:r>
+              <w:rPr>
+                <w:rStyle w:val="VerbatimChar"/>
+              </w:rPr>
+              <w:t xml:space="preserve">ecvmaas1_p1.dta</w:t>
+            </w:r>
+            <w:r>
+              <w:t xml:space="preserve"> </w:t>
+            </w:r>
+            <w:r>
+              <w:t xml:space="preserve">(</w:t>
+            </w:r>
+            <w:r>
+              <w:rPr>
+                <w:rStyle w:val="VerbatimChar"/>
+              </w:rPr>
+              <w:t xml:space="preserve">as01q*</w:t>
+            </w:r>
+            <w:r>
+              <w:t xml:space="preserve">)</w:t>
+            </w:r>
+          </w:p>
+        </w:tc>
+      </w:tr>
+      <w:tr>
+        <w:tc>
+          <w:p>
+            <w:pPr>
+              <w:pStyle w:val="Compact"/>
+              <w:jc w:val="left"/>
+            </w:pPr>
+            <w:r>
+              <w:t xml:space="preserve">2</w:t>
+            </w:r>
+          </w:p>
+        </w:tc>
+        <w:tc>
+          <w:p>
+            <w:pPr>
+              <w:pStyle w:val="Compact"/>
+              <w:jc w:val="left"/>
+            </w:pPr>
+            <w:r>
+              <w:rPr>
+                <w:rStyle w:val="VerbatimChar"/>
+              </w:rPr>
+              <w:t xml:space="preserve">Niger/ECVMA 14</w:t>
+            </w:r>
+          </w:p>
+        </w:tc>
+        <w:tc>
+          <w:p>
+            <w:pPr>
+              <w:pStyle w:val="Compact"/>
+              <w:jc w:val="left"/>
+            </w:pPr>
+            <w:r>
+              <w:t xml:space="preserve">2014</w:t>
+            </w:r>
+          </w:p>
+        </w:tc>
+        <w:tc>
+          <w:p>
+            <w:pPr>
+              <w:pStyle w:val="Compact"/>
+              <w:jc w:val="left"/>
+            </w:pPr>
+            <w:r>
+              <w:rPr>
+                <w:rStyle w:val="VerbatimChar"/>
+              </w:rPr>
+              <w:t xml:space="preserve">GRAPPE</w:t>
+            </w:r>
+            <w:r>
+              <w:t xml:space="preserve">-</w:t>
+            </w:r>
+            <w:r>
+              <w:rPr>
+                <w:rStyle w:val="VerbatimChar"/>
+              </w:rPr>
+              <w:t xml:space="preserve">MENAGE</w:t>
+            </w:r>
+            <w:r>
+              <w:t xml:space="preserve">-</w:t>
+            </w:r>
+            <w:r>
+              <w:rPr>
+                <w:rStyle w:val="VerbatimChar"/>
+              </w:rPr>
+              <w:t xml:space="preserve">EXTENSION</w:t>
+            </w:r>
+          </w:p>
+        </w:tc>
+        <w:tc>
+          <w:p>
+            <w:pPr>
+              <w:pStyle w:val="Compact"/>
+              <w:jc w:val="left"/>
+            </w:pPr>
+            <w:r>
+              <w:rPr>
+                <w:rStyle w:val="VerbatimChar"/>
+              </w:rPr>
+              <w:t xml:space="preserve">ECVMA2_AS1P1.dta</w:t>
+            </w:r>
+            <w:r>
+              <w:t xml:space="preserve"> </w:t>
+            </w:r>
+            <w:r>
+              <w:t xml:space="preserve">(</w:t>
+            </w:r>
+            <w:r>
+              <w:rPr>
+                <w:rStyle w:val="VerbatimChar"/>
+              </w:rPr>
+              <w:t xml:space="preserve">AS01Q*</w:t>
+            </w:r>
+            <w:r>
+              <w:t xml:space="preserve">)</w:t>
+            </w:r>
+          </w:p>
+        </w:tc>
+      </w:tr>
+    </w:tbl>
+    <w:p>
+      <w:pPr>
+        <w:pStyle w:val="BodyText"/>
+      </w:pPr>
+      <w:r>
+        <w:t xml:space="preserve">Weights: 2011</w:t>
+      </w:r>
+      <w:r>
+        <w:t xml:space="preserve"> </w:t>
+      </w:r>
+      <w:r>
+        <w:rPr>
+          <w:rStyle w:val="VerbatimChar"/>
+        </w:rPr>
+        <w:t xml:space="preserve">ecvmamen_p1_en.dta</w:t>
+      </w:r>
+      <w:r>
+        <w:t xml:space="preserve"> </w:t>
+      </w:r>
+      <w:r>
+        <w:t xml:space="preserve">(housing;</w:t>
+      </w:r>
+      <w:r>
+        <w:t xml:space="preserve"> </w:t>
+      </w:r>
+      <w:r>
+        <w:rPr>
+          <w:rStyle w:val="VerbatimChar"/>
+        </w:rPr>
+        <w:t xml:space="preserve">hhweight</w:t>
+      </w:r>
+      <w:r>
+        <w:t xml:space="preserve">,</w:t>
+      </w:r>
+      <w:r>
+        <w:t xml:space="preserve"> </w:t>
+      </w:r>
+      <w:r>
+        <w:rPr>
+          <w:rStyle w:val="VerbatimChar"/>
+        </w:rPr>
+        <w:t xml:space="preserve">grappe</w:t>
+      </w:r>
+      <w:r>
+        <w:t xml:space="preserve">,</w:t>
+      </w:r>
+      <w:r>
+        <w:t xml:space="preserve"> </w:t>
+      </w:r>
+      <w:r>
+        <w:rPr>
+          <w:rStyle w:val="VerbatimChar"/>
+        </w:rPr>
+        <w:t xml:space="preserve">strate</w:t>
+      </w:r>
+      <w:r>
+        <w:t xml:space="preserve">);</w:t>
+      </w:r>
+      <w:r>
+        <w:t xml:space="preserve"> </w:t>
+      </w:r>
+      <w:r>
+        <w:t xml:space="preserve">2014</w:t>
+      </w:r>
+      <w:r>
+        <w:t xml:space="preserve"> </w:t>
+      </w:r>
+      <w:r>
+        <w:rPr>
+          <w:rStyle w:val="VerbatimChar"/>
+        </w:rPr>
+        <w:t xml:space="preserve">ECVMA2014_P1P2_ConsoMen.dta</w:t>
+      </w:r>
+      <w:r>
+        <w:t xml:space="preserve"> </w:t>
+      </w:r>
+      <w:r>
+        <w:t xml:space="preserve">(</w:t>
+      </w:r>
+      <w:r>
+        <w:rPr>
+          <w:rStyle w:val="VerbatimChar"/>
+        </w:rPr>
+        <w:t xml:space="preserve">hhweight</w:t>
+      </w:r>
+      <w:r>
+        <w:t xml:space="preserve">) + cover</w:t>
+      </w:r>
+      <w:r>
+        <w:t xml:space="preserve"> </w:t>
+      </w:r>
+      <w:r>
+        <w:rPr>
+          <w:rStyle w:val="VerbatimChar"/>
+        </w:rPr>
+        <w:t xml:space="preserve">ECVMA2_MS00P1.dta</w:t>
+      </w:r>
+      <w:r>
+        <w:t xml:space="preserve"> </w:t>
+      </w:r>
+      <w:r>
+        <w:t xml:space="preserve">(region).</w:t>
+      </w:r>
+    </w:p>
+    <w:p>
+      <w:pPr>
+        <w:pStyle w:val="Heading3"/>
+      </w:pPr>
+      <w:bookmarkStart w:id="46" w:name="tenure-indicators-3"/>
+      <w:r>
+        <w:t xml:space="preserve">2. Tenure indicators</w:t>
+      </w:r>
+      <w:bookmarkEnd w:id="46"/>
+    </w:p>
+    <w:tbl>
+      <w:tblPr>
+        <w:tblStyle w:val="Table"/>
+        <w:tblW w:type="pct" w:w="5000.0"/>
+        <w:tblLook w:firstRow="1"/>
+      </w:tblPr>
+      <w:tblGrid>
+        <w:gridCol w:w="1800"/>
+        <w:gridCol w:w="540"/>
+        <w:gridCol w:w="1440"/>
+        <w:gridCol w:w="4140"/>
+      </w:tblGrid>
+      <w:tr>
+        <w:trPr>
+          <w:cnfStyle w:firstRow="1"/>
+        </w:trPr>
+        <w:tc>
+          <w:tcPr>
+            <w:tcBorders>
+              <w:bottom w:val="single"/>
+            </w:tcBorders>
+            <w:vAlign w:val="bottom"/>
+          </w:tcPr>
+          <w:p>
+            <w:pPr>
+              <w:pStyle w:val="Compact"/>
+              <w:jc w:val="left"/>
+            </w:pPr>
+            <w:r>
+              <w:t xml:space="preserve">Variable</w:t>
+            </w:r>
+          </w:p>
+        </w:tc>
+        <w:tc>
+          <w:tcPr>
+            <w:tcBorders>
+              <w:bottom w:val="single"/>
+            </w:tcBorders>
+            <w:vAlign w:val="bottom"/>
+          </w:tcPr>
+          <w:p>
+            <w:pPr>
+              <w:pStyle w:val="Compact"/>
+              <w:jc w:val="left"/>
+            </w:pPr>
+            <w:r>
+              <w:t xml:space="preserve">Wave</w:t>
+            </w:r>
+          </w:p>
+        </w:tc>
+        <w:tc>
+          <w:tcPr>
+            <w:tcBorders>
+              <w:bottom w:val="single"/>
+            </w:tcBorders>
+            <w:vAlign w:val="bottom"/>
+          </w:tcPr>
+          <w:p>
+            <w:pPr>
+              <w:pStyle w:val="Compact"/>
+              <w:jc w:val="left"/>
+            </w:pPr>
+            <w:r>
+              <w:t xml:space="preserve">Source var</w:t>
+            </w:r>
+          </w:p>
+        </w:tc>
+        <w:tc>
+          <w:tcPr>
+            <w:tcBorders>
+              <w:bottom w:val="single"/>
+            </w:tcBorders>
+            <w:vAlign w:val="bottom"/>
+          </w:tcPr>
+          <w:p>
+            <w:pPr>
+              <w:pStyle w:val="Compact"/>
+              <w:jc w:val="left"/>
+            </w:pPr>
+            <w:r>
+              <w:t xml:space="preserve">Construction</w:t>
+            </w:r>
+          </w:p>
+        </w:tc>
+      </w:tr>
+      <w:tr>
+        <w:tc>
+          <w:p>
+            <w:pPr>
+              <w:pStyle w:val="Compact"/>
+              <w:jc w:val="left"/>
+            </w:pPr>
+            <w:r>
+              <w:rPr>
+                <w:rStyle w:val="VerbatimChar"/>
+              </w:rPr>
+              <w:t xml:space="preserve">parcel_rentedin</w:t>
+            </w:r>
+          </w:p>
+        </w:tc>
+        <w:tc>
+          <w:p>
+            <w:pPr>
+              <w:pStyle w:val="Compact"/>
+              <w:jc w:val="left"/>
+            </w:pPr>
+            <w:r>
+              <w:t xml:space="preserve">1</w:t>
+            </w:r>
+          </w:p>
+        </w:tc>
+        <w:tc>
+          <w:p>
+            <w:pPr>
+              <w:pStyle w:val="Compact"/>
+              <w:jc w:val="left"/>
+            </w:pPr>
+            <w:r>
+              <w:rPr>
+                <w:rStyle w:val="VerbatimChar"/>
+              </w:rPr>
+              <w:t xml:space="preserve">as01q16</w:t>
+            </w:r>
+          </w:p>
+        </w:tc>
+        <w:tc>
+          <w:p>
+            <w:pPr>
+              <w:pStyle w:val="Compact"/>
+              <w:jc w:val="left"/>
+            </w:pPr>
+            <w:r>
+              <w:rPr>
+                <w:rStyle w:val="VerbatimChar"/>
+              </w:rPr>
+              <w:t xml:space="preserve">as01q16==4</w:t>
+            </w:r>
+            <w:r>
+              <w:t xml:space="preserve"> </w:t>
+            </w:r>
+            <w:r>
+              <w:t xml:space="preserve">- Location (rental)</w:t>
+            </w:r>
+          </w:p>
+        </w:tc>
+      </w:tr>
+      <w:tr>
+        <w:tc>
+          <w:p>
+            <w:pPr>
+              <w:pStyle w:val="Compact"/>
+              <w:jc w:val="left"/>
+            </w:pPr>
+            <w:r>
+              <w:rPr>
+                <w:rStyle w:val="VerbatimChar"/>
+              </w:rPr>
+              <w:t xml:space="preserve">parcel_rentedin</w:t>
+            </w:r>
+          </w:p>
+        </w:tc>
+        <w:tc>
+          <w:p>
+            <w:pPr>
+              <w:pStyle w:val="Compact"/>
+              <w:jc w:val="left"/>
+            </w:pPr>
+            <w:r>
+              <w:t xml:space="preserve">2</w:t>
+            </w:r>
+          </w:p>
+        </w:tc>
+        <w:tc>
+          <w:p>
+            <w:pPr>
+              <w:pStyle w:val="Compact"/>
+              <w:jc w:val="left"/>
+            </w:pPr>
+            <w:r>
+              <w:rPr>
+                <w:rStyle w:val="VerbatimChar"/>
+              </w:rPr>
+              <w:t xml:space="preserve">AS01Q14</w:t>
+            </w:r>
+          </w:p>
+        </w:tc>
+        <w:tc>
+          <w:p>
+            <w:pPr>
+              <w:pStyle w:val="Compact"/>
+              <w:jc w:val="left"/>
+            </w:pPr>
+            <w:r>
+              <w:rPr>
+                <w:rStyle w:val="VerbatimChar"/>
+              </w:rPr>
+              <w:t xml:space="preserve">AS01Q14==3</w:t>
+            </w:r>
+            <w:r>
+              <w:t xml:space="preserve"> </w:t>
+            </w:r>
+            <w:r>
+              <w:t xml:space="preserve">- Location (rental)</w:t>
+            </w:r>
+          </w:p>
+        </w:tc>
+      </w:tr>
+      <w:tr>
+        <w:tc>
+          <w:p>
+            <w:pPr>
+              <w:pStyle w:val="Compact"/>
+              <w:jc w:val="left"/>
+            </w:pPr>
+            <w:r>
+              <w:rPr>
+                <w:rStyle w:val="VerbatimChar"/>
+              </w:rPr>
+              <w:t xml:space="preserve">parcel_purchased</w:t>
+            </w:r>
+          </w:p>
+        </w:tc>
+        <w:tc>
+          <w:p>
+            <w:pPr>
+              <w:pStyle w:val="Compact"/>
+              <w:jc w:val="left"/>
+            </w:pPr>
+            <w:r>
+              <w:t xml:space="preserve">1</w:t>
+            </w:r>
+          </w:p>
+        </w:tc>
+        <w:tc>
+          <w:p>
+            <w:pPr>
+              <w:pStyle w:val="Compact"/>
+              <w:jc w:val="left"/>
+            </w:pPr>
+            <w:r>
+              <w:rPr>
+                <w:rStyle w:val="VerbatimChar"/>
+              </w:rPr>
+              <w:t xml:space="preserve">as01q19</w:t>
+            </w:r>
+          </w:p>
+        </w:tc>
+        <w:tc>
+          <w:p>
+            <w:pPr>
+              <w:pStyle w:val="Compact"/>
+              <w:jc w:val="left"/>
+            </w:pPr>
+            <w:r>
+              <w:rPr>
+                <w:rStyle w:val="VerbatimChar"/>
+              </w:rPr>
+              <w:t xml:space="preserve">as01q19==1</w:t>
+            </w:r>
+            <w:r>
+              <w:t xml:space="preserve"> </w:t>
+            </w:r>
+            <w:r>
+              <w:t xml:space="preserve">- Achat (9 -&gt; missing)</w:t>
+            </w:r>
+          </w:p>
+        </w:tc>
+      </w:tr>
+      <w:tr>
+        <w:tc>
+          <w:p>
+            <w:pPr>
+              <w:pStyle w:val="Compact"/>
+              <w:jc w:val="left"/>
+            </w:pPr>
+            <w:r>
+              <w:rPr>
+                <w:rStyle w:val="VerbatimChar"/>
+              </w:rPr>
+              <w:t xml:space="preserve">parcel_purchased</w:t>
+            </w:r>
+          </w:p>
+        </w:tc>
+        <w:tc>
+          <w:p>
+            <w:pPr>
+              <w:pStyle w:val="Compact"/>
+              <w:jc w:val="left"/>
+            </w:pPr>
+            <w:r>
+              <w:t xml:space="preserve">2</w:t>
+            </w:r>
+          </w:p>
+        </w:tc>
+        <w:tc>
+          <w:p>
+            <w:pPr>
+              <w:pStyle w:val="Compact"/>
+              <w:jc w:val="left"/>
+            </w:pPr>
+            <w:r>
+              <w:rPr>
+                <w:rStyle w:val="VerbatimChar"/>
+              </w:rPr>
+              <w:t xml:space="preserve">AS01Q18</w:t>
+            </w:r>
+          </w:p>
+        </w:tc>
+        <w:tc>
+          <w:p>
+            <w:pPr>
+              <w:pStyle w:val="Compact"/>
+              <w:jc w:val="left"/>
+            </w:pPr>
+            <w:r>
+              <w:rPr>
+                <w:rStyle w:val="VerbatimChar"/>
+              </w:rPr>
+              <w:t xml:space="preserve">AS01Q18==1</w:t>
+            </w:r>
+            <w:r>
+              <w:t xml:space="preserve"> </w:t>
+            </w:r>
+            <w:r>
+              <w:t xml:space="preserve">- Achat (9 -&gt; missing)</w:t>
+            </w:r>
+          </w:p>
+        </w:tc>
+      </w:tr>
+      <w:tr>
+        <w:tc>
+          <w:p>
+            <w:pPr>
+              <w:pStyle w:val="Compact"/>
+              <w:jc w:val="left"/>
+            </w:pPr>
+            <w:r>
+              <w:rPr>
+                <w:rStyle w:val="VerbatimChar"/>
+              </w:rPr>
+              <w:t xml:space="preserve">parcel_certificate</w:t>
+            </w:r>
+          </w:p>
+        </w:tc>
+        <w:tc>
+          <w:p>
+            <w:pPr>
+              <w:pStyle w:val="Compact"/>
+              <w:jc w:val="left"/>
+            </w:pPr>
+            <w:r>
+              <w:t xml:space="preserve">1</w:t>
+            </w:r>
+          </w:p>
+        </w:tc>
+        <w:tc>
+          <w:p>
+            <w:pPr>
+              <w:pStyle w:val="Compact"/>
+              <w:jc w:val="left"/>
+            </w:pPr>
+            <w:r>
+              <w:rPr>
+                <w:rStyle w:val="VerbatimChar"/>
+              </w:rPr>
+              <w:t xml:space="preserve">as01q18</w:t>
+            </w:r>
+          </w:p>
+        </w:tc>
+        <w:tc>
+          <w:p>
+            <w:pPr>
+              <w:pStyle w:val="Compact"/>
+              <w:jc w:val="left"/>
+            </w:pPr>
+            <w:r>
+              <w:rPr>
+                <w:rStyle w:val="VerbatimChar"/>
+              </w:rPr>
+              <w:t xml:space="preserve">inlist(as01q18,1,2,3,4)</w:t>
+            </w:r>
+            <w:r>
+              <w:t xml:space="preserve"> </w:t>
+            </w:r>
+            <w:r>
+              <w:t xml:space="preserve">- any title doc (9 -&gt; missing)</w:t>
+            </w:r>
+          </w:p>
+        </w:tc>
+      </w:tr>
+      <w:tr>
+        <w:tc>
+          <w:p>
+            <w:pPr>
+              <w:pStyle w:val="Compact"/>
+              <w:jc w:val="left"/>
+            </w:pPr>
+            <w:r>
+              <w:rPr>
+                <w:rStyle w:val="VerbatimChar"/>
+              </w:rPr>
+              <w:t xml:space="preserve">parcel_certificate</w:t>
+            </w:r>
+          </w:p>
+        </w:tc>
+        <w:tc>
+          <w:p>
+            <w:pPr>
+              <w:pStyle w:val="Compact"/>
+              <w:jc w:val="left"/>
+            </w:pPr>
+            <w:r>
+              <w:t xml:space="preserve">2</w:t>
+            </w:r>
+          </w:p>
+        </w:tc>
+        <w:tc>
+          <w:p>
+            <w:pPr>
+              <w:pStyle w:val="Compact"/>
+              <w:jc w:val="left"/>
+            </w:pPr>
+            <w:r>
+              <w:rPr>
+                <w:rStyle w:val="VerbatimChar"/>
+              </w:rPr>
+              <w:t xml:space="preserve">AS01Q15</w:t>
+            </w:r>
+          </w:p>
+        </w:tc>
+        <w:tc>
+          <w:p>
+            <w:pPr>
+              <w:pStyle w:val="Compact"/>
+              <w:jc w:val="left"/>
+            </w:pPr>
+            <w:r>
+              <w:rPr>
+                <w:rStyle w:val="VerbatimChar"/>
+              </w:rPr>
+              <w:t xml:space="preserve">inlist(AS01Q15,1,2,3,4)</w:t>
+            </w:r>
+            <w:r>
+              <w:t xml:space="preserve"> </w:t>
+            </w:r>
+            <w:r>
+              <w:t xml:space="preserve">- any title doc (9 -&gt; missing)</w:t>
+            </w:r>
+          </w:p>
+        </w:tc>
+      </w:tr>
+      <w:tr>
+        <w:tc>
+          <w:p>
+            <w:pPr>
+              <w:pStyle w:val="Compact"/>
+              <w:jc w:val="left"/>
+            </w:pPr>
+            <w:r>
+              <w:rPr>
+                <w:rStyle w:val="VerbatimChar"/>
+              </w:rPr>
+              <w:t xml:space="preserve">parcel_rentedout</w:t>
+            </w:r>
+          </w:p>
+        </w:tc>
+        <w:tc>
+          <w:p>
+            <w:pPr>
+              <w:pStyle w:val="Compact"/>
+              <w:jc w:val="left"/>
+            </w:pPr>
+            <w:r>
+              <w:t xml:space="preserve">1</w:t>
+            </w:r>
+          </w:p>
+        </w:tc>
+        <w:tc>
+          <w:p>
+            <w:pPr>
+              <w:pStyle w:val="Compact"/>
+              <w:jc w:val="left"/>
+            </w:pPr>
+            <w:r>
+              <w:rPr>
+                <w:rStyle w:val="VerbatimChar"/>
+              </w:rPr>
+              <w:t xml:space="preserve">as01q41</w:t>
+            </w:r>
+          </w:p>
+        </w:tc>
+        <w:tc>
+          <w:p>
+            <w:pPr>
+              <w:pStyle w:val="Compact"/>
+              <w:jc w:val="left"/>
+            </w:pPr>
+            <w:r>
+              <w:rPr>
+                <w:rStyle w:val="VerbatimChar"/>
+              </w:rPr>
+              <w:t xml:space="preserve">as01q41==4</w:t>
+            </w:r>
+            <w:r>
+              <w:t xml:space="preserve"> </w:t>
+            </w:r>
+            <w:r>
+              <w:t xml:space="preserve">-</w:t>
+            </w:r>
+            <w:r>
+              <w:t xml:space="preserve"> </w:t>
+            </w:r>
+            <w:r>
+              <w:t xml:space="preserve">“</w:t>
+            </w:r>
+            <w:r>
+              <w:t xml:space="preserve">louee a un autre</w:t>
+            </w:r>
+            <w:r>
+              <w:t xml:space="preserve">”</w:t>
+            </w:r>
+            <w:r>
+              <w:t xml:space="preserve"> </w:t>
+            </w:r>
+            <w:r>
+              <w:t xml:space="preserve">(rented out)</w:t>
+            </w:r>
+          </w:p>
+        </w:tc>
+      </w:tr>
+      <w:tr>
+        <w:tc>
+          <w:p>
+            <w:pPr>
+              <w:pStyle w:val="Compact"/>
+              <w:jc w:val="left"/>
+            </w:pPr>
+            <w:r>
+              <w:rPr>
+                <w:rStyle w:val="VerbatimChar"/>
+              </w:rPr>
+              <w:t xml:space="preserve">parcel_rentedout</w:t>
+            </w:r>
+          </w:p>
+        </w:tc>
+        <w:tc>
+          <w:p>
+            <w:pPr>
+              <w:pStyle w:val="Compact"/>
+              <w:jc w:val="left"/>
+            </w:pPr>
+            <w:r>
+              <w:t xml:space="preserve">2</w:t>
+            </w:r>
+          </w:p>
+        </w:tc>
+        <w:tc>
+          <w:p>
+            <w:pPr>
+              <w:pStyle w:val="Compact"/>
+              <w:jc w:val="left"/>
+            </w:pPr>
+            <w:r>
+              <w:rPr>
+                <w:rStyle w:val="VerbatimChar"/>
+              </w:rPr>
+              <w:t xml:space="preserve">AS01Q39</w:t>
+            </w:r>
+          </w:p>
+        </w:tc>
+        <w:tc>
+          <w:p>
+            <w:pPr>
+              <w:pStyle w:val="Compact"/>
+              <w:jc w:val="left"/>
+            </w:pPr>
+            <w:r>
+              <w:rPr>
+                <w:rStyle w:val="VerbatimChar"/>
+              </w:rPr>
+              <w:t xml:space="preserve">AS01Q39==4</w:t>
+            </w:r>
+            <w:r>
+              <w:t xml:space="preserve"> </w:t>
+            </w:r>
+            <w:r>
+              <w:t xml:space="preserve">-</w:t>
+            </w:r>
+            <w:r>
+              <w:t xml:space="preserve"> </w:t>
+            </w:r>
+            <w:r>
+              <w:t xml:space="preserve">“</w:t>
+            </w:r>
+            <w:r>
+              <w:t xml:space="preserve">louee a un autre</w:t>
+            </w:r>
+            <w:r>
+              <w:t xml:space="preserve">”</w:t>
+            </w:r>
+            <w:r>
+              <w:t xml:space="preserve"> </w:t>
+            </w:r>
+            <w:r>
+              <w:t xml:space="preserve">(rented out)</w:t>
+            </w:r>
+          </w:p>
+        </w:tc>
+      </w:tr>
+    </w:tbl>
+    <w:p>
+      <w:pPr>
+        <w:pStyle w:val="Heading3"/>
+      </w:pPr>
+      <w:bookmarkStart w:id="47" w:name="parcel-area-parcel_area_ha-3"/>
+      <w:r>
+        <w:t xml:space="preserve">3. Parcel area (</w:t>
+      </w:r>
+      <w:r>
+        <w:rPr>
+          <w:rStyle w:val="VerbatimChar"/>
+        </w:rPr>
+        <w:t xml:space="preserve">parcel_area_ha</w:t>
+      </w:r>
+      <w:r>
+        <w:t xml:space="preserve">)</w:t>
+      </w:r>
+      <w:bookmarkEnd w:id="47"/>
+    </w:p>
+    <w:p>
+      <w:pPr>
+        <w:pStyle w:val="FirstParagraph"/>
+      </w:pPr>
+      <w:r>
+        <w:t xml:space="preserve">GPS where measured, else self-reported (deterministic; no imputation). 2011: GPS</w:t>
+      </w:r>
+      <w:r>
+        <w:t xml:space="preserve"> </w:t>
+      </w:r>
+      <w:r>
+        <w:rPr>
+          <w:rStyle w:val="VerbatimChar"/>
+        </w:rPr>
+        <w:t xml:space="preserve">as01q09</w:t>
+      </w:r>
+      <w:r>
+        <w:t xml:space="preserve">, self-reported</w:t>
+      </w:r>
+      <w:r>
+        <w:t xml:space="preserve"> </w:t>
+      </w:r>
+      <w:r>
+        <w:rPr>
+          <w:rStyle w:val="VerbatimChar"/>
+        </w:rPr>
+        <w:t xml:space="preserve">as01q08</w:t>
+      </w:r>
+      <w:r>
+        <w:t xml:space="preserve">; 2014: GPS</w:t>
+      </w:r>
+      <w:r>
+        <w:t xml:space="preserve"> </w:t>
+      </w:r>
+      <w:r>
+        <w:rPr>
+          <w:rStyle w:val="VerbatimChar"/>
+        </w:rPr>
+        <w:t xml:space="preserve">AS01Q07</w:t>
+      </w:r>
+      <w:r>
+        <w:t xml:space="preserve">, self-reported</w:t>
+      </w:r>
+      <w:r>
+        <w:t xml:space="preserve"> </w:t>
+      </w:r>
+      <w:r>
+        <w:rPr>
+          <w:rStyle w:val="VerbatimChar"/>
+        </w:rPr>
+        <w:t xml:space="preserve">AS01Q06</w:t>
+      </w:r>
+      <w:r>
+        <w:t xml:space="preserve">.</w:t>
+      </w:r>
+      <w:r>
+        <w:t xml:space="preserve"> </w:t>
+      </w:r>
+      <w:r>
+        <w:t xml:space="preserve">All in m² (× 0.0001 → ha); 999999 = missing; GPS 0 = missing.</w:t>
+      </w:r>
+    </w:p>
+    <w:p>
+      <w:pPr>
+        <w:pStyle w:val="Heading3"/>
+      </w:pPr>
+      <w:bookmarkStart w:id="48" w:name="design-variables-identifiers-3"/>
+      <w:r>
+        <w:t xml:space="preserve">4. Design variables &amp; identifiers</w:t>
+      </w:r>
+      <w:bookmarkEnd w:id="48"/>
+    </w:p>
+    <w:tbl>
+      <w:tblPr>
+        <w:tblStyle w:val="Table"/>
+        <w:tblW w:type="pct" w:w="0.0"/>
+        <w:tblLook w:firstRow="1"/>
+      </w:tblPr>
+      <w:tblGrid/>
+      <w:tr>
+        <w:trPr>
+          <w:cnfStyle w:firstRow="1"/>
+        </w:trPr>
+        <w:tc>
+          <w:tcPr>
+            <w:tcBorders>
+              <w:bottom w:val="single"/>
+            </w:tcBorders>
+            <w:vAlign w:val="bottom"/>
+          </w:tcPr>
+          <w:p>
+            <w:pPr>
+              <w:pStyle w:val="Compact"/>
+              <w:jc w:val="left"/>
+            </w:pPr>
+            <w:r>
+              <w:t xml:space="preserve">Variable</w:t>
+            </w:r>
+          </w:p>
+        </w:tc>
+        <w:tc>
+          <w:tcPr>
+            <w:tcBorders>
+              <w:bottom w:val="single"/>
+            </w:tcBorders>
+            <w:vAlign w:val="bottom"/>
+          </w:tcPr>
+          <w:p>
+            <w:pPr>
+              <w:pStyle w:val="Compact"/>
+              <w:jc w:val="left"/>
+            </w:pPr>
+            <w:r>
+              <w:t xml:space="preserve">Wave</w:t>
+            </w:r>
+          </w:p>
+        </w:tc>
+        <w:tc>
+          <w:tcPr>
+            <w:tcBorders>
+              <w:bottom w:val="single"/>
+            </w:tcBorders>
+            <w:vAlign w:val="bottom"/>
+          </w:tcPr>
+          <w:p>
+            <w:pPr>
+              <w:pStyle w:val="Compact"/>
+              <w:jc w:val="left"/>
+            </w:pPr>
+            <w:r>
+              <w:t xml:space="preserve">Source</w:t>
+            </w:r>
+          </w:p>
+        </w:tc>
+        <w:tc>
+          <w:tcPr>
+            <w:tcBorders>
+              <w:bottom w:val="single"/>
+            </w:tcBorders>
+            <w:vAlign w:val="bottom"/>
+          </w:tcPr>
+          <w:p>
+            <w:pPr>
+              <w:pStyle w:val="Compact"/>
+              <w:jc w:val="left"/>
+            </w:pPr>
+            <w:r>
+              <w:t xml:space="preserve">Construction</w:t>
+            </w:r>
+          </w:p>
+        </w:tc>
+      </w:tr>
+      <w:tr>
+        <w:tc>
+          <w:p>
+            <w:pPr>
+              <w:pStyle w:val="Compact"/>
+              <w:jc w:val="left"/>
+            </w:pPr>
+            <w:r>
+              <w:rPr>
+                <w:rStyle w:val="VerbatimChar"/>
+              </w:rPr>
+              <w:t xml:space="preserve">weight</w:t>
+            </w:r>
+          </w:p>
+        </w:tc>
+        <w:tc>
+          <w:p>
+            <w:pPr>
+              <w:pStyle w:val="Compact"/>
+              <w:jc w:val="left"/>
+            </w:pPr>
+            <w:r>
+              <w:t xml:space="preserve">1</w:t>
+            </w:r>
+          </w:p>
+        </w:tc>
+        <w:tc>
+          <w:p>
+            <w:pPr>
+              <w:pStyle w:val="Compact"/>
+              <w:jc w:val="left"/>
+            </w:pPr>
+            <w:r>
+              <w:rPr>
+                <w:rStyle w:val="VerbatimChar"/>
+              </w:rPr>
+              <w:t xml:space="preserve">ecvmamen_p1_en.dta</w:t>
+            </w:r>
+          </w:p>
+        </w:tc>
+        <w:tc>
+          <w:p>
+            <w:pPr>
+              <w:pStyle w:val="Compact"/>
+              <w:jc w:val="left"/>
+            </w:pPr>
+            <w:r>
+              <w:rPr>
+                <w:rStyle w:val="VerbatimChar"/>
+              </w:rPr>
+              <w:t xml:space="preserve">hhweight</w:t>
+            </w:r>
+          </w:p>
+        </w:tc>
+      </w:tr>
+      <w:tr>
+        <w:tc>
+          <w:p>
+            <w:pPr>
+              <w:pStyle w:val="Compact"/>
+              <w:jc w:val="left"/>
+            </w:pPr>
+            <w:r>
+              <w:rPr>
+                <w:rStyle w:val="VerbatimChar"/>
+              </w:rPr>
+              <w:t xml:space="preserve">weight</w:t>
+            </w:r>
+          </w:p>
+        </w:tc>
+        <w:tc>
+          <w:p>
+            <w:pPr>
+              <w:pStyle w:val="Compact"/>
+              <w:jc w:val="left"/>
+            </w:pPr>
+            <w:r>
+              <w:t xml:space="preserve">2</w:t>
+            </w:r>
+          </w:p>
+        </w:tc>
+        <w:tc>
+          <w:p>
+            <w:pPr>
+              <w:pStyle w:val="Compact"/>
+              <w:jc w:val="left"/>
+            </w:pPr>
+            <w:r>
+              <w:rPr>
+                <w:rStyle w:val="VerbatimChar"/>
+              </w:rPr>
+              <w:t xml:space="preserve">ECVMA2014_P1P2_ConsoMen.dta</w:t>
+            </w:r>
+          </w:p>
+        </w:tc>
+        <w:tc>
+          <w:p>
+            <w:pPr>
+              <w:pStyle w:val="Compact"/>
+              <w:jc w:val="left"/>
+            </w:pPr>
+            <w:r>
+              <w:rPr>
+                <w:rStyle w:val="VerbatimChar"/>
+              </w:rPr>
+              <w:t xml:space="preserve">hhweight</w:t>
+            </w:r>
+          </w:p>
+        </w:tc>
+      </w:tr>
+      <w:tr>
+        <w:tc>
+          <w:p>
+            <w:pPr>
+              <w:pStyle w:val="Compact"/>
+              <w:jc w:val="left"/>
+            </w:pPr>
+            <w:r>
+              <w:rPr>
+                <w:rStyle w:val="VerbatimChar"/>
+              </w:rPr>
+              <w:t xml:space="preserve">ea_id</w:t>
+            </w:r>
+          </w:p>
+        </w:tc>
+        <w:tc>
+          <w:p>
+            <w:pPr>
+              <w:pStyle w:val="Compact"/>
+              <w:jc w:val="left"/>
+            </w:pPr>
+            <w:r>
+              <w:t xml:space="preserve">1</w:t>
+            </w:r>
+          </w:p>
+        </w:tc>
+        <w:tc>
+          <w:p>
+            <w:pPr>
+              <w:pStyle w:val="Compact"/>
+              <w:jc w:val="left"/>
+            </w:pPr>
+            <w:r>
+              <w:rPr>
+                <w:rStyle w:val="VerbatimChar"/>
+              </w:rPr>
+              <w:t xml:space="preserve">ecvmamen_p1_en.dta</w:t>
+            </w:r>
+          </w:p>
+        </w:tc>
+        <w:tc>
+          <w:p>
+            <w:pPr>
+              <w:pStyle w:val="Compact"/>
+              <w:jc w:val="left"/>
+            </w:pPr>
+            <w:r>
+              <w:rPr>
+                <w:rStyle w:val="VerbatimChar"/>
+              </w:rPr>
+              <w:t xml:space="preserve">grappe</w:t>
+            </w:r>
+            <w:r>
+              <w:t xml:space="preserve"> </w:t>
+            </w:r>
+            <w:r>
+              <w:t xml:space="preserve">(cluster / PSU)</w:t>
+            </w:r>
+          </w:p>
+        </w:tc>
+      </w:tr>
+      <w:tr>
+        <w:tc>
+          <w:p>
+            <w:pPr>
+              <w:pStyle w:val="Compact"/>
+              <w:jc w:val="left"/>
+            </w:pPr>
+            <w:r>
+              <w:rPr>
+                <w:rStyle w:val="VerbatimChar"/>
+              </w:rPr>
+              <w:t xml:space="preserve">ea_id</w:t>
+            </w:r>
+          </w:p>
+        </w:tc>
+        <w:tc>
+          <w:p>
+            <w:pPr>
+              <w:pStyle w:val="Compact"/>
+              <w:jc w:val="left"/>
+            </w:pPr>
+            <w:r>
+              <w:t xml:space="preserve">2</w:t>
+            </w:r>
+          </w:p>
+        </w:tc>
+        <w:tc>
+          <w:p>
+            <w:pPr>
+              <w:pStyle w:val="Compact"/>
+              <w:jc w:val="left"/>
+            </w:pPr>
+            <w:r>
+              <w:rPr>
+                <w:rStyle w:val="VerbatimChar"/>
+              </w:rPr>
+              <w:t xml:space="preserve">ECVMA2_MS00P1.dta</w:t>
+            </w:r>
+          </w:p>
+        </w:tc>
+        <w:tc>
+          <w:p>
+            <w:pPr>
+              <w:pStyle w:val="Compact"/>
+              <w:jc w:val="left"/>
+            </w:pPr>
+            <w:r>
+              <w:rPr>
+                <w:rStyle w:val="VerbatimChar"/>
+              </w:rPr>
+              <w:t xml:space="preserve">GRAPPE</w:t>
+            </w:r>
+          </w:p>
+        </w:tc>
+      </w:tr>
+      <w:tr>
+        <w:tc>
+          <w:p>
+            <w:pPr>
+              <w:pStyle w:val="Compact"/>
+              <w:jc w:val="left"/>
+            </w:pPr>
+            <w:r>
+              <w:rPr>
+                <w:rStyle w:val="VerbatimChar"/>
+              </w:rPr>
+              <w:t xml:space="preserve">strataid</w:t>
+            </w:r>
+          </w:p>
+        </w:tc>
+        <w:tc>
+          <w:p>
+            <w:pPr>
+              <w:pStyle w:val="Compact"/>
+              <w:jc w:val="left"/>
+            </w:pPr>
+            <w:r>
+              <w:t xml:space="preserve">1</w:t>
+            </w:r>
+          </w:p>
+        </w:tc>
+        <w:tc>
+          <w:p>
+            <w:pPr>
+              <w:pStyle w:val="Compact"/>
+              <w:jc w:val="left"/>
+            </w:pPr>
+            <w:r>
+              <w:rPr>
+                <w:rStyle w:val="VerbatimChar"/>
+              </w:rPr>
+              <w:t xml:space="preserve">ecvmamen_p1_en.dta</w:t>
+            </w:r>
+          </w:p>
+        </w:tc>
+        <w:tc>
+          <w:p>
+            <w:pPr>
+              <w:pStyle w:val="Compact"/>
+              <w:jc w:val="left"/>
+            </w:pPr>
+            <w:r>
+              <w:t xml:space="preserve">official</w:t>
+            </w:r>
+            <w:r>
+              <w:t xml:space="preserve"> </w:t>
+            </w:r>
+            <w:r>
+              <w:rPr>
+                <w:rStyle w:val="VerbatimChar"/>
+              </w:rPr>
+              <w:t xml:space="preserve">strate</w:t>
+            </w:r>
+          </w:p>
+        </w:tc>
+      </w:tr>
+      <w:tr>
+        <w:tc>
+          <w:p>
+            <w:pPr>
+              <w:pStyle w:val="Compact"/>
+              <w:jc w:val="left"/>
+            </w:pPr>
+            <w:r>
+              <w:rPr>
+                <w:rStyle w:val="VerbatimChar"/>
+              </w:rPr>
+              <w:t xml:space="preserve">strataid</w:t>
+            </w:r>
+          </w:p>
+        </w:tc>
+        <w:tc>
+          <w:p>
+            <w:pPr>
+              <w:pStyle w:val="Compact"/>
+              <w:jc w:val="left"/>
+            </w:pPr>
+            <w:r>
+              <w:t xml:space="preserve">2</w:t>
+            </w:r>
+          </w:p>
+        </w:tc>
+        <w:tc>
+          <w:p>
+            <w:pPr>
+              <w:pStyle w:val="Compact"/>
+              <w:jc w:val="left"/>
+            </w:pPr>
+            <w:r>
+              <w:rPr>
+                <w:rStyle w:val="VerbatimChar"/>
+              </w:rPr>
+              <w:t xml:space="preserve">ECVMA2_MS00P1.dta</w:t>
+            </w:r>
+          </w:p>
+        </w:tc>
+        <w:tc>
+          <w:p>
+            <w:pPr>
+              <w:pStyle w:val="Compact"/>
+              <w:jc w:val="left"/>
+            </w:pPr>
+            <w:r>
+              <w:rPr>
+                <w:rStyle w:val="VerbatimChar"/>
+              </w:rPr>
+              <w:t xml:space="preserve">MS00Q01</w:t>
+            </w:r>
+            <w:r>
+              <w:t xml:space="preserve"> </w:t>
+            </w:r>
+            <w:r>
+              <w:t xml:space="preserve">(region; proxy - no 2014</w:t>
+            </w:r>
+            <w:r>
+              <w:t xml:space="preserve"> </w:t>
+            </w:r>
+            <w:r>
+              <w:rPr>
+                <w:rStyle w:val="VerbatimChar"/>
+              </w:rPr>
+              <w:t xml:space="preserve">strate</w:t>
+            </w:r>
+            <w:r>
+              <w:t xml:space="preserve">)</w:t>
+            </w:r>
+          </w:p>
+        </w:tc>
+      </w:tr>
+      <w:tr>
+        <w:tc>
+          <w:p>
+            <w:pPr>
+              <w:pStyle w:val="Compact"/>
+              <w:jc w:val="left"/>
+            </w:pPr>
+            <w:r>
+              <w:rPr>
+                <w:rStyle w:val="VerbatimChar"/>
+              </w:rPr>
+              <w:t xml:space="preserve">parcel_id</w:t>
+            </w:r>
+          </w:p>
+        </w:tc>
+        <w:tc>
+          <w:p>
+            <w:pPr>
+              <w:pStyle w:val="Compact"/>
+              <w:jc w:val="left"/>
+            </w:pPr>
+            <w:r>
+              <w:t xml:space="preserve">1</w:t>
+            </w:r>
+          </w:p>
+        </w:tc>
+        <w:tc>
+          <w:p>
+            <w:pPr>
+              <w:pStyle w:val="Compact"/>
+              <w:jc w:val="left"/>
+            </w:pPr>
+            <w:r>
+              <w:t xml:space="preserve">parcel roster</w:t>
+            </w:r>
+          </w:p>
+        </w:tc>
+        <w:tc>
+          <w:p>
+            <w:pPr>
+              <w:pStyle w:val="Compact"/>
+              <w:jc w:val="left"/>
+            </w:pPr>
+            <w:r>
+              <w:rPr>
+                <w:rStyle w:val="VerbatimChar"/>
+              </w:rPr>
+              <w:t xml:space="preserve">hid-as01q03-as01q05</w:t>
+            </w:r>
+          </w:p>
+        </w:tc>
+      </w:tr>
+      <w:tr>
+        <w:tc>
+          <w:p>
+            <w:pPr>
+              <w:pStyle w:val="Compact"/>
+              <w:jc w:val="left"/>
+            </w:pPr>
+            <w:r>
+              <w:rPr>
+                <w:rStyle w:val="VerbatimChar"/>
+              </w:rPr>
+              <w:t xml:space="preserve">parcel_id</w:t>
+            </w:r>
+          </w:p>
+        </w:tc>
+        <w:tc>
+          <w:p>
+            <w:pPr>
+              <w:pStyle w:val="Compact"/>
+              <w:jc w:val="left"/>
+            </w:pPr>
+            <w:r>
+              <w:t xml:space="preserve">2</w:t>
+            </w:r>
+          </w:p>
+        </w:tc>
+        <w:tc>
+          <w:p>
+            <w:pPr>
+              <w:pStyle w:val="Compact"/>
+              <w:jc w:val="left"/>
+            </w:pPr>
+            <w:r>
+              <w:t xml:space="preserve">parcel roster</w:t>
+            </w:r>
+          </w:p>
+        </w:tc>
+        <w:tc>
+          <w:p>
+            <w:pPr>
+              <w:pStyle w:val="Compact"/>
+              <w:jc w:val="left"/>
+            </w:pPr>
+            <w:r>
+              <w:rPr>
+                <w:rStyle w:val="VerbatimChar"/>
+              </w:rPr>
+              <w:t xml:space="preserve">GRAPPE-MENAGE-EXTENSION-AS01Q01-AS01Q03</w:t>
+            </w:r>
+          </w:p>
+        </w:tc>
+      </w:tr>
+      <w:tr>
+        <w:tc>
+          <w:p>
+            <w:pPr>
+              <w:pStyle w:val="Compact"/>
+              <w:jc w:val="left"/>
+            </w:pPr>
+            <w:r>
+              <w:rPr>
+                <w:rStyle w:val="VerbatimChar"/>
+              </w:rPr>
+              <w:t xml:space="preserve">year</w:t>
+            </w:r>
+          </w:p>
+        </w:tc>
+        <w:tc>
+          <w:p>
+            <w:pPr>
+              <w:pStyle w:val="Compact"/>
+              <w:jc w:val="left"/>
+            </w:pPr>
+            <w:r>
+              <w:t xml:space="preserve">1-2</w:t>
+            </w:r>
+          </w:p>
+        </w:tc>
+        <w:tc>
+          <w:p>
+            <w:pPr>
+              <w:pStyle w:val="Compact"/>
+              <w:jc w:val="left"/>
+            </w:pPr>
+            <w:r>
+              <w:t xml:space="preserve">—</w:t>
+            </w:r>
+          </w:p>
+        </w:tc>
+        <w:tc>
+          <w:p>
+            <w:pPr>
+              <w:pStyle w:val="Compact"/>
+              <w:jc w:val="left"/>
+            </w:pPr>
+            <w:r>
+              <w:t xml:space="preserve">2011 / 2014</w:t>
+            </w:r>
+          </w:p>
+        </w:tc>
+      </w:tr>
+    </w:tbl>
+    <w:p>
+      <w:pPr>
+        <w:pStyle w:val="Heading3"/>
+      </w:pPr>
+      <w:bookmarkStart w:id="49" w:name="X646e8461e11ea76f2f34efa79915905fa78ad77"/>
+      <w:r>
+        <w:t xml:space="preserve">5. Value labels of key source variables (verified)</w:t>
+      </w:r>
+      <w:bookmarkEnd w:id="49"/>
+    </w:p>
+    <w:p>
+      <w:pPr>
+        <w:pStyle w:val="FirstParagraph"/>
+      </w:pPr>
+      <w:r>
+        <w:rPr>
+          <w:b/>
+        </w:rPr>
+        <w:t xml:space="preserve">Occupation mode</w:t>
+      </w:r>
+      <w:r>
+        <w:t xml:space="preserve"> </w:t>
+      </w:r>
+      <w:r>
+        <w:t xml:space="preserve">-</w:t>
+      </w:r>
+      <w:r>
+        <w:t xml:space="preserve"> </w:t>
+      </w:r>
+      <w:r>
+        <w:rPr>
+          <w:rStyle w:val="VerbatimChar"/>
+        </w:rPr>
+        <w:t xml:space="preserve">as01q16</w:t>
+      </w:r>
+      <w:r>
+        <w:t xml:space="preserve"> </w:t>
+      </w:r>
+      <w:r>
+        <w:t xml:space="preserve">(2011) /</w:t>
+      </w:r>
+      <w:r>
+        <w:t xml:space="preserve"> </w:t>
+      </w:r>
+      <w:r>
+        <w:rPr>
+          <w:rStyle w:val="VerbatimChar"/>
+        </w:rPr>
+        <w:t xml:space="preserve">AS01Q14</w:t>
+      </w:r>
+      <w:r>
+        <w:t xml:space="preserve"> </w:t>
+      </w:r>
+      <w:r>
+        <w:t xml:space="preserve">(2014),</w:t>
+      </w:r>
+      <w:r>
+        <w:t xml:space="preserve"> </w:t>
+      </w:r>
+      <w:r>
+        <w:rPr>
+          <w:i/>
+        </w:rPr>
+        <w:t xml:space="preserve">“</w:t>
+      </w:r>
+      <w:r>
+        <w:rPr>
+          <w:i/>
+        </w:rPr>
+        <w:t xml:space="preserve">Mode d’occupation de la parcelle</w:t>
+      </w:r>
+      <w:r>
+        <w:rPr>
+          <w:i/>
+        </w:rPr>
+        <w:t xml:space="preserve">”</w:t>
+      </w:r>
+      <w:r>
+        <w:t xml:space="preserve">:</w:t>
+      </w:r>
+      <w:r>
+        <w:t xml:space="preserve"> </w:t>
+      </w:r>
+      <w:r>
+        <w:t xml:space="preserve">2011: 1 propriete · 2 pret (gratuit) · 3 hypotheque (gage) ·</w:t>
+      </w:r>
+      <w:r>
+        <w:t xml:space="preserve"> </w:t>
+      </w:r>
+      <w:r>
+        <w:rPr>
+          <w:b/>
+        </w:rPr>
+        <w:t xml:space="preserve">4 location</w:t>
+      </w:r>
+      <w:r>
+        <w:t xml:space="preserve"> </w:t>
+      </w:r>
+      <w:r>
+        <w:t xml:space="preserve">· 5 autres.</w:t>
+      </w:r>
+      <w:r>
+        <w:t xml:space="preserve"> </w:t>
+      </w:r>
+      <w:r>
+        <w:t xml:space="preserve">2014: 1 propriete · 2 copropriete ·</w:t>
+      </w:r>
+      <w:r>
+        <w:t xml:space="preserve"> </w:t>
+      </w:r>
+      <w:r>
+        <w:rPr>
+          <w:b/>
+        </w:rPr>
+        <w:t xml:space="preserve">3 location</w:t>
+      </w:r>
+      <w:r>
+        <w:t xml:space="preserve"> </w:t>
+      </w:r>
+      <w:r>
+        <w:t xml:space="preserve">· 4 hypotheque · 5 pret · 6 autres.</w:t>
+      </w:r>
+      <w:r>
+        <w:t xml:space="preserve"> </w:t>
+      </w:r>
+      <w:r>
+        <w:rPr>
+          <w:i/>
+        </w:rPr>
+        <w:t xml:space="preserve">(No sharecropping / metayage category in either wave.)</w:t>
+      </w:r>
+    </w:p>
+    <w:p>
+      <w:pPr>
+        <w:pStyle w:val="BodyText"/>
+      </w:pPr>
+      <w:r>
+        <w:rPr>
+          <w:b/>
+        </w:rPr>
+        <w:t xml:space="preserve">Acquisition mode</w:t>
+      </w:r>
+      <w:r>
+        <w:t xml:space="preserve"> </w:t>
+      </w:r>
+      <w:r>
+        <w:t xml:space="preserve">-</w:t>
+      </w:r>
+      <w:r>
+        <w:t xml:space="preserve"> </w:t>
+      </w:r>
+      <w:r>
+        <w:rPr>
+          <w:rStyle w:val="VerbatimChar"/>
+        </w:rPr>
+        <w:t xml:space="preserve">as01q19</w:t>
+      </w:r>
+      <w:r>
+        <w:t xml:space="preserve"> </w:t>
+      </w:r>
+      <w:r>
+        <w:t xml:space="preserve">/</w:t>
+      </w:r>
+      <w:r>
+        <w:t xml:space="preserve"> </w:t>
+      </w:r>
+      <w:r>
+        <w:rPr>
+          <w:rStyle w:val="VerbatimChar"/>
+        </w:rPr>
+        <w:t xml:space="preserve">AS01Q18</w:t>
+      </w:r>
+      <w:r>
+        <w:t xml:space="preserve">:</w:t>
+      </w:r>
+      <w:r>
+        <w:t xml:space="preserve"> </w:t>
+      </w:r>
+      <w:r>
+        <w:rPr>
+          <w:b/>
+        </w:rPr>
+        <w:t xml:space="preserve">1 Achat</w:t>
+      </w:r>
+      <w:r>
+        <w:t xml:space="preserve"> </w:t>
+      </w:r>
+      <w:r>
+        <w:t xml:space="preserve">· 2 Heritage · 3 Don ·</w:t>
+      </w:r>
+      <w:r>
+        <w:t xml:space="preserve"> </w:t>
+      </w:r>
+      <w:r>
+        <w:t xml:space="preserve">4 Prise de possession simple · 5 Autres · 9 manquant.</w:t>
+      </w:r>
+    </w:p>
+    <w:p>
+      <w:pPr>
+        <w:pStyle w:val="BodyText"/>
+      </w:pPr>
+      <w:r>
+        <w:rPr>
+          <w:b/>
+        </w:rPr>
+        <w:t xml:space="preserve">Title document</w:t>
+      </w:r>
+      <w:r>
+        <w:t xml:space="preserve"> </w:t>
+      </w:r>
+      <w:r>
+        <w:t xml:space="preserve">-</w:t>
+      </w:r>
+      <w:r>
+        <w:t xml:space="preserve"> </w:t>
+      </w:r>
+      <w:r>
+        <w:rPr>
+          <w:rStyle w:val="VerbatimChar"/>
+        </w:rPr>
+        <w:t xml:space="preserve">as01q18</w:t>
+      </w:r>
+      <w:r>
+        <w:t xml:space="preserve"> </w:t>
+      </w:r>
+      <w:r>
+        <w:t xml:space="preserve">/</w:t>
+      </w:r>
+      <w:r>
+        <w:t xml:space="preserve"> </w:t>
+      </w:r>
+      <w:r>
+        <w:rPr>
+          <w:rStyle w:val="VerbatimChar"/>
+        </w:rPr>
+        <w:t xml:space="preserve">AS01Q15</w:t>
+      </w:r>
+      <w:r>
+        <w:t xml:space="preserve">: 1 titre foncier · 2 certificat coutumier ·</w:t>
+      </w:r>
+      <w:r>
+        <w:t xml:space="preserve"> </w:t>
+      </w:r>
+      <w:r>
+        <w:t xml:space="preserve">3 attestation de vente · 4 autre document · 5 aucun document · 9 manquant.</w:t>
+      </w:r>
+    </w:p>
+    <w:p>
+      <w:pPr>
+        <w:pStyle w:val="BodyText"/>
+      </w:pPr>
+      <w:r>
+        <w:rPr>
+          <w:b/>
+        </w:rPr>
+        <w:t xml:space="preserve">Disposition (reason for non-cultivation)</w:t>
+      </w:r>
+      <w:r>
+        <w:t xml:space="preserve"> </w:t>
+      </w:r>
+      <w:r>
+        <w:t xml:space="preserve">-</w:t>
+      </w:r>
+      <w:r>
+        <w:t xml:space="preserve"> </w:t>
+      </w:r>
+      <w:r>
+        <w:rPr>
+          <w:rStyle w:val="VerbatimChar"/>
+        </w:rPr>
+        <w:t xml:space="preserve">as01q41</w:t>
+      </w:r>
+      <w:r>
+        <w:t xml:space="preserve"> </w:t>
+      </w:r>
+      <w:r>
+        <w:t xml:space="preserve">/</w:t>
+      </w:r>
+      <w:r>
+        <w:t xml:space="preserve"> </w:t>
+      </w:r>
+      <w:r>
+        <w:rPr>
+          <w:rStyle w:val="VerbatimChar"/>
+        </w:rPr>
+        <w:t xml:space="preserve">AS01Q39</w:t>
+      </w:r>
+      <w:r>
+        <w:t xml:space="preserve">: 1 jachere ·</w:t>
+      </w:r>
+      <w:r>
+        <w:t xml:space="preserve"> </w:t>
+      </w:r>
+      <w:r>
+        <w:t xml:space="preserve">2 prete a un autre · 3 hypothequee ·</w:t>
+      </w:r>
+      <w:r>
+        <w:t xml:space="preserve"> </w:t>
+      </w:r>
+      <w:r>
+        <w:rPr>
+          <w:b/>
+        </w:rPr>
+        <w:t xml:space="preserve">4 louee a un autre</w:t>
+      </w:r>
+      <w:r>
+        <w:t xml:space="preserve"> </w:t>
+      </w:r>
+      <w:r>
+        <w:t xml:space="preserve">· 5 autre · 9 manquant.</w:t>
+      </w:r>
+    </w:p>
+    <w:p>
+      <w:pPr>
+        <w:pStyle w:val="Heading3"/>
+      </w:pPr>
+      <w:bookmarkStart w:id="50" w:name="harmonization-decisions-caveats-niger"/>
+      <w:r>
+        <w:t xml:space="preserve">6. Harmonization decisions &amp; caveats (Niger)</w:t>
+      </w:r>
+      <w:bookmarkEnd w:id="50"/>
+    </w:p>
+    <w:p>
+      <w:pPr>
+        <w:numPr>
+          <w:ilvl w:val="0"/>
+          <w:numId w:val="1004"/>
+        </w:numPr>
+        <w:pStyle w:val="Compact"/>
+      </w:pPr>
+      <w:r>
+        <w:rPr>
+          <w:b/>
+        </w:rPr>
+        <w:t xml:space="preserve">Rental variables derived here, not inherited</w:t>
+      </w:r>
+      <w:r>
+        <w:t xml:space="preserve"> </w:t>
+      </w:r>
+      <w:r>
+        <w:t xml:space="preserve">- upstream built only</w:t>
+      </w:r>
+      <w:r>
+        <w:t xml:space="preserve"> </w:t>
+      </w:r>
+      <w:r>
+        <w:rPr>
+          <w:rStyle w:val="VerbatimChar"/>
+        </w:rPr>
+        <w:t xml:space="preserve">plot_owned</w:t>
+      </w:r>
+      <w:r>
+        <w:t xml:space="preserve">/</w:t>
+      </w:r>
+      <w:r>
+        <w:rPr>
+          <w:rStyle w:val="VerbatimChar"/>
+        </w:rPr>
+        <w:t xml:space="preserve">plot_certificate</w:t>
+      </w:r>
+      <w:r>
+        <w:t xml:space="preserve">. Rented-in (Location), purchased (Achat) and</w:t>
+      </w:r>
+      <w:r>
+        <w:t xml:space="preserve"> </w:t>
+      </w:r>
+      <w:r>
+        <w:t xml:space="preserve">rented-out (louee a un autre) are constructed from the occupation, acquisition and</w:t>
+      </w:r>
+      <w:r>
+        <w:t xml:space="preserve"> </w:t>
+      </w:r>
+      <w:r>
+        <w:t xml:space="preserve">disposition questions.</w:t>
+      </w:r>
+    </w:p>
+    <w:p>
+      <w:pPr>
+        <w:numPr>
+          <w:ilvl w:val="0"/>
+          <w:numId w:val="1004"/>
+        </w:numPr>
+        <w:pStyle w:val="Compact"/>
+      </w:pPr>
+      <w:r>
+        <w:rPr>
+          <w:b/>
+        </w:rPr>
+        <w:t xml:space="preserve">Rented-in = rental (Location) only</w:t>
+      </w:r>
+      <w:r>
+        <w:t xml:space="preserve"> </w:t>
+      </w:r>
+      <w:r>
+        <w:t xml:space="preserve">- Niger has no sharecropping category, so</w:t>
+      </w:r>
+      <w:r>
+        <w:t xml:space="preserve"> </w:t>
+      </w:r>
+      <w:r>
+        <w:t xml:space="preserve">unlike Ethiopia/Malawi/Mali the rented-in measure excludes sharecropping. Free loan</w:t>
+      </w:r>
+      <w:r>
+        <w:t xml:space="preserve"> </w:t>
+      </w:r>
+      <w:r>
+        <w:t xml:space="preserve">(pret) and pledge (hypotheque) are also excluded as non-market arrangements.</w:t>
+      </w:r>
+    </w:p>
+    <w:p>
+      <w:pPr>
+        <w:numPr>
+          <w:ilvl w:val="0"/>
+          <w:numId w:val="1004"/>
+        </w:numPr>
+        <w:pStyle w:val="Compact"/>
+      </w:pPr>
+      <w:r>
+        <w:rPr>
+          <w:b/>
+        </w:rPr>
+        <w:t xml:space="preserve">Rented-out UNDERCOUNTS - treat as a lower bound.</w:t>
+      </w:r>
+      <w:r>
+        <w:t xml:space="preserve"> </w:t>
+      </w:r>
+      <w:r>
+        <w:t xml:space="preserve">It is captured only through the</w:t>
+      </w:r>
+      <w:r>
+        <w:t xml:space="preserve"> </w:t>
+      </w:r>
+      <w:r>
+        <w:t xml:space="preserve">“</w:t>
+      </w:r>
+      <w:r>
+        <w:t xml:space="preserve">reason for non-cultivation</w:t>
+      </w:r>
+      <w:r>
+        <w:t xml:space="preserve">”</w:t>
+      </w:r>
+      <w:r>
+        <w:t xml:space="preserve"> </w:t>
+      </w:r>
+      <w:r>
+        <w:t xml:space="preserve">item (</w:t>
+      </w:r>
+      <w:r>
+        <w:rPr>
+          <w:rStyle w:val="VerbatimChar"/>
+        </w:rPr>
+        <w:t xml:space="preserve">as01q41==4</w:t>
+      </w:r>
+      <w:r>
+        <w:t xml:space="preserve">), so parcels rented out are largely</w:t>
+      </w:r>
+      <w:r>
+        <w:t xml:space="preserve"> </w:t>
+      </w:r>
+      <w:r>
+        <w:t xml:space="preserve">under-represented in this operated-parcel roster (weighted rate ~0.0% in 2011, ~0.2%</w:t>
+      </w:r>
+      <w:r>
+        <w:t xml:space="preserve"> </w:t>
+      </w:r>
+      <w:r>
+        <w:t xml:space="preserve">in 2014). The code is real (unlike Mali), but the level is not reliable.</w:t>
+      </w:r>
+    </w:p>
+    <w:p>
+      <w:pPr>
+        <w:numPr>
+          <w:ilvl w:val="0"/>
+          <w:numId w:val="1004"/>
+        </w:numPr>
+        <w:pStyle w:val="Compact"/>
+      </w:pPr>
+      <w:r>
+        <w:rPr>
+          <w:b/>
+        </w:rPr>
+        <w:t xml:space="preserve">Cross-wave comparability - do not read the rented-in change.</w:t>
+      </w:r>
+      <w:r>
+        <w:t xml:space="preserve"> </w:t>
+      </w:r>
+      <w:r>
+        <w:t xml:space="preserve">2011 and 2014 are</w:t>
+      </w:r>
+      <w:r>
+        <w:t xml:space="preserve"> </w:t>
+      </w:r>
+      <w:r>
+        <w:t xml:space="preserve">independent cross-sections with different occupation-mode category schemes and samples;</w:t>
+      </w:r>
+      <w:r>
+        <w:t xml:space="preserve"> </w:t>
+      </w:r>
+      <w:r>
+        <w:t xml:space="preserve">the rented-in rate falls from ~14% (2011) to ~2.4% (2014), a swing too large to be</w:t>
+      </w:r>
+      <w:r>
+        <w:t xml:space="preserve"> </w:t>
+      </w:r>
+      <w:r>
+        <w:t xml:space="preserve">behavioral and not directly comparable across the redesign. Check CI overlap.</w:t>
+      </w:r>
+    </w:p>
+    <w:p>
+      <w:pPr>
+        <w:numPr>
+          <w:ilvl w:val="0"/>
+          <w:numId w:val="1004"/>
+        </w:numPr>
+        <w:pStyle w:val="Compact"/>
+      </w:pPr>
+      <w:r>
+        <w:rPr>
+          <w:b/>
+        </w:rPr>
+        <w:t xml:space="preserve">Certificate</w:t>
+      </w:r>
+      <w:r>
+        <w:t xml:space="preserve"> </w:t>
+      </w:r>
+      <w:r>
+        <w:t xml:space="preserve">= the parcel has any tenure document (</w:t>
+      </w:r>
+      <w:r>
+        <w:rPr>
+          <w:rStyle w:val="VerbatimChar"/>
+        </w:rPr>
+        <w:t xml:space="preserve">title in {1,2,3,4}</w:t>
+      </w:r>
+      <w:r>
+        <w:t xml:space="preserve">);</w:t>
+      </w:r>
+      <w:r>
+        <w:t xml:space="preserve"> </w:t>
+      </w:r>
+      <w:r>
+        <w:t xml:space="preserve">“</w:t>
+      </w:r>
+      <w:r>
+        <w:t xml:space="preserve">aucun</w:t>
+      </w:r>
+      <w:r>
+        <w:t xml:space="preserve"> </w:t>
+      </w:r>
+      <w:r>
+        <w:t xml:space="preserve">document</w:t>
+      </w:r>
+      <w:r>
+        <w:t xml:space="preserve">”</w:t>
+      </w:r>
+      <w:r>
+        <w:t xml:space="preserve"> </w:t>
+      </w:r>
+      <w:r>
+        <w:t xml:space="preserve">(5) = 0,</w:t>
+      </w:r>
+      <w:r>
+        <w:t xml:space="preserve"> </w:t>
+      </w:r>
+      <w:r>
+        <w:t xml:space="preserve">“</w:t>
+      </w:r>
+      <w:r>
+        <w:t xml:space="preserve">manquant</w:t>
+      </w:r>
+      <w:r>
+        <w:t xml:space="preserve">”</w:t>
+      </w:r>
+      <w:r>
+        <w:t xml:space="preserve"> </w:t>
+      </w:r>
+      <w:r>
+        <w:t xml:space="preserve">(9) = missing.</w:t>
+      </w:r>
+    </w:p>
+    <w:p>
+      <w:pPr>
+        <w:numPr>
+          <w:ilvl w:val="0"/>
+          <w:numId w:val="1004"/>
+        </w:numPr>
+        <w:pStyle w:val="Compact"/>
+      </w:pPr>
+      <w:r>
+        <w:rPr>
+          <w:b/>
+        </w:rPr>
+        <w:t xml:space="preserve">Strata</w:t>
+      </w:r>
+      <w:r>
+        <w:t xml:space="preserve">: 2011 uses the official</w:t>
+      </w:r>
+      <w:r>
+        <w:t xml:space="preserve"> </w:t>
+      </w:r>
+      <w:r>
+        <w:rPr>
+          <w:rStyle w:val="VerbatimChar"/>
+        </w:rPr>
+        <w:t xml:space="preserve">strate</w:t>
+      </w:r>
+      <w:r>
+        <w:t xml:space="preserve">; 2014 has no</w:t>
+      </w:r>
+      <w:r>
+        <w:t xml:space="preserve"> </w:t>
+      </w:r>
+      <w:r>
+        <w:rPr>
+          <w:rStyle w:val="VerbatimChar"/>
+        </w:rPr>
+        <w:t xml:space="preserve">strate</w:t>
+      </w:r>
+      <w:r>
+        <w:t xml:space="preserve"> </w:t>
+      </w:r>
+      <w:r>
+        <w:t xml:space="preserve">in its files, so we</w:t>
+      </w:r>
+      <w:r>
+        <w:t xml:space="preserve"> </w:t>
+      </w:r>
+      <w:r>
+        <w:t xml:space="preserve">use region (</w:t>
+      </w:r>
+      <w:r>
+        <w:rPr>
+          <w:rStyle w:val="VerbatimChar"/>
+        </w:rPr>
+        <w:t xml:space="preserve">MS00Q01</w:t>
+      </w:r>
+      <w:r>
+        <w:t xml:space="preserve">) as a coarser self-contained stratum proxy.</w:t>
+      </w:r>
+    </w:p>
+    <w:p>
+      <w:r>
+        <w:pict>
+          <v:rect style="width:0;height:1.5pt" o:hralign="center" o:hrstd="t" o:hr="t"/>
+        </w:pict>
+      </w:r>
+    </w:p>
+    <w:p>
+      <w:pPr>
+        <w:pStyle w:val="FirstParagraph"/>
+      </w:pPr>
+      <w:r>
         <w:rPr>
           <w:i/>
         </w:rPr>
@@ -14330,7 +16781,7 @@
         <w:rPr>
           <w:i/>
         </w:rPr>
-        <w:t xml:space="preserve">(ETH ESS1-5, MWI IHPS1-4, MLI EACI1-2)</w:t>
+        <w:t xml:space="preserve">(ETH ESS1-5, MWI IHPS1-4, MLI EACI1-2,</w:t>
       </w:r>
       <w:r>
         <w:rPr>
@@ -14342,7 +16793,7 @@
         <w:rPr>
           <w:i/>
         </w:rPr>
-        <w:t xml:space="preserve">and the raw survey modules, with all source variables, codes, and value labels verified</w:t>
+        <w:t xml:space="preserve">NER ECVMA1-2) and the raw survey modules, with all source variables, codes, and value</w:t>
       </w:r>
       <w:r>
         <w:rPr>
@@ -14354,7 +16805,19 @@
         <w:rPr>
           <w:i/>
         </w:rPr>
-        <w:t xml:space="preserve">against the data. Extend with one new country section (1-6) per country as the workflow grows.</w:t>
+        <w:t xml:space="preserve">labels verified against the data. Extend with one new country section (1-6) per country</w:t>
+      </w:r>
+      <w:r>
+        <w:rPr>
+          <w:i/>
+        </w:rPr>
+        <w:t xml:space="preserve"> </w:t>
+      </w:r>
+      <w:r>
+        <w:rPr>
+          <w:i/>
+        </w:rPr>
+        <w:t xml:space="preserve">as the workflow grows.</w:t>
       </w:r>
     </w:p>
     <w:sectPr/>
@@ -14603,6 +17066,9 @@
     <w:abstractNumId w:val="991"/>
   </w:num>
   <w:num w:numId="1003">
+    <w:abstractNumId w:val="991"/>
+  </w:num>
+  <w:num w:numId="1004">
     <w:abstractNumId w:val="991"/>
   </w:num>
 </w:numbering>

</xml_diff>

<commit_message>
Add Nigeria extractor (GHS 1-5, parcel-level) + provenance; enable in MASTER
</commit_message>
<xml_diff>
--- a/Reference/variable_provenance.docx
+++ b/Reference/variable_provenance.docx
@@ -1443,6 +1443,70 @@
           </w:p>
         </w:tc>
       </w:tr>
+      <w:tr>
+        <w:tc>
+          <w:p>
+            <w:pPr>
+              <w:pStyle w:val="Compact"/>
+              <w:jc w:val="left"/>
+            </w:pPr>
+            <w:r>
+              <w:t xml:space="preserve">Nigeria</w:t>
+            </w:r>
+          </w:p>
+        </w:tc>
+        <w:tc>
+          <w:p>
+            <w:pPr>
+              <w:pStyle w:val="Compact"/>
+              <w:jc w:val="left"/>
+            </w:pPr>
+            <w:r>
+              <w:rPr>
+                <w:rStyle w:val="VerbatimChar"/>
+              </w:rPr>
+              <w:t xml:space="preserve">parcel_certificate</w:t>
+            </w:r>
+          </w:p>
+        </w:tc>
+        <w:tc>
+          <w:p>
+            <w:pPr>
+              <w:pStyle w:val="Compact"/>
+              <w:jc w:val="left"/>
+            </w:pPr>
+            <w:r>
+              <w:t xml:space="preserve">2011</w:t>
+            </w:r>
+          </w:p>
+        </w:tc>
+        <w:tc>
+          <w:p>
+            <w:pPr>
+              <w:pStyle w:val="Compact"/>
+              <w:jc w:val="left"/>
+            </w:pPr>
+            <w:r>
+              <w:t xml:space="preserve">GHS wave 1 has</w:t>
+            </w:r>
+            <w:r>
+              <w:t xml:space="preserve"> </w:t>
+            </w:r>
+            <w:r>
+              <w:rPr>
+                <w:b/>
+              </w:rPr>
+              <w:t xml:space="preserve">no certificate-of-occupancy question</w:t>
+            </w:r>
+            <w:r>
+              <w:t xml:space="preserve"> </w:t>
+            </w:r>
+            <w:r>
+              <w:t xml:space="preserve">in the tenure module (added from wave 2).</w:t>
+            </w:r>
+          </w:p>
+        </w:tc>
+      </w:tr>
     </w:tbl>
     <w:p>
       <w:pPr>
@@ -16750,9 +16814,2518 @@
     </w:p>
     <w:p>
       <w:pPr>
+        <w:pStyle w:val="Heading2"/>
+      </w:pPr>
+      <w:bookmarkStart w:id="51" w:name="X4370d6f7e22f04e7f2986bdcf7fe062ac53545f"/>
+      <w:r>
+        <w:t xml:space="preserve">NIGERIA — General Household Survey-Panel (GHS)</w:t>
+      </w:r>
+      <w:bookmarkEnd w:id="51"/>
+    </w:p>
+    <w:p>
+      <w:pPr>
         <w:pStyle w:val="FirstParagraph"/>
       </w:pPr>
       <w:r>
+        <w:t xml:space="preserve">Five GHS-Panel waves (2010/11, 2012/13, 2015/16, 2018/19, 2023). Plot id =</w:t>
+      </w:r>
+      <w:r>
+        <w:t xml:space="preserve"> </w:t>
+      </w:r>
+      <w:r>
+        <w:rPr>
+          <w:rStyle w:val="VerbatimChar"/>
+        </w:rPr>
+        <w:t xml:space="preserve">hhid-plotid</w:t>
+      </w:r>
+      <w:r>
+        <w:t xml:space="preserve">. Tenure (acquisition, rented-out, certificate) is in the tenure</w:t>
+      </w:r>
+      <w:r>
+        <w:t xml:space="preserve"> </w:t>
+      </w:r>
+      <w:r>
+        <w:t xml:space="preserve">module; area is in the plot roster - the two are merged on</w:t>
+      </w:r>
+      <w:r>
+        <w:t xml:space="preserve"> </w:t>
+      </w:r>
+      <w:r>
+        <w:rPr>
+          <w:rStyle w:val="VerbatimChar"/>
+        </w:rPr>
+        <w:t xml:space="preserve">hhid-plotid</w:t>
+      </w:r>
+      <w:r>
+        <w:t xml:space="preserve">.</w:t>
+      </w:r>
+    </w:p>
+    <w:p>
+      <w:pPr>
+        <w:pStyle w:val="BlockText"/>
+      </w:pPr>
+      <w:r>
+        <w:rPr>
+          <w:b/>
+        </w:rPr>
+        <w:t xml:space="preserve">Unit note.</w:t>
+      </w:r>
+      <w:r>
+        <w:t xml:space="preserve"> </w:t>
+      </w:r>
+      <w:r>
+        <w:t xml:space="preserve">The</w:t>
+      </w:r>
+      <w:r>
+        <w:t xml:space="preserve"> </w:t>
+      </w:r>
+      <w:r>
+        <w:rPr>
+          <w:rStyle w:val="VerbatimChar"/>
+        </w:rPr>
+        <w:t xml:space="preserve">parcel</w:t>
+      </w:r>
+      <w:r>
+        <w:t xml:space="preserve"> </w:t>
+      </w:r>
+      <w:r>
+        <w:t xml:space="preserve">is the plot record. Tenure variable names shift:</w:t>
+      </w:r>
+      <w:r>
+        <w:t xml:space="preserve"> </w:t>
+      </w:r>
+      <w:r>
+        <w:t xml:space="preserve">wave 1 uses</w:t>
+      </w:r>
+      <w:r>
+        <w:t xml:space="preserve"> </w:t>
+      </w:r>
+      <w:r>
+        <w:rPr>
+          <w:rStyle w:val="VerbatimChar"/>
+        </w:rPr>
+        <w:t xml:space="preserve">s11bq*</w:t>
+      </w:r>
+      <w:r>
+        <w:t xml:space="preserve">; waves 2-5 use</w:t>
+      </w:r>
+      <w:r>
+        <w:t xml:space="preserve"> </w:t>
+      </w:r>
+      <w:r>
+        <w:rPr>
+          <w:rStyle w:val="VerbatimChar"/>
+        </w:rPr>
+        <w:t xml:space="preserve">s11b1q*</w:t>
+      </w:r>
+      <w:r>
+        <w:t xml:space="preserve">.</w:t>
+      </w:r>
+    </w:p>
+    <w:p>
+      <w:pPr>
+        <w:pStyle w:val="Heading3"/>
+      </w:pPr>
+      <w:bookmarkStart w:id="52" w:name="survey-wave-key-4"/>
+      <w:r>
+        <w:t xml:space="preserve">1. Survey &amp; wave key</w:t>
+      </w:r>
+      <w:bookmarkEnd w:id="52"/>
+    </w:p>
+    <w:tbl>
+      <w:tblPr>
+        <w:tblStyle w:val="Table"/>
+        <w:tblW w:type="pct" w:w="0.0"/>
+        <w:tblLook w:firstRow="1"/>
+      </w:tblPr>
+      <w:tblGrid/>
+      <w:tr>
+        <w:trPr>
+          <w:cnfStyle w:firstRow="1"/>
+        </w:trPr>
+        <w:tc>
+          <w:tcPr>
+            <w:tcBorders>
+              <w:bottom w:val="single"/>
+            </w:tcBorders>
+            <w:vAlign w:val="bottom"/>
+          </w:tcPr>
+          <w:p>
+            <w:pPr>
+              <w:pStyle w:val="Compact"/>
+              <w:jc w:val="left"/>
+            </w:pPr>
+            <w:r>
+              <w:t xml:space="preserve">Wave</w:t>
+            </w:r>
+          </w:p>
+        </w:tc>
+        <w:tc>
+          <w:tcPr>
+            <w:tcBorders>
+              <w:bottom w:val="single"/>
+            </w:tcBorders>
+            <w:vAlign w:val="bottom"/>
+          </w:tcPr>
+          <w:p>
+            <w:pPr>
+              <w:pStyle w:val="Compact"/>
+              <w:jc w:val="left"/>
+            </w:pPr>
+            <w:r>
+              <w:t xml:space="preserve">Round folder</w:t>
+            </w:r>
+          </w:p>
+        </w:tc>
+        <w:tc>
+          <w:tcPr>
+            <w:tcBorders>
+              <w:bottom w:val="single"/>
+            </w:tcBorders>
+            <w:vAlign w:val="bottom"/>
+          </w:tcPr>
+          <w:p>
+            <w:pPr>
+              <w:pStyle w:val="Compact"/>
+              <w:jc w:val="left"/>
+            </w:pPr>
+            <w:r>
+              <w:t xml:space="preserve">Year</w:t>
+            </w:r>
+          </w:p>
+        </w:tc>
+        <w:tc>
+          <w:tcPr>
+            <w:tcBorders>
+              <w:bottom w:val="single"/>
+            </w:tcBorders>
+            <w:vAlign w:val="bottom"/>
+          </w:tcPr>
+          <w:p>
+            <w:pPr>
+              <w:pStyle w:val="Compact"/>
+              <w:jc w:val="left"/>
+            </w:pPr>
+            <w:r>
+              <w:t xml:space="preserve">Tenure module</w:t>
+            </w:r>
+          </w:p>
+        </w:tc>
+        <w:tc>
+          <w:tcPr>
+            <w:tcBorders>
+              <w:bottom w:val="single"/>
+            </w:tcBorders>
+            <w:vAlign w:val="bottom"/>
+          </w:tcPr>
+          <w:p>
+            <w:pPr>
+              <w:pStyle w:val="Compact"/>
+              <w:jc w:val="left"/>
+            </w:pPr>
+            <w:r>
+              <w:t xml:space="preserve">Plot roster</w:t>
+            </w:r>
+          </w:p>
+        </w:tc>
+      </w:tr>
+      <w:tr>
+        <w:tc>
+          <w:p>
+            <w:pPr>
+              <w:pStyle w:val="Compact"/>
+              <w:jc w:val="left"/>
+            </w:pPr>
+            <w:r>
+              <w:t xml:space="preserve">1</w:t>
+            </w:r>
+          </w:p>
+        </w:tc>
+        <w:tc>
+          <w:p>
+            <w:pPr>
+              <w:pStyle w:val="Compact"/>
+              <w:jc w:val="left"/>
+            </w:pPr>
+            <w:r>
+              <w:rPr>
+                <w:rStyle w:val="VerbatimChar"/>
+              </w:rPr>
+              <w:t xml:space="preserve">Nigeria/GHS 10</w:t>
+            </w:r>
+          </w:p>
+        </w:tc>
+        <w:tc>
+          <w:p>
+            <w:pPr>
+              <w:pStyle w:val="Compact"/>
+              <w:jc w:val="left"/>
+            </w:pPr>
+            <w:r>
+              <w:t xml:space="preserve">2011</w:t>
+            </w:r>
+          </w:p>
+        </w:tc>
+        <w:tc>
+          <w:p>
+            <w:pPr>
+              <w:pStyle w:val="Compact"/>
+              <w:jc w:val="left"/>
+            </w:pPr>
+            <w:r>
+              <w:rPr>
+                <w:rStyle w:val="VerbatimChar"/>
+              </w:rPr>
+              <w:t xml:space="preserve">sect11b_plantingw1</w:t>
+            </w:r>
+            <w:r>
+              <w:t xml:space="preserve"> </w:t>
+            </w:r>
+            <w:r>
+              <w:t xml:space="preserve">(</w:t>
+            </w:r>
+            <w:r>
+              <w:rPr>
+                <w:rStyle w:val="VerbatimChar"/>
+              </w:rPr>
+              <w:t xml:space="preserve">s11bq*</w:t>
+            </w:r>
+            <w:r>
+              <w:t xml:space="preserve">)</w:t>
+            </w:r>
+          </w:p>
+        </w:tc>
+        <w:tc>
+          <w:p>
+            <w:pPr>
+              <w:pStyle w:val="Compact"/>
+              <w:jc w:val="left"/>
+            </w:pPr>
+            <w:r>
+              <w:rPr>
+                <w:rStyle w:val="VerbatimChar"/>
+              </w:rPr>
+              <w:t xml:space="preserve">sect11a1_plantingw1</w:t>
+            </w:r>
+          </w:p>
+        </w:tc>
+      </w:tr>
+      <w:tr>
+        <w:tc>
+          <w:p>
+            <w:pPr>
+              <w:pStyle w:val="Compact"/>
+              <w:jc w:val="left"/>
+            </w:pPr>
+            <w:r>
+              <w:t xml:space="preserve">2</w:t>
+            </w:r>
+          </w:p>
+        </w:tc>
+        <w:tc>
+          <w:p>
+            <w:pPr>
+              <w:pStyle w:val="Compact"/>
+              <w:jc w:val="left"/>
+            </w:pPr>
+            <w:r>
+              <w:rPr>
+                <w:rStyle w:val="VerbatimChar"/>
+              </w:rPr>
+              <w:t xml:space="preserve">Nigeria/GHS 12</w:t>
+            </w:r>
+          </w:p>
+        </w:tc>
+        <w:tc>
+          <w:p>
+            <w:pPr>
+              <w:pStyle w:val="Compact"/>
+              <w:jc w:val="left"/>
+            </w:pPr>
+            <w:r>
+              <w:t xml:space="preserve">2013</w:t>
+            </w:r>
+          </w:p>
+        </w:tc>
+        <w:tc>
+          <w:p>
+            <w:pPr>
+              <w:pStyle w:val="Compact"/>
+              <w:jc w:val="left"/>
+            </w:pPr>
+            <w:r>
+              <w:rPr>
+                <w:rStyle w:val="VerbatimChar"/>
+              </w:rPr>
+              <w:t xml:space="preserve">sect11b1_plantingw2</w:t>
+            </w:r>
+            <w:r>
+              <w:t xml:space="preserve"> </w:t>
+            </w:r>
+            <w:r>
+              <w:t xml:space="preserve">(</w:t>
+            </w:r>
+            <w:r>
+              <w:rPr>
+                <w:rStyle w:val="VerbatimChar"/>
+              </w:rPr>
+              <w:t xml:space="preserve">s11b1q*</w:t>
+            </w:r>
+            <w:r>
+              <w:t xml:space="preserve">)</w:t>
+            </w:r>
+          </w:p>
+        </w:tc>
+        <w:tc>
+          <w:p>
+            <w:pPr>
+              <w:pStyle w:val="Compact"/>
+              <w:jc w:val="left"/>
+            </w:pPr>
+            <w:r>
+              <w:rPr>
+                <w:rStyle w:val="VerbatimChar"/>
+              </w:rPr>
+              <w:t xml:space="preserve">sect11a1_plantingw2</w:t>
+            </w:r>
+          </w:p>
+        </w:tc>
+      </w:tr>
+      <w:tr>
+        <w:tc>
+          <w:p>
+            <w:pPr>
+              <w:pStyle w:val="Compact"/>
+              <w:jc w:val="left"/>
+            </w:pPr>
+            <w:r>
+              <w:t xml:space="preserve">3</w:t>
+            </w:r>
+          </w:p>
+        </w:tc>
+        <w:tc>
+          <w:p>
+            <w:pPr>
+              <w:pStyle w:val="Compact"/>
+              <w:jc w:val="left"/>
+            </w:pPr>
+            <w:r>
+              <w:rPr>
+                <w:rStyle w:val="VerbatimChar"/>
+              </w:rPr>
+              <w:t xml:space="preserve">Nigeria/GHS 15</w:t>
+            </w:r>
+          </w:p>
+        </w:tc>
+        <w:tc>
+          <w:p>
+            <w:pPr>
+              <w:pStyle w:val="Compact"/>
+              <w:jc w:val="left"/>
+            </w:pPr>
+            <w:r>
+              <w:t xml:space="preserve">2016</w:t>
+            </w:r>
+          </w:p>
+        </w:tc>
+        <w:tc>
+          <w:p>
+            <w:pPr>
+              <w:pStyle w:val="Compact"/>
+              <w:jc w:val="left"/>
+            </w:pPr>
+            <w:r>
+              <w:rPr>
+                <w:rStyle w:val="VerbatimChar"/>
+              </w:rPr>
+              <w:t xml:space="preserve">sect11b1_plantingw3</w:t>
+            </w:r>
+          </w:p>
+        </w:tc>
+        <w:tc>
+          <w:p>
+            <w:pPr>
+              <w:pStyle w:val="Compact"/>
+              <w:jc w:val="left"/>
+            </w:pPr>
+            <w:r>
+              <w:rPr>
+                <w:rStyle w:val="VerbatimChar"/>
+              </w:rPr>
+              <w:t xml:space="preserve">sect11a1_plantingw3</w:t>
+            </w:r>
+          </w:p>
+        </w:tc>
+      </w:tr>
+      <w:tr>
+        <w:tc>
+          <w:p>
+            <w:pPr>
+              <w:pStyle w:val="Compact"/>
+              <w:jc w:val="left"/>
+            </w:pPr>
+            <w:r>
+              <w:t xml:space="preserve">4</w:t>
+            </w:r>
+          </w:p>
+        </w:tc>
+        <w:tc>
+          <w:p>
+            <w:pPr>
+              <w:pStyle w:val="Compact"/>
+              <w:jc w:val="left"/>
+            </w:pPr>
+            <w:r>
+              <w:rPr>
+                <w:rStyle w:val="VerbatimChar"/>
+              </w:rPr>
+              <w:t xml:space="preserve">Nigeria/GHS 18</w:t>
+            </w:r>
+          </w:p>
+        </w:tc>
+        <w:tc>
+          <w:p>
+            <w:pPr>
+              <w:pStyle w:val="Compact"/>
+              <w:jc w:val="left"/>
+            </w:pPr>
+            <w:r>
+              <w:t xml:space="preserve">2019</w:t>
+            </w:r>
+          </w:p>
+        </w:tc>
+        <w:tc>
+          <w:p>
+            <w:pPr>
+              <w:pStyle w:val="Compact"/>
+              <w:jc w:val="left"/>
+            </w:pPr>
+            <w:r>
+              <w:rPr>
+                <w:rStyle w:val="VerbatimChar"/>
+              </w:rPr>
+              <w:t xml:space="preserve">sect11b1_plantingw4</w:t>
+            </w:r>
+          </w:p>
+        </w:tc>
+        <w:tc>
+          <w:p>
+            <w:pPr>
+              <w:pStyle w:val="Compact"/>
+              <w:jc w:val="left"/>
+            </w:pPr>
+            <w:r>
+              <w:rPr>
+                <w:rStyle w:val="VerbatimChar"/>
+              </w:rPr>
+              <w:t xml:space="preserve">sect11a1_plantingw4</w:t>
+            </w:r>
+          </w:p>
+        </w:tc>
+      </w:tr>
+      <w:tr>
+        <w:tc>
+          <w:p>
+            <w:pPr>
+              <w:pStyle w:val="Compact"/>
+              <w:jc w:val="left"/>
+            </w:pPr>
+            <w:r>
+              <w:t xml:space="preserve">5</w:t>
+            </w:r>
+          </w:p>
+        </w:tc>
+        <w:tc>
+          <w:p>
+            <w:pPr>
+              <w:pStyle w:val="Compact"/>
+              <w:jc w:val="left"/>
+            </w:pPr>
+            <w:r>
+              <w:rPr>
+                <w:rStyle w:val="VerbatimChar"/>
+              </w:rPr>
+              <w:t xml:space="preserve">Nigeria/GHS 23</w:t>
+            </w:r>
+          </w:p>
+        </w:tc>
+        <w:tc>
+          <w:p>
+            <w:pPr>
+              <w:pStyle w:val="Compact"/>
+              <w:jc w:val="left"/>
+            </w:pPr>
+            <w:r>
+              <w:t xml:space="preserve">2023</w:t>
+            </w:r>
+          </w:p>
+        </w:tc>
+        <w:tc>
+          <w:p>
+            <w:pPr>
+              <w:pStyle w:val="Compact"/>
+              <w:jc w:val="left"/>
+            </w:pPr>
+            <w:r>
+              <w:rPr>
+                <w:rStyle w:val="VerbatimChar"/>
+              </w:rPr>
+              <w:t xml:space="preserve">sect11b1_plantingw5</w:t>
+            </w:r>
+          </w:p>
+        </w:tc>
+        <w:tc>
+          <w:p>
+            <w:pPr>
+              <w:pStyle w:val="Compact"/>
+              <w:jc w:val="left"/>
+            </w:pPr>
+            <w:r>
+              <w:rPr>
+                <w:rStyle w:val="VerbatimChar"/>
+              </w:rPr>
+              <w:t xml:space="preserve">sect11a1_plantingw5</w:t>
+            </w:r>
+          </w:p>
+        </w:tc>
+      </w:tr>
+    </w:tbl>
+    <w:p>
+      <w:pPr>
+        <w:pStyle w:val="Heading3"/>
+      </w:pPr>
+      <w:bookmarkStart w:id="53" w:name="tenure-indicators-4"/>
+      <w:r>
+        <w:t xml:space="preserve">2. Tenure indicators</w:t>
+      </w:r>
+      <w:bookmarkEnd w:id="53"/>
+    </w:p>
+    <w:tbl>
+      <w:tblPr>
+        <w:tblStyle w:val="Table"/>
+        <w:tblW w:type="pct" w:w="0.0"/>
+        <w:tblLook w:firstRow="1"/>
+      </w:tblPr>
+      <w:tblGrid/>
+      <w:tr>
+        <w:trPr>
+          <w:cnfStyle w:firstRow="1"/>
+        </w:trPr>
+        <w:tc>
+          <w:tcPr>
+            <w:tcBorders>
+              <w:bottom w:val="single"/>
+            </w:tcBorders>
+            <w:vAlign w:val="bottom"/>
+          </w:tcPr>
+          <w:p>
+            <w:pPr>
+              <w:pStyle w:val="Compact"/>
+              <w:jc w:val="left"/>
+            </w:pPr>
+            <w:r>
+              <w:t xml:space="preserve">Variable</w:t>
+            </w:r>
+          </w:p>
+        </w:tc>
+        <w:tc>
+          <w:tcPr>
+            <w:tcBorders>
+              <w:bottom w:val="single"/>
+            </w:tcBorders>
+            <w:vAlign w:val="bottom"/>
+          </w:tcPr>
+          <w:p>
+            <w:pPr>
+              <w:pStyle w:val="Compact"/>
+              <w:jc w:val="left"/>
+            </w:pPr>
+            <w:r>
+              <w:t xml:space="preserve">Wave</w:t>
+            </w:r>
+          </w:p>
+        </w:tc>
+        <w:tc>
+          <w:tcPr>
+            <w:tcBorders>
+              <w:bottom w:val="single"/>
+            </w:tcBorders>
+            <w:vAlign w:val="bottom"/>
+          </w:tcPr>
+          <w:p>
+            <w:pPr>
+              <w:pStyle w:val="Compact"/>
+              <w:jc w:val="left"/>
+            </w:pPr>
+            <w:r>
+              <w:t xml:space="preserve">Source var</w:t>
+            </w:r>
+          </w:p>
+        </w:tc>
+        <w:tc>
+          <w:tcPr>
+            <w:tcBorders>
+              <w:bottom w:val="single"/>
+            </w:tcBorders>
+            <w:vAlign w:val="bottom"/>
+          </w:tcPr>
+          <w:p>
+            <w:pPr>
+              <w:pStyle w:val="Compact"/>
+              <w:jc w:val="left"/>
+            </w:pPr>
+            <w:r>
+              <w:t xml:space="preserve">Construction</w:t>
+            </w:r>
+          </w:p>
+        </w:tc>
+      </w:tr>
+      <w:tr>
+        <w:tc>
+          <w:p>
+            <w:pPr>
+              <w:pStyle w:val="Compact"/>
+              <w:jc w:val="left"/>
+            </w:pPr>
+            <w:r>
+              <w:rPr>
+                <w:rStyle w:val="VerbatimChar"/>
+              </w:rPr>
+              <w:t xml:space="preserve">parcel_purchased</w:t>
+            </w:r>
+          </w:p>
+        </w:tc>
+        <w:tc>
+          <w:p>
+            <w:pPr>
+              <w:pStyle w:val="Compact"/>
+              <w:jc w:val="left"/>
+            </w:pPr>
+            <w:r>
+              <w:t xml:space="preserve">1</w:t>
+            </w:r>
+          </w:p>
+        </w:tc>
+        <w:tc>
+          <w:p>
+            <w:pPr>
+              <w:pStyle w:val="Compact"/>
+              <w:jc w:val="left"/>
+            </w:pPr>
+            <w:r>
+              <w:rPr>
+                <w:rStyle w:val="VerbatimChar"/>
+              </w:rPr>
+              <w:t xml:space="preserve">s11bq4</w:t>
+            </w:r>
+          </w:p>
+        </w:tc>
+        <w:tc>
+          <w:p>
+            <w:pPr>
+              <w:pStyle w:val="Compact"/>
+              <w:jc w:val="left"/>
+            </w:pPr>
+            <w:r>
+              <w:rPr>
+                <w:rStyle w:val="VerbatimChar"/>
+              </w:rPr>
+              <w:t xml:space="preserve">s11bq4==1</w:t>
+            </w:r>
+            <w:r>
+              <w:t xml:space="preserve"> </w:t>
+            </w:r>
+            <w:r>
+              <w:t xml:space="preserve">- outright purchase</w:t>
+            </w:r>
+          </w:p>
+        </w:tc>
+      </w:tr>
+      <w:tr>
+        <w:tc>
+          <w:p>
+            <w:pPr>
+              <w:pStyle w:val="Compact"/>
+              <w:jc w:val="left"/>
+            </w:pPr>
+            <w:r>
+              <w:rPr>
+                <w:rStyle w:val="VerbatimChar"/>
+              </w:rPr>
+              <w:t xml:space="preserve">parcel_purchased</w:t>
+            </w:r>
+          </w:p>
+        </w:tc>
+        <w:tc>
+          <w:p>
+            <w:pPr>
+              <w:pStyle w:val="Compact"/>
+              <w:jc w:val="left"/>
+            </w:pPr>
+            <w:r>
+              <w:t xml:space="preserve">2-5</w:t>
+            </w:r>
+          </w:p>
+        </w:tc>
+        <w:tc>
+          <w:p>
+            <w:pPr>
+              <w:pStyle w:val="Compact"/>
+              <w:jc w:val="left"/>
+            </w:pPr>
+            <w:r>
+              <w:rPr>
+                <w:rStyle w:val="VerbatimChar"/>
+              </w:rPr>
+              <w:t xml:space="preserve">s11b1q4</w:t>
+            </w:r>
+          </w:p>
+        </w:tc>
+        <w:tc>
+          <w:p>
+            <w:pPr>
+              <w:pStyle w:val="Compact"/>
+              <w:jc w:val="left"/>
+            </w:pPr>
+            <w:r>
+              <w:rPr>
+                <w:rStyle w:val="VerbatimChar"/>
+              </w:rPr>
+              <w:t xml:space="preserve">s11b1q4==1</w:t>
+            </w:r>
+            <w:r>
+              <w:t xml:space="preserve"> </w:t>
+            </w:r>
+            <w:r>
+              <w:t xml:space="preserve">- outright purchase</w:t>
+            </w:r>
+          </w:p>
+        </w:tc>
+      </w:tr>
+      <w:tr>
+        <w:tc>
+          <w:p>
+            <w:pPr>
+              <w:pStyle w:val="Compact"/>
+              <w:jc w:val="left"/>
+            </w:pPr>
+            <w:r>
+              <w:rPr>
+                <w:rStyle w:val="VerbatimChar"/>
+              </w:rPr>
+              <w:t xml:space="preserve">parcel_rentedin</w:t>
+            </w:r>
+          </w:p>
+        </w:tc>
+        <w:tc>
+          <w:p>
+            <w:pPr>
+              <w:pStyle w:val="Compact"/>
+              <w:jc w:val="left"/>
+            </w:pPr>
+            <w:r>
+              <w:t xml:space="preserve">1</w:t>
+            </w:r>
+          </w:p>
+        </w:tc>
+        <w:tc>
+          <w:p>
+            <w:pPr>
+              <w:pStyle w:val="Compact"/>
+              <w:jc w:val="left"/>
+            </w:pPr>
+            <w:r>
+              <w:rPr>
+                <w:rStyle w:val="VerbatimChar"/>
+              </w:rPr>
+              <w:t xml:space="preserve">s11bq4</w:t>
+            </w:r>
+          </w:p>
+        </w:tc>
+        <w:tc>
+          <w:p>
+            <w:pPr>
+              <w:pStyle w:val="Compact"/>
+              <w:jc w:val="left"/>
+            </w:pPr>
+            <w:r>
+              <w:rPr>
+                <w:rStyle w:val="VerbatimChar"/>
+              </w:rPr>
+              <w:t xml:space="preserve">s11bq4==2</w:t>
+            </w:r>
+            <w:r>
+              <w:t xml:space="preserve"> </w:t>
+            </w:r>
+            <w:r>
+              <w:t xml:space="preserve">- rented for cash/in-kind</w:t>
+            </w:r>
+          </w:p>
+        </w:tc>
+      </w:tr>
+      <w:tr>
+        <w:tc>
+          <w:p>
+            <w:pPr>
+              <w:pStyle w:val="Compact"/>
+              <w:jc w:val="left"/>
+            </w:pPr>
+            <w:r>
+              <w:rPr>
+                <w:rStyle w:val="VerbatimChar"/>
+              </w:rPr>
+              <w:t xml:space="preserve">parcel_rentedin</w:t>
+            </w:r>
+          </w:p>
+        </w:tc>
+        <w:tc>
+          <w:p>
+            <w:pPr>
+              <w:pStyle w:val="Compact"/>
+              <w:jc w:val="left"/>
+            </w:pPr>
+            <w:r>
+              <w:t xml:space="preserve">2-4</w:t>
+            </w:r>
+          </w:p>
+        </w:tc>
+        <w:tc>
+          <w:p>
+            <w:pPr>
+              <w:pStyle w:val="Compact"/>
+              <w:jc w:val="left"/>
+            </w:pPr>
+            <w:r>
+              <w:rPr>
+                <w:rStyle w:val="VerbatimChar"/>
+              </w:rPr>
+              <w:t xml:space="preserve">s11b1q4</w:t>
+            </w:r>
+          </w:p>
+        </w:tc>
+        <w:tc>
+          <w:p>
+            <w:pPr>
+              <w:pStyle w:val="Compact"/>
+              <w:jc w:val="left"/>
+            </w:pPr>
+            <w:r>
+              <w:rPr>
+                <w:rStyle w:val="VerbatimChar"/>
+              </w:rPr>
+              <w:t xml:space="preserve">s11b1q4==2</w:t>
+            </w:r>
+          </w:p>
+        </w:tc>
+      </w:tr>
+      <w:tr>
+        <w:tc>
+          <w:p>
+            <w:pPr>
+              <w:pStyle w:val="Compact"/>
+              <w:jc w:val="left"/>
+            </w:pPr>
+            <w:r>
+              <w:rPr>
+                <w:rStyle w:val="VerbatimChar"/>
+              </w:rPr>
+              <w:t xml:space="preserve">parcel_rentedin</w:t>
+            </w:r>
+          </w:p>
+        </w:tc>
+        <w:tc>
+          <w:p>
+            <w:pPr>
+              <w:pStyle w:val="Compact"/>
+              <w:jc w:val="left"/>
+            </w:pPr>
+            <w:r>
+              <w:t xml:space="preserve">5</w:t>
+            </w:r>
+          </w:p>
+        </w:tc>
+        <w:tc>
+          <w:p>
+            <w:pPr>
+              <w:pStyle w:val="Compact"/>
+              <w:jc w:val="left"/>
+            </w:pPr>
+            <w:r>
+              <w:rPr>
+                <w:rStyle w:val="VerbatimChar"/>
+              </w:rPr>
+              <w:t xml:space="preserve">s11b1q4</w:t>
+            </w:r>
+          </w:p>
+        </w:tc>
+        <w:tc>
+          <w:p>
+            <w:pPr>
+              <w:pStyle w:val="Compact"/>
+              <w:jc w:val="left"/>
+            </w:pPr>
+            <w:r>
+              <w:rPr>
+                <w:rStyle w:val="VerbatimChar"/>
+              </w:rPr>
+              <w:t xml:space="preserve">inlist(s11b1q4,2,6)</w:t>
+            </w:r>
+          </w:p>
+        </w:tc>
+      </w:tr>
+      <w:tr>
+        <w:tc>
+          <w:p>
+            <w:pPr>
+              <w:pStyle w:val="Compact"/>
+              <w:jc w:val="left"/>
+            </w:pPr>
+            <w:r>
+              <w:rPr>
+                <w:rStyle w:val="VerbatimChar"/>
+              </w:rPr>
+              <w:t xml:space="preserve">parcel_rentedout</w:t>
+            </w:r>
+          </w:p>
+        </w:tc>
+        <w:tc>
+          <w:p>
+            <w:pPr>
+              <w:pStyle w:val="Compact"/>
+              <w:jc w:val="left"/>
+            </w:pPr>
+            <w:r>
+              <w:t xml:space="preserve">1</w:t>
+            </w:r>
+          </w:p>
+        </w:tc>
+        <w:tc>
+          <w:p>
+            <w:pPr>
+              <w:pStyle w:val="Compact"/>
+              <w:jc w:val="left"/>
+            </w:pPr>
+            <w:r>
+              <w:rPr>
+                <w:rStyle w:val="VerbatimChar"/>
+              </w:rPr>
+              <w:t xml:space="preserve">s11bq17</w:t>
+            </w:r>
+          </w:p>
+        </w:tc>
+        <w:tc>
+          <w:p>
+            <w:pPr>
+              <w:pStyle w:val="Compact"/>
+              <w:jc w:val="left"/>
+            </w:pPr>
+            <w:r>
+              <w:rPr>
+                <w:rStyle w:val="VerbatimChar"/>
+              </w:rPr>
+              <w:t xml:space="preserve">s11bq17==2</w:t>
+            </w:r>
+            <w:r>
+              <w:t xml:space="preserve"> </w:t>
+            </w:r>
+            <w:r>
+              <w:t xml:space="preserve">- main use = rented out</w:t>
+            </w:r>
+          </w:p>
+        </w:tc>
+      </w:tr>
+      <w:tr>
+        <w:tc>
+          <w:p>
+            <w:pPr>
+              <w:pStyle w:val="Compact"/>
+              <w:jc w:val="left"/>
+            </w:pPr>
+            <w:r>
+              <w:rPr>
+                <w:rStyle w:val="VerbatimChar"/>
+              </w:rPr>
+              <w:t xml:space="preserve">parcel_rentedout</w:t>
+            </w:r>
+          </w:p>
+        </w:tc>
+        <w:tc>
+          <w:p>
+            <w:pPr>
+              <w:pStyle w:val="Compact"/>
+              <w:jc w:val="left"/>
+            </w:pPr>
+            <w:r>
+              <w:t xml:space="preserve">2-4</w:t>
+            </w:r>
+          </w:p>
+        </w:tc>
+        <w:tc>
+          <w:p>
+            <w:pPr>
+              <w:pStyle w:val="Compact"/>
+              <w:jc w:val="left"/>
+            </w:pPr>
+            <w:r>
+              <w:rPr>
+                <w:rStyle w:val="VerbatimChar"/>
+              </w:rPr>
+              <w:t xml:space="preserve">s11b1q28</w:t>
+            </w:r>
+          </w:p>
+        </w:tc>
+        <w:tc>
+          <w:p>
+            <w:pPr>
+              <w:pStyle w:val="Compact"/>
+              <w:jc w:val="left"/>
+            </w:pPr>
+            <w:r>
+              <w:rPr>
+                <w:rStyle w:val="VerbatimChar"/>
+              </w:rPr>
+              <w:t xml:space="preserve">inlist(s11b1q28,2,3)</w:t>
+            </w:r>
+          </w:p>
+        </w:tc>
+      </w:tr>
+      <w:tr>
+        <w:tc>
+          <w:p>
+            <w:pPr>
+              <w:pStyle w:val="Compact"/>
+              <w:jc w:val="left"/>
+            </w:pPr>
+            <w:r>
+              <w:rPr>
+                <w:rStyle w:val="VerbatimChar"/>
+              </w:rPr>
+              <w:t xml:space="preserve">parcel_rentedout</w:t>
+            </w:r>
+          </w:p>
+        </w:tc>
+        <w:tc>
+          <w:p>
+            <w:pPr>
+              <w:pStyle w:val="Compact"/>
+              <w:jc w:val="left"/>
+            </w:pPr>
+            <w:r>
+              <w:t xml:space="preserve">5</w:t>
+            </w:r>
+          </w:p>
+        </w:tc>
+        <w:tc>
+          <w:p>
+            <w:pPr>
+              <w:pStyle w:val="Compact"/>
+              <w:jc w:val="left"/>
+            </w:pPr>
+            <w:r>
+              <w:rPr>
+                <w:rStyle w:val="VerbatimChar"/>
+              </w:rPr>
+              <w:t xml:space="preserve">s11b1q44</w:t>
+            </w:r>
+          </w:p>
+        </w:tc>
+        <w:tc>
+          <w:p>
+            <w:pPr>
+              <w:pStyle w:val="Compact"/>
+              <w:jc w:val="left"/>
+            </w:pPr>
+            <w:r>
+              <w:rPr>
+                <w:rStyle w:val="VerbatimChar"/>
+              </w:rPr>
+              <w:t xml:space="preserve">inlist(s11b1q44,2,3)</w:t>
+            </w:r>
+          </w:p>
+        </w:tc>
+      </w:tr>
+      <w:tr>
+        <w:tc>
+          <w:p>
+            <w:pPr>
+              <w:pStyle w:val="Compact"/>
+              <w:jc w:val="left"/>
+            </w:pPr>
+            <w:r>
+              <w:rPr>
+                <w:rStyle w:val="VerbatimChar"/>
+              </w:rPr>
+              <w:t xml:space="preserve">parcel_certificate</w:t>
+            </w:r>
+          </w:p>
+        </w:tc>
+        <w:tc>
+          <w:p>
+            <w:pPr>
+              <w:pStyle w:val="Compact"/>
+              <w:jc w:val="left"/>
+            </w:pPr>
+            <w:r>
+              <w:t xml:space="preserve">1</w:t>
+            </w:r>
+          </w:p>
+        </w:tc>
+        <w:tc>
+          <w:p>
+            <w:pPr>
+              <w:pStyle w:val="Compact"/>
+              <w:jc w:val="left"/>
+            </w:pPr>
+            <w:r>
+              <w:t xml:space="preserve">—</w:t>
+            </w:r>
+          </w:p>
+        </w:tc>
+        <w:tc>
+          <w:p>
+            <w:pPr>
+              <w:pStyle w:val="Compact"/>
+              <w:jc w:val="left"/>
+            </w:pPr>
+            <w:r>
+              <w:rPr>
+                <w:b/>
+              </w:rPr>
+              <w:t xml:space="preserve">missing</w:t>
+            </w:r>
+            <w:r>
+              <w:t xml:space="preserve"> </w:t>
+            </w:r>
+            <w:r>
+              <w:t xml:space="preserve">- not asked</w:t>
+            </w:r>
+          </w:p>
+        </w:tc>
+      </w:tr>
+      <w:tr>
+        <w:tc>
+          <w:p>
+            <w:pPr>
+              <w:pStyle w:val="Compact"/>
+              <w:jc w:val="left"/>
+            </w:pPr>
+            <w:r>
+              <w:rPr>
+                <w:rStyle w:val="VerbatimChar"/>
+              </w:rPr>
+              <w:t xml:space="preserve">parcel_certificate</w:t>
+            </w:r>
+          </w:p>
+        </w:tc>
+        <w:tc>
+          <w:p>
+            <w:pPr>
+              <w:pStyle w:val="Compact"/>
+              <w:jc w:val="left"/>
+            </w:pPr>
+            <w:r>
+              <w:t xml:space="preserve">2-4</w:t>
+            </w:r>
+          </w:p>
+        </w:tc>
+        <w:tc>
+          <w:p>
+            <w:pPr>
+              <w:pStyle w:val="Compact"/>
+              <w:jc w:val="left"/>
+            </w:pPr>
+            <w:r>
+              <w:rPr>
+                <w:rStyle w:val="VerbatimChar"/>
+              </w:rPr>
+              <w:t xml:space="preserve">s11b1q7</w:t>
+            </w:r>
+          </w:p>
+        </w:tc>
+        <w:tc>
+          <w:p>
+            <w:pPr>
+              <w:pStyle w:val="Compact"/>
+              <w:jc w:val="left"/>
+            </w:pPr>
+            <w:r>
+              <w:rPr>
+                <w:rStyle w:val="VerbatimChar"/>
+              </w:rPr>
+              <w:t xml:space="preserve">s11b1q7==1</w:t>
+            </w:r>
+            <w:r>
+              <w:t xml:space="preserve"> </w:t>
+            </w:r>
+            <w:r>
+              <w:t xml:space="preserve">(0 if not owned)</w:t>
+            </w:r>
+          </w:p>
+        </w:tc>
+      </w:tr>
+      <w:tr>
+        <w:tc>
+          <w:p>
+            <w:pPr>
+              <w:pStyle w:val="Compact"/>
+              <w:jc w:val="left"/>
+            </w:pPr>
+            <w:r>
+              <w:rPr>
+                <w:rStyle w:val="VerbatimChar"/>
+              </w:rPr>
+              <w:t xml:space="preserve">parcel_certificate</w:t>
+            </w:r>
+          </w:p>
+        </w:tc>
+        <w:tc>
+          <w:p>
+            <w:pPr>
+              <w:pStyle w:val="Compact"/>
+              <w:jc w:val="left"/>
+            </w:pPr>
+            <w:r>
+              <w:t xml:space="preserve">5</w:t>
+            </w:r>
+          </w:p>
+        </w:tc>
+        <w:tc>
+          <w:p>
+            <w:pPr>
+              <w:pStyle w:val="Compact"/>
+              <w:jc w:val="left"/>
+            </w:pPr>
+            <w:r>
+              <w:rPr>
+                <w:rStyle w:val="VerbatimChar"/>
+              </w:rPr>
+              <w:t xml:space="preserve">s11b1q8</w:t>
+            </w:r>
+          </w:p>
+        </w:tc>
+        <w:tc>
+          <w:p>
+            <w:pPr>
+              <w:pStyle w:val="Compact"/>
+              <w:jc w:val="left"/>
+            </w:pPr>
+            <w:r>
+              <w:rPr>
+                <w:rStyle w:val="VerbatimChar"/>
+              </w:rPr>
+              <w:t xml:space="preserve">s11b1q8==1</w:t>
+            </w:r>
+            <w:r>
+              <w:t xml:space="preserve"> </w:t>
+            </w:r>
+            <w:r>
+              <w:t xml:space="preserve">(0 if not owned)</w:t>
+            </w:r>
+          </w:p>
+        </w:tc>
+      </w:tr>
+    </w:tbl>
+    <w:p>
+      <w:pPr>
+        <w:pStyle w:val="Heading3"/>
+      </w:pPr>
+      <w:bookmarkStart w:id="54" w:name="parcel-area-parcel_area_ha-4"/>
+      <w:r>
+        <w:t xml:space="preserve">3. Parcel area (</w:t>
+      </w:r>
+      <w:r>
+        <w:rPr>
+          <w:rStyle w:val="VerbatimChar"/>
+        </w:rPr>
+        <w:t xml:space="preserve">parcel_area_ha</w:t>
+      </w:r>
+      <w:r>
+        <w:t xml:space="preserve">)</w:t>
+      </w:r>
+      <w:bookmarkEnd w:id="54"/>
+    </w:p>
+    <w:p>
+      <w:pPr>
+        <w:pStyle w:val="FirstParagraph"/>
+      </w:pPr>
+      <w:r>
+        <w:t xml:space="preserve">GPS where measured (</w:t>
+      </w:r>
+      <w:r>
+        <w:rPr>
+          <w:rStyle w:val="VerbatimChar"/>
+        </w:rPr>
+        <w:t xml:space="preserve">plot_area</w:t>
+      </w:r>
+      <w:r>
+        <w:t xml:space="preserve"> </w:t>
+      </w:r>
+      <w:r>
+        <w:t xml:space="preserve">× 0.0001, m² → ha), else self-reported. Self-reported</w:t>
+      </w:r>
+      <w:r>
+        <w:t xml:space="preserve"> </w:t>
+      </w:r>
+      <w:r>
+        <w:t xml:space="preserve">is in local units with</w:t>
+      </w:r>
+      <w:r>
+        <w:t xml:space="preserve"> </w:t>
+      </w:r>
+      <w:r>
+        <w:rPr>
+          <w:b/>
+        </w:rPr>
+        <w:t xml:space="preserve">region-specific</w:t>
+      </w:r>
+      <w:r>
+        <w:t xml:space="preserve"> </w:t>
+      </w:r>
+      <w:r>
+        <w:t xml:space="preserve">conversion factors (heaps/ridges/stands ×</w:t>
+      </w:r>
+      <w:r>
+        <w:t xml:space="preserve"> </w:t>
+      </w:r>
+      <w:r>
+        <w:t xml:space="preserve">the survey zone</w:t>
+      </w:r>
+      <w:r>
+        <w:t xml:space="preserve"> </w:t>
+      </w:r>
+      <w:r>
+        <w:rPr>
+          <w:rStyle w:val="VerbatimChar"/>
+        </w:rPr>
+        <w:t xml:space="preserve">admin_1</w:t>
+      </w:r>
+      <w:r>
+        <w:t xml:space="preserve"> </w:t>
+      </w:r>
+      <w:r>
+        <w:t xml:space="preserve">1-6; plus acres/m²/plot factors). Wave 1-4 self-reported =</w:t>
+      </w:r>
+      <w:r>
+        <w:t xml:space="preserve"> </w:t>
+      </w:r>
+      <w:r>
+        <w:rPr>
+          <w:rStyle w:val="VerbatimChar"/>
+        </w:rPr>
+        <w:t xml:space="preserve">s11aq4a</w:t>
+      </w:r>
+      <w:r>
+        <w:t xml:space="preserve">/</w:t>
+      </w:r>
+      <w:r>
+        <w:rPr>
+          <w:rStyle w:val="VerbatimChar"/>
+        </w:rPr>
+        <w:t xml:space="preserve">s11aq4aa</w:t>
+      </w:r>
+      <w:r>
+        <w:t xml:space="preserve"> </w:t>
+      </w:r>
+      <w:r>
+        <w:t xml:space="preserve">with unit</w:t>
+      </w:r>
+      <w:r>
+        <w:t xml:space="preserve"> </w:t>
+      </w:r>
+      <w:r>
+        <w:rPr>
+          <w:rStyle w:val="VerbatimChar"/>
+        </w:rPr>
+        <w:t xml:space="preserve">s11aq4b</w:t>
+      </w:r>
+      <w:r>
+        <w:t xml:space="preserve">; wave 5 =</w:t>
+      </w:r>
+      <w:r>
+        <w:t xml:space="preserve"> </w:t>
+      </w:r>
+      <w:r>
+        <w:rPr>
+          <w:rStyle w:val="VerbatimChar"/>
+        </w:rPr>
+        <w:t xml:space="preserve">s11aq3_number</w:t>
+      </w:r>
+      <w:r>
+        <w:t xml:space="preserve"> </w:t>
+      </w:r>
+      <w:r>
+        <w:t xml:space="preserve">with unit</w:t>
+      </w:r>
+      <w:r>
+        <w:t xml:space="preserve"> </w:t>
+      </w:r>
+      <w:r>
+        <w:rPr>
+          <w:rStyle w:val="VerbatimChar"/>
+        </w:rPr>
+        <w:t xml:space="preserve">s11aq3_unit</w:t>
+      </w:r>
+      <w:r>
+        <w:t xml:space="preserve"> </w:t>
+      </w:r>
+      <w:r>
+        <w:t xml:space="preserve">(different simple-unit codes). The region factors are identical across</w:t>
+      </w:r>
+      <w:r>
+        <w:t xml:space="preserve"> </w:t>
+      </w:r>
+      <w:r>
+        <w:t xml:space="preserve">waves and transcribed verbatim from the upstream pipeline.</w:t>
+      </w:r>
+    </w:p>
+    <w:p>
+      <w:pPr>
+        <w:pStyle w:val="Heading3"/>
+      </w:pPr>
+      <w:bookmarkStart w:id="55" w:name="design-variables-identifiers-4"/>
+      <w:r>
+        <w:t xml:space="preserve">4. Design variables &amp; identifiers</w:t>
+      </w:r>
+      <w:bookmarkEnd w:id="55"/>
+    </w:p>
+    <w:tbl>
+      <w:tblPr>
+        <w:tblStyle w:val="Table"/>
+        <w:tblW w:type="pct" w:w="0.0"/>
+        <w:tblLook w:firstRow="1"/>
+      </w:tblPr>
+      <w:tblGrid/>
+      <w:tr>
+        <w:trPr>
+          <w:cnfStyle w:firstRow="1"/>
+        </w:trPr>
+        <w:tc>
+          <w:tcPr>
+            <w:tcBorders>
+              <w:bottom w:val="single"/>
+            </w:tcBorders>
+            <w:vAlign w:val="bottom"/>
+          </w:tcPr>
+          <w:p>
+            <w:pPr>
+              <w:pStyle w:val="Compact"/>
+              <w:jc w:val="left"/>
+            </w:pPr>
+            <w:r>
+              <w:t xml:space="preserve">Variable</w:t>
+            </w:r>
+          </w:p>
+        </w:tc>
+        <w:tc>
+          <w:tcPr>
+            <w:tcBorders>
+              <w:bottom w:val="single"/>
+            </w:tcBorders>
+            <w:vAlign w:val="bottom"/>
+          </w:tcPr>
+          <w:p>
+            <w:pPr>
+              <w:pStyle w:val="Compact"/>
+              <w:jc w:val="left"/>
+            </w:pPr>
+            <w:r>
+              <w:t xml:space="preserve">Wave</w:t>
+            </w:r>
+          </w:p>
+        </w:tc>
+        <w:tc>
+          <w:tcPr>
+            <w:tcBorders>
+              <w:bottom w:val="single"/>
+            </w:tcBorders>
+            <w:vAlign w:val="bottom"/>
+          </w:tcPr>
+          <w:p>
+            <w:pPr>
+              <w:pStyle w:val="Compact"/>
+              <w:jc w:val="left"/>
+            </w:pPr>
+            <w:r>
+              <w:t xml:space="preserve">Source</w:t>
+            </w:r>
+          </w:p>
+        </w:tc>
+        <w:tc>
+          <w:tcPr>
+            <w:tcBorders>
+              <w:bottom w:val="single"/>
+            </w:tcBorders>
+            <w:vAlign w:val="bottom"/>
+          </w:tcPr>
+          <w:p>
+            <w:pPr>
+              <w:pStyle w:val="Compact"/>
+              <w:jc w:val="left"/>
+            </w:pPr>
+            <w:r>
+              <w:t xml:space="preserve">Construction</w:t>
+            </w:r>
+          </w:p>
+        </w:tc>
+      </w:tr>
+      <w:tr>
+        <w:tc>
+          <w:p>
+            <w:pPr>
+              <w:pStyle w:val="Compact"/>
+              <w:jc w:val="left"/>
+            </w:pPr>
+            <w:r>
+              <w:rPr>
+                <w:rStyle w:val="VerbatimChar"/>
+              </w:rPr>
+              <w:t xml:space="preserve">weight</w:t>
+            </w:r>
+          </w:p>
+        </w:tc>
+        <w:tc>
+          <w:p>
+            <w:pPr>
+              <w:pStyle w:val="Compact"/>
+              <w:jc w:val="left"/>
+            </w:pPr>
+            <w:r>
+              <w:t xml:space="preserve">1-3</w:t>
+            </w:r>
+          </w:p>
+        </w:tc>
+        <w:tc>
+          <w:p>
+            <w:pPr>
+              <w:pStyle w:val="Compact"/>
+              <w:jc w:val="left"/>
+            </w:pPr>
+            <w:r>
+              <w:rPr>
+                <w:rStyle w:val="VerbatimChar"/>
+              </w:rPr>
+              <w:t xml:space="preserve">cons_agg_waveN_visit1/2.dta</w:t>
+            </w:r>
+          </w:p>
+        </w:tc>
+        <w:tc>
+          <w:p>
+            <w:pPr>
+              <w:pStyle w:val="Compact"/>
+              <w:jc w:val="left"/>
+            </w:pPr>
+            <w:r>
+              <w:rPr>
+                <w:rStyle w:val="VerbatimChar"/>
+              </w:rPr>
+              <w:t xml:space="preserve">hhweight</w:t>
+            </w:r>
+          </w:p>
+        </w:tc>
+      </w:tr>
+      <w:tr>
+        <w:tc>
+          <w:p>
+            <w:pPr>
+              <w:pStyle w:val="Compact"/>
+              <w:jc w:val="left"/>
+            </w:pPr>
+            <w:r>
+              <w:rPr>
+                <w:rStyle w:val="VerbatimChar"/>
+              </w:rPr>
+              <w:t xml:space="preserve">weight</w:t>
+            </w:r>
+          </w:p>
+        </w:tc>
+        <w:tc>
+          <w:p>
+            <w:pPr>
+              <w:pStyle w:val="Compact"/>
+              <w:jc w:val="left"/>
+            </w:pPr>
+            <w:r>
+              <w:t xml:space="preserve">4</w:t>
+            </w:r>
+          </w:p>
+        </w:tc>
+        <w:tc>
+          <w:p>
+            <w:pPr>
+              <w:pStyle w:val="Compact"/>
+              <w:jc w:val="left"/>
+            </w:pPr>
+            <w:r>
+              <w:rPr>
+                <w:rStyle w:val="VerbatimChar"/>
+              </w:rPr>
+              <w:t xml:space="preserve">totcons_final.dta</w:t>
+            </w:r>
+          </w:p>
+        </w:tc>
+        <w:tc>
+          <w:p>
+            <w:pPr>
+              <w:pStyle w:val="Compact"/>
+              <w:jc w:val="left"/>
+            </w:pPr>
+            <w:r>
+              <w:rPr>
+                <w:rStyle w:val="VerbatimChar"/>
+              </w:rPr>
+              <w:t xml:space="preserve">wt_wave4</w:t>
+            </w:r>
+          </w:p>
+        </w:tc>
+      </w:tr>
+      <w:tr>
+        <w:tc>
+          <w:p>
+            <w:pPr>
+              <w:pStyle w:val="Compact"/>
+              <w:jc w:val="left"/>
+            </w:pPr>
+            <w:r>
+              <w:rPr>
+                <w:rStyle w:val="VerbatimChar"/>
+              </w:rPr>
+              <w:t xml:space="preserve">weight</w:t>
+            </w:r>
+          </w:p>
+        </w:tc>
+        <w:tc>
+          <w:p>
+            <w:pPr>
+              <w:pStyle w:val="Compact"/>
+              <w:jc w:val="left"/>
+            </w:pPr>
+            <w:r>
+              <w:t xml:space="preserve">5</w:t>
+            </w:r>
+          </w:p>
+        </w:tc>
+        <w:tc>
+          <w:p>
+            <w:pPr>
+              <w:pStyle w:val="Compact"/>
+              <w:jc w:val="left"/>
+            </w:pPr>
+            <w:r>
+              <w:rPr>
+                <w:rStyle w:val="VerbatimChar"/>
+              </w:rPr>
+              <w:t xml:space="preserve">secta_plantingw5.dta</w:t>
+            </w:r>
+          </w:p>
+        </w:tc>
+        <w:tc>
+          <w:p>
+            <w:pPr>
+              <w:pStyle w:val="Compact"/>
+              <w:jc w:val="left"/>
+            </w:pPr>
+            <w:r>
+              <w:rPr>
+                <w:rStyle w:val="VerbatimChar"/>
+              </w:rPr>
+              <w:t xml:space="preserve">wt_cross_wave5</w:t>
+            </w:r>
+          </w:p>
+        </w:tc>
+      </w:tr>
+      <w:tr>
+        <w:tc>
+          <w:p>
+            <w:pPr>
+              <w:pStyle w:val="Compact"/>
+              <w:jc w:val="left"/>
+            </w:pPr>
+            <w:r>
+              <w:rPr>
+                <w:rStyle w:val="VerbatimChar"/>
+              </w:rPr>
+              <w:t xml:space="preserve">ea_id</w:t>
+            </w:r>
+          </w:p>
+        </w:tc>
+        <w:tc>
+          <w:p>
+            <w:pPr>
+              <w:pStyle w:val="Compact"/>
+              <w:jc w:val="left"/>
+            </w:pPr>
+            <w:r>
+              <w:t xml:space="preserve">1-5</w:t>
+            </w:r>
+          </w:p>
+        </w:tc>
+        <w:tc>
+          <w:p>
+            <w:pPr>
+              <w:pStyle w:val="Compact"/>
+              <w:jc w:val="left"/>
+            </w:pPr>
+            <w:r>
+              <w:rPr>
+                <w:rStyle w:val="VerbatimChar"/>
+              </w:rPr>
+              <w:t xml:space="preserve">secta_planting*</w:t>
+            </w:r>
+            <w:r>
+              <w:t xml:space="preserve"> </w:t>
+            </w:r>
+            <w:r>
+              <w:t xml:space="preserve">(+ GHS10 fallback)</w:t>
+            </w:r>
+          </w:p>
+        </w:tc>
+        <w:tc>
+          <w:p>
+            <w:pPr>
+              <w:pStyle w:val="Compact"/>
+              <w:jc w:val="left"/>
+            </w:pPr>
+            <w:r>
+              <w:rPr>
+                <w:rStyle w:val="VerbatimChar"/>
+              </w:rPr>
+              <w:t xml:space="preserve">lga-ea</w:t>
+            </w:r>
+          </w:p>
+        </w:tc>
+      </w:tr>
+      <w:tr>
+        <w:tc>
+          <w:p>
+            <w:pPr>
+              <w:pStyle w:val="Compact"/>
+              <w:jc w:val="left"/>
+            </w:pPr>
+            <w:r>
+              <w:rPr>
+                <w:rStyle w:val="VerbatimChar"/>
+              </w:rPr>
+              <w:t xml:space="preserve">strataid</w:t>
+            </w:r>
+          </w:p>
+        </w:tc>
+        <w:tc>
+          <w:p>
+            <w:pPr>
+              <w:pStyle w:val="Compact"/>
+              <w:jc w:val="left"/>
+            </w:pPr>
+            <w:r>
+              <w:t xml:space="preserve">1-5</w:t>
+            </w:r>
+          </w:p>
+        </w:tc>
+        <w:tc>
+          <w:p>
+            <w:pPr>
+              <w:pStyle w:val="Compact"/>
+              <w:jc w:val="left"/>
+            </w:pPr>
+            <w:r>
+              <w:rPr>
+                <w:rStyle w:val="VerbatimChar"/>
+              </w:rPr>
+              <w:t xml:space="preserve">secta_planting*</w:t>
+            </w:r>
+            <w:r>
+              <w:t xml:space="preserve"> </w:t>
+            </w:r>
+            <w:r>
+              <w:t xml:space="preserve">(+ GHS10 fallback)</w:t>
+            </w:r>
+          </w:p>
+        </w:tc>
+        <w:tc>
+          <w:p>
+            <w:pPr>
+              <w:pStyle w:val="Compact"/>
+              <w:jc w:val="left"/>
+            </w:pPr>
+            <w:r>
+              <w:rPr>
+                <w:rStyle w:val="VerbatimChar"/>
+              </w:rPr>
+              <w:t xml:space="preserve">zone</w:t>
+            </w:r>
+          </w:p>
+        </w:tc>
+      </w:tr>
+      <w:tr>
+        <w:tc>
+          <w:p>
+            <w:pPr>
+              <w:pStyle w:val="Compact"/>
+              <w:jc w:val="left"/>
+            </w:pPr>
+            <w:r>
+              <w:rPr>
+                <w:rStyle w:val="VerbatimChar"/>
+              </w:rPr>
+              <w:t xml:space="preserve">parcel_id</w:t>
+            </w:r>
+          </w:p>
+        </w:tc>
+        <w:tc>
+          <w:p>
+            <w:pPr>
+              <w:pStyle w:val="Compact"/>
+              <w:jc w:val="left"/>
+            </w:pPr>
+            <w:r>
+              <w:t xml:space="preserve">1-5</w:t>
+            </w:r>
+          </w:p>
+        </w:tc>
+        <w:tc>
+          <w:p>
+            <w:pPr>
+              <w:pStyle w:val="Compact"/>
+              <w:jc w:val="left"/>
+            </w:pPr>
+            <w:r>
+              <w:t xml:space="preserve">tenure / roster</w:t>
+            </w:r>
+          </w:p>
+        </w:tc>
+        <w:tc>
+          <w:p>
+            <w:pPr>
+              <w:pStyle w:val="Compact"/>
+              <w:jc w:val="left"/>
+            </w:pPr>
+            <w:r>
+              <w:rPr>
+                <w:rStyle w:val="VerbatimChar"/>
+              </w:rPr>
+              <w:t xml:space="preserve">hhid-plotid</w:t>
+            </w:r>
+          </w:p>
+        </w:tc>
+      </w:tr>
+      <w:tr>
+        <w:tc>
+          <w:p>
+            <w:pPr>
+              <w:pStyle w:val="Compact"/>
+              <w:jc w:val="left"/>
+            </w:pPr>
+            <w:r>
+              <w:rPr>
+                <w:rStyle w:val="VerbatimChar"/>
+              </w:rPr>
+              <w:t xml:space="preserve">year</w:t>
+            </w:r>
+          </w:p>
+        </w:tc>
+        <w:tc>
+          <w:p>
+            <w:pPr>
+              <w:pStyle w:val="Compact"/>
+              <w:jc w:val="left"/>
+            </w:pPr>
+            <w:r>
+              <w:t xml:space="preserve">1-5</w:t>
+            </w:r>
+          </w:p>
+        </w:tc>
+        <w:tc>
+          <w:p>
+            <w:pPr>
+              <w:pStyle w:val="Compact"/>
+              <w:jc w:val="left"/>
+            </w:pPr>
+            <w:r>
+              <w:t xml:space="preserve">—</w:t>
+            </w:r>
+          </w:p>
+        </w:tc>
+        <w:tc>
+          <w:p>
+            <w:pPr>
+              <w:pStyle w:val="Compact"/>
+              <w:jc w:val="left"/>
+            </w:pPr>
+            <w:r>
+              <w:t xml:space="preserve">2011 / 2013 / 2016 / 2019 / 2023</w:t>
+            </w:r>
+          </w:p>
+        </w:tc>
+      </w:tr>
+    </w:tbl>
+    <w:p>
+      <w:pPr>
+        <w:pStyle w:val="Heading3"/>
+      </w:pPr>
+      <w:bookmarkStart w:id="56" w:name="Xb4d582268a3ea5115cbf391ae4ab1d6685f948d"/>
+      <w:r>
+        <w:t xml:space="preserve">5. Value labels of key source variables (verified for GHS10; consistent instrument)</w:t>
+      </w:r>
+      <w:bookmarkEnd w:id="56"/>
+    </w:p>
+    <w:p>
+      <w:pPr>
+        <w:pStyle w:val="FirstParagraph"/>
+      </w:pPr>
+      <w:r>
+        <w:rPr>
+          <w:b/>
+        </w:rPr>
+        <w:t xml:space="preserve">Acquisition</w:t>
+      </w:r>
+      <w:r>
+        <w:t xml:space="preserve"> </w:t>
+      </w:r>
+      <w:r>
+        <w:t xml:space="preserve">-</w:t>
+      </w:r>
+      <w:r>
+        <w:t xml:space="preserve"> </w:t>
+      </w:r>
+      <w:r>
+        <w:rPr>
+          <w:rStyle w:val="VerbatimChar"/>
+        </w:rPr>
+        <w:t xml:space="preserve">s11bq4</w:t>
+      </w:r>
+      <w:r>
+        <w:t xml:space="preserve"> </w:t>
+      </w:r>
+      <w:r>
+        <w:t xml:space="preserve">(w1) /</w:t>
+      </w:r>
+      <w:r>
+        <w:t xml:space="preserve"> </w:t>
+      </w:r>
+      <w:r>
+        <w:rPr>
+          <w:rStyle w:val="VerbatimChar"/>
+        </w:rPr>
+        <w:t xml:space="preserve">s11b1q4</w:t>
+      </w:r>
+      <w:r>
+        <w:t xml:space="preserve"> </w:t>
+      </w:r>
+      <w:r>
+        <w:t xml:space="preserve">(w2-5),</w:t>
+      </w:r>
+      <w:r>
+        <w:t xml:space="preserve"> </w:t>
+      </w:r>
+      <w:r>
+        <w:rPr>
+          <w:i/>
+        </w:rPr>
+        <w:t xml:space="preserve">“</w:t>
+      </w:r>
+      <w:r>
+        <w:rPr>
+          <w:i/>
+        </w:rPr>
+        <w:t xml:space="preserve">How was [PLOT] acquired?</w:t>
+      </w:r>
+      <w:r>
+        <w:rPr>
+          <w:i/>
+        </w:rPr>
+        <w:t xml:space="preserve">”</w:t>
+      </w:r>
+      <w:r>
+        <w:t xml:space="preserve">:</w:t>
+      </w:r>
+      <w:r>
+        <w:t xml:space="preserve"> </w:t>
+      </w:r>
+      <w:r>
+        <w:rPr>
+          <w:b/>
+        </w:rPr>
+        <w:t xml:space="preserve">1 outright purchase</w:t>
+      </w:r>
+      <w:r>
+        <w:t xml:space="preserve"> </w:t>
+      </w:r>
+      <w:r>
+        <w:t xml:space="preserve">·</w:t>
+      </w:r>
+      <w:r>
+        <w:t xml:space="preserve"> </w:t>
+      </w:r>
+      <w:r>
+        <w:rPr>
+          <w:b/>
+        </w:rPr>
+        <w:t xml:space="preserve">2 rented for cash/in-kind</w:t>
+      </w:r>
+      <w:r>
+        <w:t xml:space="preserve"> </w:t>
+      </w:r>
+      <w:r>
+        <w:t xml:space="preserve">· 3 used free of charge ·</w:t>
+      </w:r>
+      <w:r>
+        <w:t xml:space="preserve"> </w:t>
+      </w:r>
+      <w:r>
+        <w:t xml:space="preserve">4 distributed by community/family · (w3+ add code 5 = other ownership; w5 adds further</w:t>
+      </w:r>
+      <w:r>
+        <w:t xml:space="preserve"> </w:t>
+      </w:r>
+      <w:r>
+        <w:t xml:space="preserve">non-owned codes incl. 6 = another rental arrangement).</w:t>
+      </w:r>
+    </w:p>
+    <w:p>
+      <w:pPr>
+        <w:pStyle w:val="BodyText"/>
+      </w:pPr>
+      <w:r>
+        <w:rPr>
+          <w:b/>
+        </w:rPr>
+        <w:t xml:space="preserve">Rented-out</w:t>
+      </w:r>
+      <w:r>
+        <w:t xml:space="preserve"> </w:t>
+      </w:r>
+      <w:r>
+        <w:t xml:space="preserve">- w1</w:t>
+      </w:r>
+      <w:r>
+        <w:t xml:space="preserve"> </w:t>
+      </w:r>
+      <w:r>
+        <w:rPr>
+          <w:rStyle w:val="VerbatimChar"/>
+        </w:rPr>
+        <w:t xml:space="preserve">s11bq17</w:t>
+      </w:r>
+      <w:r>
+        <w:t xml:space="preserve"> </w:t>
+      </w:r>
+      <w:r>
+        <w:t xml:space="preserve">(</w:t>
+      </w:r>
+      <w:r>
+        <w:t xml:space="preserve">“</w:t>
+      </w:r>
+      <w:r>
+        <w:t xml:space="preserve">main use of plot</w:t>
+      </w:r>
+      <w:r>
+        <w:t xml:space="preserve">”</w:t>
+      </w:r>
+      <w:r>
+        <w:t xml:space="preserve">): 1 left fallow, 2 rented out.</w:t>
+      </w:r>
+      <w:r>
+        <w:t xml:space="preserve"> </w:t>
+      </w:r>
+      <w:r>
+        <w:t xml:space="preserve">w2-4</w:t>
+      </w:r>
+      <w:r>
+        <w:t xml:space="preserve"> </w:t>
+      </w:r>
+      <w:r>
+        <w:rPr>
+          <w:rStyle w:val="VerbatimChar"/>
+        </w:rPr>
+        <w:t xml:space="preserve">s11b1q28</w:t>
+      </w:r>
+      <w:r>
+        <w:t xml:space="preserve"> </w:t>
+      </w:r>
+      <w:r>
+        <w:t xml:space="preserve">/ w5</w:t>
+      </w:r>
+      <w:r>
+        <w:t xml:space="preserve"> </w:t>
+      </w:r>
+      <w:r>
+        <w:rPr>
+          <w:rStyle w:val="VerbatimChar"/>
+        </w:rPr>
+        <w:t xml:space="preserve">s11b1q44</w:t>
+      </w:r>
+      <w:r>
+        <w:t xml:space="preserve"> </w:t>
+      </w:r>
+      <w:r>
+        <w:t xml:space="preserve">(codes 2,3 = rented/leased out).</w:t>
+      </w:r>
+    </w:p>
+    <w:p>
+      <w:pPr>
+        <w:pStyle w:val="BodyText"/>
+      </w:pPr>
+      <w:r>
+        <w:rPr>
+          <w:b/>
+        </w:rPr>
+        <w:t xml:space="preserve">Certificate</w:t>
+      </w:r>
+      <w:r>
+        <w:t xml:space="preserve"> </w:t>
+      </w:r>
+      <w:r>
+        <w:t xml:space="preserve">-</w:t>
+      </w:r>
+      <w:r>
+        <w:t xml:space="preserve"> </w:t>
+      </w:r>
+      <w:r>
+        <w:rPr>
+          <w:rStyle w:val="VerbatimChar"/>
+        </w:rPr>
+        <w:t xml:space="preserve">s11b1q7</w:t>
+      </w:r>
+      <w:r>
+        <w:t xml:space="preserve"> </w:t>
+      </w:r>
+      <w:r>
+        <w:t xml:space="preserve">(w2-4) /</w:t>
+      </w:r>
+      <w:r>
+        <w:t xml:space="preserve"> </w:t>
+      </w:r>
+      <w:r>
+        <w:rPr>
+          <w:rStyle w:val="VerbatimChar"/>
+        </w:rPr>
+        <w:t xml:space="preserve">s11b1q8</w:t>
+      </w:r>
+      <w:r>
+        <w:t xml:space="preserve"> </w:t>
+      </w:r>
+      <w:r>
+        <w:t xml:space="preserve">(w5): 1 yes, 2 no, 3 = missing.</w:t>
+      </w:r>
+    </w:p>
+    <w:p>
+      <w:pPr>
+        <w:pStyle w:val="Heading3"/>
+      </w:pPr>
+      <w:bookmarkStart w:id="57" w:name="harmonization-decisions-caveats-nigeria"/>
+      <w:r>
+        <w:t xml:space="preserve">6. Harmonization decisions &amp; caveats (Nigeria)</w:t>
+      </w:r>
+      <w:bookmarkEnd w:id="57"/>
+    </w:p>
+    <w:p>
+      <w:pPr>
+        <w:numPr>
+          <w:ilvl w:val="0"/>
+          <w:numId w:val="1005"/>
+        </w:numPr>
+        <w:pStyle w:val="Compact"/>
+      </w:pPr>
+      <w:r>
+        <w:rPr>
+          <w:b/>
+        </w:rPr>
+        <w:t xml:space="preserve">Purchase recovered from the acquisition question</w:t>
+      </w:r>
+      <w:r>
+        <w:t xml:space="preserve"> </w:t>
+      </w:r>
+      <w:r>
+        <w:t xml:space="preserve">(</w:t>
+      </w:r>
+      <w:r>
+        <w:rPr>
+          <w:rStyle w:val="VerbatimChar"/>
+        </w:rPr>
+        <w:t xml:space="preserve">*q4==1</w:t>
+      </w:r>
+      <w:r>
+        <w:t xml:space="preserve">, outright purchase) -</w:t>
+      </w:r>
+      <w:r>
+        <w:t xml:space="preserve"> </w:t>
+      </w:r>
+      <w:r>
+        <w:t xml:space="preserve">the upstream pipeline built owned/rented but not purchase. Verified against the GHS10</w:t>
+      </w:r>
+      <w:r>
+        <w:t xml:space="preserve"> </w:t>
+      </w:r>
+      <w:r>
+        <w:t xml:space="preserve">value labels; applied to later waves under the consistent GHS instrument (the owned</w:t>
+      </w:r>
+      <w:r>
+        <w:t xml:space="preserve"> </w:t>
+      </w:r>
+      <w:r>
+        <w:t xml:space="preserve">recode</w:t>
+      </w:r>
+      <w:r>
+        <w:t xml:space="preserve"> </w:t>
+      </w:r>
+      <w:r>
+        <w:rPr>
+          <w:rStyle w:val="VerbatimChar"/>
+        </w:rPr>
+        <w:t xml:space="preserve">{1,4}</w:t>
+      </w:r>
+      <w:r>
+        <w:t xml:space="preserve">/</w:t>
+      </w:r>
+      <w:r>
+        <w:rPr>
+          <w:rStyle w:val="VerbatimChar"/>
+        </w:rPr>
+        <w:t xml:space="preserve">{1,4,5}</w:t>
+      </w:r>
+      <w:r>
+        <w:t xml:space="preserve"> </w:t>
+      </w:r>
+      <w:r>
+        <w:t xml:space="preserve">is consistent with 1 = purchase across waves).</w:t>
+      </w:r>
+    </w:p>
+    <w:p>
+      <w:pPr>
+        <w:numPr>
+          <w:ilvl w:val="0"/>
+          <w:numId w:val="1005"/>
+        </w:numPr>
+        <w:pStyle w:val="Compact"/>
+      </w:pPr>
+      <w:r>
+        <w:rPr>
+          <w:b/>
+        </w:rPr>
+        <w:t xml:space="preserve">Rented-out likely UNDERCOUNTS in wave 1</w:t>
+      </w:r>
+      <w:r>
+        <w:t xml:space="preserve"> </w:t>
+      </w:r>
+      <w:r>
+        <w:t xml:space="preserve">- it comes from the</w:t>
+      </w:r>
+      <w:r>
+        <w:t xml:space="preserve"> </w:t>
+      </w:r>
+      <w:r>
+        <w:t xml:space="preserve">“</w:t>
+      </w:r>
+      <w:r>
+        <w:t xml:space="preserve">main use of plot</w:t>
+      </w:r>
+      <w:r>
+        <w:t xml:space="preserve">”</w:t>
+      </w:r>
+      <w:r>
+        <w:t xml:space="preserve"> </w:t>
+      </w:r>
+      <w:r>
+        <w:t xml:space="preserve">item, and since most plots are cultivated, only ~0.15% are flagged rented out.</w:t>
+      </w:r>
+      <w:r>
+        <w:t xml:space="preserve"> </w:t>
+      </w:r>
+      <w:r>
+        <w:t xml:space="preserve">Waves 2-5 use a dedicated rented-out item (</w:t>
+      </w:r>
+      <w:r>
+        <w:rPr>
+          <w:rStyle w:val="VerbatimChar"/>
+        </w:rPr>
+        <w:t xml:space="preserve">s11b1q28</w:t>
+      </w:r>
+      <w:r>
+        <w:t xml:space="preserve">/</w:t>
+      </w:r>
+      <w:r>
+        <w:rPr>
+          <w:rStyle w:val="VerbatimChar"/>
+        </w:rPr>
+        <w:t xml:space="preserve">s11b1q44</w:t>
+      </w:r>
+      <w:r>
+        <w:t xml:space="preserve">) that should capture</w:t>
+      </w:r>
+      <w:r>
+        <w:t xml:space="preserve"> </w:t>
+      </w:r>
+      <w:r>
+        <w:t xml:space="preserve">more; treat the wave-1 level as a lower bound and mind cross-wave comparability.</w:t>
+      </w:r>
+    </w:p>
+    <w:p>
+      <w:pPr>
+        <w:numPr>
+          <w:ilvl w:val="0"/>
+          <w:numId w:val="1005"/>
+        </w:numPr>
+        <w:pStyle w:val="Compact"/>
+      </w:pPr>
+      <w:r>
+        <w:rPr>
+          <w:b/>
+        </w:rPr>
+        <w:t xml:space="preserve">Certificate not asked in wave 1</w:t>
+      </w:r>
+      <w:r>
+        <w:t xml:space="preserve"> </w:t>
+      </w:r>
+      <w:r>
+        <w:t xml:space="preserve">-&gt; missing in 2011 (added from wave 2); coded 0</w:t>
+      </w:r>
+      <w:r>
+        <w:t xml:space="preserve"> </w:t>
+      </w:r>
+      <w:r>
+        <w:t xml:space="preserve">for non-owned parcels in later waves (a certificate applies to owned land).</w:t>
+      </w:r>
+    </w:p>
+    <w:p>
+      <w:pPr>
+        <w:numPr>
+          <w:ilvl w:val="0"/>
+          <w:numId w:val="1005"/>
+        </w:numPr>
+        <w:pStyle w:val="Compact"/>
+      </w:pPr>
+      <w:r>
+        <w:rPr>
+          <w:b/>
+        </w:rPr>
+        <w:t xml:space="preserve">Area</w:t>
+      </w:r>
+      <w:r>
+        <w:t xml:space="preserve"> </w:t>
+      </w:r>
+      <w:r>
+        <w:t xml:space="preserve">uses GPS (</w:t>
+      </w:r>
+      <w:r>
+        <w:rPr>
+          <w:rStyle w:val="VerbatimChar"/>
+        </w:rPr>
+        <w:t xml:space="preserve">plot_area</w:t>
+      </w:r>
+      <w:r>
+        <w:t xml:space="preserve"> </w:t>
+      </w:r>
+      <w:r>
+        <w:t xml:space="preserve">× 0.0001) else self-reported with Nigeria’s</w:t>
+      </w:r>
+      <w:r>
+        <w:t xml:space="preserve"> </w:t>
+      </w:r>
+      <w:r>
+        <w:t xml:space="preserve">region-specific local-unit conversions; deterministic (no imputation).</w:t>
+      </w:r>
+    </w:p>
+    <w:p>
+      <w:pPr>
+        <w:numPr>
+          <w:ilvl w:val="0"/>
+          <w:numId w:val="1005"/>
+        </w:numPr>
+        <w:pStyle w:val="Compact"/>
+      </w:pPr>
+      <w:r>
+        <w:rPr>
+          <w:b/>
+        </w:rPr>
+        <w:t xml:space="preserve">Strata/PSU</w:t>
+      </w:r>
+      <w:r>
+        <w:t xml:space="preserve">:</w:t>
+      </w:r>
+      <w:r>
+        <w:t xml:space="preserve"> </w:t>
+      </w:r>
+      <w:r>
+        <w:rPr>
+          <w:rStyle w:val="VerbatimChar"/>
+        </w:rPr>
+        <w:t xml:space="preserve">strataid = zone</w:t>
+      </w:r>
+      <w:r>
+        <w:t xml:space="preserve">,</w:t>
+      </w:r>
+      <w:r>
+        <w:t xml:space="preserve"> </w:t>
+      </w:r>
+      <w:r>
+        <w:rPr>
+          <w:rStyle w:val="VerbatimChar"/>
+        </w:rPr>
+        <w:t xml:space="preserve">ea_id = lga-ea</w:t>
+      </w:r>
+      <w:r>
+        <w:t xml:space="preserve">, taken from each wave’s cover with</w:t>
+      </w:r>
+      <w:r>
+        <w:t xml:space="preserve"> </w:t>
+      </w:r>
+      <w:r>
+        <w:t xml:space="preserve">the GHS10 cover as a panel fallback (the panel covers drop ea/lga for non-refresh HHs).</w:t>
+      </w:r>
+    </w:p>
+    <w:p>
+      <w:pPr>
+        <w:numPr>
+          <w:ilvl w:val="0"/>
+          <w:numId w:val="1005"/>
+        </w:numPr>
+        <w:pStyle w:val="Compact"/>
+      </w:pPr>
+      <w:r>
+        <w:rPr>
+          <w:b/>
+        </w:rPr>
+        <w:t xml:space="preserve">Most complex country</w:t>
+      </w:r>
+      <w:r>
+        <w:t xml:space="preserve"> </w:t>
+      </w:r>
+      <w:r>
+        <w:t xml:space="preserve">- 5 waves, region-specific area conversions, panel geography.</w:t>
+      </w:r>
+      <w:r>
+        <w:t xml:space="preserve"> </w:t>
+      </w:r>
+      <w:r>
+        <w:t xml:space="preserve">The first Stata run is a shakedown: confirm the area GPS source (</w:t>
+      </w:r>
+      <w:r>
+        <w:rPr>
+          <w:rStyle w:val="VerbatimChar"/>
+        </w:rPr>
+        <w:t xml:space="preserve">plot_area</w:t>
+      </w:r>
+      <w:r>
+        <w:t xml:space="preserve">) and the</w:t>
+      </w:r>
+      <w:r>
+        <w:t xml:space="preserve"> </w:t>
+      </w:r>
+      <w:r>
+        <w:t xml:space="preserve">per-wave cover/weight merges resolve as expected.</w:t>
+      </w:r>
+    </w:p>
+    <w:p>
+      <w:r>
+        <w:pict>
+          <v:rect style="width:0;height:1.5pt" o:hralign="center" o:hrstd="t" o:hr="t"/>
+        </w:pict>
+      </w:r>
+    </w:p>
+    <w:p>
+      <w:pPr>
+        <w:pStyle w:val="FirstParagraph"/>
+      </w:pPr>
+      <w:r>
         <w:rPr>
           <w:i/>
         </w:rPr>
@@ -16793,7 +19366,7 @@
         <w:rPr>
           <w:i/>
         </w:rPr>
-        <w:t xml:space="preserve">NER ECVMA1-2) and the raw survey modules, with all source variables, codes, and value</w:t>
+        <w:t xml:space="preserve">NER ECVMA1-2, NGA GHS1-5) and the raw survey modules, with source variables, codes, and</w:t>
       </w:r>
       <w:r>
         <w:rPr>
@@ -16805,7 +19378,7 @@
         <w:rPr>
           <w:i/>
         </w:rPr>
-        <w:t xml:space="preserve">labels verified against the data. Extend with one new country section (1-6) per country</w:t>
+        <w:t xml:space="preserve">value labels verified against the data. Extend with one new country section (1-6) per</w:t>
       </w:r>
       <w:r>
         <w:rPr>
@@ -16817,7 +19390,7 @@
         <w:rPr>
           <w:i/>
         </w:rPr>
-        <w:t xml:space="preserve">as the workflow grows.</w:t>
+        <w:t xml:space="preserve">country as the workflow grows.</w:t>
       </w:r>
     </w:p>
     <w:sectPr/>
@@ -17069,6 +19642,9 @@
     <w:abstractNumId w:val="991"/>
   </w:num>
   <w:num w:numId="1004">
+    <w:abstractNumId w:val="991"/>
+  </w:num>
+  <w:num w:numId="1005">
     <w:abstractNumId w:val="991"/>
   </w:num>
 </w:numbering>

</xml_diff>

<commit_message>
Fix Nigeria GPS area: correct per-wave GPS var (s11aq4d/s11aq4c/s11mq3) x0.0001 to ha
</commit_message>
<xml_diff>
--- a/Reference/variable_provenance.docx
+++ b/Reference/variable_provenance.docx
@@ -18149,11 +18149,116 @@
         <w:pStyle w:val="FirstParagraph"/>
       </w:pPr>
       <w:r>
-        <w:t xml:space="preserve">GPS where measured (</w:t>
+        <w:t xml:space="preserve">GPS where measured (the</w:t>
+      </w:r>
+      <w:r>
+        <w:t xml:space="preserve"> </w:t>
+      </w:r>
+      <w:r>
+        <w:t xml:space="preserve">“</w:t>
+      </w:r>
+      <w:r>
+        <w:t xml:space="preserve">GPS measured in square meters</w:t>
+      </w:r>
+      <w:r>
+        <w:t xml:space="preserve">”</w:t>
+      </w:r>
+      <w:r>
+        <w:t xml:space="preserve"> </w:t>
+      </w:r>
+      <w:r>
+        <w:t xml:space="preserve">variable × 0.0001 → ha), else</w:t>
+      </w:r>
+      <w:r>
+        <w:t xml:space="preserve"> </w:t>
+      </w:r>
+      <w:r>
+        <w:t xml:space="preserve">self-reported. The GPS variable name shifts by wave:</w:t>
+      </w:r>
+      <w:r>
+        <w:t xml:space="preserve"> </w:t>
+      </w:r>
+      <w:r>
+        <w:rPr>
+          <w:b/>
+        </w:rPr>
+        <w:t xml:space="preserve">w1</w:t>
+      </w:r>
+      <w:r>
+        <w:rPr>
+          <w:b/>
+        </w:rPr>
+        <w:t xml:space="preserve"> </w:t>
       </w:r>
       <w:r>
         <w:rPr>
           <w:rStyle w:val="VerbatimChar"/>
+          <w:b/>
+        </w:rPr>
+        <w:t xml:space="preserve">s11aq4d</w:t>
+      </w:r>
+      <w:r>
+        <w:rPr>
+          <w:b/>
+        </w:rPr>
+        <w:t xml:space="preserve">, w2-4</w:t>
+      </w:r>
+      <w:r>
+        <w:rPr>
+          <w:b/>
+        </w:rPr>
+        <w:t xml:space="preserve"> </w:t>
+      </w:r>
+      <w:r>
+        <w:rPr>
+          <w:rStyle w:val="VerbatimChar"/>
+          <w:b/>
+        </w:rPr>
+        <w:t xml:space="preserve">s11aq4c</w:t>
+      </w:r>
+      <w:r>
+        <w:rPr>
+          <w:b/>
+        </w:rPr>
+        <w:t xml:space="preserve">,</w:t>
+      </w:r>
+      <w:r>
+        <w:rPr>
+          <w:b/>
+        </w:rPr>
+        <w:t xml:space="preserve"> </w:t>
+      </w:r>
+      <w:r>
+        <w:rPr>
+          <w:b/>
+        </w:rPr>
+        <w:t xml:space="preserve">w5</w:t>
+      </w:r>
+      <w:r>
+        <w:rPr>
+          <w:b/>
+        </w:rPr>
+        <w:t xml:space="preserve"> </w:t>
+      </w:r>
+      <w:r>
+        <w:rPr>
+          <w:rStyle w:val="VerbatimChar"/>
+          <w:b/>
+        </w:rPr>
+        <w:t xml:space="preserve">s11mq3</w:t>
+      </w:r>
+      <w:r>
+        <w:t xml:space="preserve"> </w:t>
+      </w:r>
+      <w:r>
+        <w:t xml:space="preserve">(there is no</w:t>
+      </w:r>
+      <w:r>
+        <w:t xml:space="preserve"> </w:t>
+      </w:r>
+      <w:r>
+        <w:rPr>
+          <w:rStyle w:val="VerbatimChar"/>
         </w:rPr>
         <w:t xml:space="preserve">plot_area</w:t>
       </w:r>
@@ -18161,13 +18266,19 @@
         <w:t xml:space="preserve"> </w:t>
       </w:r>
       <w:r>
-        <w:t xml:space="preserve">× 0.0001, m² → ha), else self-reported. Self-reported</w:t>
-      </w:r>
-      <w:r>
-        <w:t xml:space="preserve"> </w:t>
-      </w:r>
-      <w:r>
-        <w:t xml:space="preserve">is in local units with</w:t>
+        <w:t xml:space="preserve">variable in the raw - the upstream pipeline</w:t>
+      </w:r>
+      <w:r>
+        <w:t xml:space="preserve"> </w:t>
+      </w:r>
+      <w:r>
+        <w:t xml:space="preserve">referenced a nonexistent one, so its GPS was effectively unused). Self-reported is in</w:t>
+      </w:r>
+      <w:r>
+        <w:t xml:space="preserve"> </w:t>
+      </w:r>
+      <w:r>
+        <w:t xml:space="preserve">local units with</w:t>
       </w:r>
       <w:r>
         <w:t xml:space="preserve"> </w:t>
@@ -18182,13 +18293,13 @@
         <w:t xml:space="preserve"> </w:t>
       </w:r>
       <w:r>
-        <w:t xml:space="preserve">conversion factors (heaps/ridges/stands ×</w:t>
-      </w:r>
-      <w:r>
-        <w:t xml:space="preserve"> </w:t>
-      </w:r>
-      <w:r>
-        <w:t xml:space="preserve">the survey zone</w:t>
+        <w:t xml:space="preserve">conversion factors (heaps/ridges/stands × the</w:t>
+      </w:r>
+      <w:r>
+        <w:t xml:space="preserve"> </w:t>
+      </w:r>
+      <w:r>
+        <w:t xml:space="preserve">survey zone</w:t>
       </w:r>
       <w:r>
         <w:t xml:space="preserve"> </w:t>
@@ -18203,7 +18314,7 @@
         <w:t xml:space="preserve"> </w:t>
       </w:r>
       <w:r>
-        <w:t xml:space="preserve">1-6; plus acres/m²/plot factors). Wave 1-4 self-reported =</w:t>
+        <w:t xml:space="preserve">1-6; plus acres/m²/plot factors); self-reported number =</w:t>
       </w:r>
       <w:r>
         <w:t xml:space="preserve"> </w:t>
@@ -18215,7 +18326,13 @@
         <w:t xml:space="preserve">s11aq4a</w:t>
       </w:r>
       <w:r>
-        <w:t xml:space="preserve">/</w:t>
+        <w:t xml:space="preserve"> </w:t>
+      </w:r>
+      <w:r>
+        <w:t xml:space="preserve">(w1-3) /</w:t>
+      </w:r>
+      <w:r>
+        <w:t xml:space="preserve"> </w:t>
       </w:r>
       <w:r>
         <w:rPr>
@@ -18227,7 +18344,7 @@
         <w:t xml:space="preserve"> </w:t>
       </w:r>
       <w:r>
-        <w:t xml:space="preserve">with unit</w:t>
+        <w:t xml:space="preserve">(w4) /</w:t>
       </w:r>
       <w:r>
         <w:t xml:space="preserve"> </w:t>
@@ -18236,10 +18353,28 @@
         <w:rPr>
           <w:rStyle w:val="VerbatimChar"/>
         </w:rPr>
+        <w:t xml:space="preserve">s11aq3_number</w:t>
+      </w:r>
+      <w:r>
+        <w:t xml:space="preserve"> </w:t>
+      </w:r>
+      <w:r>
+        <w:t xml:space="preserve">(w5), unit</w:t>
+      </w:r>
+      <w:r>
+        <w:t xml:space="preserve"> </w:t>
+      </w:r>
+      <w:r>
+        <w:rPr>
+          <w:rStyle w:val="VerbatimChar"/>
+        </w:rPr>
         <w:t xml:space="preserve">s11aq4b</w:t>
       </w:r>
       <w:r>
-        <w:t xml:space="preserve">; wave 5 =</w:t>
+        <w:t xml:space="preserve"> </w:t>
+      </w:r>
+      <w:r>
+        <w:t xml:space="preserve">(w1-4) /</w:t>
       </w:r>
       <w:r>
         <w:t xml:space="preserve"> </w:t>
@@ -18248,34 +18383,13 @@
         <w:rPr>
           <w:rStyle w:val="VerbatimChar"/>
         </w:rPr>
-        <w:t xml:space="preserve">s11aq3_number</w:t>
-      </w:r>
-      <w:r>
-        <w:t xml:space="preserve"> </w:t>
-      </w:r>
-      <w:r>
-        <w:t xml:space="preserve">with unit</w:t>
-      </w:r>
-      <w:r>
-        <w:t xml:space="preserve"> </w:t>
-      </w:r>
-      <w:r>
-        <w:rPr>
-          <w:rStyle w:val="VerbatimChar"/>
-        </w:rPr>
         <w:t xml:space="preserve">s11aq3_unit</w:t>
       </w:r>
       <w:r>
         <w:t xml:space="preserve"> </w:t>
       </w:r>
       <w:r>
-        <w:t xml:space="preserve">(different simple-unit codes). The region factors are identical across</w:t>
-      </w:r>
-      <w:r>
-        <w:t xml:space="preserve"> </w:t>
-      </w:r>
-      <w:r>
-        <w:t xml:space="preserve">waves and transcribed verbatim from the upstream pipeline.</w:t>
+        <w:t xml:space="preserve">(w5). The region factors are identical across waves (transcribed from the upstream pipeline).</w:t>
       </w:r>
     </w:p>
     <w:p>

</xml_diff>

<commit_message>
Top-code parcel_area_ha at 40 ha (data-entry outliers) across all extractors + doc
</commit_message>
<xml_diff>
--- a/Reference/variable_provenance.docx
+++ b/Reference/variable_provenance.docx
@@ -703,6 +703,131 @@
         </w:tc>
       </w:tr>
     </w:tbl>
+    <w:p>
+      <w:pPr>
+        <w:pStyle w:val="BodyText"/>
+      </w:pPr>
+      <w:r>
+        <w:rPr>
+          <w:b/>
+        </w:rPr>
+        <w:t xml:space="preserve">Area cleaning.</w:t>
+      </w:r>
+      <w:r>
+        <w:t xml:space="preserve"> </w:t>
+      </w:r>
+      <w:r>
+        <w:rPr>
+          <w:rStyle w:val="VerbatimChar"/>
+        </w:rPr>
+        <w:t xml:space="preserve">parcel_area_ha</w:t>
+      </w:r>
+      <w:r>
+        <w:t xml:space="preserve"> </w:t>
+      </w:r>
+      <w:r>
+        <w:t xml:space="preserve">is</w:t>
+      </w:r>
+      <w:r>
+        <w:t xml:space="preserve"> </w:t>
+      </w:r>
+      <w:r>
+        <w:rPr>
+          <w:b/>
+        </w:rPr>
+        <w:t xml:space="preserve">top-coded</w:t>
+      </w:r>
+      <w:r>
+        <w:t xml:space="preserve">: values above</w:t>
+      </w:r>
+      <w:r>
+        <w:t xml:space="preserve"> </w:t>
+      </w:r>
+      <w:r>
+        <w:rPr>
+          <w:rStyle w:val="VerbatimChar"/>
+        </w:rPr>
+        <w:t xml:space="preserve">${area_max}</w:t>
+      </w:r>
+      <w:r>
+        <w:t xml:space="preserve"> </w:t>
+      </w:r>
+      <w:r>
+        <w:t xml:space="preserve">(40 ha,</w:t>
+      </w:r>
+      <w:r>
+        <w:t xml:space="preserve"> </w:t>
+      </w:r>
+      <w:r>
+        <w:t xml:space="preserve">set in</w:t>
+      </w:r>
+      <w:r>
+        <w:t xml:space="preserve"> </w:t>
+      </w:r>
+      <w:r>
+        <w:rPr>
+          <w:rStyle w:val="VerbatimChar"/>
+        </w:rPr>
+        <w:t xml:space="preserve">MASTER.do</w:t>
+      </w:r>
+      <w:r>
+        <w:t xml:space="preserve">) are treated as data-entry errors and set missing. Smallholder</w:t>
+      </w:r>
+      <w:r>
+        <w:t xml:space="preserve"> </w:t>
+      </w:r>
+      <w:r>
+        <w:t xml:space="preserve">parcels rarely exceed this, but the raw self-reported areas carry unit-entry outliers</w:t>
+      </w:r>
+      <w:r>
+        <w:t xml:space="preserve"> </w:t>
+      </w:r>
+      <w:r>
+        <w:t xml:space="preserve">(e.g. tens of thousands of</w:t>
+      </w:r>
+      <w:r>
+        <w:t xml:space="preserve"> </w:t>
+      </w:r>
+      <w:r>
+        <w:t xml:space="preserve">“</w:t>
+      </w:r>
+      <w:r>
+        <w:t xml:space="preserve">acres</w:t>
+      </w:r>
+      <w:r>
+        <w:t xml:space="preserve">”</w:t>
+      </w:r>
+      <w:r>
+        <w:t xml:space="preserve">) that otherwise inflate the</w:t>
+      </w:r>
+      <w:r>
+        <w:t xml:space="preserve"> </w:t>
+      </w:r>
+      <w:r>
+        <w:rPr>
+          <w:i/>
+        </w:rPr>
+        <w:t xml:space="preserve">mean</w:t>
+      </w:r>
+      <w:r>
+        <w:t xml:space="preserve"> </w:t>
+      </w:r>
+      <w:r>
+        <w:t xml:space="preserve">(the median is</w:t>
+      </w:r>
+      <w:r>
+        <w:t xml:space="preserve"> </w:t>
+      </w:r>
+      <w:r>
+        <w:t xml:space="preserve">unaffected). This matters most where a parcel falls back to self-reported area because</w:t>
+      </w:r>
+      <w:r>
+        <w:t xml:space="preserve"> </w:t>
+      </w:r>
+      <w:r>
+        <w:t xml:space="preserve">GPS is missing; GPS-measured areas are well-behaved.</w:t>
+      </w:r>
+    </w:p>
     <w:p>
       <w:r>
         <w:pict>

</xml_diff>

<commit_message>
Add Tanzania extractor (NPS 1-5 incl. extended+refresh, parcel-level) + provenance; enable in MASTER
</commit_message>
<xml_diff>
--- a/Reference/variable_provenance.docx
+++ b/Reference/variable_provenance.docx
@@ -1632,6 +1632,106 @@
           </w:p>
         </w:tc>
       </w:tr>
+      <w:tr>
+        <w:tc>
+          <w:p>
+            <w:pPr>
+              <w:pStyle w:val="Compact"/>
+              <w:jc w:val="left"/>
+            </w:pPr>
+            <w:r>
+              <w:t xml:space="preserve">Tanzania</w:t>
+            </w:r>
+          </w:p>
+        </w:tc>
+        <w:tc>
+          <w:p>
+            <w:pPr>
+              <w:pStyle w:val="Compact"/>
+              <w:jc w:val="left"/>
+            </w:pPr>
+            <w:r>
+              <w:rPr>
+                <w:rStyle w:val="VerbatimChar"/>
+              </w:rPr>
+              <w:t xml:space="preserve">parcel_purchased</w:t>
+            </w:r>
+          </w:p>
+        </w:tc>
+        <w:tc>
+          <w:p>
+            <w:pPr>
+              <w:pStyle w:val="Compact"/>
+              <w:jc w:val="left"/>
+            </w:pPr>
+            <w:r>
+              <w:t xml:space="preserve">2009, 2011, 2013</w:t>
+            </w:r>
+          </w:p>
+        </w:tc>
+        <w:tc>
+          <w:p>
+            <w:pPr>
+              <w:pStyle w:val="Compact"/>
+              <w:jc w:val="left"/>
+            </w:pPr>
+            <w:r>
+              <w:t xml:space="preserve">The early NPS</w:t>
+            </w:r>
+            <w:r>
+              <w:t xml:space="preserve"> </w:t>
+            </w:r>
+            <w:r>
+              <w:t xml:space="preserve">“</w:t>
+            </w:r>
+            <w:r>
+              <w:t xml:space="preserve">ownership status</w:t>
+            </w:r>
+            <w:r>
+              <w:t xml:space="preserve">”</w:t>
+            </w:r>
+            <w:r>
+              <w:t xml:space="preserve"> </w:t>
+            </w:r>
+            <w:r>
+              <w:t xml:space="preserve">question has</w:t>
+            </w:r>
+            <w:r>
+              <w:t xml:space="preserve"> </w:t>
+            </w:r>
+            <w:r>
+              <w:rPr>
+                <w:b/>
+              </w:rPr>
+              <w:t xml:space="preserve">no acquisition-mode / purchase category</w:t>
+            </w:r>
+            <w:r>
+              <w:t xml:space="preserve"> </w:t>
+            </w:r>
+            <w:r>
+              <w:t xml:space="preserve">(added when the question was redesigned to</w:t>
+            </w:r>
+            <w:r>
+              <w:t xml:space="preserve"> </w:t>
+            </w:r>
+            <w:r>
+              <w:t xml:space="preserve">“</w:t>
+            </w:r>
+            <w:r>
+              <w:t xml:space="preserve">how was this plot acquired?</w:t>
+            </w:r>
+            <w:r>
+              <w:t xml:space="preserve">”</w:t>
+            </w:r>
+            <w:r>
+              <w:t xml:space="preserve"> </w:t>
+            </w:r>
+            <w:r>
+              <w:t xml:space="preserve">in NPS4, 2015).</w:t>
+            </w:r>
+          </w:p>
+        </w:tc>
+      </w:tr>
     </w:tbl>
     <w:p>
       <w:pPr>
@@ -19562,9 +19662,2546 @@
     </w:p>
     <w:p>
       <w:pPr>
+        <w:pStyle w:val="Heading2"/>
+      </w:pPr>
+      <w:bookmarkStart w:id="58" w:name="tanzania-national-panel-survey-nps"/>
+      <w:r>
+        <w:t xml:space="preserve">TANZANIA — National Panel Survey (NPS)</w:t>
+      </w:r>
+      <w:bookmarkEnd w:id="58"/>
+    </w:p>
+    <w:p>
+      <w:pPr>
         <w:pStyle w:val="FirstParagraph"/>
       </w:pPr>
       <w:r>
+        <w:t xml:space="preserve">Five NPS waves. Waves</w:t>
+      </w:r>
+      <w:r>
+        <w:t xml:space="preserve"> </w:t>
+      </w:r>
+      <w:r>
+        <w:rPr>
+          <w:b/>
+        </w:rPr>
+        <w:t xml:space="preserve">4 (2014/15) and 5 (2019/20) each split into an EXTENDED (long</w:t>
+      </w:r>
+      <w:r>
+        <w:rPr>
+          <w:b/>
+        </w:rPr>
+        <w:t xml:space="preserve"> </w:t>
+      </w:r>
+      <w:r>
+        <w:rPr>
+          <w:b/>
+        </w:rPr>
+        <w:t xml:space="preserve">panel) and a REFRESH subsample</w:t>
+      </w:r>
+      <w:r>
+        <w:t xml:space="preserve"> </w:t>
+      </w:r>
+      <w:r>
+        <w:t xml:space="preserve">- 7 datasets in all, combined here into waves 4 and 5</w:t>
+      </w:r>
+      <w:r>
+        <w:t xml:space="preserve"> </w:t>
+      </w:r>
+      <w:r>
+        <w:t xml:space="preserve">using each subsample’s own weights. Tenure (acquisition &amp; use) is in the plot-inputs</w:t>
+      </w:r>
+      <w:r>
+        <w:t xml:space="preserve"> </w:t>
+      </w:r>
+      <w:r>
+        <w:t xml:space="preserve">module; area is in the plot roster - merged on</w:t>
+      </w:r>
+      <w:r>
+        <w:t xml:space="preserve"> </w:t>
+      </w:r>
+      <w:r>
+        <w:rPr>
+          <w:rStyle w:val="VerbatimChar"/>
+        </w:rPr>
+        <w:t xml:space="preserve">hhid-plotnum</w:t>
+      </w:r>
+      <w:r>
+        <w:t xml:space="preserve">.</w:t>
+      </w:r>
+    </w:p>
+    <w:p>
+      <w:pPr>
+        <w:pStyle w:val="BlockText"/>
+      </w:pPr>
+      <w:r>
+        <w:rPr>
+          <w:b/>
+        </w:rPr>
+        <w:t xml:space="preserve">Unit note.</w:t>
+      </w:r>
+      <w:r>
+        <w:t xml:space="preserve"> </w:t>
+      </w:r>
+      <w:r>
+        <w:rPr>
+          <w:rStyle w:val="VerbatimChar"/>
+        </w:rPr>
+        <w:t xml:space="preserve">parcel</w:t>
+      </w:r>
+      <w:r>
+        <w:t xml:space="preserve"> </w:t>
+      </w:r>
+      <w:r>
+        <w:t xml:space="preserve">= the plot. The household id changes each wave</w:t>
+      </w:r>
+      <w:r>
+        <w:t xml:space="preserve"> </w:t>
+      </w:r>
+      <w:r>
+        <w:t xml:space="preserve">(</w:t>
+      </w:r>
+      <w:r>
+        <w:rPr>
+          <w:rStyle w:val="VerbatimChar"/>
+        </w:rPr>
+        <w:t xml:space="preserve">hhid</w:t>
+      </w:r>
+      <w:r>
+        <w:t xml:space="preserve"> </w:t>
+      </w:r>
+      <w:r>
+        <w:t xml:space="preserve">→</w:t>
+      </w:r>
+      <w:r>
+        <w:t xml:space="preserve"> </w:t>
+      </w:r>
+      <w:r>
+        <w:rPr>
+          <w:rStyle w:val="VerbatimChar"/>
+        </w:rPr>
+        <w:t xml:space="preserve">y2_hhid</w:t>
+      </w:r>
+      <w:r>
+        <w:t xml:space="preserve"> </w:t>
+      </w:r>
+      <w:r>
+        <w:t xml:space="preserve">→</w:t>
+      </w:r>
+      <w:r>
+        <w:t xml:space="preserve"> </w:t>
+      </w:r>
+      <w:r>
+        <w:rPr>
+          <w:rStyle w:val="VerbatimChar"/>
+        </w:rPr>
+        <w:t xml:space="preserve">y3_hhid</w:t>
+      </w:r>
+      <w:r>
+        <w:t xml:space="preserve"> </w:t>
+      </w:r>
+      <w:r>
+        <w:t xml:space="preserve">→</w:t>
+      </w:r>
+      <w:r>
+        <w:t xml:space="preserve"> </w:t>
+      </w:r>
+      <w:r>
+        <w:rPr>
+          <w:rStyle w:val="VerbatimChar"/>
+        </w:rPr>
+        <w:t xml:space="preserve">y4_hhid</w:t>
+      </w:r>
+      <w:r>
+        <w:t xml:space="preserve"> </w:t>
+      </w:r>
+      <w:r>
+        <w:t xml:space="preserve">→</w:t>
+      </w:r>
+      <w:r>
+        <w:t xml:space="preserve"> </w:t>
+      </w:r>
+      <w:r>
+        <w:rPr>
+          <w:rStyle w:val="VerbatimChar"/>
+        </w:rPr>
+        <w:t xml:space="preserve">sdd_hhid</w:t>
+      </w:r>
+      <w:r>
+        <w:t xml:space="preserve">/</w:t>
+      </w:r>
+      <w:r>
+        <w:rPr>
+          <w:rStyle w:val="VerbatimChar"/>
+        </w:rPr>
+        <w:t xml:space="preserve">y5_hhid</w:t>
+      </w:r>
+      <w:r>
+        <w:t xml:space="preserve">).</w:t>
+      </w:r>
+    </w:p>
+    <w:p>
+      <w:pPr>
+        <w:pStyle w:val="Heading3"/>
+      </w:pPr>
+      <w:bookmarkStart w:id="59" w:name="survey-wave-key-5"/>
+      <w:r>
+        <w:t xml:space="preserve">1. Survey &amp; wave key</w:t>
+      </w:r>
+      <w:bookmarkEnd w:id="59"/>
+    </w:p>
+    <w:tbl>
+      <w:tblPr>
+        <w:tblStyle w:val="Table"/>
+        <w:tblW w:type="pct" w:w="5000.0"/>
+        <w:tblLook w:firstRow="1"/>
+      </w:tblPr>
+      <w:tblGrid>
+        <w:gridCol w:w="805"/>
+        <w:gridCol w:w="2282"/>
+        <w:gridCol w:w="1073"/>
+        <w:gridCol w:w="2147"/>
+        <w:gridCol w:w="1610"/>
+      </w:tblGrid>
+      <w:tr>
+        <w:trPr>
+          <w:cnfStyle w:firstRow="1"/>
+        </w:trPr>
+        <w:tc>
+          <w:tcPr>
+            <w:tcBorders>
+              <w:bottom w:val="single"/>
+            </w:tcBorders>
+            <w:vAlign w:val="bottom"/>
+          </w:tcPr>
+          <w:p>
+            <w:pPr>
+              <w:pStyle w:val="Compact"/>
+              <w:jc w:val="left"/>
+            </w:pPr>
+            <w:r>
+              <w:t xml:space="preserve">Wave</w:t>
+            </w:r>
+          </w:p>
+        </w:tc>
+        <w:tc>
+          <w:tcPr>
+            <w:tcBorders>
+              <w:bottom w:val="single"/>
+            </w:tcBorders>
+            <w:vAlign w:val="bottom"/>
+          </w:tcPr>
+          <w:p>
+            <w:pPr>
+              <w:pStyle w:val="Compact"/>
+              <w:jc w:val="left"/>
+            </w:pPr>
+            <w:r>
+              <w:t xml:space="preserve">Round folder(s)</w:t>
+            </w:r>
+          </w:p>
+        </w:tc>
+        <w:tc>
+          <w:tcPr>
+            <w:tcBorders>
+              <w:bottom w:val="single"/>
+            </w:tcBorders>
+            <w:vAlign w:val="bottom"/>
+          </w:tcPr>
+          <w:p>
+            <w:pPr>
+              <w:pStyle w:val="Compact"/>
+              <w:jc w:val="left"/>
+            </w:pPr>
+            <w:r>
+              <w:t xml:space="preserve">Year</w:t>
+            </w:r>
+          </w:p>
+        </w:tc>
+        <w:tc>
+          <w:tcPr>
+            <w:tcBorders>
+              <w:bottom w:val="single"/>
+            </w:tcBorders>
+            <w:vAlign w:val="bottom"/>
+          </w:tcPr>
+          <w:p>
+            <w:pPr>
+              <w:pStyle w:val="Compact"/>
+              <w:jc w:val="left"/>
+            </w:pPr>
+            <w:r>
+              <w:t xml:space="preserve">HH id</w:t>
+            </w:r>
+          </w:p>
+        </w:tc>
+        <w:tc>
+          <w:tcPr>
+            <w:tcBorders>
+              <w:bottom w:val="single"/>
+            </w:tcBorders>
+            <w:vAlign w:val="bottom"/>
+          </w:tcPr>
+          <w:p>
+            <w:pPr>
+              <w:pStyle w:val="Compact"/>
+              <w:jc w:val="left"/>
+            </w:pPr>
+            <w:r>
+              <w:t xml:space="preserve">Tenure var</w:t>
+            </w:r>
+          </w:p>
+        </w:tc>
+      </w:tr>
+      <w:tr>
+        <w:tc>
+          <w:p>
+            <w:pPr>
+              <w:pStyle w:val="Compact"/>
+              <w:jc w:val="left"/>
+            </w:pPr>
+            <w:r>
+              <w:t xml:space="preserve">1</w:t>
+            </w:r>
+          </w:p>
+        </w:tc>
+        <w:tc>
+          <w:p>
+            <w:pPr>
+              <w:pStyle w:val="Compact"/>
+              <w:jc w:val="left"/>
+            </w:pPr>
+            <w:r>
+              <w:rPr>
+                <w:rStyle w:val="VerbatimChar"/>
+              </w:rPr>
+              <w:t xml:space="preserve">Tanzania/NPS 08</w:t>
+            </w:r>
+          </w:p>
+        </w:tc>
+        <w:tc>
+          <w:p>
+            <w:pPr>
+              <w:pStyle w:val="Compact"/>
+              <w:jc w:val="left"/>
+            </w:pPr>
+            <w:r>
+              <w:t xml:space="preserve">2009</w:t>
+            </w:r>
+          </w:p>
+        </w:tc>
+        <w:tc>
+          <w:p>
+            <w:pPr>
+              <w:pStyle w:val="Compact"/>
+              <w:jc w:val="left"/>
+            </w:pPr>
+            <w:r>
+              <w:rPr>
+                <w:rStyle w:val="VerbatimChar"/>
+              </w:rPr>
+              <w:t xml:space="preserve">hhid</w:t>
+            </w:r>
+          </w:p>
+        </w:tc>
+        <w:tc>
+          <w:p>
+            <w:pPr>
+              <w:pStyle w:val="Compact"/>
+              <w:jc w:val="left"/>
+            </w:pPr>
+            <w:r>
+              <w:rPr>
+                <w:rStyle w:val="VerbatimChar"/>
+              </w:rPr>
+              <w:t xml:space="preserve">s3aq22</w:t>
+            </w:r>
+            <w:r>
+              <w:t xml:space="preserve"> </w:t>
+            </w:r>
+            <w:r>
+              <w:t xml:space="preserve">(early)</w:t>
+            </w:r>
+          </w:p>
+        </w:tc>
+      </w:tr>
+      <w:tr>
+        <w:tc>
+          <w:p>
+            <w:pPr>
+              <w:pStyle w:val="Compact"/>
+              <w:jc w:val="left"/>
+            </w:pPr>
+            <w:r>
+              <w:t xml:space="preserve">2</w:t>
+            </w:r>
+          </w:p>
+        </w:tc>
+        <w:tc>
+          <w:p>
+            <w:pPr>
+              <w:pStyle w:val="Compact"/>
+              <w:jc w:val="left"/>
+            </w:pPr>
+            <w:r>
+              <w:rPr>
+                <w:rStyle w:val="VerbatimChar"/>
+              </w:rPr>
+              <w:t xml:space="preserve">Tanzania/NPS 10</w:t>
+            </w:r>
+          </w:p>
+        </w:tc>
+        <w:tc>
+          <w:p>
+            <w:pPr>
+              <w:pStyle w:val="Compact"/>
+              <w:jc w:val="left"/>
+            </w:pPr>
+            <w:r>
+              <w:t xml:space="preserve">2011</w:t>
+            </w:r>
+          </w:p>
+        </w:tc>
+        <w:tc>
+          <w:p>
+            <w:pPr>
+              <w:pStyle w:val="Compact"/>
+              <w:jc w:val="left"/>
+            </w:pPr>
+            <w:r>
+              <w:rPr>
+                <w:rStyle w:val="VerbatimChar"/>
+              </w:rPr>
+              <w:t xml:space="preserve">y2_hhid</w:t>
+            </w:r>
+          </w:p>
+        </w:tc>
+        <w:tc>
+          <w:p>
+            <w:pPr>
+              <w:pStyle w:val="Compact"/>
+              <w:jc w:val="left"/>
+            </w:pPr>
+            <w:r>
+              <w:rPr>
+                <w:rStyle w:val="VerbatimChar"/>
+              </w:rPr>
+              <w:t xml:space="preserve">ag3a_24</w:t>
+            </w:r>
+            <w:r>
+              <w:t xml:space="preserve"> </w:t>
+            </w:r>
+            <w:r>
+              <w:t xml:space="preserve">(early)</w:t>
+            </w:r>
+          </w:p>
+        </w:tc>
+      </w:tr>
+      <w:tr>
+        <w:tc>
+          <w:p>
+            <w:pPr>
+              <w:pStyle w:val="Compact"/>
+              <w:jc w:val="left"/>
+            </w:pPr>
+            <w:r>
+              <w:t xml:space="preserve">3</w:t>
+            </w:r>
+          </w:p>
+        </w:tc>
+        <w:tc>
+          <w:p>
+            <w:pPr>
+              <w:pStyle w:val="Compact"/>
+              <w:jc w:val="left"/>
+            </w:pPr>
+            <w:r>
+              <w:rPr>
+                <w:rStyle w:val="VerbatimChar"/>
+              </w:rPr>
+              <w:t xml:space="preserve">Tanzania/NPS 12</w:t>
+            </w:r>
+          </w:p>
+        </w:tc>
+        <w:tc>
+          <w:p>
+            <w:pPr>
+              <w:pStyle w:val="Compact"/>
+              <w:jc w:val="left"/>
+            </w:pPr>
+            <w:r>
+              <w:t xml:space="preserve">2013</w:t>
+            </w:r>
+          </w:p>
+        </w:tc>
+        <w:tc>
+          <w:p>
+            <w:pPr>
+              <w:pStyle w:val="Compact"/>
+              <w:jc w:val="left"/>
+            </w:pPr>
+            <w:r>
+              <w:rPr>
+                <w:rStyle w:val="VerbatimChar"/>
+              </w:rPr>
+              <w:t xml:space="preserve">y3_hhid</w:t>
+            </w:r>
+          </w:p>
+        </w:tc>
+        <w:tc>
+          <w:p>
+            <w:pPr>
+              <w:pStyle w:val="Compact"/>
+              <w:jc w:val="left"/>
+            </w:pPr>
+            <w:r>
+              <w:rPr>
+                <w:rStyle w:val="VerbatimChar"/>
+              </w:rPr>
+              <w:t xml:space="preserve">ag3a_25</w:t>
+            </w:r>
+            <w:r>
+              <w:t xml:space="preserve"> </w:t>
+            </w:r>
+            <w:r>
+              <w:t xml:space="preserve">(early)</w:t>
+            </w:r>
+          </w:p>
+        </w:tc>
+      </w:tr>
+      <w:tr>
+        <w:tc>
+          <w:p>
+            <w:pPr>
+              <w:pStyle w:val="Compact"/>
+              <w:jc w:val="left"/>
+            </w:pPr>
+            <w:r>
+              <w:t xml:space="preserve">4</w:t>
+            </w:r>
+          </w:p>
+        </w:tc>
+        <w:tc>
+          <w:p>
+            <w:pPr>
+              <w:pStyle w:val="Compact"/>
+              <w:jc w:val="left"/>
+            </w:pPr>
+            <w:r>
+              <w:rPr>
+                <w:rStyle w:val="VerbatimChar"/>
+              </w:rPr>
+              <w:t xml:space="preserve">NPS 14 - extended</w:t>
+            </w:r>
+            <w:r>
+              <w:t xml:space="preserve"> </w:t>
+            </w:r>
+            <w:r>
+              <w:t xml:space="preserve">+</w:t>
+            </w:r>
+            <w:r>
+              <w:t xml:space="preserve"> </w:t>
+            </w:r>
+            <w:r>
+              <w:rPr>
+                <w:rStyle w:val="VerbatimChar"/>
+              </w:rPr>
+              <w:t xml:space="preserve">NPS 14 - refresh</w:t>
+            </w:r>
+          </w:p>
+        </w:tc>
+        <w:tc>
+          <w:p>
+            <w:pPr>
+              <w:pStyle w:val="Compact"/>
+              <w:jc w:val="left"/>
+            </w:pPr>
+            <w:r>
+              <w:t xml:space="preserve">2015</w:t>
+            </w:r>
+          </w:p>
+        </w:tc>
+        <w:tc>
+          <w:p>
+            <w:pPr>
+              <w:pStyle w:val="Compact"/>
+              <w:jc w:val="left"/>
+            </w:pPr>
+            <w:r>
+              <w:rPr>
+                <w:rStyle w:val="VerbatimChar"/>
+              </w:rPr>
+              <w:t xml:space="preserve">y4_hhid</w:t>
+            </w:r>
+          </w:p>
+        </w:tc>
+        <w:tc>
+          <w:p>
+            <w:pPr>
+              <w:pStyle w:val="Compact"/>
+              <w:jc w:val="left"/>
+            </w:pPr>
+            <w:r>
+              <w:rPr>
+                <w:rStyle w:val="VerbatimChar"/>
+              </w:rPr>
+              <w:t xml:space="preserve">ag3a_25</w:t>
+            </w:r>
+            <w:r>
+              <w:t xml:space="preserve"> </w:t>
+            </w:r>
+            <w:r>
+              <w:t xml:space="preserve">(late)</w:t>
+            </w:r>
+          </w:p>
+        </w:tc>
+      </w:tr>
+      <w:tr>
+        <w:tc>
+          <w:p>
+            <w:pPr>
+              <w:pStyle w:val="Compact"/>
+              <w:jc w:val="left"/>
+            </w:pPr>
+            <w:r>
+              <w:t xml:space="preserve">5</w:t>
+            </w:r>
+          </w:p>
+        </w:tc>
+        <w:tc>
+          <w:p>
+            <w:pPr>
+              <w:pStyle w:val="Compact"/>
+              <w:jc w:val="left"/>
+            </w:pPr>
+            <w:r>
+              <w:rPr>
+                <w:rStyle w:val="VerbatimChar"/>
+              </w:rPr>
+              <w:t xml:space="preserve">NPS 19 - extended</w:t>
+            </w:r>
+            <w:r>
+              <w:t xml:space="preserve"> </w:t>
+            </w:r>
+            <w:r>
+              <w:t xml:space="preserve">(</w:t>
+            </w:r>
+            <w:r>
+              <w:rPr>
+                <w:rStyle w:val="VerbatimChar"/>
+              </w:rPr>
+              <w:t xml:space="preserve">sdd_hhid</w:t>
+            </w:r>
+            <w:r>
+              <w:t xml:space="preserve">) +</w:t>
+            </w:r>
+            <w:r>
+              <w:t xml:space="preserve"> </w:t>
+            </w:r>
+            <w:r>
+              <w:rPr>
+                <w:rStyle w:val="VerbatimChar"/>
+              </w:rPr>
+              <w:t xml:space="preserve">NPS 19 - refresh</w:t>
+            </w:r>
+            <w:r>
+              <w:t xml:space="preserve"> </w:t>
+            </w:r>
+            <w:r>
+              <w:t xml:space="preserve">(</w:t>
+            </w:r>
+            <w:r>
+              <w:rPr>
+                <w:rStyle w:val="VerbatimChar"/>
+              </w:rPr>
+              <w:t xml:space="preserve">y5_hhid</w:t>
+            </w:r>
+            <w:r>
+              <w:t xml:space="preserve">)</w:t>
+            </w:r>
+          </w:p>
+        </w:tc>
+        <w:tc>
+          <w:p>
+            <w:pPr>
+              <w:pStyle w:val="Compact"/>
+              <w:jc w:val="left"/>
+            </w:pPr>
+            <w:r>
+              <w:t xml:space="preserve">2019</w:t>
+            </w:r>
+          </w:p>
+        </w:tc>
+        <w:tc>
+          <w:p>
+            <w:pPr>
+              <w:pStyle w:val="Compact"/>
+              <w:jc w:val="left"/>
+            </w:pPr>
+            <w:r>
+              <w:t xml:space="preserve">—</w:t>
+            </w:r>
+          </w:p>
+        </w:tc>
+        <w:tc>
+          <w:p>
+            <w:pPr>
+              <w:pStyle w:val="Compact"/>
+              <w:jc w:val="left"/>
+            </w:pPr>
+            <w:r>
+              <w:rPr>
+                <w:rStyle w:val="VerbatimChar"/>
+              </w:rPr>
+              <w:t xml:space="preserve">ag3a_25</w:t>
+            </w:r>
+            <w:r>
+              <w:t xml:space="preserve"> </w:t>
+            </w:r>
+            <w:r>
+              <w:t xml:space="preserve">(late)</w:t>
+            </w:r>
+          </w:p>
+        </w:tc>
+      </w:tr>
+    </w:tbl>
+    <w:p>
+      <w:pPr>
+        <w:pStyle w:val="BodyText"/>
+      </w:pPr>
+      <w:r>
+        <w:t xml:space="preserve">Plot roster:</w:t>
+      </w:r>
+      <w:r>
+        <w:t xml:space="preserve"> </w:t>
+      </w:r>
+      <w:r>
+        <w:rPr>
+          <w:rStyle w:val="VerbatimChar"/>
+        </w:rPr>
+        <w:t xml:space="preserve">SEC_2A</w:t>
+      </w:r>
+      <w:r>
+        <w:t xml:space="preserve">/</w:t>
+      </w:r>
+      <w:r>
+        <w:rPr>
+          <w:rStyle w:val="VerbatimChar"/>
+        </w:rPr>
+        <w:t xml:space="preserve">AG_SEC2A</w:t>
+      </w:r>
+      <w:r>
+        <w:t xml:space="preserve">/</w:t>
+      </w:r>
+      <w:r>
+        <w:rPr>
+          <w:rStyle w:val="VerbatimChar"/>
+        </w:rPr>
+        <w:t xml:space="preserve">AG_SEC_2A</w:t>
+      </w:r>
+      <w:r>
+        <w:t xml:space="preserve">/</w:t>
+      </w:r>
+      <w:r>
+        <w:rPr>
+          <w:rStyle w:val="VerbatimChar"/>
+        </w:rPr>
+        <w:t xml:space="preserve">AG_SEC_02</w:t>
+      </w:r>
+      <w:r>
+        <w:t xml:space="preserve">. Weights from the cover</w:t>
+      </w:r>
+      <w:r>
+        <w:t xml:space="preserve"> </w:t>
+      </w:r>
+      <w:r>
+        <w:t xml:space="preserve">(</w:t>
+      </w:r>
+      <w:r>
+        <w:rPr>
+          <w:rStyle w:val="VerbatimChar"/>
+        </w:rPr>
+        <w:t xml:space="preserve">hh_weight</w:t>
+      </w:r>
+      <w:r>
+        <w:t xml:space="preserve">/</w:t>
+      </w:r>
+      <w:r>
+        <w:rPr>
+          <w:rStyle w:val="VerbatimChar"/>
+        </w:rPr>
+        <w:t xml:space="preserve">y2_weight</w:t>
+      </w:r>
+      <w:r>
+        <w:t xml:space="preserve">/</w:t>
+      </w:r>
+      <w:r>
+        <w:rPr>
+          <w:rStyle w:val="VerbatimChar"/>
+        </w:rPr>
+        <w:t xml:space="preserve">y3_weight</w:t>
+      </w:r>
+      <w:r>
+        <w:t xml:space="preserve">/</w:t>
+      </w:r>
+      <w:r>
+        <w:rPr>
+          <w:rStyle w:val="VerbatimChar"/>
+        </w:rPr>
+        <w:t xml:space="preserve">y4_weights</w:t>
+      </w:r>
+      <w:r>
+        <w:t xml:space="preserve">/</w:t>
+      </w:r>
+      <w:r>
+        <w:rPr>
+          <w:rStyle w:val="VerbatimChar"/>
+        </w:rPr>
+        <w:t xml:space="preserve">sdd_weights</w:t>
+      </w:r>
+      <w:r>
+        <w:t xml:space="preserve">/</w:t>
+      </w:r>
+      <w:r>
+        <w:rPr>
+          <w:rStyle w:val="VerbatimChar"/>
+        </w:rPr>
+        <w:t xml:space="preserve">y5_crossweight</w:t>
+      </w:r>
+      <w:r>
+        <w:t xml:space="preserve">).</w:t>
+      </w:r>
+    </w:p>
+    <w:p>
+      <w:pPr>
+        <w:pStyle w:val="Heading3"/>
+      </w:pPr>
+      <w:bookmarkStart w:id="60" w:name="tenure-indicators-5"/>
+      <w:r>
+        <w:t xml:space="preserve">2. Tenure indicators</w:t>
+      </w:r>
+      <w:bookmarkEnd w:id="60"/>
+    </w:p>
+    <w:tbl>
+      <w:tblPr>
+        <w:tblStyle w:val="Table"/>
+        <w:tblW w:type="pct" w:w="5000.0"/>
+        <w:tblLook w:firstRow="1"/>
+      </w:tblPr>
+      <w:tblGrid>
+        <w:gridCol w:w="1800"/>
+        <w:gridCol w:w="540"/>
+        <w:gridCol w:w="1440"/>
+        <w:gridCol w:w="4140"/>
+      </w:tblGrid>
+      <w:tr>
+        <w:trPr>
+          <w:cnfStyle w:firstRow="1"/>
+        </w:trPr>
+        <w:tc>
+          <w:tcPr>
+            <w:tcBorders>
+              <w:bottom w:val="single"/>
+            </w:tcBorders>
+            <w:vAlign w:val="bottom"/>
+          </w:tcPr>
+          <w:p>
+            <w:pPr>
+              <w:pStyle w:val="Compact"/>
+              <w:jc w:val="left"/>
+            </w:pPr>
+            <w:r>
+              <w:t xml:space="preserve">Variable</w:t>
+            </w:r>
+          </w:p>
+        </w:tc>
+        <w:tc>
+          <w:tcPr>
+            <w:tcBorders>
+              <w:bottom w:val="single"/>
+            </w:tcBorders>
+            <w:vAlign w:val="bottom"/>
+          </w:tcPr>
+          <w:p>
+            <w:pPr>
+              <w:pStyle w:val="Compact"/>
+              <w:jc w:val="left"/>
+            </w:pPr>
+            <w:r>
+              <w:t xml:space="preserve">Wave</w:t>
+            </w:r>
+          </w:p>
+        </w:tc>
+        <w:tc>
+          <w:tcPr>
+            <w:tcBorders>
+              <w:bottom w:val="single"/>
+            </w:tcBorders>
+            <w:vAlign w:val="bottom"/>
+          </w:tcPr>
+          <w:p>
+            <w:pPr>
+              <w:pStyle w:val="Compact"/>
+              <w:jc w:val="left"/>
+            </w:pPr>
+            <w:r>
+              <w:t xml:space="preserve">Source var</w:t>
+            </w:r>
+          </w:p>
+        </w:tc>
+        <w:tc>
+          <w:tcPr>
+            <w:tcBorders>
+              <w:bottom w:val="single"/>
+            </w:tcBorders>
+            <w:vAlign w:val="bottom"/>
+          </w:tcPr>
+          <w:p>
+            <w:pPr>
+              <w:pStyle w:val="Compact"/>
+              <w:jc w:val="left"/>
+            </w:pPr>
+            <w:r>
+              <w:t xml:space="preserve">Construction</w:t>
+            </w:r>
+          </w:p>
+        </w:tc>
+      </w:tr>
+      <w:tr>
+        <w:tc>
+          <w:p>
+            <w:pPr>
+              <w:pStyle w:val="Compact"/>
+              <w:jc w:val="left"/>
+            </w:pPr>
+            <w:r>
+              <w:rPr>
+                <w:rStyle w:val="VerbatimChar"/>
+              </w:rPr>
+              <w:t xml:space="preserve">parcel_rentedin</w:t>
+            </w:r>
+          </w:p>
+        </w:tc>
+        <w:tc>
+          <w:p>
+            <w:pPr>
+              <w:pStyle w:val="Compact"/>
+              <w:jc w:val="left"/>
+            </w:pPr>
+            <w:r>
+              <w:t xml:space="preserve">1-3</w:t>
+            </w:r>
+          </w:p>
+        </w:tc>
+        <w:tc>
+          <w:p>
+            <w:pPr>
+              <w:pStyle w:val="Compact"/>
+              <w:jc w:val="left"/>
+            </w:pPr>
+            <w:r>
+              <w:rPr>
+                <w:rStyle w:val="VerbatimChar"/>
+              </w:rPr>
+              <w:t xml:space="preserve">s3aq22</w:t>
+            </w:r>
+            <w:r>
+              <w:t xml:space="preserve">/</w:t>
+            </w:r>
+            <w:r>
+              <w:rPr>
+                <w:rStyle w:val="VerbatimChar"/>
+              </w:rPr>
+              <w:t xml:space="preserve">ag3a_24</w:t>
+            </w:r>
+            <w:r>
+              <w:t xml:space="preserve">/</w:t>
+            </w:r>
+            <w:r>
+              <w:rPr>
+                <w:rStyle w:val="VerbatimChar"/>
+              </w:rPr>
+              <w:t xml:space="preserve">ag3a_25</w:t>
+            </w:r>
+          </w:p>
+        </w:tc>
+        <w:tc>
+          <w:p>
+            <w:pPr>
+              <w:pStyle w:val="Compact"/>
+              <w:jc w:val="left"/>
+            </w:pPr>
+            <w:r>
+              <w:rPr>
+                <w:rStyle w:val="VerbatimChar"/>
+              </w:rPr>
+              <w:t xml:space="preserve">inlist(.,3,4)</w:t>
+            </w:r>
+            <w:r>
+              <w:t xml:space="preserve"> </w:t>
+            </w:r>
+            <w:r>
+              <w:t xml:space="preserve">- rented in + shared-rent</w:t>
+            </w:r>
+          </w:p>
+        </w:tc>
+      </w:tr>
+      <w:tr>
+        <w:tc>
+          <w:p>
+            <w:pPr>
+              <w:pStyle w:val="Compact"/>
+              <w:jc w:val="left"/>
+            </w:pPr>
+            <w:r>
+              <w:rPr>
+                <w:rStyle w:val="VerbatimChar"/>
+              </w:rPr>
+              <w:t xml:space="preserve">parcel_rentedin</w:t>
+            </w:r>
+          </w:p>
+        </w:tc>
+        <w:tc>
+          <w:p>
+            <w:pPr>
+              <w:pStyle w:val="Compact"/>
+              <w:jc w:val="left"/>
+            </w:pPr>
+            <w:r>
+              <w:t xml:space="preserve">4-5</w:t>
+            </w:r>
+          </w:p>
+        </w:tc>
+        <w:tc>
+          <w:p>
+            <w:pPr>
+              <w:pStyle w:val="Compact"/>
+              <w:jc w:val="left"/>
+            </w:pPr>
+            <w:r>
+              <w:rPr>
+                <w:rStyle w:val="VerbatimChar"/>
+              </w:rPr>
+              <w:t xml:space="preserve">ag3a_25</w:t>
+            </w:r>
+          </w:p>
+        </w:tc>
+        <w:tc>
+          <w:p>
+            <w:pPr>
+              <w:pStyle w:val="Compact"/>
+              <w:jc w:val="left"/>
+            </w:pPr>
+            <w:r>
+              <w:rPr>
+                <w:rStyle w:val="VerbatimChar"/>
+              </w:rPr>
+              <w:t xml:space="preserve">inlist(ag3a_25,7,8)</w:t>
+            </w:r>
+            <w:r>
+              <w:t xml:space="preserve"> </w:t>
+            </w:r>
+            <w:r>
+              <w:t xml:space="preserve">- rented in + shared-rent</w:t>
+            </w:r>
+          </w:p>
+        </w:tc>
+      </w:tr>
+      <w:tr>
+        <w:tc>
+          <w:p>
+            <w:pPr>
+              <w:pStyle w:val="Compact"/>
+              <w:jc w:val="left"/>
+            </w:pPr>
+            <w:r>
+              <w:rPr>
+                <w:rStyle w:val="VerbatimChar"/>
+              </w:rPr>
+              <w:t xml:space="preserve">parcel_rentedout</w:t>
+            </w:r>
+          </w:p>
+        </w:tc>
+        <w:tc>
+          <w:p>
+            <w:pPr>
+              <w:pStyle w:val="Compact"/>
+              <w:jc w:val="left"/>
+            </w:pPr>
+            <w:r>
+              <w:t xml:space="preserve">1-5</w:t>
+            </w:r>
+          </w:p>
+        </w:tc>
+        <w:tc>
+          <w:p>
+            <w:pPr>
+              <w:pStyle w:val="Compact"/>
+              <w:jc w:val="left"/>
+            </w:pPr>
+            <w:r>
+              <w:rPr>
+                <w:rStyle w:val="VerbatimChar"/>
+              </w:rPr>
+              <w:t xml:space="preserve">s3aq3</w:t>
+            </w:r>
+            <w:r>
+              <w:t xml:space="preserve">/</w:t>
+            </w:r>
+            <w:r>
+              <w:rPr>
+                <w:rStyle w:val="VerbatimChar"/>
+              </w:rPr>
+              <w:t xml:space="preserve">ag3a_03</w:t>
+            </w:r>
+          </w:p>
+        </w:tc>
+        <w:tc>
+          <w:p>
+            <w:pPr>
+              <w:pStyle w:val="Compact"/>
+              <w:jc w:val="left"/>
+            </w:pPr>
+            <w:r>
+              <w:rPr>
+                <w:rStyle w:val="VerbatimChar"/>
+              </w:rPr>
+              <w:t xml:space="preserve">== 2</w:t>
+            </w:r>
+            <w:r>
+              <w:t xml:space="preserve"> </w:t>
+            </w:r>
+            <w:r>
+              <w:t xml:space="preserve">(plot</w:t>
+            </w:r>
+            <w:r>
+              <w:t xml:space="preserve"> </w:t>
+            </w:r>
+            <w:r>
+              <w:t xml:space="preserve">“</w:t>
+            </w:r>
+            <w:r>
+              <w:t xml:space="preserve">rented out</w:t>
+            </w:r>
+            <w:r>
+              <w:t xml:space="preserve">”</w:t>
+            </w:r>
+            <w:r>
+              <w:t xml:space="preserve"> </w:t>
+            </w:r>
+            <w:r>
+              <w:t xml:space="preserve">in the use question)</w:t>
+            </w:r>
+          </w:p>
+        </w:tc>
+      </w:tr>
+      <w:tr>
+        <w:tc>
+          <w:p>
+            <w:pPr>
+              <w:pStyle w:val="Compact"/>
+              <w:jc w:val="left"/>
+            </w:pPr>
+            <w:r>
+              <w:rPr>
+                <w:rStyle w:val="VerbatimChar"/>
+              </w:rPr>
+              <w:t xml:space="preserve">parcel_purchased</w:t>
+            </w:r>
+          </w:p>
+        </w:tc>
+        <w:tc>
+          <w:p>
+            <w:pPr>
+              <w:pStyle w:val="Compact"/>
+              <w:jc w:val="left"/>
+            </w:pPr>
+            <w:r>
+              <w:t xml:space="preserve">1-3</w:t>
+            </w:r>
+          </w:p>
+        </w:tc>
+        <w:tc>
+          <w:p>
+            <w:pPr>
+              <w:pStyle w:val="Compact"/>
+              <w:jc w:val="left"/>
+            </w:pPr>
+            <w:r>
+              <w:t xml:space="preserve">—</w:t>
+            </w:r>
+          </w:p>
+        </w:tc>
+        <w:tc>
+          <w:p>
+            <w:pPr>
+              <w:pStyle w:val="Compact"/>
+              <w:jc w:val="left"/>
+            </w:pPr>
+            <w:r>
+              <w:rPr>
+                <w:b/>
+              </w:rPr>
+              <w:t xml:space="preserve">missing</w:t>
+            </w:r>
+            <w:r>
+              <w:t xml:space="preserve"> </w:t>
+            </w:r>
+            <w:r>
+              <w:t xml:space="preserve">- no acquisition/purchase category</w:t>
+            </w:r>
+          </w:p>
+        </w:tc>
+      </w:tr>
+      <w:tr>
+        <w:tc>
+          <w:p>
+            <w:pPr>
+              <w:pStyle w:val="Compact"/>
+              <w:jc w:val="left"/>
+            </w:pPr>
+            <w:r>
+              <w:rPr>
+                <w:rStyle w:val="VerbatimChar"/>
+              </w:rPr>
+              <w:t xml:space="preserve">parcel_purchased</w:t>
+            </w:r>
+          </w:p>
+        </w:tc>
+        <w:tc>
+          <w:p>
+            <w:pPr>
+              <w:pStyle w:val="Compact"/>
+              <w:jc w:val="left"/>
+            </w:pPr>
+            <w:r>
+              <w:t xml:space="preserve">4-5</w:t>
+            </w:r>
+          </w:p>
+        </w:tc>
+        <w:tc>
+          <w:p>
+            <w:pPr>
+              <w:pStyle w:val="Compact"/>
+              <w:jc w:val="left"/>
+            </w:pPr>
+            <w:r>
+              <w:rPr>
+                <w:rStyle w:val="VerbatimChar"/>
+              </w:rPr>
+              <w:t xml:space="preserve">ag3a_25</w:t>
+            </w:r>
+          </w:p>
+        </w:tc>
+        <w:tc>
+          <w:p>
+            <w:pPr>
+              <w:pStyle w:val="Compact"/>
+              <w:jc w:val="left"/>
+            </w:pPr>
+            <w:r>
+              <w:rPr>
+                <w:rStyle w:val="VerbatimChar"/>
+              </w:rPr>
+              <w:t xml:space="preserve">ag3a_25==5</w:t>
+            </w:r>
+            <w:r>
+              <w:t xml:space="preserve"> </w:t>
+            </w:r>
+            <w:r>
+              <w:t xml:space="preserve">- PURCHASED</w:t>
+            </w:r>
+          </w:p>
+        </w:tc>
+      </w:tr>
+      <w:tr>
+        <w:tc>
+          <w:p>
+            <w:pPr>
+              <w:pStyle w:val="Compact"/>
+              <w:jc w:val="left"/>
+            </w:pPr>
+            <w:r>
+              <w:rPr>
+                <w:rStyle w:val="VerbatimChar"/>
+              </w:rPr>
+              <w:t xml:space="preserve">parcel_certificate</w:t>
+            </w:r>
+          </w:p>
+        </w:tc>
+        <w:tc>
+          <w:p>
+            <w:pPr>
+              <w:pStyle w:val="Compact"/>
+              <w:jc w:val="left"/>
+            </w:pPr>
+            <w:r>
+              <w:t xml:space="preserve">1</w:t>
+            </w:r>
+          </w:p>
+        </w:tc>
+        <w:tc>
+          <w:p>
+            <w:pPr>
+              <w:pStyle w:val="Compact"/>
+              <w:jc w:val="left"/>
+            </w:pPr>
+            <w:r>
+              <w:rPr>
+                <w:rStyle w:val="VerbatimChar"/>
+              </w:rPr>
+              <w:t xml:space="preserve">s3aq25</w:t>
+            </w:r>
+          </w:p>
+        </w:tc>
+        <w:tc>
+          <w:p>
+            <w:pPr>
+              <w:pStyle w:val="Compact"/>
+              <w:jc w:val="left"/>
+            </w:pPr>
+            <w:r>
+              <w:rPr>
+                <w:rStyle w:val="VerbatimChar"/>
+              </w:rPr>
+              <w:t xml:space="preserve">==1</w:t>
+            </w:r>
+            <w:r>
+              <w:t xml:space="preserve"> </w:t>
+            </w:r>
+            <w:r>
+              <w:t xml:space="preserve">(has title)</w:t>
+            </w:r>
+          </w:p>
+        </w:tc>
+      </w:tr>
+      <w:tr>
+        <w:tc>
+          <w:p>
+            <w:pPr>
+              <w:pStyle w:val="Compact"/>
+              <w:jc w:val="left"/>
+            </w:pPr>
+            <w:r>
+              <w:rPr>
+                <w:rStyle w:val="VerbatimChar"/>
+              </w:rPr>
+              <w:t xml:space="preserve">parcel_certificate</w:t>
+            </w:r>
+          </w:p>
+        </w:tc>
+        <w:tc>
+          <w:p>
+            <w:pPr>
+              <w:pStyle w:val="Compact"/>
+              <w:jc w:val="left"/>
+            </w:pPr>
+            <w:r>
+              <w:t xml:space="preserve">2</w:t>
+            </w:r>
+          </w:p>
+        </w:tc>
+        <w:tc>
+          <w:p>
+            <w:pPr>
+              <w:pStyle w:val="Compact"/>
+              <w:jc w:val="left"/>
+            </w:pPr>
+            <w:r>
+              <w:rPr>
+                <w:rStyle w:val="VerbatimChar"/>
+              </w:rPr>
+              <w:t xml:space="preserve">ag3a_27</w:t>
+            </w:r>
+          </w:p>
+        </w:tc>
+        <w:tc>
+          <w:p>
+            <w:pPr>
+              <w:pStyle w:val="Compact"/>
+              <w:jc w:val="left"/>
+            </w:pPr>
+            <w:r>
+              <w:rPr>
+                <w:rStyle w:val="VerbatimChar"/>
+              </w:rPr>
+              <w:t xml:space="preserve">==1</w:t>
+            </w:r>
+          </w:p>
+        </w:tc>
+      </w:tr>
+      <w:tr>
+        <w:tc>
+          <w:p>
+            <w:pPr>
+              <w:pStyle w:val="Compact"/>
+              <w:jc w:val="left"/>
+            </w:pPr>
+            <w:r>
+              <w:rPr>
+                <w:rStyle w:val="VerbatimChar"/>
+              </w:rPr>
+              <w:t xml:space="preserve">parcel_certificate</w:t>
+            </w:r>
+          </w:p>
+        </w:tc>
+        <w:tc>
+          <w:p>
+            <w:pPr>
+              <w:pStyle w:val="Compact"/>
+              <w:jc w:val="left"/>
+            </w:pPr>
+            <w:r>
+              <w:t xml:space="preserve">3</w:t>
+            </w:r>
+          </w:p>
+        </w:tc>
+        <w:tc>
+          <w:p>
+            <w:pPr>
+              <w:pStyle w:val="Compact"/>
+              <w:jc w:val="left"/>
+            </w:pPr>
+            <w:r>
+              <w:rPr>
+                <w:rStyle w:val="VerbatimChar"/>
+              </w:rPr>
+              <w:t xml:space="preserve">ag3a_28</w:t>
+            </w:r>
+          </w:p>
+        </w:tc>
+        <w:tc>
+          <w:p>
+            <w:pPr>
+              <w:pStyle w:val="Compact"/>
+              <w:jc w:val="left"/>
+            </w:pPr>
+            <w:r>
+              <w:t xml:space="preserve">not in {9,10,11} = has title</w:t>
+            </w:r>
+          </w:p>
+        </w:tc>
+      </w:tr>
+      <w:tr>
+        <w:tc>
+          <w:p>
+            <w:pPr>
+              <w:pStyle w:val="Compact"/>
+              <w:jc w:val="left"/>
+            </w:pPr>
+            <w:r>
+              <w:rPr>
+                <w:rStyle w:val="VerbatimChar"/>
+              </w:rPr>
+              <w:t xml:space="preserve">parcel_certificate</w:t>
+            </w:r>
+          </w:p>
+        </w:tc>
+        <w:tc>
+          <w:p>
+            <w:pPr>
+              <w:pStyle w:val="Compact"/>
+              <w:jc w:val="left"/>
+            </w:pPr>
+            <w:r>
+              <w:t xml:space="preserve">4-5</w:t>
+            </w:r>
+          </w:p>
+        </w:tc>
+        <w:tc>
+          <w:p>
+            <w:pPr>
+              <w:pStyle w:val="Compact"/>
+              <w:jc w:val="left"/>
+            </w:pPr>
+            <w:r>
+              <w:rPr>
+                <w:rStyle w:val="VerbatimChar"/>
+              </w:rPr>
+              <w:t xml:space="preserve">ag3a_28a</w:t>
+            </w:r>
+            <w:r>
+              <w:t xml:space="preserve">,</w:t>
+            </w:r>
+            <w:r>
+              <w:rPr>
+                <w:rStyle w:val="VerbatimChar"/>
+              </w:rPr>
+              <w:t xml:space="preserve">ag3a_28d</w:t>
+            </w:r>
+          </w:p>
+        </w:tc>
+        <w:tc>
+          <w:p>
+            <w:pPr>
+              <w:pStyle w:val="Compact"/>
+              <w:jc w:val="left"/>
+            </w:pPr>
+            <w:r>
+              <w:rPr>
+                <w:rStyle w:val="VerbatimChar"/>
+              </w:rPr>
+              <w:t xml:space="preserve">ag3a_28a in {1,2}</w:t>
+            </w:r>
+            <w:r>
+              <w:t xml:space="preserve"> </w:t>
+            </w:r>
+            <w:r>
+              <w:t xml:space="preserve">or</w:t>
+            </w:r>
+            <w:r>
+              <w:t xml:space="preserve"> </w:t>
+            </w:r>
+            <w:r>
+              <w:rPr>
+                <w:rStyle w:val="VerbatimChar"/>
+              </w:rPr>
+              <w:t xml:space="preserve">ag3a_28d in 1-5</w:t>
+            </w:r>
+          </w:p>
+        </w:tc>
+      </w:tr>
+    </w:tbl>
+    <w:p>
+      <w:pPr>
+        <w:pStyle w:val="BodyText"/>
+      </w:pPr>
+      <w:r>
+        <w:t xml:space="preserve">(Certificate set to 0 for non-owned parcels.)</w:t>
+      </w:r>
+    </w:p>
+    <w:p>
+      <w:pPr>
+        <w:pStyle w:val="Heading3"/>
+      </w:pPr>
+      <w:bookmarkStart w:id="61" w:name="parcel-area-parcel_area_ha-5"/>
+      <w:r>
+        <w:t xml:space="preserve">3. Parcel area (</w:t>
+      </w:r>
+      <w:r>
+        <w:rPr>
+          <w:rStyle w:val="VerbatimChar"/>
+        </w:rPr>
+        <w:t xml:space="preserve">parcel_area_ha</w:t>
+      </w:r>
+      <w:r>
+        <w:t xml:space="preserve">)</w:t>
+      </w:r>
+      <w:bookmarkEnd w:id="61"/>
+    </w:p>
+    <w:p>
+      <w:pPr>
+        <w:pStyle w:val="FirstParagraph"/>
+      </w:pPr>
+      <w:r>
+        <w:t xml:space="preserve">GPS where measured, else self-reported (deterministic; both in</w:t>
+      </w:r>
+      <w:r>
+        <w:t xml:space="preserve"> </w:t>
+      </w:r>
+      <w:r>
+        <w:rPr>
+          <w:b/>
+        </w:rPr>
+        <w:t xml:space="preserve">acres × 0.404686 → ha</w:t>
+      </w:r>
+      <w:r>
+        <w:t xml:space="preserve">).</w:t>
+      </w:r>
+      <w:r>
+        <w:t xml:space="preserve"> </w:t>
+      </w:r>
+      <w:r>
+        <w:t xml:space="preserve">Self-reported =</w:t>
+      </w:r>
+      <w:r>
+        <w:t xml:space="preserve"> </w:t>
+      </w:r>
+      <w:r>
+        <w:rPr>
+          <w:rStyle w:val="VerbatimChar"/>
+        </w:rPr>
+        <w:t xml:space="preserve">s2aq4</w:t>
+      </w:r>
+      <w:r>
+        <w:t xml:space="preserve"> </w:t>
+      </w:r>
+      <w:r>
+        <w:t xml:space="preserve">(w1) /</w:t>
+      </w:r>
+      <w:r>
+        <w:t xml:space="preserve"> </w:t>
+      </w:r>
+      <w:r>
+        <w:rPr>
+          <w:rStyle w:val="VerbatimChar"/>
+        </w:rPr>
+        <w:t xml:space="preserve">ag2a_04</w:t>
+      </w:r>
+      <w:r>
+        <w:t xml:space="preserve"> </w:t>
+      </w:r>
+      <w:r>
+        <w:t xml:space="preserve">(w2-5); GPS =</w:t>
+      </w:r>
+      <w:r>
+        <w:t xml:space="preserve"> </w:t>
+      </w:r>
+      <w:r>
+        <w:rPr>
+          <w:rStyle w:val="VerbatimChar"/>
+        </w:rPr>
+        <w:t xml:space="preserve">area</w:t>
+      </w:r>
+      <w:r>
+        <w:t xml:space="preserve"> </w:t>
+      </w:r>
+      <w:r>
+        <w:t xml:space="preserve">(w1) /</w:t>
+      </w:r>
+      <w:r>
+        <w:t xml:space="preserve"> </w:t>
+      </w:r>
+      <w:r>
+        <w:rPr>
+          <w:rStyle w:val="VerbatimChar"/>
+        </w:rPr>
+        <w:t xml:space="preserve">ag2a_09</w:t>
+      </w:r>
+      <w:r>
+        <w:t xml:space="preserve"> </w:t>
+      </w:r>
+      <w:r>
+        <w:t xml:space="preserve">(w2-5).</w:t>
+      </w:r>
+    </w:p>
+    <w:p>
+      <w:pPr>
+        <w:pStyle w:val="Heading3"/>
+      </w:pPr>
+      <w:bookmarkStart w:id="62" w:name="design-variables-identifiers-5"/>
+      <w:r>
+        <w:t xml:space="preserve">4. Design variables &amp; identifiers</w:t>
+      </w:r>
+      <w:bookmarkEnd w:id="62"/>
+    </w:p>
+    <w:tbl>
+      <w:tblPr>
+        <w:tblStyle w:val="Table"/>
+        <w:tblW w:type="pct" w:w="5000.0"/>
+        <w:tblLook w:firstRow="1"/>
+      </w:tblPr>
+      <w:tblGrid>
+        <w:gridCol w:w="1920"/>
+        <w:gridCol w:w="720"/>
+        <w:gridCol w:w="960"/>
+        <w:gridCol w:w="4320"/>
+      </w:tblGrid>
+      <w:tr>
+        <w:trPr>
+          <w:cnfStyle w:firstRow="1"/>
+        </w:trPr>
+        <w:tc>
+          <w:tcPr>
+            <w:tcBorders>
+              <w:bottom w:val="single"/>
+            </w:tcBorders>
+            <w:vAlign w:val="bottom"/>
+          </w:tcPr>
+          <w:p>
+            <w:pPr>
+              <w:pStyle w:val="Compact"/>
+              <w:jc w:val="left"/>
+            </w:pPr>
+            <w:r>
+              <w:t xml:space="preserve">Variable</w:t>
+            </w:r>
+          </w:p>
+        </w:tc>
+        <w:tc>
+          <w:tcPr>
+            <w:tcBorders>
+              <w:bottom w:val="single"/>
+            </w:tcBorders>
+            <w:vAlign w:val="bottom"/>
+          </w:tcPr>
+          <w:p>
+            <w:pPr>
+              <w:pStyle w:val="Compact"/>
+              <w:jc w:val="left"/>
+            </w:pPr>
+            <w:r>
+              <w:t xml:space="preserve">Wave</w:t>
+            </w:r>
+          </w:p>
+        </w:tc>
+        <w:tc>
+          <w:tcPr>
+            <w:tcBorders>
+              <w:bottom w:val="single"/>
+            </w:tcBorders>
+            <w:vAlign w:val="bottom"/>
+          </w:tcPr>
+          <w:p>
+            <w:pPr>
+              <w:pStyle w:val="Compact"/>
+              <w:jc w:val="left"/>
+            </w:pPr>
+            <w:r>
+              <w:t xml:space="preserve">Source</w:t>
+            </w:r>
+          </w:p>
+        </w:tc>
+        <w:tc>
+          <w:tcPr>
+            <w:tcBorders>
+              <w:bottom w:val="single"/>
+            </w:tcBorders>
+            <w:vAlign w:val="bottom"/>
+          </w:tcPr>
+          <w:p>
+            <w:pPr>
+              <w:pStyle w:val="Compact"/>
+              <w:jc w:val="left"/>
+            </w:pPr>
+            <w:r>
+              <w:t xml:space="preserve">Construction</w:t>
+            </w:r>
+          </w:p>
+        </w:tc>
+      </w:tr>
+      <w:tr>
+        <w:tc>
+          <w:p>
+            <w:pPr>
+              <w:pStyle w:val="Compact"/>
+              <w:jc w:val="left"/>
+            </w:pPr>
+            <w:r>
+              <w:rPr>
+                <w:rStyle w:val="VerbatimChar"/>
+              </w:rPr>
+              <w:t xml:space="preserve">weight</w:t>
+            </w:r>
+          </w:p>
+        </w:tc>
+        <w:tc>
+          <w:p>
+            <w:pPr>
+              <w:pStyle w:val="Compact"/>
+              <w:jc w:val="left"/>
+            </w:pPr>
+            <w:r>
+              <w:t xml:space="preserve">1-5</w:t>
+            </w:r>
+          </w:p>
+        </w:tc>
+        <w:tc>
+          <w:p>
+            <w:pPr>
+              <w:pStyle w:val="Compact"/>
+              <w:jc w:val="left"/>
+            </w:pPr>
+            <w:r>
+              <w:t xml:space="preserve">cover (</w:t>
+            </w:r>
+            <w:r>
+              <w:rPr>
+                <w:rStyle w:val="VerbatimChar"/>
+              </w:rPr>
+              <w:t xml:space="preserve">HH_SEC_A</w:t>
+            </w:r>
+            <w:r>
+              <w:t xml:space="preserve">/</w:t>
+            </w:r>
+            <w:r>
+              <w:rPr>
+                <w:rStyle w:val="VerbatimChar"/>
+              </w:rPr>
+              <w:t xml:space="preserve">SEC_A_T</w:t>
+            </w:r>
+            <w:r>
+              <w:t xml:space="preserve">)</w:t>
+            </w:r>
+          </w:p>
+        </w:tc>
+        <w:tc>
+          <w:p>
+            <w:pPr>
+              <w:pStyle w:val="Compact"/>
+              <w:jc w:val="left"/>
+            </w:pPr>
+            <w:r>
+              <w:t xml:space="preserve">wave-specific weight; extended &amp; refresh use their own</w:t>
+            </w:r>
+          </w:p>
+        </w:tc>
+      </w:tr>
+      <w:tr>
+        <w:tc>
+          <w:p>
+            <w:pPr>
+              <w:pStyle w:val="Compact"/>
+              <w:jc w:val="left"/>
+            </w:pPr>
+            <w:r>
+              <w:rPr>
+                <w:rStyle w:val="VerbatimChar"/>
+              </w:rPr>
+              <w:t xml:space="preserve">strataid</w:t>
+            </w:r>
+          </w:p>
+        </w:tc>
+        <w:tc>
+          <w:p>
+            <w:pPr>
+              <w:pStyle w:val="Compact"/>
+              <w:jc w:val="left"/>
+            </w:pPr>
+            <w:r>
+              <w:t xml:space="preserve">1-5</w:t>
+            </w:r>
+          </w:p>
+        </w:tc>
+        <w:tc>
+          <w:p>
+            <w:pPr>
+              <w:pStyle w:val="Compact"/>
+              <w:jc w:val="left"/>
+            </w:pPr>
+            <w:r>
+              <w:t xml:space="preserve">cover</w:t>
+            </w:r>
+          </w:p>
+        </w:tc>
+        <w:tc>
+          <w:p>
+            <w:pPr>
+              <w:pStyle w:val="Compact"/>
+              <w:jc w:val="left"/>
+            </w:pPr>
+            <w:r>
+              <w:rPr>
+                <w:rStyle w:val="VerbatimChar"/>
+              </w:rPr>
+              <w:t xml:space="preserve">strataid</w:t>
+            </w:r>
+            <w:r>
+              <w:t xml:space="preserve"> </w:t>
+            </w:r>
+            <w:r>
+              <w:t xml:space="preserve">(direct)</w:t>
+            </w:r>
+          </w:p>
+        </w:tc>
+      </w:tr>
+      <w:tr>
+        <w:tc>
+          <w:p>
+            <w:pPr>
+              <w:pStyle w:val="Compact"/>
+              <w:jc w:val="left"/>
+            </w:pPr>
+            <w:r>
+              <w:rPr>
+                <w:rStyle w:val="VerbatimChar"/>
+              </w:rPr>
+              <w:t xml:space="preserve">ea_id</w:t>
+            </w:r>
+          </w:p>
+        </w:tc>
+        <w:tc>
+          <w:p>
+            <w:pPr>
+              <w:pStyle w:val="Compact"/>
+              <w:jc w:val="left"/>
+            </w:pPr>
+            <w:r>
+              <w:t xml:space="preserve">1-5</w:t>
+            </w:r>
+          </w:p>
+        </w:tc>
+        <w:tc>
+          <w:p>
+            <w:pPr>
+              <w:pStyle w:val="Compact"/>
+              <w:jc w:val="left"/>
+            </w:pPr>
+            <w:r>
+              <w:t xml:space="preserve">cover</w:t>
+            </w:r>
+          </w:p>
+        </w:tc>
+        <w:tc>
+          <w:p>
+            <w:pPr>
+              <w:pStyle w:val="Compact"/>
+              <w:jc w:val="left"/>
+            </w:pPr>
+            <w:r>
+              <w:t xml:space="preserve">cluster/admin vars (region-district-ward-ea), else household id</w:t>
+            </w:r>
+          </w:p>
+        </w:tc>
+      </w:tr>
+      <w:tr>
+        <w:tc>
+          <w:p>
+            <w:pPr>
+              <w:pStyle w:val="Compact"/>
+              <w:jc w:val="left"/>
+            </w:pPr>
+            <w:r>
+              <w:rPr>
+                <w:rStyle w:val="VerbatimChar"/>
+              </w:rPr>
+              <w:t xml:space="preserve">parcel_id</w:t>
+            </w:r>
+          </w:p>
+        </w:tc>
+        <w:tc>
+          <w:p>
+            <w:pPr>
+              <w:pStyle w:val="Compact"/>
+              <w:jc w:val="left"/>
+            </w:pPr>
+            <w:r>
+              <w:t xml:space="preserve">1-5</w:t>
+            </w:r>
+          </w:p>
+        </w:tc>
+        <w:tc>
+          <w:p>
+            <w:pPr>
+              <w:pStyle w:val="Compact"/>
+              <w:jc w:val="left"/>
+            </w:pPr>
+            <w:r>
+              <w:t xml:space="preserve">tenure/roster</w:t>
+            </w:r>
+          </w:p>
+        </w:tc>
+        <w:tc>
+          <w:p>
+            <w:pPr>
+              <w:pStyle w:val="Compact"/>
+              <w:jc w:val="left"/>
+            </w:pPr>
+            <w:r>
+              <w:rPr>
+                <w:rStyle w:val="VerbatimChar"/>
+              </w:rPr>
+              <w:t xml:space="preserve">hhid-plotnum</w:t>
+            </w:r>
+          </w:p>
+        </w:tc>
+      </w:tr>
+      <w:tr>
+        <w:tc>
+          <w:p>
+            <w:pPr>
+              <w:pStyle w:val="Compact"/>
+              <w:jc w:val="left"/>
+            </w:pPr>
+            <w:r>
+              <w:rPr>
+                <w:rStyle w:val="VerbatimChar"/>
+              </w:rPr>
+              <w:t xml:space="preserve">year</w:t>
+            </w:r>
+          </w:p>
+        </w:tc>
+        <w:tc>
+          <w:p>
+            <w:pPr>
+              <w:pStyle w:val="Compact"/>
+              <w:jc w:val="left"/>
+            </w:pPr>
+            <w:r>
+              <w:t xml:space="preserve">1-5</w:t>
+            </w:r>
+          </w:p>
+        </w:tc>
+        <w:tc>
+          <w:p>
+            <w:pPr>
+              <w:pStyle w:val="Compact"/>
+              <w:jc w:val="left"/>
+            </w:pPr>
+            <w:r>
+              <w:t xml:space="preserve">—</w:t>
+            </w:r>
+          </w:p>
+        </w:tc>
+        <w:tc>
+          <w:p>
+            <w:pPr>
+              <w:pStyle w:val="Compact"/>
+              <w:jc w:val="left"/>
+            </w:pPr>
+            <w:r>
+              <w:t xml:space="preserve">2009 / 2011 / 2013 / 2015 / 2019</w:t>
+            </w:r>
+          </w:p>
+        </w:tc>
+      </w:tr>
+    </w:tbl>
+    <w:p>
+      <w:pPr>
+        <w:pStyle w:val="Heading3"/>
+      </w:pPr>
+      <w:bookmarkStart w:id="63" w:name="X8b517451fc0444510e3f71dace152c3da4f1fbf"/>
+      <w:r>
+        <w:t xml:space="preserve">5. Value labels of key source variables (verified)</w:t>
+      </w:r>
+      <w:bookmarkEnd w:id="63"/>
+    </w:p>
+    <w:p>
+      <w:pPr>
+        <w:pStyle w:val="FirstParagraph"/>
+      </w:pPr>
+      <w:r>
+        <w:rPr>
+          <w:b/>
+        </w:rPr>
+        <w:t xml:space="preserve">EARLY ownership status</w:t>
+      </w:r>
+      <w:r>
+        <w:t xml:space="preserve"> </w:t>
+      </w:r>
+      <w:r>
+        <w:t xml:space="preserve">-</w:t>
+      </w:r>
+      <w:r>
+        <w:t xml:space="preserve"> </w:t>
+      </w:r>
+      <w:r>
+        <w:rPr>
+          <w:rStyle w:val="VerbatimChar"/>
+        </w:rPr>
+        <w:t xml:space="preserve">s3aq22</w:t>
+      </w:r>
+      <w:r>
+        <w:t xml:space="preserve">/</w:t>
+      </w:r>
+      <w:r>
+        <w:rPr>
+          <w:rStyle w:val="VerbatimChar"/>
+        </w:rPr>
+        <w:t xml:space="preserve">ag3a_24</w:t>
+      </w:r>
+      <w:r>
+        <w:t xml:space="preserve">/</w:t>
+      </w:r>
+      <w:r>
+        <w:rPr>
+          <w:rStyle w:val="VerbatimChar"/>
+        </w:rPr>
+        <w:t xml:space="preserve">ag3a_25</w:t>
+      </w:r>
+      <w:r>
+        <w:t xml:space="preserve"> </w:t>
+      </w:r>
+      <w:r>
+        <w:t xml:space="preserve">(w1-3): 1 owned · 2 used free ·</w:t>
+      </w:r>
+      <w:r>
+        <w:t xml:space="preserve"> </w:t>
+      </w:r>
+      <w:r>
+        <w:rPr>
+          <w:b/>
+        </w:rPr>
+        <w:t xml:space="preserve">3 rented in</w:t>
+      </w:r>
+      <w:r>
+        <w:t xml:space="preserve"> </w:t>
+      </w:r>
+      <w:r>
+        <w:t xml:space="preserve">·</w:t>
+      </w:r>
+      <w:r>
+        <w:t xml:space="preserve"> </w:t>
+      </w:r>
+      <w:r>
+        <w:rPr>
+          <w:b/>
+        </w:rPr>
+        <w:t xml:space="preserve">4 shared rent</w:t>
+      </w:r>
+      <w:r>
+        <w:t xml:space="preserve"> </w:t>
+      </w:r>
+      <w:r>
+        <w:t xml:space="preserve">· 5 shared ownership.</w:t>
+      </w:r>
+      <w:r>
+        <w:t xml:space="preserve"> </w:t>
+      </w:r>
+      <w:r>
+        <w:rPr>
+          <w:i/>
+        </w:rPr>
+        <w:t xml:space="preserve">(No purchase category.)</w:t>
+      </w:r>
+    </w:p>
+    <w:p>
+      <w:pPr>
+        <w:pStyle w:val="BodyText"/>
+      </w:pPr>
+      <w:r>
+        <w:rPr>
+          <w:b/>
+        </w:rPr>
+        <w:t xml:space="preserve">LATE</w:t>
+      </w:r>
+      <w:r>
+        <w:rPr>
+          <w:b/>
+        </w:rPr>
+        <w:t xml:space="preserve"> </w:t>
+      </w:r>
+      <w:r>
+        <w:rPr>
+          <w:b/>
+        </w:rPr>
+        <w:t xml:space="preserve">“</w:t>
+      </w:r>
+      <w:r>
+        <w:rPr>
+          <w:b/>
+        </w:rPr>
+        <w:t xml:space="preserve">How was this plot acquired?</w:t>
+      </w:r>
+      <w:r>
+        <w:rPr>
+          <w:b/>
+        </w:rPr>
+        <w:t xml:space="preserve">”</w:t>
+      </w:r>
+      <w:r>
+        <w:t xml:space="preserve"> </w:t>
+      </w:r>
+      <w:r>
+        <w:t xml:space="preserve">-</w:t>
+      </w:r>
+      <w:r>
+        <w:t xml:space="preserve"> </w:t>
+      </w:r>
+      <w:r>
+        <w:rPr>
+          <w:rStyle w:val="VerbatimChar"/>
+        </w:rPr>
+        <w:t xml:space="preserve">ag3a_25</w:t>
+      </w:r>
+      <w:r>
+        <w:t xml:space="preserve"> </w:t>
+      </w:r>
+      <w:r>
+        <w:t xml:space="preserve">(w4-5): 1 inheritance · 2 gift ·</w:t>
+      </w:r>
+      <w:r>
+        <w:t xml:space="preserve"> </w:t>
+      </w:r>
+      <w:r>
+        <w:t xml:space="preserve">3 borrowing · 4 village allocation ·</w:t>
+      </w:r>
+      <w:r>
+        <w:t xml:space="preserve"> </w:t>
+      </w:r>
+      <w:r>
+        <w:rPr>
+          <w:b/>
+        </w:rPr>
+        <w:t xml:space="preserve">5 PURCHASED</w:t>
+      </w:r>
+      <w:r>
+        <w:t xml:space="preserve"> </w:t>
+      </w:r>
+      <w:r>
+        <w:t xml:space="preserve">· 6 used free ·</w:t>
+      </w:r>
+      <w:r>
+        <w:t xml:space="preserve"> </w:t>
+      </w:r>
+      <w:r>
+        <w:rPr>
+          <w:b/>
+        </w:rPr>
+        <w:t xml:space="preserve">7 rented in</w:t>
+      </w:r>
+      <w:r>
+        <w:t xml:space="preserve"> </w:t>
+      </w:r>
+      <w:r>
+        <w:t xml:space="preserve">·</w:t>
+      </w:r>
+      <w:r>
+        <w:t xml:space="preserve"> </w:t>
+      </w:r>
+      <w:r>
+        <w:rPr>
+          <w:b/>
+        </w:rPr>
+        <w:t xml:space="preserve">8 shared-rent</w:t>
+      </w:r>
+      <w:r>
+        <w:t xml:space="preserve"> </w:t>
+      </w:r>
+      <w:r>
+        <w:t xml:space="preserve">· 9 shared-own · 10 squatting · 11 other.</w:t>
+      </w:r>
+    </w:p>
+    <w:p>
+      <w:pPr>
+        <w:pStyle w:val="BodyText"/>
+      </w:pPr>
+      <w:r>
+        <w:rPr>
+          <w:b/>
+        </w:rPr>
+        <w:t xml:space="preserve">Use of plot</w:t>
+      </w:r>
+      <w:r>
+        <w:t xml:space="preserve"> </w:t>
+      </w:r>
+      <w:r>
+        <w:t xml:space="preserve">-</w:t>
+      </w:r>
+      <w:r>
+        <w:t xml:space="preserve"> </w:t>
+      </w:r>
+      <w:r>
+        <w:rPr>
+          <w:rStyle w:val="VerbatimChar"/>
+        </w:rPr>
+        <w:t xml:space="preserve">s3aq3</w:t>
+      </w:r>
+      <w:r>
+        <w:t xml:space="preserve">/</w:t>
+      </w:r>
+      <w:r>
+        <w:rPr>
+          <w:rStyle w:val="VerbatimChar"/>
+        </w:rPr>
+        <w:t xml:space="preserve">ag3a_03</w:t>
+      </w:r>
+      <w:r>
+        <w:t xml:space="preserve">: 1 cultivated ·</w:t>
+      </w:r>
+      <w:r>
+        <w:t xml:space="preserve"> </w:t>
+      </w:r>
+      <w:r>
+        <w:rPr>
+          <w:b/>
+        </w:rPr>
+        <w:t xml:space="preserve">2 rented out</w:t>
+      </w:r>
+      <w:r>
+        <w:t xml:space="preserve"> </w:t>
+      </w:r>
+      <w:r>
+        <w:t xml:space="preserve">· 3 given out ·</w:t>
+      </w:r>
+      <w:r>
+        <w:t xml:space="preserve"> </w:t>
+      </w:r>
+      <w:r>
+        <w:t xml:space="preserve">4 fallow · 5 forest · 6 other.</w:t>
+      </w:r>
+    </w:p>
+    <w:p>
+      <w:pPr>
+        <w:pStyle w:val="Heading3"/>
+      </w:pPr>
+      <w:bookmarkStart w:id="64" w:name="harmonization-decisions-caveats-tanzania"/>
+      <w:r>
+        <w:t xml:space="preserve">6. Harmonization decisions &amp; caveats (Tanzania)</w:t>
+      </w:r>
+      <w:bookmarkEnd w:id="64"/>
+    </w:p>
+    <w:p>
+      <w:pPr>
+        <w:numPr>
+          <w:ilvl w:val="0"/>
+          <w:numId w:val="1006"/>
+        </w:numPr>
+        <w:pStyle w:val="Compact"/>
+      </w:pPr>
+      <w:r>
+        <w:rPr>
+          <w:b/>
+        </w:rPr>
+        <w:t xml:space="preserve">Purchase only measurable from 2015.</w:t>
+      </w:r>
+      <w:r>
+        <w:t xml:space="preserve"> </w:t>
+      </w:r>
+      <w:r>
+        <w:t xml:space="preserve">NPS1-3 ask</w:t>
+      </w:r>
+      <w:r>
+        <w:t xml:space="preserve"> </w:t>
+      </w:r>
+      <w:r>
+        <w:t xml:space="preserve">“</w:t>
+      </w:r>
+      <w:r>
+        <w:t xml:space="preserve">ownership status</w:t>
+      </w:r>
+      <w:r>
+        <w:t xml:space="preserve">”</w:t>
+      </w:r>
+      <w:r>
+        <w:t xml:space="preserve"> </w:t>
+      </w:r>
+      <w:r>
+        <w:t xml:space="preserve">(owned/free/</w:t>
+      </w:r>
+      <w:r>
+        <w:t xml:space="preserve"> </w:t>
+      </w:r>
+      <w:r>
+        <w:t xml:space="preserve">rented/shared) with no acquisition mode, so</w:t>
+      </w:r>
+      <w:r>
+        <w:t xml:space="preserve"> </w:t>
+      </w:r>
+      <w:r>
+        <w:rPr>
+          <w:rStyle w:val="VerbatimChar"/>
+        </w:rPr>
+        <w:t xml:space="preserve">parcel_purchased</w:t>
+      </w:r>
+      <w:r>
+        <w:t xml:space="preserve"> </w:t>
+      </w:r>
+      <w:r>
+        <w:t xml:space="preserve">is missing in</w:t>
+      </w:r>
+      <w:r>
+        <w:t xml:space="preserve"> </w:t>
+      </w:r>
+      <w:r>
+        <w:t xml:space="preserve">2009/2011/2013. From NPS4 the question becomes</w:t>
+      </w:r>
+      <w:r>
+        <w:t xml:space="preserve"> </w:t>
+      </w:r>
+      <w:r>
+        <w:t xml:space="preserve">“</w:t>
+      </w:r>
+      <w:r>
+        <w:t xml:space="preserve">how was this plot acquired?</w:t>
+      </w:r>
+      <w:r>
+        <w:t xml:space="preserve">”</w:t>
+      </w:r>
+      <w:r>
+        <w:t xml:space="preserve"> </w:t>
+      </w:r>
+      <w:r>
+        <w:t xml:space="preserve">with a</w:t>
+      </w:r>
+      <w:r>
+        <w:t xml:space="preserve"> </w:t>
+      </w:r>
+      <w:r>
+        <w:t xml:space="preserve">PURCHASED code (5). The 2015 level is high (~25% in the extended panel) - a</w:t>
+      </w:r>
+      <w:r>
+        <w:t xml:space="preserve"> </w:t>
+      </w:r>
+      <w:r>
+        <w:rPr>
+          <w:i/>
+        </w:rPr>
+        <w:t xml:space="preserve">stock</w:t>
+      </w:r>
+      <w:r>
+        <w:t xml:space="preserve"> </w:t>
+      </w:r>
+      <w:r>
+        <w:t xml:space="preserve">(</w:t>
+      </w:r>
+      <w:r>
+        <w:t xml:space="preserve">“</w:t>
+      </w:r>
+      <w:r>
+        <w:t xml:space="preserve">ever acquired by purchase</w:t>
+      </w:r>
+      <w:r>
+        <w:t xml:space="preserve">”</w:t>
+      </w:r>
+      <w:r>
+        <w:t xml:space="preserve">); scrutinize and mind the level break from the redesign.</w:t>
+      </w:r>
+    </w:p>
+    <w:p>
+      <w:pPr>
+        <w:numPr>
+          <w:ilvl w:val="0"/>
+          <w:numId w:val="1006"/>
+        </w:numPr>
+        <w:pStyle w:val="Compact"/>
+      </w:pPr>
+      <w:r>
+        <w:rPr>
+          <w:b/>
+        </w:rPr>
+        <w:t xml:space="preserve">Rented-in includes sharecropping</w:t>
+      </w:r>
+      <w:r>
+        <w:t xml:space="preserve"> </w:t>
+      </w:r>
+      <w:r>
+        <w:t xml:space="preserve">(shared-rent: code 4 early / 8 late) alongside</w:t>
+      </w:r>
+      <w:r>
+        <w:t xml:space="preserve"> </w:t>
+      </w:r>
+      <w:r>
+        <w:t xml:space="preserve">cash rental (3 / 7); the upstream pipeline used pure rental only. Shared-OWN (5 / 9)</w:t>
+      </w:r>
+      <w:r>
+        <w:t xml:space="preserve"> </w:t>
+      </w:r>
+      <w:r>
+        <w:t xml:space="preserve">is treated as owned, not rented.</w:t>
+      </w:r>
+    </w:p>
+    <w:p>
+      <w:pPr>
+        <w:numPr>
+          <w:ilvl w:val="0"/>
+          <w:numId w:val="1006"/>
+        </w:numPr>
+        <w:pStyle w:val="Compact"/>
+      </w:pPr>
+      <w:r>
+        <w:rPr>
+          <w:b/>
+        </w:rPr>
+        <w:t xml:space="preserve">Waves 4 and 5 pool an extended panel and a refresh sample</w:t>
+      </w:r>
+      <w:r>
+        <w:t xml:space="preserve">, each weighted by its</w:t>
+      </w:r>
+      <w:r>
+        <w:t xml:space="preserve"> </w:t>
+      </w:r>
+      <w:r>
+        <w:t xml:space="preserve">own design weight; together they represent the wave’s population.</w:t>
+      </w:r>
+    </w:p>
+    <w:p>
+      <w:pPr>
+        <w:numPr>
+          <w:ilvl w:val="0"/>
+          <w:numId w:val="1006"/>
+        </w:numPr>
+        <w:pStyle w:val="Compact"/>
+      </w:pPr>
+      <w:r>
+        <w:rPr>
+          <w:b/>
+        </w:rPr>
+        <w:t xml:space="preserve">Rented-out is well-measured</w:t>
+      </w:r>
+      <w:r>
+        <w:t xml:space="preserve"> </w:t>
+      </w:r>
+      <w:r>
+        <w:t xml:space="preserve">(the roster lists plots owned</w:t>
+      </w:r>
+      <w:r>
+        <w:t xml:space="preserve"> </w:t>
+      </w:r>
+      <w:r>
+        <w:rPr>
+          <w:i/>
+        </w:rPr>
+        <w:t xml:space="preserve">or</w:t>
+      </w:r>
+      <w:r>
+        <w:t xml:space="preserve"> </w:t>
+      </w:r>
+      <w:r>
+        <w:t xml:space="preserve">cultivated, and the</w:t>
+      </w:r>
+      <w:r>
+        <w:t xml:space="preserve"> </w:t>
+      </w:r>
+      <w:r>
+        <w:t xml:space="preserve">“</w:t>
+      </w:r>
+      <w:r>
+        <w:t xml:space="preserve">use</w:t>
+      </w:r>
+      <w:r>
+        <w:t xml:space="preserve">”</w:t>
+      </w:r>
+      <w:r>
+        <w:t xml:space="preserve"> </w:t>
+      </w:r>
+      <w:r>
+        <w:t xml:space="preserve">question flags rented-out) - unlike Mali/Niger.</w:t>
+      </w:r>
+    </w:p>
+    <w:p>
+      <w:pPr>
+        <w:numPr>
+          <w:ilvl w:val="0"/>
+          <w:numId w:val="1006"/>
+        </w:numPr>
+        <w:pStyle w:val="Compact"/>
+      </w:pPr>
+      <w:r>
+        <w:rPr>
+          <w:b/>
+        </w:rPr>
+        <w:t xml:space="preserve">ea_id</w:t>
+      </w:r>
+      <w:r>
+        <w:t xml:space="preserve"> </w:t>
+      </w:r>
+      <w:r>
+        <w:t xml:space="preserve">is built from the cover’s cluster/admin variables where present, else the</w:t>
+      </w:r>
+      <w:r>
+        <w:t xml:space="preserve"> </w:t>
+      </w:r>
+      <w:r>
+        <w:t xml:space="preserve">household id (a conservative PSU);</w:t>
+      </w:r>
+      <w:r>
+        <w:t xml:space="preserve"> </w:t>
+      </w:r>
+      <w:r>
+        <w:rPr>
+          <w:rStyle w:val="VerbatimChar"/>
+        </w:rPr>
+        <w:t xml:space="preserve">strataid</w:t>
+      </w:r>
+      <w:r>
+        <w:t xml:space="preserve"> </w:t>
+      </w:r>
+      <w:r>
+        <w:t xml:space="preserve">comes directly from the cover.</w:t>
+      </w:r>
+    </w:p>
+    <w:p>
+      <w:r>
+        <w:pict>
+          <v:rect style="width:0;height:1.5pt" o:hralign="center" o:hrstd="t" o:hr="t"/>
+        </w:pict>
+      </w:r>
+    </w:p>
+    <w:p>
+      <w:pPr>
+        <w:pStyle w:val="FirstParagraph"/>
+      </w:pPr>
+      <w:r>
         <w:rPr>
           <w:i/>
         </w:rPr>
@@ -19605,7 +22242,7 @@
         <w:rPr>
           <w:i/>
         </w:rPr>
-        <w:t xml:space="preserve">NER ECVMA1-2, NGA GHS1-5) and the raw survey modules, with source variables, codes, and</w:t>
+        <w:t xml:space="preserve">NER ECVMA1-2, NGA GHS1-5, TZA NPS1-5 incl. refresh) and the raw survey modules, with</w:t>
       </w:r>
       <w:r>
         <w:rPr>
@@ -19617,7 +22254,7 @@
         <w:rPr>
           <w:i/>
         </w:rPr>
-        <w:t xml:space="preserve">value labels verified against the data. Extend with one new country section (1-6) per</w:t>
+        <w:t xml:space="preserve">source variables, codes, and value labels verified against the data. Extend with one new</w:t>
       </w:r>
       <w:r>
         <w:rPr>
@@ -19629,7 +22266,7 @@
         <w:rPr>
           <w:i/>
         </w:rPr>
-        <w:t xml:space="preserve">country as the workflow grows.</w:t>
+        <w:t xml:space="preserve">country section (1-6) per country as the workflow grows.</w:t>
       </w:r>
     </w:p>
     <w:sectPr/>
@@ -19884,6 +22521,9 @@
     <w:abstractNumId w:val="991"/>
   </w:num>
   <w:num w:numId="1005">
+    <w:abstractNumId w:val="991"/>
+  </w:num>
+  <w:num w:numId="1006">
     <w:abstractNumId w:val="991"/>
   </w:num>
 </w:numbering>

</xml_diff>

<commit_message>
Docs: add Uganda section to provenance (+docx), DATA_SOURCES, README; season row, 2018 purchase missing-by-design, Zambia planned
</commit_message>
<xml_diff>
--- a/Reference/variable_provenance.docx
+++ b/Reference/variable_provenance.docx
@@ -2,32 +2,6 @@
 <file path=word/document.xml><?xml version="1.0" encoding="utf-8"?>
 <w:document xmlns:w="http://schemas.openxmlformats.org/wordprocessingml/2006/main" xmlns:m="http://schemas.openxmlformats.org/officeDocument/2006/math" xmlns:r="http://schemas.openxmlformats.org/officeDocument/2006/relationships" xmlns:o="urn:schemas-microsoft-com:office:office" xmlns:v="urn:schemas-microsoft-com:vml" xmlns:w10="urn:schemas-microsoft-com:office:word" xmlns:a="http://schemas.openxmlformats.org/drawingml/2006/main" xmlns:pic="http://schemas.openxmlformats.org/drawingml/2006/picture" xmlns:wp="http://schemas.openxmlformats.org/drawingml/2006/wordprocessingDrawing">
   <w:body>
-    <w:sdt>
-      <w:sdtPr>
-        <w:docPartObj>
-          <w:docPartGallery w:val="Table of Contents"/>
-          <w:docPartUnique/>
-        </w:docPartObj>
-      </w:sdtPr>
-      <w:sdtContent>
-        <w:p>
-          <w:pPr>
-            <w:pStyle w:val="TOCHeading"/>
-          </w:pPr>
-          <w:r>
-            <w:t xml:space="preserve">Table of Contents</w:t>
-          </w:r>
-        </w:p>
-        <w:p>
-          <w:r>
-            <w:fldChar w:fldCharType="begin" w:dirty="true"/>
-            <w:instrText xml:space="preserve">TOC \o "1-2" \h \z \u</w:instrText>
-            <w:fldChar w:fldCharType="separate"/>
-            <w:fldChar w:fldCharType="end"/>
-          </w:r>
-        </w:p>
-      </w:sdtContent>
-    </w:sdt>
     <w:p>
       <w:pPr>
         <w:pStyle w:val="Heading1"/>
@@ -501,6 +475,44 @@
             </w:pPr>
             <w:r>
               <w:t xml:space="preserve">count</w:t>
+            </w:r>
+          </w:p>
+        </w:tc>
+      </w:tr>
+      <w:tr>
+        <w:tc>
+          <w:p>
+            <w:pPr>
+              <w:pStyle w:val="Compact"/>
+              <w:jc w:val="left"/>
+            </w:pPr>
+            <w:r>
+              <w:rPr>
+                <w:rStyle w:val="VerbatimChar"/>
+              </w:rPr>
+              <w:t xml:space="preserve">season</w:t>
+            </w:r>
+          </w:p>
+        </w:tc>
+        <w:tc>
+          <w:p>
+            <w:pPr>
+              <w:pStyle w:val="Compact"/>
+              <w:jc w:val="left"/>
+            </w:pPr>
+            <w:r>
+              <w:t xml:space="preserve">Cropping season (1 = single-season country / Uganda season 1; 2 = Uganda season 2)</w:t>
+            </w:r>
+          </w:p>
+        </w:tc>
+        <w:tc>
+          <w:p>
+            <w:pPr>
+              <w:pStyle w:val="Compact"/>
+              <w:jc w:val="left"/>
+            </w:pPr>
+            <w:r>
+              <w:t xml:space="preserve">1/2</w:t>
             </w:r>
           </w:p>
         </w:tc>
@@ -1728,6 +1740,82 @@
             </w:r>
             <w:r>
               <w:t xml:space="preserve">in NPS4, 2015).</w:t>
+            </w:r>
+          </w:p>
+        </w:tc>
+      </w:tr>
+      <w:tr>
+        <w:tc>
+          <w:p>
+            <w:pPr>
+              <w:pStyle w:val="Compact"/>
+              <w:jc w:val="left"/>
+            </w:pPr>
+            <w:r>
+              <w:t xml:space="preserve">Uganda</w:t>
+            </w:r>
+          </w:p>
+        </w:tc>
+        <w:tc>
+          <w:p>
+            <w:pPr>
+              <w:pStyle w:val="Compact"/>
+              <w:jc w:val="left"/>
+            </w:pPr>
+            <w:r>
+              <w:rPr>
+                <w:rStyle w:val="VerbatimChar"/>
+              </w:rPr>
+              <w:t xml:space="preserve">parcel_purchased</w:t>
+            </w:r>
+          </w:p>
+        </w:tc>
+        <w:tc>
+          <w:p>
+            <w:pPr>
+              <w:pStyle w:val="Compact"/>
+              <w:jc w:val="left"/>
+            </w:pPr>
+            <w:r>
+              <w:t xml:space="preserve">2018</w:t>
+            </w:r>
+          </w:p>
+        </w:tc>
+        <w:tc>
+          <w:p>
+            <w:pPr>
+              <w:pStyle w:val="Compact"/>
+              <w:jc w:val="left"/>
+            </w:pPr>
+            <w:r>
+              <w:t xml:space="preserve">UNPS7 (2018/19) did</w:t>
+            </w:r>
+            <w:r>
+              <w:t xml:space="preserve"> </w:t>
+            </w:r>
+            <w:r>
+              <w:rPr>
+                <w:b/>
+              </w:rPr>
+              <w:t xml:space="preserve">not record the owned-parcel acquisition item</w:t>
+            </w:r>
+            <w:r>
+              <w:t xml:space="preserve"> </w:t>
+            </w:r>
+            <w:r>
+              <w:t xml:space="preserve">(</w:t>
+            </w:r>
+            <w:r>
+              <w:rPr>
+                <w:rStyle w:val="VerbatimChar"/>
+              </w:rPr>
+              <w:t xml:space="preserve">s2aq8</w:t>
+            </w:r>
+            <w:r>
+              <w:t xml:space="preserve"> </w:t>
+            </w:r>
+            <w:r>
+              <w:t xml:space="preserve">is entirely empty), so acquisition mode - including purchase - is unidentifiable that round.</w:t>
             </w:r>
           </w:p>
         </w:tc>
@@ -22199,9 +22287,3278 @@
     </w:p>
     <w:p>
       <w:pPr>
+        <w:pStyle w:val="Heading2"/>
+      </w:pPr>
+      <w:bookmarkStart w:id="65" w:name="uganda-national-panel-survey-unps"/>
+      <w:r>
+        <w:t xml:space="preserve">UGANDA — National Panel Survey (UNPS)</w:t>
+      </w:r>
+      <w:bookmarkEnd w:id="65"/>
+    </w:p>
+    <w:p>
+      <w:pPr>
         <w:pStyle w:val="FirstParagraph"/>
       </w:pPr>
       <w:r>
+        <w:t xml:space="preserve">Seven UNPS rounds (2009/10, 2010/11, 2011/12, 2013/14, 2015/16, 2018/19, 2019/20;</w:t>
+      </w:r>
+      <w:r>
+        <w:t xml:space="preserve"> </w:t>
+      </w:r>
+      <w:r>
+        <w:t xml:space="preserve">internal waves 1-5, 7, 8). The land roster is split into</w:t>
+      </w:r>
+      <w:r>
+        <w:t xml:space="preserve"> </w:t>
+      </w:r>
+      <w:r>
+        <w:rPr>
+          <w:b/>
+        </w:rPr>
+        <w:t xml:space="preserve">two modules per round</w:t>
+      </w:r>
+      <w:r>
+        <w:t xml:space="preserve">:</w:t>
+      </w:r>
+      <w:r>
+        <w:t xml:space="preserve"> </w:t>
+      </w:r>
+      <w:r>
+        <w:rPr>
+          <w:rStyle w:val="VerbatimChar"/>
+        </w:rPr>
+        <w:t xml:space="preserve">AGSEC2A</w:t>
+      </w:r>
+      <w:r>
+        <w:t xml:space="preserve"> </w:t>
+      </w:r>
+      <w:r>
+        <w:t xml:space="preserve">= parcels the household</w:t>
+      </w:r>
+      <w:r>
+        <w:t xml:space="preserve"> </w:t>
+      </w:r>
+      <w:r>
+        <w:rPr>
+          <w:b/>
+        </w:rPr>
+        <w:t xml:space="preserve">owns / holds use-rights to</w:t>
+      </w:r>
+      <w:r>
+        <w:t xml:space="preserve">, and</w:t>
+      </w:r>
+      <w:r>
+        <w:t xml:space="preserve"> </w:t>
+      </w:r>
+      <w:r>
+        <w:rPr>
+          <w:rStyle w:val="VerbatimChar"/>
+        </w:rPr>
+        <w:t xml:space="preserve">AGSEC2B</w:t>
+      </w:r>
+      <w:r>
+        <w:t xml:space="preserve"> </w:t>
+      </w:r>
+      <w:r>
+        <w:t xml:space="preserve">=</w:t>
+      </w:r>
+      <w:r>
+        <w:t xml:space="preserve"> </w:t>
+      </w:r>
+      <w:r>
+        <w:t xml:space="preserve">parcels</w:t>
+      </w:r>
+      <w:r>
+        <w:t xml:space="preserve"> </w:t>
+      </w:r>
+      <w:r>
+        <w:rPr>
+          <w:b/>
+        </w:rPr>
+        <w:t xml:space="preserve">accessed for use but not owned</w:t>
+      </w:r>
+      <w:r>
+        <w:t xml:space="preserve"> </w:t>
+      </w:r>
+      <w:r>
+        <w:t xml:space="preserve">(rented or borrowed in). These are disjoint</w:t>
+      </w:r>
+      <w:r>
+        <w:t xml:space="preserve"> </w:t>
+      </w:r>
+      <w:r>
+        <w:t xml:space="preserve">parcel sets, so the extractor</w:t>
+      </w:r>
+      <w:r>
+        <w:t xml:space="preserve"> </w:t>
+      </w:r>
+      <w:r>
+        <w:rPr>
+          <w:b/>
+        </w:rPr>
+        <w:t xml:space="preserve">stacks</w:t>
+      </w:r>
+      <w:r>
+        <w:t xml:space="preserve"> </w:t>
+      </w:r>
+      <w:r>
+        <w:t xml:space="preserve">them (origin tagged in</w:t>
+      </w:r>
+      <w:r>
+        <w:t xml:space="preserve"> </w:t>
+      </w:r>
+      <w:r>
+        <w:rPr>
+          <w:rStyle w:val="VerbatimChar"/>
+        </w:rPr>
+        <w:t xml:space="preserve">parcel_id</w:t>
+      </w:r>
+      <w:r>
+        <w:t xml:space="preserve">:</w:t>
+      </w:r>
+      <w:r>
+        <w:t xml:space="preserve"> </w:t>
+      </w:r>
+      <w:r>
+        <w:rPr>
+          <w:rStyle w:val="VerbatimChar"/>
+        </w:rPr>
+        <w:t xml:space="preserve">-A-</w:t>
+      </w:r>
+      <w:r>
+        <w:t xml:space="preserve"> </w:t>
+      </w:r>
+      <w:r>
+        <w:t xml:space="preserve">owned,</w:t>
+      </w:r>
+      <w:r>
+        <w:t xml:space="preserve"> </w:t>
+      </w:r>
+      <w:r>
+        <w:rPr>
+          <w:rStyle w:val="VerbatimChar"/>
+        </w:rPr>
+        <w:t xml:space="preserve">-B-</w:t>
+      </w:r>
+      <w:r>
+        <w:t xml:space="preserve"> </w:t>
+      </w:r>
+      <w:r>
+        <w:t xml:space="preserve">accessed) rather than merging them on the parcel number.</w:t>
+      </w:r>
+    </w:p>
+    <w:p>
+      <w:pPr>
+        <w:pStyle w:val="BlockText"/>
+      </w:pPr>
+      <w:r>
+        <w:rPr>
+          <w:b/>
+        </w:rPr>
+        <w:t xml:space="preserve">Unit note.</w:t>
+      </w:r>
+      <w:r>
+        <w:t xml:space="preserve"> </w:t>
+      </w:r>
+      <w:r>
+        <w:rPr>
+          <w:rStyle w:val="VerbatimChar"/>
+        </w:rPr>
+        <w:t xml:space="preserve">parcel</w:t>
+      </w:r>
+      <w:r>
+        <w:t xml:space="preserve"> </w:t>
+      </w:r>
+      <w:r>
+        <w:t xml:space="preserve">= a parcel record from 2A or 2B. Variable NAMES drift across</w:t>
+      </w:r>
+      <w:r>
+        <w:t xml:space="preserve"> </w:t>
+      </w:r>
+      <w:r>
+        <w:t xml:space="preserve">rounds (</w:t>
+      </w:r>
+      <w:r>
+        <w:rPr>
+          <w:rStyle w:val="VerbatimChar"/>
+        </w:rPr>
+        <w:t xml:space="preserve">a2aq*</w:t>
+      </w:r>
+      <w:r>
+        <w:t xml:space="preserve">/</w:t>
+      </w:r>
+      <w:r>
+        <w:rPr>
+          <w:rStyle w:val="VerbatimChar"/>
+        </w:rPr>
+        <w:t xml:space="preserve">A2aq*</w:t>
+      </w:r>
+      <w:r>
+        <w:t xml:space="preserve">/</w:t>
+      </w:r>
+      <w:r>
+        <w:rPr>
+          <w:rStyle w:val="VerbatimChar"/>
+        </w:rPr>
+        <w:t xml:space="preserve">s2aq*</w:t>
+      </w:r>
+      <w:r>
+        <w:t xml:space="preserve">) - notably the</w:t>
+      </w:r>
+      <w:r>
+        <w:t xml:space="preserve"> </w:t>
+      </w:r>
+      <w:r>
+        <w:rPr>
+          <w:b/>
+        </w:rPr>
+        <w:t xml:space="preserve">certificate</w:t>
+      </w:r>
+      <w:r>
+        <w:t xml:space="preserve"> </w:t>
+      </w:r>
+      <w:r>
+        <w:t xml:space="preserve">item moves</w:t>
+      </w:r>
+      <w:r>
+        <w:t xml:space="preserve"> </w:t>
+      </w:r>
+      <w:r>
+        <w:rPr>
+          <w:rStyle w:val="VerbatimChar"/>
+        </w:rPr>
+        <w:t xml:space="preserve">A2aq25</w:t>
+      </w:r>
+      <w:r>
+        <w:t xml:space="preserve"> </w:t>
+      </w:r>
+      <w:r>
+        <w:t xml:space="preserve">(2009/10) →</w:t>
+      </w:r>
+      <w:r>
+        <w:t xml:space="preserve"> </w:t>
+      </w:r>
+      <w:r>
+        <w:rPr>
+          <w:rStyle w:val="VerbatimChar"/>
+        </w:rPr>
+        <w:t xml:space="preserve">a2aq23</w:t>
+      </w:r>
+      <w:r>
+        <w:t xml:space="preserve"> </w:t>
+      </w:r>
+      <w:r>
+        <w:t xml:space="preserve">(2011-2015) →</w:t>
+      </w:r>
+      <w:r>
+        <w:t xml:space="preserve"> </w:t>
+      </w:r>
+      <w:r>
+        <w:rPr>
+          <w:rStyle w:val="VerbatimChar"/>
+        </w:rPr>
+        <w:t xml:space="preserve">s2aq23</w:t>
+      </w:r>
+      <w:r>
+        <w:t xml:space="preserve"> </w:t>
+      </w:r>
+      <w:r>
+        <w:t xml:space="preserve">(2018/19). The household key</w:t>
+      </w:r>
+      <w:r>
+        <w:t xml:space="preserve"> </w:t>
+      </w:r>
+      <w:r>
+        <w:t xml:space="preserve">also changes (</w:t>
+      </w:r>
+      <w:r>
+        <w:rPr>
+          <w:rStyle w:val="VerbatimChar"/>
+        </w:rPr>
+        <w:t xml:space="preserve">Hhid</w:t>
+      </w:r>
+      <w:r>
+        <w:t xml:space="preserve">/</w:t>
+      </w:r>
+      <w:r>
+        <w:rPr>
+          <w:rStyle w:val="VerbatimChar"/>
+        </w:rPr>
+        <w:t xml:space="preserve">HHID</w:t>
+      </w:r>
+      <w:r>
+        <w:t xml:space="preserve"> </w:t>
+      </w:r>
+      <w:r>
+        <w:t xml:space="preserve">numeric →</w:t>
+      </w:r>
+      <w:r>
+        <w:t xml:space="preserve"> </w:t>
+      </w:r>
+      <w:r>
+        <w:rPr>
+          <w:rStyle w:val="VerbatimChar"/>
+        </w:rPr>
+        <w:t xml:space="preserve">hh</w:t>
+      </w:r>
+      <w:r>
+        <w:t xml:space="preserve">/</w:t>
+      </w:r>
+      <w:r>
+        <w:rPr>
+          <w:rStyle w:val="VerbatimChar"/>
+        </w:rPr>
+        <w:t xml:space="preserve">hhid</w:t>
+      </w:r>
+      <w:r>
+        <w:t xml:space="preserve"> </w:t>
+      </w:r>
+      <w:r>
+        <w:t xml:space="preserve">string → 32-char interview GUID).</w:t>
+      </w:r>
+    </w:p>
+    <w:p>
+      <w:pPr>
+        <w:pStyle w:val="BlockText"/>
+      </w:pPr>
+      <w:r>
+        <w:rPr>
+          <w:b/>
+        </w:rPr>
+        <w:t xml:space="preserve">Season note.</w:t>
+      </w:r>
+      <w:r>
+        <w:t xml:space="preserve"> </w:t>
+      </w:r>
+      <w:r>
+        <w:t xml:space="preserve">The parcel roster (tenure, certificate, purchase, area) is</w:t>
+      </w:r>
+      <w:r>
+        <w:t xml:space="preserve"> </w:t>
+      </w:r>
+      <w:r>
+        <w:rPr>
+          <w:b/>
+        </w:rPr>
+        <w:t xml:space="preserve">annual</w:t>
+      </w:r>
+      <w:r>
+        <w:t xml:space="preserve"> </w:t>
+      </w:r>
+      <w:r>
+        <w:t xml:space="preserve">and identical across the two cropping seasons;</w:t>
+      </w:r>
+      <w:r>
+        <w:t xml:space="preserve"> </w:t>
+      </w:r>
+      <w:r>
+        <w:rPr>
+          <w:b/>
+        </w:rPr>
+        <w:t xml:space="preserve">only</w:t>
+      </w:r>
+      <w:r>
+        <w:rPr>
+          <w:b/>
+        </w:rPr>
+        <w:t xml:space="preserve"> </w:t>
+      </w:r>
+      <w:r>
+        <w:rPr>
+          <w:rStyle w:val="VerbatimChar"/>
+          <w:b/>
+        </w:rPr>
+        <w:t xml:space="preserve">parcel_rentedout</w:t>
+      </w:r>
+      <w:r>
+        <w:rPr>
+          <w:b/>
+        </w:rPr>
+        <w:t xml:space="preserve"> </w:t>
+      </w:r>
+      <w:r>
+        <w:rPr>
+          <w:b/>
+        </w:rPr>
+        <w:t xml:space="preserve">is</w:t>
+      </w:r>
+      <w:r>
+        <w:rPr>
+          <w:b/>
+        </w:rPr>
+        <w:t xml:space="preserve"> </w:t>
+      </w:r>
+      <w:r>
+        <w:rPr>
+          <w:b/>
+        </w:rPr>
+        <w:t xml:space="preserve">season-specific</w:t>
+      </w:r>
+      <w:r>
+        <w:t xml:space="preserve"> </w:t>
+      </w:r>
+      <w:r>
+        <w:t xml:space="preserve">(read from the per-season</w:t>
+      </w:r>
+      <w:r>
+        <w:t xml:space="preserve"> </w:t>
+      </w:r>
+      <w:r>
+        <w:t xml:space="preserve">“</w:t>
+      </w:r>
+      <w:r>
+        <w:t xml:space="preserve">primary use of parcel</w:t>
+      </w:r>
+      <w:r>
+        <w:t xml:space="preserve">”</w:t>
+      </w:r>
+      <w:r>
+        <w:t xml:space="preserve"> </w:t>
+      </w:r>
+      <w:r>
+        <w:t xml:space="preserve">item, code 3). The</w:t>
+      </w:r>
+      <w:r>
+        <w:t xml:space="preserve"> </w:t>
+      </w:r>
+      <w:r>
+        <w:t xml:space="preserve">extractor writes one row per parcel</w:t>
+      </w:r>
+      <w:r>
+        <w:t xml:space="preserve"> </w:t>
+      </w:r>
+      <w:r>
+        <w:rPr>
+          <w:b/>
+        </w:rPr>
+        <w:t xml:space="preserve">× season</w:t>
+      </w:r>
+      <w:r>
+        <w:t xml:space="preserve"> </w:t>
+      </w:r>
+      <w:r>
+        <w:t xml:space="preserve">(</w:t>
+      </w:r>
+      <w:r>
+        <w:rPr>
+          <w:rStyle w:val="VerbatimChar"/>
+        </w:rPr>
+        <w:t xml:space="preserve">season</w:t>
+      </w:r>
+      <w:r>
+        <w:t xml:space="preserve"> </w:t>
+      </w:r>
+      <w:r>
+        <w:t xml:space="preserve">= 1, 2) differing only in</w:t>
+      </w:r>
+      <w:r>
+        <w:t xml:space="preserve"> </w:t>
+      </w:r>
+      <w:r>
+        <w:rPr>
+          <w:rStyle w:val="VerbatimChar"/>
+        </w:rPr>
+        <w:t xml:space="preserve">parcel_rentedout</w:t>
+      </w:r>
+      <w:r>
+        <w:t xml:space="preserve">, and</w:t>
+      </w:r>
+      <w:r>
+        <w:t xml:space="preserve"> </w:t>
+      </w:r>
+      <w:r>
+        <w:rPr>
+          <w:b/>
+        </w:rPr>
+        <w:t xml:space="preserve">the paper reports season 1</w:t>
+      </w:r>
+      <w:r>
+        <w:t xml:space="preserve">.</w:t>
+      </w:r>
+      <w:r>
+        <w:t xml:space="preserve"> </w:t>
+      </w:r>
+      <w:r>
+        <w:rPr>
+          <w:i/>
+        </w:rPr>
+        <w:t xml:space="preserve">The season order is SWAPPED in</w:t>
+      </w:r>
+      <w:r>
+        <w:rPr>
+          <w:i/>
+        </w:rPr>
+        <w:t xml:space="preserve"> </w:t>
+      </w:r>
+      <w:r>
+        <w:rPr>
+          <w:i/>
+        </w:rPr>
+        <w:t xml:space="preserve">2015, 2018 and 2019:</w:t>
+      </w:r>
+      <w:r>
+        <w:t xml:space="preserve"> </w:t>
+      </w:r>
+      <w:r>
+        <w:t xml:space="preserve">there the</w:t>
+      </w:r>
+      <w:r>
+        <w:t xml:space="preserve"> </w:t>
+      </w:r>
+      <w:r>
+        <w:t xml:space="preserve">“</w:t>
+      </w:r>
+      <w:r>
+        <w:t xml:space="preserve">…b</w:t>
+      </w:r>
+      <w:r>
+        <w:t xml:space="preserve">”</w:t>
+      </w:r>
+      <w:r>
+        <w:t xml:space="preserve"> </w:t>
+      </w:r>
+      <w:r>
+        <w:t xml:space="preserve">primary-use variable is the 1st season and</w:t>
+      </w:r>
+      <w:r>
+        <w:t xml:space="preserve"> </w:t>
+      </w:r>
+      <w:r>
+        <w:t xml:space="preserve">“</w:t>
+      </w:r>
+      <w:r>
+        <w:t xml:space="preserve">…a</w:t>
+      </w:r>
+      <w:r>
+        <w:t xml:space="preserve">”</w:t>
+      </w:r>
+      <w:r>
+        <w:t xml:space="preserve"> </w:t>
+      </w:r>
+      <w:r>
+        <w:t xml:space="preserve">the</w:t>
+      </w:r>
+      <w:r>
+        <w:t xml:space="preserve"> </w:t>
+      </w:r>
+      <w:r>
+        <w:t xml:space="preserve">2nd (handled per wave).</w:t>
+      </w:r>
+    </w:p>
+    <w:p>
+      <w:pPr>
+        <w:pStyle w:val="Heading3"/>
+      </w:pPr>
+      <w:bookmarkStart w:id="66" w:name="survey-wave-key-6"/>
+      <w:r>
+        <w:t xml:space="preserve">1. Survey &amp; wave key</w:t>
+      </w:r>
+      <w:bookmarkEnd w:id="66"/>
+    </w:p>
+    <w:tbl>
+      <w:tblPr>
+        <w:tblStyle w:val="Table"/>
+        <w:tblW w:type="pct" w:w="0.0"/>
+        <w:tblLook w:firstRow="1"/>
+      </w:tblPr>
+      <w:tblGrid/>
+      <w:tr>
+        <w:trPr>
+          <w:cnfStyle w:firstRow="1"/>
+        </w:trPr>
+        <w:tc>
+          <w:tcPr>
+            <w:tcBorders>
+              <w:bottom w:val="single"/>
+            </w:tcBorders>
+            <w:vAlign w:val="bottom"/>
+          </w:tcPr>
+          <w:p>
+            <w:pPr>
+              <w:pStyle w:val="Compact"/>
+              <w:jc w:val="left"/>
+            </w:pPr>
+            <w:r>
+              <w:t xml:space="preserve">Wave</w:t>
+            </w:r>
+          </w:p>
+        </w:tc>
+        <w:tc>
+          <w:tcPr>
+            <w:tcBorders>
+              <w:bottom w:val="single"/>
+            </w:tcBorders>
+            <w:vAlign w:val="bottom"/>
+          </w:tcPr>
+          <w:p>
+            <w:pPr>
+              <w:pStyle w:val="Compact"/>
+              <w:jc w:val="left"/>
+            </w:pPr>
+            <w:r>
+              <w:t xml:space="preserve">Round folder</w:t>
+            </w:r>
+          </w:p>
+        </w:tc>
+        <w:tc>
+          <w:tcPr>
+            <w:tcBorders>
+              <w:bottom w:val="single"/>
+            </w:tcBorders>
+            <w:vAlign w:val="bottom"/>
+          </w:tcPr>
+          <w:p>
+            <w:pPr>
+              <w:pStyle w:val="Compact"/>
+              <w:jc w:val="left"/>
+            </w:pPr>
+            <w:r>
+              <w:t xml:space="preserve">Year</w:t>
+            </w:r>
+          </w:p>
+        </w:tc>
+        <w:tc>
+          <w:tcPr>
+            <w:tcBorders>
+              <w:bottom w:val="single"/>
+            </w:tcBorders>
+            <w:vAlign w:val="bottom"/>
+          </w:tcPr>
+          <w:p>
+            <w:pPr>
+              <w:pStyle w:val="Compact"/>
+              <w:jc w:val="left"/>
+            </w:pPr>
+            <w:r>
+              <w:t xml:space="preserve">HH key (roster ↔ cover)</w:t>
+            </w:r>
+          </w:p>
+        </w:tc>
+        <w:tc>
+          <w:tcPr>
+            <w:tcBorders>
+              <w:bottom w:val="single"/>
+            </w:tcBorders>
+            <w:vAlign w:val="bottom"/>
+          </w:tcPr>
+          <w:p>
+            <w:pPr>
+              <w:pStyle w:val="Compact"/>
+              <w:jc w:val="left"/>
+            </w:pPr>
+            <w:r>
+              <w:t xml:space="preserve">Cross-sec weight</w:t>
+            </w:r>
+          </w:p>
+        </w:tc>
+      </w:tr>
+      <w:tr>
+        <w:tc>
+          <w:p>
+            <w:pPr>
+              <w:pStyle w:val="Compact"/>
+              <w:jc w:val="left"/>
+            </w:pPr>
+            <w:r>
+              <w:t xml:space="preserve">1</w:t>
+            </w:r>
+          </w:p>
+        </w:tc>
+        <w:tc>
+          <w:p>
+            <w:pPr>
+              <w:pStyle w:val="Compact"/>
+              <w:jc w:val="left"/>
+            </w:pPr>
+            <w:r>
+              <w:rPr>
+                <w:rStyle w:val="VerbatimChar"/>
+              </w:rPr>
+              <w:t xml:space="preserve">Uganda/UNPS 09</w:t>
+            </w:r>
+          </w:p>
+        </w:tc>
+        <w:tc>
+          <w:p>
+            <w:pPr>
+              <w:pStyle w:val="Compact"/>
+              <w:jc w:val="left"/>
+            </w:pPr>
+            <w:r>
+              <w:t xml:space="preserve">2009</w:t>
+            </w:r>
+          </w:p>
+        </w:tc>
+        <w:tc>
+          <w:p>
+            <w:pPr>
+              <w:pStyle w:val="Compact"/>
+              <w:jc w:val="left"/>
+            </w:pPr>
+            <w:r>
+              <w:rPr>
+                <w:rStyle w:val="VerbatimChar"/>
+              </w:rPr>
+              <w:t xml:space="preserve">Hhid</w:t>
+            </w:r>
+            <w:r>
+              <w:t xml:space="preserve"> </w:t>
+            </w:r>
+            <w:r>
+              <w:t xml:space="preserve">↔</w:t>
+            </w:r>
+            <w:r>
+              <w:t xml:space="preserve"> </w:t>
+            </w:r>
+            <w:r>
+              <w:rPr>
+                <w:rStyle w:val="VerbatimChar"/>
+              </w:rPr>
+              <w:t xml:space="preserve">HHID</w:t>
+            </w:r>
+          </w:p>
+        </w:tc>
+        <w:tc>
+          <w:p>
+            <w:pPr>
+              <w:pStyle w:val="Compact"/>
+              <w:jc w:val="left"/>
+            </w:pPr>
+            <w:r>
+              <w:rPr>
+                <w:rStyle w:val="VerbatimChar"/>
+              </w:rPr>
+              <w:t xml:space="preserve">wgt09</w:t>
+            </w:r>
+          </w:p>
+        </w:tc>
+      </w:tr>
+      <w:tr>
+        <w:tc>
+          <w:p>
+            <w:pPr>
+              <w:pStyle w:val="Compact"/>
+              <w:jc w:val="left"/>
+            </w:pPr>
+            <w:r>
+              <w:t xml:space="preserve">2</w:t>
+            </w:r>
+          </w:p>
+        </w:tc>
+        <w:tc>
+          <w:p>
+            <w:pPr>
+              <w:pStyle w:val="Compact"/>
+              <w:jc w:val="left"/>
+            </w:pPr>
+            <w:r>
+              <w:rPr>
+                <w:rStyle w:val="VerbatimChar"/>
+              </w:rPr>
+              <w:t xml:space="preserve">Uganda/UNPS 10</w:t>
+            </w:r>
+          </w:p>
+        </w:tc>
+        <w:tc>
+          <w:p>
+            <w:pPr>
+              <w:pStyle w:val="Compact"/>
+              <w:jc w:val="left"/>
+            </w:pPr>
+            <w:r>
+              <w:t xml:space="preserve">2010</w:t>
+            </w:r>
+          </w:p>
+        </w:tc>
+        <w:tc>
+          <w:p>
+            <w:pPr>
+              <w:pStyle w:val="Compact"/>
+              <w:jc w:val="left"/>
+            </w:pPr>
+            <w:r>
+              <w:rPr>
+                <w:rStyle w:val="VerbatimChar"/>
+              </w:rPr>
+              <w:t xml:space="preserve">HHID</w:t>
+            </w:r>
+            <w:r>
+              <w:t xml:space="preserve"> </w:t>
+            </w:r>
+            <w:r>
+              <w:t xml:space="preserve">↔</w:t>
+            </w:r>
+            <w:r>
+              <w:t xml:space="preserve"> </w:t>
+            </w:r>
+            <w:r>
+              <w:rPr>
+                <w:rStyle w:val="VerbatimChar"/>
+              </w:rPr>
+              <w:t xml:space="preserve">HHID</w:t>
+            </w:r>
+          </w:p>
+        </w:tc>
+        <w:tc>
+          <w:p>
+            <w:pPr>
+              <w:pStyle w:val="Compact"/>
+              <w:jc w:val="left"/>
+            </w:pPr>
+            <w:r>
+              <w:rPr>
+                <w:rStyle w:val="VerbatimChar"/>
+              </w:rPr>
+              <w:t xml:space="preserve">wgt10</w:t>
+            </w:r>
+          </w:p>
+        </w:tc>
+      </w:tr>
+      <w:tr>
+        <w:tc>
+          <w:p>
+            <w:pPr>
+              <w:pStyle w:val="Compact"/>
+              <w:jc w:val="left"/>
+            </w:pPr>
+            <w:r>
+              <w:t xml:space="preserve">3</w:t>
+            </w:r>
+          </w:p>
+        </w:tc>
+        <w:tc>
+          <w:p>
+            <w:pPr>
+              <w:pStyle w:val="Compact"/>
+              <w:jc w:val="left"/>
+            </w:pPr>
+            <w:r>
+              <w:rPr>
+                <w:rStyle w:val="VerbatimChar"/>
+              </w:rPr>
+              <w:t xml:space="preserve">Uganda/UNPS 11</w:t>
+            </w:r>
+          </w:p>
+        </w:tc>
+        <w:tc>
+          <w:p>
+            <w:pPr>
+              <w:pStyle w:val="Compact"/>
+              <w:jc w:val="left"/>
+            </w:pPr>
+            <w:r>
+              <w:t xml:space="preserve">2011</w:t>
+            </w:r>
+          </w:p>
+        </w:tc>
+        <w:tc>
+          <w:p>
+            <w:pPr>
+              <w:pStyle w:val="Compact"/>
+              <w:jc w:val="left"/>
+            </w:pPr>
+            <w:r>
+              <w:rPr>
+                <w:rStyle w:val="VerbatimChar"/>
+              </w:rPr>
+              <w:t xml:space="preserve">HHID</w:t>
+            </w:r>
+            <w:r>
+              <w:t xml:space="preserve"> </w:t>
+            </w:r>
+            <w:r>
+              <w:t xml:space="preserve">↔</w:t>
+            </w:r>
+            <w:r>
+              <w:t xml:space="preserve"> </w:t>
+            </w:r>
+            <w:r>
+              <w:rPr>
+                <w:rStyle w:val="VerbatimChar"/>
+              </w:rPr>
+              <w:t xml:space="preserve">HHID</w:t>
+            </w:r>
+          </w:p>
+        </w:tc>
+        <w:tc>
+          <w:p>
+            <w:pPr>
+              <w:pStyle w:val="Compact"/>
+              <w:jc w:val="left"/>
+            </w:pPr>
+            <w:r>
+              <w:rPr>
+                <w:rStyle w:val="VerbatimChar"/>
+              </w:rPr>
+              <w:t xml:space="preserve">mult</w:t>
+            </w:r>
+          </w:p>
+        </w:tc>
+      </w:tr>
+      <w:tr>
+        <w:tc>
+          <w:p>
+            <w:pPr>
+              <w:pStyle w:val="Compact"/>
+              <w:jc w:val="left"/>
+            </w:pPr>
+            <w:r>
+              <w:t xml:space="preserve">4</w:t>
+            </w:r>
+          </w:p>
+        </w:tc>
+        <w:tc>
+          <w:p>
+            <w:pPr>
+              <w:pStyle w:val="Compact"/>
+              <w:jc w:val="left"/>
+            </w:pPr>
+            <w:r>
+              <w:rPr>
+                <w:rStyle w:val="VerbatimChar"/>
+              </w:rPr>
+              <w:t xml:space="preserve">Uganda/UNPS 13</w:t>
+            </w:r>
+          </w:p>
+        </w:tc>
+        <w:tc>
+          <w:p>
+            <w:pPr>
+              <w:pStyle w:val="Compact"/>
+              <w:jc w:val="left"/>
+            </w:pPr>
+            <w:r>
+              <w:t xml:space="preserve">2013</w:t>
+            </w:r>
+          </w:p>
+        </w:tc>
+        <w:tc>
+          <w:p>
+            <w:pPr>
+              <w:pStyle w:val="Compact"/>
+              <w:jc w:val="left"/>
+            </w:pPr>
+            <w:r>
+              <w:rPr>
+                <w:rStyle w:val="VerbatimChar"/>
+              </w:rPr>
+              <w:t xml:space="preserve">hh</w:t>
+            </w:r>
+            <w:r>
+              <w:t xml:space="preserve"> </w:t>
+            </w:r>
+            <w:r>
+              <w:t xml:space="preserve">↔</w:t>
+            </w:r>
+            <w:r>
+              <w:t xml:space="preserve"> </w:t>
+            </w:r>
+            <w:r>
+              <w:rPr>
+                <w:rStyle w:val="VerbatimChar"/>
+              </w:rPr>
+              <w:t xml:space="preserve">hhid</w:t>
+            </w:r>
+            <w:r>
+              <w:t xml:space="preserve"> </w:t>
+            </w:r>
+            <w:r>
+              <w:t xml:space="preserve">(string)</w:t>
+            </w:r>
+          </w:p>
+        </w:tc>
+        <w:tc>
+          <w:p>
+            <w:pPr>
+              <w:pStyle w:val="Compact"/>
+              <w:jc w:val="left"/>
+            </w:pPr>
+            <w:r>
+              <w:rPr>
+                <w:rStyle w:val="VerbatimChar"/>
+              </w:rPr>
+              <w:t xml:space="preserve">wgt_X</w:t>
+            </w:r>
+          </w:p>
+        </w:tc>
+      </w:tr>
+      <w:tr>
+        <w:tc>
+          <w:p>
+            <w:pPr>
+              <w:pStyle w:val="Compact"/>
+              <w:jc w:val="left"/>
+            </w:pPr>
+            <w:r>
+              <w:t xml:space="preserve">5</w:t>
+            </w:r>
+          </w:p>
+        </w:tc>
+        <w:tc>
+          <w:p>
+            <w:pPr>
+              <w:pStyle w:val="Compact"/>
+              <w:jc w:val="left"/>
+            </w:pPr>
+            <w:r>
+              <w:rPr>
+                <w:rStyle w:val="VerbatimChar"/>
+              </w:rPr>
+              <w:t xml:space="preserve">Uganda/UNPS 15</w:t>
+            </w:r>
+          </w:p>
+        </w:tc>
+        <w:tc>
+          <w:p>
+            <w:pPr>
+              <w:pStyle w:val="Compact"/>
+              <w:jc w:val="left"/>
+            </w:pPr>
+            <w:r>
+              <w:t xml:space="preserve">2015</w:t>
+            </w:r>
+          </w:p>
+        </w:tc>
+        <w:tc>
+          <w:p>
+            <w:pPr>
+              <w:pStyle w:val="Compact"/>
+              <w:jc w:val="left"/>
+            </w:pPr>
+            <w:r>
+              <w:rPr>
+                <w:rStyle w:val="VerbatimChar"/>
+              </w:rPr>
+              <w:t xml:space="preserve">hhid</w:t>
+            </w:r>
+            <w:r>
+              <w:t xml:space="preserve"> </w:t>
+            </w:r>
+            <w:r>
+              <w:t xml:space="preserve">↔</w:t>
+            </w:r>
+            <w:r>
+              <w:t xml:space="preserve"> </w:t>
+            </w:r>
+            <w:r>
+              <w:rPr>
+                <w:rStyle w:val="VerbatimChar"/>
+              </w:rPr>
+              <w:t xml:space="preserve">hhid</w:t>
+            </w:r>
+          </w:p>
+        </w:tc>
+        <w:tc>
+          <w:p>
+            <w:pPr>
+              <w:pStyle w:val="Compact"/>
+              <w:jc w:val="left"/>
+            </w:pPr>
+            <w:r>
+              <w:rPr>
+                <w:rStyle w:val="VerbatimChar"/>
+              </w:rPr>
+              <w:t xml:space="preserve">h_xwgt_W5</w:t>
+            </w:r>
+          </w:p>
+        </w:tc>
+      </w:tr>
+      <w:tr>
+        <w:tc>
+          <w:p>
+            <w:pPr>
+              <w:pStyle w:val="Compact"/>
+              <w:jc w:val="left"/>
+            </w:pPr>
+            <w:r>
+              <w:t xml:space="preserve">7</w:t>
+            </w:r>
+          </w:p>
+        </w:tc>
+        <w:tc>
+          <w:p>
+            <w:pPr>
+              <w:pStyle w:val="Compact"/>
+              <w:jc w:val="left"/>
+            </w:pPr>
+            <w:r>
+              <w:rPr>
+                <w:rStyle w:val="VerbatimChar"/>
+              </w:rPr>
+              <w:t xml:space="preserve">Uganda/UNPS 18</w:t>
+            </w:r>
+          </w:p>
+        </w:tc>
+        <w:tc>
+          <w:p>
+            <w:pPr>
+              <w:pStyle w:val="Compact"/>
+              <w:jc w:val="left"/>
+            </w:pPr>
+            <w:r>
+              <w:t xml:space="preserve">2018</w:t>
+            </w:r>
+          </w:p>
+        </w:tc>
+        <w:tc>
+          <w:p>
+            <w:pPr>
+              <w:pStyle w:val="Compact"/>
+              <w:jc w:val="left"/>
+            </w:pPr>
+            <w:r>
+              <w:rPr>
+                <w:rStyle w:val="VerbatimChar"/>
+              </w:rPr>
+              <w:t xml:space="preserve">hhid</w:t>
+            </w:r>
+            <w:r>
+              <w:t xml:space="preserve"> </w:t>
+            </w:r>
+            <w:r>
+              <w:t xml:space="preserve">↔</w:t>
+            </w:r>
+            <w:r>
+              <w:t xml:space="preserve"> </w:t>
+            </w:r>
+            <w:r>
+              <w:rPr>
+                <w:rStyle w:val="VerbatimChar"/>
+              </w:rPr>
+              <w:t xml:space="preserve">hhid</w:t>
+            </w:r>
+            <w:r>
+              <w:t xml:space="preserve"> </w:t>
+            </w:r>
+            <w:r>
+              <w:t xml:space="preserve">(GUID)</w:t>
+            </w:r>
+          </w:p>
+        </w:tc>
+        <w:tc>
+          <w:p>
+            <w:pPr>
+              <w:pStyle w:val="Compact"/>
+              <w:jc w:val="left"/>
+            </w:pPr>
+            <w:r>
+              <w:rPr>
+                <w:rStyle w:val="VerbatimChar"/>
+              </w:rPr>
+              <w:t xml:space="preserve">wgt</w:t>
+            </w:r>
+          </w:p>
+        </w:tc>
+      </w:tr>
+      <w:tr>
+        <w:tc>
+          <w:p>
+            <w:pPr>
+              <w:pStyle w:val="Compact"/>
+              <w:jc w:val="left"/>
+            </w:pPr>
+            <w:r>
+              <w:t xml:space="preserve">8</w:t>
+            </w:r>
+          </w:p>
+        </w:tc>
+        <w:tc>
+          <w:p>
+            <w:pPr>
+              <w:pStyle w:val="Compact"/>
+              <w:jc w:val="left"/>
+            </w:pPr>
+            <w:r>
+              <w:rPr>
+                <w:rStyle w:val="VerbatimChar"/>
+              </w:rPr>
+              <w:t xml:space="preserve">Uganda/UNPS 19</w:t>
+            </w:r>
+          </w:p>
+        </w:tc>
+        <w:tc>
+          <w:p>
+            <w:pPr>
+              <w:pStyle w:val="Compact"/>
+              <w:jc w:val="left"/>
+            </w:pPr>
+            <w:r>
+              <w:t xml:space="preserve">2019</w:t>
+            </w:r>
+          </w:p>
+        </w:tc>
+        <w:tc>
+          <w:p>
+            <w:pPr>
+              <w:pStyle w:val="Compact"/>
+              <w:jc w:val="left"/>
+            </w:pPr>
+            <w:r>
+              <w:rPr>
+                <w:rStyle w:val="VerbatimChar"/>
+              </w:rPr>
+              <w:t xml:space="preserve">hhid</w:t>
+            </w:r>
+            <w:r>
+              <w:t xml:space="preserve"> </w:t>
+            </w:r>
+            <w:r>
+              <w:t xml:space="preserve">↔</w:t>
+            </w:r>
+            <w:r>
+              <w:t xml:space="preserve"> </w:t>
+            </w:r>
+            <w:r>
+              <w:rPr>
+                <w:rStyle w:val="VerbatimChar"/>
+              </w:rPr>
+              <w:t xml:space="preserve">hhid</w:t>
+            </w:r>
+            <w:r>
+              <w:t xml:space="preserve"> </w:t>
+            </w:r>
+            <w:r>
+              <w:t xml:space="preserve">(GUID)</w:t>
+            </w:r>
+          </w:p>
+        </w:tc>
+        <w:tc>
+          <w:p>
+            <w:pPr>
+              <w:pStyle w:val="Compact"/>
+              <w:jc w:val="left"/>
+            </w:pPr>
+            <w:r>
+              <w:rPr>
+                <w:rStyle w:val="VerbatimChar"/>
+              </w:rPr>
+              <w:t xml:space="preserve">wgt</w:t>
+            </w:r>
+          </w:p>
+        </w:tc>
+      </w:tr>
+    </w:tbl>
+    <w:p>
+      <w:pPr>
+        <w:pStyle w:val="BodyText"/>
+      </w:pPr>
+      <w:r>
+        <w:t xml:space="preserve">Land roster:</w:t>
+      </w:r>
+      <w:r>
+        <w:t xml:space="preserve"> </w:t>
+      </w:r>
+      <w:r>
+        <w:rPr>
+          <w:rStyle w:val="VerbatimChar"/>
+        </w:rPr>
+        <w:t xml:space="preserve">AGSEC2A</w:t>
+      </w:r>
+      <w:r>
+        <w:t xml:space="preserve"> </w:t>
+      </w:r>
+      <w:r>
+        <w:t xml:space="preserve">(owned) +</w:t>
+      </w:r>
+      <w:r>
+        <w:t xml:space="preserve"> </w:t>
+      </w:r>
+      <w:r>
+        <w:rPr>
+          <w:rStyle w:val="VerbatimChar"/>
+        </w:rPr>
+        <w:t xml:space="preserve">AGSEC2B</w:t>
+      </w:r>
+      <w:r>
+        <w:t xml:space="preserve"> </w:t>
+      </w:r>
+      <w:r>
+        <w:t xml:space="preserve">(accessed). Cover:</w:t>
+      </w:r>
+      <w:r>
+        <w:t xml:space="preserve"> </w:t>
+      </w:r>
+      <w:r>
+        <w:rPr>
+          <w:rStyle w:val="VerbatimChar"/>
+        </w:rPr>
+        <w:t xml:space="preserve">GSEC1</w:t>
+      </w:r>
+      <w:r>
+        <w:t xml:space="preserve">. Household keys and</w:t>
+      </w:r>
+      <w:r>
+        <w:t xml:space="preserve"> </w:t>
+      </w:r>
+      <w:r>
+        <w:t xml:space="preserve">their types were verified against the raw files (roster numeric ids are matched to the</w:t>
+      </w:r>
+      <w:r>
+        <w:t xml:space="preserve"> </w:t>
+      </w:r>
+      <w:r>
+        <w:t xml:space="preserve">string cover ids via</w:t>
+      </w:r>
+      <w:r>
+        <w:t xml:space="preserve"> </w:t>
+      </w:r>
+      <w:r>
+        <w:rPr>
+          <w:rStyle w:val="VerbatimChar"/>
+        </w:rPr>
+        <w:t xml:space="preserve">tostring … , format("%17.0f")</w:t>
+      </w:r>
+      <w:r>
+        <w:t xml:space="preserve">, as in the upstream pipeline).</w:t>
+      </w:r>
+    </w:p>
+    <w:p>
+      <w:pPr>
+        <w:pStyle w:val="Heading3"/>
+      </w:pPr>
+      <w:bookmarkStart w:id="67" w:name="tenure-indicators-6"/>
+      <w:r>
+        <w:t xml:space="preserve">2. Tenure indicators</w:t>
+      </w:r>
+      <w:bookmarkEnd w:id="67"/>
+    </w:p>
+    <w:tbl>
+      <w:tblPr>
+        <w:tblStyle w:val="Table"/>
+        <w:tblW w:type="pct" w:w="5000.0"/>
+        <w:tblLook w:firstRow="1"/>
+      </w:tblPr>
+      <w:tblGrid>
+        <w:gridCol w:w="1342"/>
+        <w:gridCol w:w="1073"/>
+        <w:gridCol w:w="3624"/>
+        <w:gridCol w:w="1879"/>
+      </w:tblGrid>
+      <w:tr>
+        <w:trPr>
+          <w:cnfStyle w:firstRow="1"/>
+        </w:trPr>
+        <w:tc>
+          <w:tcPr>
+            <w:tcBorders>
+              <w:bottom w:val="single"/>
+            </w:tcBorders>
+            <w:vAlign w:val="bottom"/>
+          </w:tcPr>
+          <w:p>
+            <w:pPr>
+              <w:pStyle w:val="Compact"/>
+              <w:jc w:val="left"/>
+            </w:pPr>
+            <w:r>
+              <w:t xml:space="preserve">Variable</w:t>
+            </w:r>
+          </w:p>
+        </w:tc>
+        <w:tc>
+          <w:tcPr>
+            <w:tcBorders>
+              <w:bottom w:val="single"/>
+            </w:tcBorders>
+            <w:vAlign w:val="bottom"/>
+          </w:tcPr>
+          <w:p>
+            <w:pPr>
+              <w:pStyle w:val="Compact"/>
+              <w:jc w:val="left"/>
+            </w:pPr>
+            <w:r>
+              <w:t xml:space="preserve">Module</w:t>
+            </w:r>
+          </w:p>
+        </w:tc>
+        <w:tc>
+          <w:tcPr>
+            <w:tcBorders>
+              <w:bottom w:val="single"/>
+            </w:tcBorders>
+            <w:vAlign w:val="bottom"/>
+          </w:tcPr>
+          <w:p>
+            <w:pPr>
+              <w:pStyle w:val="Compact"/>
+              <w:jc w:val="left"/>
+            </w:pPr>
+            <w:r>
+              <w:t xml:space="preserve">Source var (across waves)</w:t>
+            </w:r>
+          </w:p>
+        </w:tc>
+        <w:tc>
+          <w:tcPr>
+            <w:tcBorders>
+              <w:bottom w:val="single"/>
+            </w:tcBorders>
+            <w:vAlign w:val="bottom"/>
+          </w:tcPr>
+          <w:p>
+            <w:pPr>
+              <w:pStyle w:val="Compact"/>
+              <w:jc w:val="left"/>
+            </w:pPr>
+            <w:r>
+              <w:t xml:space="preserve">Construction</w:t>
+            </w:r>
+          </w:p>
+        </w:tc>
+      </w:tr>
+      <w:tr>
+        <w:tc>
+          <w:p>
+            <w:pPr>
+              <w:pStyle w:val="Compact"/>
+              <w:jc w:val="left"/>
+            </w:pPr>
+            <w:r>
+              <w:rPr>
+                <w:rStyle w:val="VerbatimChar"/>
+              </w:rPr>
+              <w:t xml:space="preserve">parcel_rentedin</w:t>
+            </w:r>
+          </w:p>
+        </w:tc>
+        <w:tc>
+          <w:p>
+            <w:pPr>
+              <w:pStyle w:val="Compact"/>
+              <w:jc w:val="left"/>
+            </w:pPr>
+            <w:r>
+              <w:t xml:space="preserve">2B</w:t>
+            </w:r>
+          </w:p>
+        </w:tc>
+        <w:tc>
+          <w:p>
+            <w:pPr>
+              <w:pStyle w:val="Compact"/>
+              <w:jc w:val="left"/>
+            </w:pPr>
+            <w:r>
+              <w:t xml:space="preserve">rent paid</w:t>
+            </w:r>
+            <w:r>
+              <w:t xml:space="preserve"> </w:t>
+            </w:r>
+            <w:r>
+              <w:rPr>
+                <w:rStyle w:val="VerbatimChar"/>
+              </w:rPr>
+              <w:t xml:space="preserve">A2bq9</w:t>
+            </w:r>
+            <w:r>
+              <w:t xml:space="preserve">/</w:t>
+            </w:r>
+            <w:r>
+              <w:rPr>
+                <w:rStyle w:val="VerbatimChar"/>
+              </w:rPr>
+              <w:t xml:space="preserve">a2bq9</w:t>
+            </w:r>
+            <w:r>
+              <w:t xml:space="preserve">/</w:t>
+            </w:r>
+            <w:r>
+              <w:rPr>
+                <w:rStyle w:val="VerbatimChar"/>
+              </w:rPr>
+              <w:t xml:space="preserve">a2bq09</w:t>
+            </w:r>
+          </w:p>
+        </w:tc>
+        <w:tc>
+          <w:p>
+            <w:pPr>
+              <w:pStyle w:val="Compact"/>
+              <w:jc w:val="left"/>
+            </w:pPr>
+            <w:r>
+              <w:rPr>
+                <w:rStyle w:val="VerbatimChar"/>
+              </w:rPr>
+              <w:t xml:space="preserve">&gt; 0</w:t>
+            </w:r>
+            <w:r>
+              <w:t xml:space="preserve"> </w:t>
+            </w:r>
+            <w:r>
+              <w:t xml:space="preserve">(accessed parcel paid for)</w:t>
+            </w:r>
+          </w:p>
+        </w:tc>
+      </w:tr>
+      <w:tr>
+        <w:tc>
+          <w:p>
+            <w:pPr>
+              <w:pStyle w:val="Compact"/>
+              <w:jc w:val="left"/>
+            </w:pPr>
+            <w:r>
+              <w:rPr>
+                <w:rStyle w:val="VerbatimChar"/>
+              </w:rPr>
+              <w:t xml:space="preserve">parcel_rentedin</w:t>
+            </w:r>
+          </w:p>
+        </w:tc>
+        <w:tc>
+          <w:p>
+            <w:pPr>
+              <w:pStyle w:val="Compact"/>
+              <w:jc w:val="left"/>
+            </w:pPr>
+            <w:r>
+              <w:t xml:space="preserve">2A</w:t>
+            </w:r>
+          </w:p>
+        </w:tc>
+        <w:tc>
+          <w:p>
+            <w:pPr>
+              <w:pStyle w:val="Compact"/>
+              <w:jc w:val="left"/>
+            </w:pPr>
+            <w:r>
+              <w:t xml:space="preserve">acquisition</w:t>
+            </w:r>
+            <w:r>
+              <w:t xml:space="preserve"> </w:t>
+            </w:r>
+            <w:r>
+              <w:rPr>
+                <w:rStyle w:val="VerbatimChar"/>
+              </w:rPr>
+              <w:t xml:space="preserve">A2aq8</w:t>
+            </w:r>
+            <w:r>
+              <w:t xml:space="preserve">/</w:t>
+            </w:r>
+            <w:r>
+              <w:rPr>
+                <w:rStyle w:val="VerbatimChar"/>
+              </w:rPr>
+              <w:t xml:space="preserve">a2aq8</w:t>
+            </w:r>
+            <w:r>
+              <w:t xml:space="preserve">/</w:t>
+            </w:r>
+            <w:r>
+              <w:rPr>
+                <w:rStyle w:val="VerbatimChar"/>
+              </w:rPr>
+              <w:t xml:space="preserve">s2aq8</w:t>
+            </w:r>
+          </w:p>
+        </w:tc>
+        <w:tc>
+          <w:p>
+            <w:pPr>
+              <w:pStyle w:val="Compact"/>
+              <w:jc w:val="left"/>
+            </w:pPr>
+            <w:r>
+              <w:rPr>
+                <w:rStyle w:val="VerbatimChar"/>
+              </w:rPr>
+              <w:t xml:space="preserve">== 3</w:t>
+            </w:r>
+            <w:r>
+              <w:t xml:space="preserve"> </w:t>
+            </w:r>
+            <w:r>
+              <w:t xml:space="preserve">(Leased-in)</w:t>
+            </w:r>
+          </w:p>
+        </w:tc>
+      </w:tr>
+      <w:tr>
+        <w:tc>
+          <w:p>
+            <w:pPr>
+              <w:pStyle w:val="Compact"/>
+              <w:jc w:val="left"/>
+            </w:pPr>
+            <w:r>
+              <w:rPr>
+                <w:rStyle w:val="VerbatimChar"/>
+              </w:rPr>
+              <w:t xml:space="preserve">parcel_rentedout</w:t>
+            </w:r>
+          </w:p>
+        </w:tc>
+        <w:tc>
+          <w:p>
+            <w:pPr>
+              <w:pStyle w:val="Compact"/>
+              <w:jc w:val="left"/>
+            </w:pPr>
+            <w:r>
+              <w:t xml:space="preserve">2A/2B</w:t>
+            </w:r>
+          </w:p>
+        </w:tc>
+        <w:tc>
+          <w:p>
+            <w:pPr>
+              <w:pStyle w:val="Compact"/>
+              <w:jc w:val="left"/>
+            </w:pPr>
+            <w:r>
+              <w:t xml:space="preserve">per-season primary use</w:t>
+            </w:r>
+          </w:p>
+        </w:tc>
+        <w:tc>
+          <w:p>
+            <w:pPr>
+              <w:pStyle w:val="Compact"/>
+              <w:jc w:val="left"/>
+            </w:pPr>
+            <w:r>
+              <w:rPr>
+                <w:rStyle w:val="VerbatimChar"/>
+              </w:rPr>
+              <w:t xml:space="preserve">== 3</w:t>
+            </w:r>
+            <w:r>
+              <w:t xml:space="preserve"> </w:t>
+            </w:r>
+            <w:r>
+              <w:t xml:space="preserve">(</w:t>
+            </w:r>
+            <w:r>
+              <w:t xml:space="preserve">“</w:t>
+            </w:r>
+            <w:r>
+              <w:t xml:space="preserve">Rented-out</w:t>
+            </w:r>
+            <w:r>
+              <w:t xml:space="preserve">”</w:t>
+            </w:r>
+            <w:r>
+              <w:t xml:space="preserve"> </w:t>
+            </w:r>
+            <w:r>
+              <w:t xml:space="preserve">2A /</w:t>
+            </w:r>
+            <w:r>
+              <w:t xml:space="preserve"> </w:t>
+            </w:r>
+            <w:r>
+              <w:t xml:space="preserve">“</w:t>
+            </w:r>
+            <w:r>
+              <w:t xml:space="preserve">Sub-contracted out</w:t>
+            </w:r>
+            <w:r>
+              <w:t xml:space="preserve">”</w:t>
+            </w:r>
+            <w:r>
+              <w:t xml:space="preserve"> </w:t>
+            </w:r>
+            <w:r>
+              <w:t xml:space="preserve">2B)</w:t>
+            </w:r>
+          </w:p>
+        </w:tc>
+      </w:tr>
+      <w:tr>
+        <w:tc>
+          <w:p>
+            <w:pPr>
+              <w:pStyle w:val="Compact"/>
+              <w:jc w:val="left"/>
+            </w:pPr>
+            <w:r>
+              <w:rPr>
+                <w:rStyle w:val="VerbatimChar"/>
+              </w:rPr>
+              <w:t xml:space="preserve">parcel_purchased</w:t>
+            </w:r>
+          </w:p>
+        </w:tc>
+        <w:tc>
+          <w:p>
+            <w:pPr>
+              <w:pStyle w:val="Compact"/>
+              <w:jc w:val="left"/>
+            </w:pPr>
+            <w:r>
+              <w:t xml:space="preserve">2A</w:t>
+            </w:r>
+          </w:p>
+        </w:tc>
+        <w:tc>
+          <w:p>
+            <w:pPr>
+              <w:pStyle w:val="Compact"/>
+              <w:jc w:val="left"/>
+            </w:pPr>
+            <w:r>
+              <w:t xml:space="preserve">acquisition</w:t>
+            </w:r>
+            <w:r>
+              <w:t xml:space="preserve"> </w:t>
+            </w:r>
+            <w:r>
+              <w:rPr>
+                <w:rStyle w:val="VerbatimChar"/>
+              </w:rPr>
+              <w:t xml:space="preserve">A2aq8</w:t>
+            </w:r>
+            <w:r>
+              <w:t xml:space="preserve">/</w:t>
+            </w:r>
+            <w:r>
+              <w:rPr>
+                <w:rStyle w:val="VerbatimChar"/>
+              </w:rPr>
+              <w:t xml:space="preserve">a2aq8</w:t>
+            </w:r>
+            <w:r>
+              <w:t xml:space="preserve">/</w:t>
+            </w:r>
+            <w:r>
+              <w:rPr>
+                <w:rStyle w:val="VerbatimChar"/>
+              </w:rPr>
+              <w:t xml:space="preserve">s2aq8</w:t>
+            </w:r>
+          </w:p>
+        </w:tc>
+        <w:tc>
+          <w:p>
+            <w:pPr>
+              <w:pStyle w:val="Compact"/>
+              <w:jc w:val="left"/>
+            </w:pPr>
+            <w:r>
+              <w:rPr>
+                <w:rStyle w:val="VerbatimChar"/>
+              </w:rPr>
+              <w:t xml:space="preserve">== 1</w:t>
+            </w:r>
+            <w:r>
+              <w:t xml:space="preserve"> </w:t>
+            </w:r>
+            <w:r>
+              <w:t xml:space="preserve">Purchased (</w:t>
+            </w:r>
+            <w:r>
+              <w:rPr>
+                <w:rStyle w:val="VerbatimChar"/>
+              </w:rPr>
+              <w:t xml:space="preserve">.</w:t>
+            </w:r>
+            <w:r>
+              <w:t xml:space="preserve"> </w:t>
+            </w:r>
+            <w:r>
+              <w:t xml:space="preserve">in 2018)</w:t>
+            </w:r>
+          </w:p>
+        </w:tc>
+      </w:tr>
+      <w:tr>
+        <w:tc>
+          <w:p>
+            <w:pPr>
+              <w:pStyle w:val="Compact"/>
+              <w:jc w:val="left"/>
+            </w:pPr>
+            <w:r>
+              <w:rPr>
+                <w:rStyle w:val="VerbatimChar"/>
+              </w:rPr>
+              <w:t xml:space="preserve">parcel_certificate</w:t>
+            </w:r>
+          </w:p>
+        </w:tc>
+        <w:tc>
+          <w:p>
+            <w:pPr>
+              <w:pStyle w:val="Compact"/>
+              <w:jc w:val="left"/>
+            </w:pPr>
+            <w:r>
+              <w:t xml:space="preserve">2A</w:t>
+            </w:r>
+          </w:p>
+        </w:tc>
+        <w:tc>
+          <w:p>
+            <w:pPr>
+              <w:pStyle w:val="Compact"/>
+              <w:jc w:val="left"/>
+            </w:pPr>
+            <w:r>
+              <w:rPr>
+                <w:rStyle w:val="VerbatimChar"/>
+              </w:rPr>
+              <w:t xml:space="preserve">A2aq25</w:t>
+            </w:r>
+            <w:r>
+              <w:t xml:space="preserve">(09/10) /</w:t>
+            </w:r>
+            <w:r>
+              <w:t xml:space="preserve"> </w:t>
+            </w:r>
+            <w:r>
+              <w:rPr>
+                <w:rStyle w:val="VerbatimChar"/>
+              </w:rPr>
+              <w:t xml:space="preserve">a2aq23</w:t>
+            </w:r>
+            <w:r>
+              <w:t xml:space="preserve">(11-15) /</w:t>
+            </w:r>
+            <w:r>
+              <w:t xml:space="preserve"> </w:t>
+            </w:r>
+            <w:r>
+              <w:rPr>
+                <w:rStyle w:val="VerbatimChar"/>
+              </w:rPr>
+              <w:t xml:space="preserve">s2aq23</w:t>
+            </w:r>
+            <w:r>
+              <w:t xml:space="preserve">(18/19)</w:t>
+            </w:r>
+          </w:p>
+        </w:tc>
+        <w:tc>
+          <w:p>
+            <w:pPr>
+              <w:pStyle w:val="Compact"/>
+              <w:jc w:val="left"/>
+            </w:pPr>
+            <w:r>
+              <w:rPr>
+                <w:rStyle w:val="VerbatimChar"/>
+              </w:rPr>
+              <w:t xml:space="preserve">inlist(1,2,3)</w:t>
+            </w:r>
+            <w:r>
+              <w:t xml:space="preserve">=1;</w:t>
+            </w:r>
+            <w:r>
+              <w:t xml:space="preserve"> </w:t>
+            </w:r>
+            <w:r>
+              <w:rPr>
+                <w:rStyle w:val="VerbatimChar"/>
+              </w:rPr>
+              <w:t xml:space="preserve">4</w:t>
+            </w:r>
+            <w:r>
+              <w:t xml:space="preserve">=0; accessed parcels=0</w:t>
+            </w:r>
+          </w:p>
+        </w:tc>
+      </w:tr>
+    </w:tbl>
+    <w:p>
+      <w:pPr>
+        <w:pStyle w:val="BodyText"/>
+      </w:pPr>
+      <w:r>
+        <w:t xml:space="preserve">Primary-use</w:t>
+      </w:r>
+      <w:r>
+        <w:t xml:space="preserve"> </w:t>
+      </w:r>
+      <w:r>
+        <w:rPr>
+          <w:b/>
+        </w:rPr>
+        <w:t xml:space="preserve">season-1</w:t>
+      </w:r>
+      <w:r>
+        <w:t xml:space="preserve"> </w:t>
+      </w:r>
+      <w:r>
+        <w:t xml:space="preserve">variable by wave:</w:t>
+      </w:r>
+      <w:r>
+        <w:t xml:space="preserve"> </w:t>
+      </w:r>
+      <w:r>
+        <w:rPr>
+          <w:rStyle w:val="VerbatimChar"/>
+        </w:rPr>
+        <w:t xml:space="preserve">A2aq13a</w:t>
+      </w:r>
+      <w:r>
+        <w:t xml:space="preserve">(09) ·</w:t>
+      </w:r>
+      <w:r>
+        <w:t xml:space="preserve"> </w:t>
+      </w:r>
+      <w:r>
+        <w:rPr>
+          <w:rStyle w:val="VerbatimChar"/>
+        </w:rPr>
+        <w:t xml:space="preserve">a2aq13a</w:t>
+      </w:r>
+      <w:r>
+        <w:t xml:space="preserve">(10) ·</w:t>
+      </w:r>
+      <w:r>
+        <w:t xml:space="preserve"> </w:t>
+      </w:r>
+      <w:r>
+        <w:rPr>
+          <w:rStyle w:val="VerbatimChar"/>
+        </w:rPr>
+        <w:t xml:space="preserve">a2aq11a</w:t>
+      </w:r>
+      <w:r>
+        <w:t xml:space="preserve">(11,13) ·</w:t>
+      </w:r>
+      <w:r>
+        <w:t xml:space="preserve"> </w:t>
+      </w:r>
+      <w:r>
+        <w:rPr>
+          <w:rStyle w:val="VerbatimChar"/>
+        </w:rPr>
+        <w:t xml:space="preserve">a2aq11b</w:t>
+      </w:r>
+      <w:r>
+        <w:t xml:space="preserve">(15) ·</w:t>
+      </w:r>
+      <w:r>
+        <w:t xml:space="preserve"> </w:t>
+      </w:r>
+      <w:r>
+        <w:rPr>
+          <w:rStyle w:val="VerbatimChar"/>
+        </w:rPr>
+        <w:t xml:space="preserve">s2aq11b</w:t>
+      </w:r>
+      <w:r>
+        <w:t xml:space="preserve">(18,19) — swapped from 2015. The 2B analogues are</w:t>
+      </w:r>
+      <w:r>
+        <w:t xml:space="preserve"> </w:t>
+      </w:r>
+      <w:r>
+        <w:rPr>
+          <w:rStyle w:val="VerbatimChar"/>
+        </w:rPr>
+        <w:t xml:space="preserve">A2bq15*</w:t>
+      </w:r>
+      <w:r>
+        <w:t xml:space="preserve">/</w:t>
+      </w:r>
+      <w:r>
+        <w:rPr>
+          <w:rStyle w:val="VerbatimChar"/>
+        </w:rPr>
+        <w:t xml:space="preserve">a2bq15*</w:t>
+      </w:r>
+      <w:r>
+        <w:t xml:space="preserve">/</w:t>
+      </w:r>
+      <w:r>
+        <w:rPr>
+          <w:rStyle w:val="VerbatimChar"/>
+        </w:rPr>
+        <w:t xml:space="preserve">a2bq12*</w:t>
+      </w:r>
+      <w:r>
+        <w:t xml:space="preserve">.</w:t>
+      </w:r>
+    </w:p>
+    <w:p>
+      <w:pPr>
+        <w:pStyle w:val="Heading3"/>
+      </w:pPr>
+      <w:bookmarkStart w:id="68" w:name="parcel-area-parcel_area_ha-6"/>
+      <w:r>
+        <w:t xml:space="preserve">3. Parcel area (</w:t>
+      </w:r>
+      <w:r>
+        <w:rPr>
+          <w:rStyle w:val="VerbatimChar"/>
+        </w:rPr>
+        <w:t xml:space="preserve">parcel_area_ha</w:t>
+      </w:r>
+      <w:r>
+        <w:t xml:space="preserve">)</w:t>
+      </w:r>
+      <w:bookmarkEnd w:id="68"/>
+    </w:p>
+    <w:p>
+      <w:pPr>
+        <w:pStyle w:val="FirstParagraph"/>
+      </w:pPr>
+      <w:r>
+        <w:t xml:space="preserve">GPS where measured, else self-reported (deterministic; both in</w:t>
+      </w:r>
+      <w:r>
+        <w:t xml:space="preserve"> </w:t>
+      </w:r>
+      <w:r>
+        <w:rPr>
+          <w:b/>
+        </w:rPr>
+        <w:t xml:space="preserve">acres × 0.404686 → ha</w:t>
+      </w:r>
+      <w:r>
+        <w:t xml:space="preserve">).</w:t>
+      </w:r>
+      <w:r>
+        <w:t xml:space="preserve"> </w:t>
+      </w:r>
+      <w:r>
+        <w:t xml:space="preserve">GPS =</w:t>
+      </w:r>
+      <w:r>
+        <w:t xml:space="preserve"> </w:t>
+      </w:r>
+      <w:r>
+        <w:rPr>
+          <w:rStyle w:val="VerbatimChar"/>
+        </w:rPr>
+        <w:t xml:space="preserve">A2aq4</w:t>
+      </w:r>
+      <w:r>
+        <w:t xml:space="preserve">/</w:t>
+      </w:r>
+      <w:r>
+        <w:rPr>
+          <w:rStyle w:val="VerbatimChar"/>
+        </w:rPr>
+        <w:t xml:space="preserve">a2aq4</w:t>
+      </w:r>
+      <w:r>
+        <w:t xml:space="preserve">/</w:t>
+      </w:r>
+      <w:r>
+        <w:rPr>
+          <w:rStyle w:val="VerbatimChar"/>
+        </w:rPr>
+        <w:t xml:space="preserve">s2aq4</w:t>
+      </w:r>
+      <w:r>
+        <w:t xml:space="preserve"> </w:t>
+      </w:r>
+      <w:r>
+        <w:t xml:space="preserve">(2A),</w:t>
+      </w:r>
+      <w:r>
+        <w:t xml:space="preserve"> </w:t>
+      </w:r>
+      <w:r>
+        <w:rPr>
+          <w:rStyle w:val="VerbatimChar"/>
+        </w:rPr>
+        <w:t xml:space="preserve">A2bq4</w:t>
+      </w:r>
+      <w:r>
+        <w:t xml:space="preserve">/</w:t>
+      </w:r>
+      <w:r>
+        <w:rPr>
+          <w:rStyle w:val="VerbatimChar"/>
+        </w:rPr>
+        <w:t xml:space="preserve">a2bq4</w:t>
+      </w:r>
+      <w:r>
+        <w:t xml:space="preserve">/</w:t>
+      </w:r>
+      <w:r>
+        <w:rPr>
+          <w:rStyle w:val="VerbatimChar"/>
+        </w:rPr>
+        <w:t xml:space="preserve">s2aq04</w:t>
+      </w:r>
+      <w:r>
+        <w:t xml:space="preserve"> </w:t>
+      </w:r>
+      <w:r>
+        <w:t xml:space="preserve">(2B); self-reported = the</w:t>
+      </w:r>
+      <w:r>
+        <w:t xml:space="preserve"> </w:t>
+      </w:r>
+      <w:r>
+        <w:t xml:space="preserve">matching</w:t>
+      </w:r>
+      <w:r>
+        <w:t xml:space="preserve"> </w:t>
+      </w:r>
+      <w:r>
+        <w:rPr>
+          <w:rStyle w:val="VerbatimChar"/>
+        </w:rPr>
+        <w:t xml:space="preserve">…5</w:t>
+      </w:r>
+      <w:r>
+        <w:t xml:space="preserve">/</w:t>
+      </w:r>
+      <w:r>
+        <w:rPr>
+          <w:rStyle w:val="VerbatimChar"/>
+        </w:rPr>
+        <w:t xml:space="preserve">…05</w:t>
+      </w:r>
+      <w:r>
+        <w:t xml:space="preserve"> </w:t>
+      </w:r>
+      <w:r>
+        <w:t xml:space="preserve">variable. Top-coded at</w:t>
+      </w:r>
+      <w:r>
+        <w:t xml:space="preserve"> </w:t>
+      </w:r>
+      <w:r>
+        <w:rPr>
+          <w:rStyle w:val="VerbatimChar"/>
+        </w:rPr>
+        <w:t xml:space="preserve">${area_max}</w:t>
+      </w:r>
+      <w:r>
+        <w:t xml:space="preserve"> </w:t>
+      </w:r>
+      <w:r>
+        <w:t xml:space="preserve">ha.</w:t>
+      </w:r>
+    </w:p>
+    <w:p>
+      <w:pPr>
+        <w:pStyle w:val="Heading3"/>
+      </w:pPr>
+      <w:bookmarkStart w:id="69" w:name="design-variables-identifiers-6"/>
+      <w:r>
+        <w:t xml:space="preserve">4. Design variables &amp; identifiers</w:t>
+      </w:r>
+      <w:bookmarkEnd w:id="69"/>
+    </w:p>
+    <w:tbl>
+      <w:tblPr>
+        <w:tblStyle w:val="Table"/>
+        <w:tblW w:type="pct" w:w="5000.0"/>
+        <w:tblLook w:firstRow="1"/>
+      </w:tblPr>
+      <w:tblGrid>
+        <w:gridCol w:w="2475"/>
+        <w:gridCol w:w="1980"/>
+        <w:gridCol w:w="3465"/>
+      </w:tblGrid>
+      <w:tr>
+        <w:trPr>
+          <w:cnfStyle w:firstRow="1"/>
+        </w:trPr>
+        <w:tc>
+          <w:tcPr>
+            <w:tcBorders>
+              <w:bottom w:val="single"/>
+            </w:tcBorders>
+            <w:vAlign w:val="bottom"/>
+          </w:tcPr>
+          <w:p>
+            <w:pPr>
+              <w:pStyle w:val="Compact"/>
+              <w:jc w:val="left"/>
+            </w:pPr>
+            <w:r>
+              <w:t xml:space="preserve">Variable</w:t>
+            </w:r>
+          </w:p>
+        </w:tc>
+        <w:tc>
+          <w:tcPr>
+            <w:tcBorders>
+              <w:bottom w:val="single"/>
+            </w:tcBorders>
+            <w:vAlign w:val="bottom"/>
+          </w:tcPr>
+          <w:p>
+            <w:pPr>
+              <w:pStyle w:val="Compact"/>
+              <w:jc w:val="left"/>
+            </w:pPr>
+            <w:r>
+              <w:t xml:space="preserve">Source</w:t>
+            </w:r>
+          </w:p>
+        </w:tc>
+        <w:tc>
+          <w:tcPr>
+            <w:tcBorders>
+              <w:bottom w:val="single"/>
+            </w:tcBorders>
+            <w:vAlign w:val="bottom"/>
+          </w:tcPr>
+          <w:p>
+            <w:pPr>
+              <w:pStyle w:val="Compact"/>
+              <w:jc w:val="left"/>
+            </w:pPr>
+            <w:r>
+              <w:t xml:space="preserve">Construction</w:t>
+            </w:r>
+          </w:p>
+        </w:tc>
+      </w:tr>
+      <w:tr>
+        <w:tc>
+          <w:p>
+            <w:pPr>
+              <w:pStyle w:val="Compact"/>
+              <w:jc w:val="left"/>
+            </w:pPr>
+            <w:r>
+              <w:rPr>
+                <w:rStyle w:val="VerbatimChar"/>
+              </w:rPr>
+              <w:t xml:space="preserve">weight</w:t>
+            </w:r>
+          </w:p>
+        </w:tc>
+        <w:tc>
+          <w:p>
+            <w:pPr>
+              <w:pStyle w:val="Compact"/>
+              <w:jc w:val="left"/>
+            </w:pPr>
+            <w:r>
+              <w:t xml:space="preserve">cover</w:t>
+            </w:r>
+            <w:r>
+              <w:t xml:space="preserve"> </w:t>
+            </w:r>
+            <w:r>
+              <w:rPr>
+                <w:rStyle w:val="VerbatimChar"/>
+              </w:rPr>
+              <w:t xml:space="preserve">GSEC1</w:t>
+            </w:r>
+          </w:p>
+        </w:tc>
+        <w:tc>
+          <w:p>
+            <w:pPr>
+              <w:pStyle w:val="Compact"/>
+              <w:jc w:val="left"/>
+            </w:pPr>
+            <w:r>
+              <w:t xml:space="preserve">cross-sectional HH weight (see wave key)</w:t>
+            </w:r>
+          </w:p>
+        </w:tc>
+      </w:tr>
+      <w:tr>
+        <w:tc>
+          <w:p>
+            <w:pPr>
+              <w:pStyle w:val="Compact"/>
+              <w:jc w:val="left"/>
+            </w:pPr>
+            <w:r>
+              <w:rPr>
+                <w:rStyle w:val="VerbatimChar"/>
+              </w:rPr>
+              <w:t xml:space="preserve">strataid</w:t>
+            </w:r>
+          </w:p>
+        </w:tc>
+        <w:tc>
+          <w:p>
+            <w:pPr>
+              <w:pStyle w:val="Compact"/>
+              <w:jc w:val="left"/>
+            </w:pPr>
+            <w:r>
+              <w:t xml:space="preserve">cover</w:t>
+            </w:r>
+          </w:p>
+        </w:tc>
+        <w:tc>
+          <w:p>
+            <w:pPr>
+              <w:pStyle w:val="Compact"/>
+              <w:jc w:val="left"/>
+            </w:pPr>
+            <w:r>
+              <w:rPr>
+                <w:rStyle w:val="VerbatimChar"/>
+              </w:rPr>
+              <w:t xml:space="preserve">group()</w:t>
+            </w:r>
+            <w:r>
+              <w:t xml:space="preserve"> </w:t>
+            </w:r>
+            <w:r>
+              <w:t xml:space="preserve">of</w:t>
+            </w:r>
+            <w:r>
+              <w:t xml:space="preserve"> </w:t>
+            </w:r>
+            <w:r>
+              <w:rPr>
+                <w:rStyle w:val="VerbatimChar"/>
+              </w:rPr>
+              <w:t xml:space="preserve">stratum</w:t>
+            </w:r>
+            <w:r>
+              <w:t xml:space="preserve"> </w:t>
+            </w:r>
+            <w:r>
+              <w:t xml:space="preserve">(09/10) /</w:t>
+            </w:r>
+            <w:r>
+              <w:t xml:space="preserve"> </w:t>
+            </w:r>
+            <w:r>
+              <w:rPr>
+                <w:rStyle w:val="VerbatimChar"/>
+              </w:rPr>
+              <w:t xml:space="preserve">sregion</w:t>
+            </w:r>
+            <w:r>
+              <w:t xml:space="preserve"> </w:t>
+            </w:r>
+            <w:r>
+              <w:t xml:space="preserve">(11-15) /</w:t>
+            </w:r>
+            <w:r>
+              <w:t xml:space="preserve"> </w:t>
+            </w:r>
+            <w:r>
+              <w:rPr>
+                <w:rStyle w:val="VerbatimChar"/>
+              </w:rPr>
+              <w:t xml:space="preserve">region</w:t>
+            </w:r>
+            <w:r>
+              <w:t xml:space="preserve"> </w:t>
+            </w:r>
+            <w:r>
+              <w:t xml:space="preserve">(18/19)</w:t>
+            </w:r>
+          </w:p>
+        </w:tc>
+      </w:tr>
+      <w:tr>
+        <w:tc>
+          <w:p>
+            <w:pPr>
+              <w:pStyle w:val="Compact"/>
+              <w:jc w:val="left"/>
+            </w:pPr>
+            <w:r>
+              <w:rPr>
+                <w:rStyle w:val="VerbatimChar"/>
+              </w:rPr>
+              <w:t xml:space="preserve">ea_id</w:t>
+            </w:r>
+          </w:p>
+        </w:tc>
+        <w:tc>
+          <w:p>
+            <w:pPr>
+              <w:pStyle w:val="Compact"/>
+              <w:jc w:val="left"/>
+            </w:pPr>
+            <w:r>
+              <w:t xml:space="preserve">cover</w:t>
+            </w:r>
+          </w:p>
+        </w:tc>
+        <w:tc>
+          <w:p>
+            <w:pPr>
+              <w:pStyle w:val="Compact"/>
+              <w:jc w:val="left"/>
+            </w:pPr>
+            <w:r>
+              <w:rPr>
+                <w:rStyle w:val="VerbatimChar"/>
+              </w:rPr>
+              <w:t xml:space="preserve">comm</w:t>
+            </w:r>
+            <w:r>
+              <w:t xml:space="preserve"> </w:t>
+            </w:r>
+            <w:r>
+              <w:t xml:space="preserve">(09-11) /</w:t>
+            </w:r>
+            <w:r>
+              <w:t xml:space="preserve"> </w:t>
+            </w:r>
+            <w:r>
+              <w:rPr>
+                <w:rStyle w:val="VerbatimChar"/>
+              </w:rPr>
+              <w:t xml:space="preserve">ea</w:t>
+            </w:r>
+            <w:r>
+              <w:t xml:space="preserve"> </w:t>
+            </w:r>
+            <w:r>
+              <w:t xml:space="preserve">(13/15);</w:t>
+            </w:r>
+            <w:r>
+              <w:t xml:space="preserve"> </w:t>
+            </w:r>
+            <w:r>
+              <w:rPr>
+                <w:b/>
+              </w:rPr>
+              <w:t xml:space="preserve">blank in 2018/19</w:t>
+            </w:r>
+            <w:r>
+              <w:t xml:space="preserve"> </w:t>
+            </w:r>
+            <w:r>
+              <w:t xml:space="preserve">(no EA on the cover)</w:t>
+            </w:r>
+          </w:p>
+        </w:tc>
+      </w:tr>
+      <w:tr>
+        <w:tc>
+          <w:p>
+            <w:pPr>
+              <w:pStyle w:val="Compact"/>
+              <w:jc w:val="left"/>
+            </w:pPr>
+            <w:r>
+              <w:rPr>
+                <w:rStyle w:val="VerbatimChar"/>
+              </w:rPr>
+              <w:t xml:space="preserve">parcel_id</w:t>
+            </w:r>
+          </w:p>
+        </w:tc>
+        <w:tc>
+          <w:p>
+            <w:pPr>
+              <w:pStyle w:val="Compact"/>
+              <w:jc w:val="left"/>
+            </w:pPr>
+            <w:r>
+              <w:t xml:space="preserve">roster</w:t>
+            </w:r>
+          </w:p>
+        </w:tc>
+        <w:tc>
+          <w:p>
+            <w:pPr>
+              <w:pStyle w:val="Compact"/>
+              <w:jc w:val="left"/>
+            </w:pPr>
+            <w:r>
+              <w:rPr>
+                <w:rStyle w:val="VerbatimChar"/>
+              </w:rPr>
+              <w:t xml:space="preserve">hh_id + "-A-"/"-B-" + parcelID</w:t>
+            </w:r>
+            <w:r>
+              <w:t xml:space="preserve"> </w:t>
+            </w:r>
+            <w:r>
+              <w:t xml:space="preserve">(origin-tagged, globally unique)</w:t>
+            </w:r>
+          </w:p>
+        </w:tc>
+      </w:tr>
+      <w:tr>
+        <w:tc>
+          <w:p>
+            <w:pPr>
+              <w:pStyle w:val="Compact"/>
+              <w:jc w:val="left"/>
+            </w:pPr>
+            <w:r>
+              <w:rPr>
+                <w:rStyle w:val="VerbatimChar"/>
+              </w:rPr>
+              <w:t xml:space="preserve">year</w:t>
+            </w:r>
+          </w:p>
+        </w:tc>
+        <w:tc>
+          <w:p>
+            <w:pPr>
+              <w:pStyle w:val="Compact"/>
+              <w:jc w:val="left"/>
+            </w:pPr>
+            <w:r>
+              <w:t xml:space="preserve">—</w:t>
+            </w:r>
+          </w:p>
+        </w:tc>
+        <w:tc>
+          <w:p>
+            <w:pPr>
+              <w:pStyle w:val="Compact"/>
+              <w:jc w:val="left"/>
+            </w:pPr>
+            <w:r>
+              <w:t xml:space="preserve">2009 / 2010 / 2011 / 2013 / 2015 / 2018 / 2019</w:t>
+            </w:r>
+          </w:p>
+        </w:tc>
+      </w:tr>
+    </w:tbl>
+    <w:p>
+      <w:pPr>
+        <w:pStyle w:val="Heading3"/>
+      </w:pPr>
+      <w:bookmarkStart w:id="70" w:name="X41b3da375b96f03c8be77259d3c225da7481aa7"/>
+      <w:r>
+        <w:t xml:space="preserve">5. Value labels of key source variables (verified against the raw rosters)</w:t>
+      </w:r>
+      <w:bookmarkEnd w:id="70"/>
+    </w:p>
+    <w:p>
+      <w:pPr>
+        <w:pStyle w:val="FirstParagraph"/>
+      </w:pPr>
+      <w:r>
+        <w:rPr>
+          <w:b/>
+        </w:rPr>
+        <w:t xml:space="preserve">Acquisition (2A)</w:t>
+      </w:r>
+      <w:r>
+        <w:t xml:space="preserve"> </w:t>
+      </w:r>
+      <w:r>
+        <w:rPr>
+          <w:rStyle w:val="VerbatimChar"/>
+        </w:rPr>
+        <w:t xml:space="preserve">…aq8</w:t>
+      </w:r>
+      <w:r>
+        <w:t xml:space="preserve">:</w:t>
+      </w:r>
+      <w:r>
+        <w:t xml:space="preserve"> </w:t>
+      </w:r>
+      <w:r>
+        <w:rPr>
+          <w:b/>
+        </w:rPr>
+        <w:t xml:space="preserve">1 Purchased</w:t>
+      </w:r>
+      <w:r>
+        <w:t xml:space="preserve"> </w:t>
+      </w:r>
+      <w:r>
+        <w:t xml:space="preserve">· 2 inherited / received as gift ·</w:t>
+      </w:r>
+      <w:r>
+        <w:t xml:space="preserve"> </w:t>
+      </w:r>
+      <w:r>
+        <w:rPr>
+          <w:b/>
+        </w:rPr>
+        <w:t xml:space="preserve">3 Leased-in</w:t>
+      </w:r>
+      <w:r>
+        <w:t xml:space="preserve"> </w:t>
+      </w:r>
+      <w:r>
+        <w:t xml:space="preserve">·</w:t>
+      </w:r>
+      <w:r>
+        <w:t xml:space="preserve"> </w:t>
+      </w:r>
+      <w:r>
+        <w:t xml:space="preserve">4 just walked in (cleared) · 5 don’t know · 6 other (2018/19 add 7 given by gov / authority ·</w:t>
+      </w:r>
+      <w:r>
+        <w:t xml:space="preserve"> </w:t>
+      </w:r>
+      <w:r>
+        <w:t xml:space="preserve">8 agreement with owner · 9 without agreement · 96 other).</w:t>
+      </w:r>
+      <w:r>
+        <w:t xml:space="preserve"> </w:t>
+      </w:r>
+      <w:r>
+        <w:rPr>
+          <w:i/>
+        </w:rPr>
+        <w:t xml:space="preserve">(2018: entirely missing.)</w:t>
+      </w:r>
+    </w:p>
+    <w:p>
+      <w:pPr>
+        <w:pStyle w:val="BodyText"/>
+      </w:pPr>
+      <w:r>
+        <w:rPr>
+          <w:b/>
+        </w:rPr>
+        <w:t xml:space="preserve">Certificate / title (2A)</w:t>
+      </w:r>
+      <w:r>
+        <w:t xml:space="preserve"> </w:t>
+      </w:r>
+      <w:r>
+        <w:rPr>
+          <w:rStyle w:val="VerbatimChar"/>
+        </w:rPr>
+        <w:t xml:space="preserve">…aq25</w:t>
+      </w:r>
+      <w:r>
+        <w:t xml:space="preserve">/</w:t>
+      </w:r>
+      <w:r>
+        <w:rPr>
+          <w:rStyle w:val="VerbatimChar"/>
+        </w:rPr>
+        <w:t xml:space="preserve">…aq23</w:t>
+      </w:r>
+      <w:r>
+        <w:t xml:space="preserve">/</w:t>
+      </w:r>
+      <w:r>
+        <w:rPr>
+          <w:rStyle w:val="VerbatimChar"/>
+        </w:rPr>
+        <w:t xml:space="preserve">s2aq23</w:t>
+      </w:r>
+      <w:r>
+        <w:t xml:space="preserve">:</w:t>
+      </w:r>
+      <w:r>
+        <w:t xml:space="preserve"> </w:t>
+      </w:r>
+      <w:r>
+        <w:rPr>
+          <w:b/>
+        </w:rPr>
+        <w:t xml:space="preserve">1 certificate of title</w:t>
+      </w:r>
+      <w:r>
+        <w:t xml:space="preserve"> </w:t>
+      </w:r>
+      <w:r>
+        <w:t xml:space="preserve">·</w:t>
+      </w:r>
+      <w:r>
+        <w:t xml:space="preserve"> </w:t>
+      </w:r>
+      <w:r>
+        <w:rPr>
+          <w:b/>
+        </w:rPr>
+        <w:t xml:space="preserve">2 certificate of customary ownership</w:t>
+      </w:r>
+      <w:r>
+        <w:t xml:space="preserve"> </w:t>
+      </w:r>
+      <w:r>
+        <w:t xml:space="preserve">·</w:t>
+      </w:r>
+      <w:r>
+        <w:t xml:space="preserve"> </w:t>
+      </w:r>
+      <w:r>
+        <w:rPr>
+          <w:b/>
+        </w:rPr>
+        <w:t xml:space="preserve">3 certificate of occupancy</w:t>
+      </w:r>
+      <w:r>
+        <w:t xml:space="preserve"> </w:t>
+      </w:r>
+      <w:r>
+        <w:t xml:space="preserve">· 4 no document.</w:t>
+      </w:r>
+    </w:p>
+    <w:p>
+      <w:pPr>
+        <w:pStyle w:val="BodyText"/>
+      </w:pPr>
+      <w:r>
+        <w:rPr>
+          <w:b/>
+        </w:rPr>
+        <w:t xml:space="preserve">Primary use of parcel</w:t>
+      </w:r>
+      <w:r>
+        <w:t xml:space="preserve"> </w:t>
+      </w:r>
+      <w:r>
+        <w:t xml:space="preserve">(per season): 1 own-cultivated annual · 2 own-cultivated perennial ·</w:t>
+      </w:r>
+      <w:r>
+        <w:t xml:space="preserve"> </w:t>
+      </w:r>
+      <w:r>
+        <w:rPr>
+          <w:b/>
+        </w:rPr>
+        <w:t xml:space="preserve">3 Rented-out</w:t>
+      </w:r>
+      <w:r>
+        <w:t xml:space="preserve"> </w:t>
+      </w:r>
+      <w:r>
+        <w:t xml:space="preserve">(2A) /</w:t>
+      </w:r>
+      <w:r>
+        <w:t xml:space="preserve"> </w:t>
+      </w:r>
+      <w:r>
+        <w:rPr>
+          <w:b/>
+        </w:rPr>
+        <w:t xml:space="preserve">3 Sub-contracted out</w:t>
+      </w:r>
+      <w:r>
+        <w:t xml:space="preserve"> </w:t>
+      </w:r>
+      <w:r>
+        <w:t xml:space="preserve">(2B) · 4 cultivated by mailo tenant (2A) ·</w:t>
+      </w:r>
+      <w:r>
+        <w:t xml:space="preserve"> </w:t>
+      </w:r>
+      <w:r>
+        <w:t xml:space="preserve">5 fallow · 6 pasture / grazing · 7 woodlot / forest · 96 other.</w:t>
+      </w:r>
+    </w:p>
+    <w:p>
+      <w:pPr>
+        <w:pStyle w:val="BodyText"/>
+      </w:pPr>
+      <w:r>
+        <w:rPr>
+          <w:b/>
+        </w:rPr>
+        <w:t xml:space="preserve">Tenure system</w:t>
+      </w:r>
+      <w:r>
+        <w:t xml:space="preserve"> </w:t>
+      </w:r>
+      <w:r>
+        <w:rPr>
+          <w:rStyle w:val="VerbatimChar"/>
+        </w:rPr>
+        <w:t xml:space="preserve">…aq7</w:t>
+      </w:r>
+      <w:r>
+        <w:t xml:space="preserve">: 1 freehold · 2 leasehold · 3 mailo · 4 customary · 6 other.</w:t>
+      </w:r>
+      <w:r>
+        <w:t xml:space="preserve"> </w:t>
+      </w:r>
+      <w:r>
+        <w:rPr>
+          <w:i/>
+        </w:rPr>
+        <w:t xml:space="preserve">(Recorded but not used directly; rented-in keys off rent-paid / leased-in acquisition.)</w:t>
+      </w:r>
+    </w:p>
+    <w:p>
+      <w:pPr>
+        <w:pStyle w:val="Heading3"/>
+      </w:pPr>
+      <w:bookmarkStart w:id="71" w:name="harmonization-decisions-caveats-uganda"/>
+      <w:r>
+        <w:t xml:space="preserve">6. Harmonization decisions &amp; caveats (Uganda)</w:t>
+      </w:r>
+      <w:bookmarkEnd w:id="71"/>
+    </w:p>
+    <w:p>
+      <w:pPr>
+        <w:numPr>
+          <w:ilvl w:val="0"/>
+          <w:numId w:val="1007"/>
+        </w:numPr>
+        <w:pStyle w:val="Compact"/>
+      </w:pPr>
+      <w:r>
+        <w:rPr>
+          <w:b/>
+        </w:rPr>
+        <w:t xml:space="preserve">Owned vs accessed are separate modules.</w:t>
+      </w:r>
+      <w:r>
+        <w:t xml:space="preserve"> </w:t>
+      </w:r>
+      <w:r>
+        <w:t xml:space="preserve">2A (owned) supplies purchase, certificate and</w:t>
+      </w:r>
+      <w:r>
+        <w:t xml:space="preserve"> </w:t>
+      </w:r>
+      <w:r>
+        <w:t xml:space="preserve">rented-out; 2B (accessed) supplies rented-in. They are stacked into one parcel frame;</w:t>
+      </w:r>
+      <w:r>
+        <w:t xml:space="preserve"> </w:t>
+      </w:r>
+      <w:r>
+        <w:t xml:space="preserve">accessed parcels carry</w:t>
+      </w:r>
+      <w:r>
+        <w:t xml:space="preserve"> </w:t>
+      </w:r>
+      <w:r>
+        <w:rPr>
+          <w:rStyle w:val="VerbatimChar"/>
+        </w:rPr>
+        <w:t xml:space="preserve">parcel_purchased = 0</w:t>
+      </w:r>
+      <w:r>
+        <w:t xml:space="preserve"> </w:t>
+      </w:r>
+      <w:r>
+        <w:t xml:space="preserve">and</w:t>
+      </w:r>
+      <w:r>
+        <w:t xml:space="preserve"> </w:t>
+      </w:r>
+      <w:r>
+        <w:rPr>
+          <w:rStyle w:val="VerbatimChar"/>
+        </w:rPr>
+        <w:t xml:space="preserve">parcel_certificate = 0</w:t>
+      </w:r>
+      <w:r>
+        <w:t xml:space="preserve"> </w:t>
+      </w:r>
+      <w:r>
+        <w:t xml:space="preserve">(the household</w:t>
+      </w:r>
+      <w:r>
+        <w:t xml:space="preserve"> </w:t>
+      </w:r>
+      <w:r>
+        <w:t xml:space="preserve">holds no title to a rented-in parcel), so the rates use an all-parcels denominator</w:t>
+      </w:r>
+      <w:r>
+        <w:t xml:space="preserve"> </w:t>
+      </w:r>
+      <w:r>
+        <w:t xml:space="preserve">comparable to the other countries.</w:t>
+      </w:r>
+    </w:p>
+    <w:p>
+      <w:pPr>
+        <w:numPr>
+          <w:ilvl w:val="0"/>
+          <w:numId w:val="1007"/>
+        </w:numPr>
+        <w:pStyle w:val="Compact"/>
+      </w:pPr>
+      <w:r>
+        <w:rPr>
+          <w:b/>
+        </w:rPr>
+        <w:t xml:space="preserve">Rented-in = paid access.</w:t>
+      </w:r>
+      <w:r>
+        <w:t xml:space="preserve"> </w:t>
+      </w:r>
+      <w:r>
+        <w:t xml:space="preserve">A 2B parcel counts as rented-in when rent paid</w:t>
+      </w:r>
+      <w:r>
+        <w:t xml:space="preserve"> </w:t>
+      </w:r>
+      <w:r>
+        <w:rPr>
+          <w:rStyle w:val="VerbatimChar"/>
+        </w:rPr>
+        <w:t xml:space="preserve">&gt; 0</w:t>
+      </w:r>
+      <w:r>
+        <w:t xml:space="preserve"> </w:t>
+      </w:r>
+      <w:r>
+        <w:t xml:space="preserve">(cash or sharecrop); free-borrowed parcels (rent 0) are not rented-in. 2A parcels with</w:t>
+      </w:r>
+      <w:r>
+        <w:t xml:space="preserve"> </w:t>
+      </w:r>
+      <w:r>
+        <w:t xml:space="preserve">acquisition</w:t>
+      </w:r>
+      <w:r>
+        <w:t xml:space="preserve"> </w:t>
+      </w:r>
+      <w:r>
+        <w:t xml:space="preserve">“</w:t>
+      </w:r>
+      <w:r>
+        <w:t xml:space="preserve">Leased-in</w:t>
+      </w:r>
+      <w:r>
+        <w:t xml:space="preserve">”</w:t>
+      </w:r>
+      <w:r>
+        <w:t xml:space="preserve"> </w:t>
+      </w:r>
+      <w:r>
+        <w:t xml:space="preserve">(code 3) are also flagged rented-in.</w:t>
+      </w:r>
+    </w:p>
+    <w:p>
+      <w:pPr>
+        <w:numPr>
+          <w:ilvl w:val="0"/>
+          <w:numId w:val="1007"/>
+        </w:numPr>
+        <w:pStyle w:val="Compact"/>
+      </w:pPr>
+      <w:r>
+        <w:rPr>
+          <w:b/>
+        </w:rPr>
+        <w:t xml:space="preserve">Rented-out is a lower bound.</w:t>
+      </w:r>
+      <w:r>
+        <w:t xml:space="preserve"> </w:t>
+      </w:r>
+      <w:r>
+        <w:t xml:space="preserve">It is read from the categorical per-season primary use</w:t>
+      </w:r>
+      <w:r>
+        <w:t xml:space="preserve"> </w:t>
+      </w:r>
+      <w:r>
+        <w:t xml:space="preserve">(</w:t>
+      </w:r>
+      <w:r>
+        <w:t xml:space="preserve">“</w:t>
+      </w:r>
+      <w:r>
+        <w:t xml:space="preserve">Rented-out</w:t>
+      </w:r>
+      <w:r>
+        <w:t xml:space="preserve">”</w:t>
+      </w:r>
+      <w:r>
+        <w:t xml:space="preserve"> </w:t>
+      </w:r>
+      <w:r>
+        <w:t xml:space="preserve">/</w:t>
+      </w:r>
+      <w:r>
+        <w:t xml:space="preserve"> </w:t>
+      </w:r>
+      <w:r>
+        <w:t xml:space="preserve">“</w:t>
+      </w:r>
+      <w:r>
+        <w:t xml:space="preserve">Sub-contracted out</w:t>
+      </w:r>
+      <w:r>
+        <w:t xml:space="preserve">”</w:t>
+      </w:r>
+      <w:r>
+        <w:t xml:space="preserve">); weighted rates are low (~0.2-1.3 %), as in</w:t>
+      </w:r>
+      <w:r>
+        <w:t xml:space="preserve"> </w:t>
+      </w:r>
+      <w:r>
+        <w:t xml:space="preserve">Mali / Niger. The cash</w:t>
+      </w:r>
+      <w:r>
+        <w:t xml:space="preserve"> </w:t>
+      </w:r>
+      <w:r>
+        <w:t xml:space="preserve">“</w:t>
+      </w:r>
+      <w:r>
+        <w:t xml:space="preserve">rent received</w:t>
+      </w:r>
+      <w:r>
+        <w:t xml:space="preserve">”</w:t>
+      </w:r>
+      <w:r>
+        <w:t xml:space="preserve"> </w:t>
+      </w:r>
+      <w:r>
+        <w:t xml:space="preserve">amount (</w:t>
+      </w:r>
+      <w:r>
+        <w:rPr>
+          <w:rStyle w:val="VerbatimChar"/>
+        </w:rPr>
+        <w:t xml:space="preserve">…aq14</w:t>
+      </w:r>
+      <w:r>
+        <w:t xml:space="preserve">/</w:t>
+      </w:r>
+      <w:r>
+        <w:rPr>
+          <w:rStyle w:val="VerbatimChar"/>
+        </w:rPr>
+        <w:t xml:space="preserve">s2aq14</w:t>
+      </w:r>
+      <w:r>
+        <w:t xml:space="preserve">) corroborates but is not</w:t>
+      </w:r>
+      <w:r>
+        <w:t xml:space="preserve"> </w:t>
+      </w:r>
+      <w:r>
+        <w:t xml:space="preserve">used to define the flag (it is annual, not season-specific).</w:t>
+      </w:r>
+    </w:p>
+    <w:p>
+      <w:pPr>
+        <w:numPr>
+          <w:ilvl w:val="0"/>
+          <w:numId w:val="1007"/>
+        </w:numPr>
+        <w:pStyle w:val="Compact"/>
+      </w:pPr>
+      <w:r>
+        <w:rPr>
+          <w:b/>
+        </w:rPr>
+        <w:t xml:space="preserve">Purchase missing in 2018.</w:t>
+      </w:r>
+      <w:r>
+        <w:t xml:space="preserve"> </w:t>
+      </w:r>
+      <w:r>
+        <w:t xml:space="preserve">UNPS7 did not record the owned-parcel acquisition item</w:t>
+      </w:r>
+      <w:r>
+        <w:t xml:space="preserve"> </w:t>
+      </w:r>
+      <w:r>
+        <w:t xml:space="preserve">(</w:t>
+      </w:r>
+      <w:r>
+        <w:rPr>
+          <w:rStyle w:val="VerbatimChar"/>
+        </w:rPr>
+        <w:t xml:space="preserve">s2aq8</w:t>
+      </w:r>
+      <w:r>
+        <w:t xml:space="preserve"> </w:t>
+      </w:r>
+      <w:r>
+        <w:t xml:space="preserve">empty), so</w:t>
+      </w:r>
+      <w:r>
+        <w:t xml:space="preserve"> </w:t>
+      </w:r>
+      <w:r>
+        <w:rPr>
+          <w:rStyle w:val="VerbatimChar"/>
+        </w:rPr>
+        <w:t xml:space="preserve">parcel_purchased</w:t>
+      </w:r>
+      <w:r>
+        <w:t xml:space="preserve"> </w:t>
+      </w:r>
+      <w:r>
+        <w:t xml:space="preserve">is</w:t>
+      </w:r>
+      <w:r>
+        <w:t xml:space="preserve"> </w:t>
+      </w:r>
+      <w:r>
+        <w:rPr>
+          <w:rStyle w:val="VerbatimChar"/>
+        </w:rPr>
+        <w:t xml:space="preserve">.</w:t>
+      </w:r>
+      <w:r>
+        <w:t xml:space="preserve"> </w:t>
+      </w:r>
+      <w:r>
+        <w:t xml:space="preserve">in 2018 — do not read the 2B-only zeros as</w:t>
+      </w:r>
+      <w:r>
+        <w:t xml:space="preserve"> </w:t>
+      </w:r>
+      <w:r>
+        <w:t xml:space="preserve">a 0 % purchase rate.</w:t>
+      </w:r>
+    </w:p>
+    <w:p>
+      <w:pPr>
+        <w:numPr>
+          <w:ilvl w:val="0"/>
+          <w:numId w:val="1007"/>
+        </w:numPr>
+        <w:pStyle w:val="Compact"/>
+      </w:pPr>
+      <w:r>
+        <w:rPr>
+          <w:b/>
+        </w:rPr>
+        <w:t xml:space="preserve">Season order swapped in 2015 / 2018 / 2019</w:t>
+      </w:r>
+      <w:r>
+        <w:t xml:space="preserve"> </w:t>
+      </w:r>
+      <w:r>
+        <w:t xml:space="preserve">(the</w:t>
+      </w:r>
+      <w:r>
+        <w:t xml:space="preserve"> </w:t>
+      </w:r>
+      <w:r>
+        <w:t xml:space="preserve">“</w:t>
+      </w:r>
+      <w:r>
+        <w:t xml:space="preserve">…b</w:t>
+      </w:r>
+      <w:r>
+        <w:t xml:space="preserve">”</w:t>
+      </w:r>
+      <w:r>
+        <w:t xml:space="preserve"> </w:t>
+      </w:r>
+      <w:r>
+        <w:t xml:space="preserve">primary-use variable is season 1);</w:t>
+      </w:r>
+      <w:r>
+        <w:t xml:space="preserve"> </w:t>
+      </w:r>
+      <w:r>
+        <w:t xml:space="preserve">only</w:t>
+      </w:r>
+      <w:r>
+        <w:t xml:space="preserve"> </w:t>
+      </w:r>
+      <w:r>
+        <w:rPr>
+          <w:rStyle w:val="VerbatimChar"/>
+        </w:rPr>
+        <w:t xml:space="preserve">parcel_rentedout</w:t>
+      </w:r>
+      <w:r>
+        <w:t xml:space="preserve"> </w:t>
+      </w:r>
+      <w:r>
+        <w:t xml:space="preserve">differs across seasons, and the paper reports season 1.</w:t>
+      </w:r>
+    </w:p>
+    <w:p>
+      <w:pPr>
+        <w:numPr>
+          <w:ilvl w:val="0"/>
+          <w:numId w:val="1007"/>
+        </w:numPr>
+        <w:pStyle w:val="Compact"/>
+      </w:pPr>
+      <w:r>
+        <w:rPr>
+          <w:b/>
+        </w:rPr>
+        <w:t xml:space="preserve">Deterministic area</w:t>
+      </w:r>
+      <w:r>
+        <w:t xml:space="preserve"> </w:t>
+      </w:r>
+      <w:r>
+        <w:t xml:space="preserve">(GPS else self-reported, no pmm imputation, unlike the upstream</w:t>
+      </w:r>
+      <w:r>
+        <w:t xml:space="preserve"> </w:t>
+      </w:r>
+      <w:r>
+        <w:t xml:space="preserve">pipeline); acres → ha via 0.404686; top-coded at 40 ha.</w:t>
+      </w:r>
+    </w:p>
+    <w:p>
+      <w:pPr>
+        <w:numPr>
+          <w:ilvl w:val="0"/>
+          <w:numId w:val="1007"/>
+        </w:numPr>
+        <w:pStyle w:val="Compact"/>
+      </w:pPr>
+      <w:r>
+        <w:rPr>
+          <w:b/>
+        </w:rPr>
+        <w:t xml:space="preserve">Weights</w:t>
+      </w:r>
+      <w:r>
+        <w:t xml:space="preserve"> </w:t>
+      </w:r>
+      <w:r>
+        <w:t xml:space="preserve">are each round’s</w:t>
+      </w:r>
+      <w:r>
+        <w:t xml:space="preserve"> </w:t>
+      </w:r>
+      <w:r>
+        <w:rPr>
+          <w:b/>
+        </w:rPr>
+        <w:t xml:space="preserve">cross-sectional</w:t>
+      </w:r>
+      <w:r>
+        <w:t xml:space="preserve"> </w:t>
+      </w:r>
+      <w:r>
+        <w:t xml:space="preserve">household weight;</w:t>
+      </w:r>
+      <w:r>
+        <w:t xml:space="preserve"> </w:t>
+      </w:r>
+      <w:r>
+        <w:rPr>
+          <w:rStyle w:val="VerbatimChar"/>
+        </w:rPr>
+        <w:t xml:space="preserve">ea_id</w:t>
+      </w:r>
+      <w:r>
+        <w:t xml:space="preserve"> </w:t>
+      </w:r>
+      <w:r>
+        <w:t xml:space="preserve">(PSU) is absent</w:t>
+      </w:r>
+      <w:r>
+        <w:t xml:space="preserve"> </w:t>
+      </w:r>
+      <w:r>
+        <w:t xml:space="preserve">on the 2018/2019 cover, so design-based SEs there rest on strata + weights (point</w:t>
+      </w:r>
+      <w:r>
+        <w:t xml:space="preserve"> </w:t>
+      </w:r>
+      <w:r>
+        <w:t xml:space="preserve">estimates are unaffected). Validated by a Python replication of the extractor against the</w:t>
+      </w:r>
+      <w:r>
+        <w:t xml:space="preserve"> </w:t>
+      </w:r>
+      <w:r>
+        <w:t xml:space="preserve">raw data: household-weight match 97-100 % and rates within expected ranges for all waves.</w:t>
+      </w:r>
+    </w:p>
+    <w:p>
+      <w:r>
+        <w:pict>
+          <v:rect style="width:0;height:1.5pt" o:hralign="center" o:hrstd="t" o:hr="t"/>
+        </w:pict>
+      </w:r>
+    </w:p>
+    <w:p>
+      <w:pPr>
+        <w:pStyle w:val="FirstParagraph"/>
+      </w:pPr>
+      <w:r>
         <w:rPr>
           <w:i/>
         </w:rPr>
@@ -22242,7 +25599,7 @@
         <w:rPr>
           <w:i/>
         </w:rPr>
-        <w:t xml:space="preserve">NER ECVMA1-2, NGA GHS1-5, TZA NPS1-5 incl. refresh) and the raw survey modules, with</w:t>
+        <w:t xml:space="preserve">NER ECVMA1-2, NGA GHS1-5, TZA NPS1-5 incl. refresh, UGA UNPS1-5/7/8) and the raw survey</w:t>
       </w:r>
       <w:r>
         <w:rPr>
@@ -22254,7 +25611,7 @@
         <w:rPr>
           <w:i/>
         </w:rPr>
-        <w:t xml:space="preserve">source variables, codes, and value labels verified against the data. Extend with one new</w:t>
+        <w:t xml:space="preserve">modules, with source variables, codes, and value labels verified against the data. Extend</w:t>
       </w:r>
       <w:r>
         <w:rPr>
@@ -22266,7 +25623,7 @@
         <w:rPr>
           <w:i/>
         </w:rPr>
-        <w:t xml:space="preserve">country section (1-6) per country as the workflow grows.</w:t>
+        <w:t xml:space="preserve">with one new country section (1-6) per country as the workflow grows.</w:t>
       </w:r>
     </w:p>
     <w:sectPr/>
@@ -22524,6 +25881,9 @@
     <w:abstractNumId w:val="991"/>
   </w:num>
   <w:num w:numId="1006">
+    <w:abstractNumId w:val="991"/>
+  </w:num>
+  <w:num w:numId="1007">
     <w:abstractNumId w:val="991"/>
   </w:num>
 </w:numbering>

</xml_diff>

<commit_message>
Docs: document 2018 UNPS reduced panel re-interview (purchase absent, area/tenure sparse ~25%)
</commit_message>
<xml_diff>
--- a/Reference/variable_provenance.docx
+++ b/Reference/variable_provenance.docx
@@ -1788,7 +1788,7 @@
               <w:jc w:val="left"/>
             </w:pPr>
             <w:r>
-              <w:t xml:space="preserve">UNPS7 (2018/19) did</w:t>
+              <w:t xml:space="preserve">UNPS7 (2018/19) fielded a</w:t>
             </w:r>
             <w:r>
               <w:t xml:space="preserve"> </w:t>
@@ -1797,13 +1797,16 @@
               <w:rPr>
                 <w:b/>
               </w:rPr>
-              <w:t xml:space="preserve">not record the owned-parcel acquisition item</w:t>
+              <w:t xml:space="preserve">reduced panel re-interview</w:t>
             </w:r>
             <w:r>
               <w:t xml:space="preserve"> </w:t>
             </w:r>
             <w:r>
-              <w:t xml:space="preserve">(</w:t>
+              <w:t xml:space="preserve">roster for owned parcels: the acquisition item</w:t>
+            </w:r>
+            <w:r>
+              <w:t xml:space="preserve"> </w:t>
             </w:r>
             <w:r>
               <w:rPr>
@@ -1815,7 +1818,22 @@
               <w:t xml:space="preserve"> </w:t>
             </w:r>
             <w:r>
-              <w:t xml:space="preserve">is entirely empty), so acquisition mode - including purchase - is unidentifiable that round.</w:t>
+              <w:t xml:space="preserve">was</w:t>
+            </w:r>
+            <w:r>
+              <w:t xml:space="preserve"> </w:t>
+            </w:r>
+            <w:r>
+              <w:rPr>
+                <w:b/>
+              </w:rPr>
+              <w:t xml:space="preserve">not administered</w:t>
+            </w:r>
+            <w:r>
+              <w:t xml:space="preserve"> </w:t>
+            </w:r>
+            <w:r>
+              <w:t xml:space="preserve">(0 of 4,368 parcels), so acquisition mode - including purchase - is unidentifiable. (Area and tenure-system were also only re-collected for the ~25% of parcels that were new or re-measured; see Uganda §6.)</w:t>
             </w:r>
           </w:p>
         </w:tc>
@@ -25328,19 +25346,43 @@
         <w:rPr>
           <w:b/>
         </w:rPr>
-        <w:t xml:space="preserve">Purchase missing in 2018.</w:t>
-      </w:r>
-      <w:r>
-        <w:t xml:space="preserve"> </w:t>
-      </w:r>
-      <w:r>
-        <w:t xml:space="preserve">UNPS7 did not record the owned-parcel acquisition item</w:t>
-      </w:r>
-      <w:r>
-        <w:t xml:space="preserve"> </w:t>
-      </w:r>
-      <w:r>
-        <w:t xml:space="preserve">(</w:t>
+        <w:t xml:space="preserve">2018 is a reduced panel re-interview.</w:t>
+      </w:r>
+      <w:r>
+        <w:t xml:space="preserve"> </w:t>
+      </w:r>
+      <w:r>
+        <w:t xml:space="preserve">UNPS7 (2018/19) re-asked owned parcels with a</w:t>
+      </w:r>
+      <w:r>
+        <w:t xml:space="preserve"> </w:t>
+      </w:r>
+      <w:r>
+        <w:t xml:space="preserve">shortened update instrument: most parcel characteristics were carried forward, not</w:t>
+      </w:r>
+      <w:r>
+        <w:t xml:space="preserve"> </w:t>
+      </w:r>
+      <w:r>
+        <w:t xml:space="preserve">re-collected. In</w:t>
+      </w:r>
+      <w:r>
+        <w:t xml:space="preserve"> </w:t>
+      </w:r>
+      <w:r>
+        <w:rPr>
+          <w:rStyle w:val="VerbatimChar"/>
+        </w:rPr>
+        <w:t xml:space="preserve">AGSEC2A</w:t>
+      </w:r>
+      <w:r>
+        <w:t xml:space="preserve"> </w:t>
+      </w:r>
+      <w:r>
+        <w:t xml:space="preserve">the acquisition item</w:t>
+      </w:r>
+      <w:r>
+        <w:t xml:space="preserve"> </w:t>
       </w:r>
       <w:r>
         <w:rPr>
@@ -25352,7 +25394,22 @@
         <w:t xml:space="preserve"> </w:t>
       </w:r>
       <w:r>
-        <w:t xml:space="preserve">empty), so</w:t>
+        <w:t xml:space="preserve">has</w:t>
+      </w:r>
+      <w:r>
+        <w:t xml:space="preserve"> </w:t>
+      </w:r>
+      <w:r>
+        <w:rPr>
+          <w:b/>
+        </w:rPr>
+        <w:t xml:space="preserve">0</w:t>
+      </w:r>
+      <w:r>
+        <w:t xml:space="preserve"> </w:t>
+      </w:r>
+      <w:r>
+        <w:t xml:space="preserve">non-missing values (so</w:t>
       </w:r>
       <w:r>
         <w:t xml:space="preserve"> </w:t>
@@ -25367,7 +25424,7 @@
         <w:t xml:space="preserve"> </w:t>
       </w:r>
       <w:r>
-        <w:t xml:space="preserve">is</w:t>
+        <w:t xml:space="preserve">is set</w:t>
       </w:r>
       <w:r>
         <w:t xml:space="preserve"> </w:t>
@@ -25382,13 +25439,94 @@
         <w:t xml:space="preserve"> </w:t>
       </w:r>
       <w:r>
-        <w:t xml:space="preserve">in 2018 — do not read the 2B-only zeros as</w:t>
-      </w:r>
-      <w:r>
-        <w:t xml:space="preserve"> </w:t>
-      </w:r>
-      <w:r>
-        <w:t xml:space="preserve">a 0 % purchase rate.</w:t>
+        <w:t xml:space="preserve">- do not read the 2B-only zeros as 0% purchase), and GPS /</w:t>
+      </w:r>
+      <w:r>
+        <w:t xml:space="preserve"> </w:t>
+      </w:r>
+      <w:r>
+        <w:t xml:space="preserve">self-reported</w:t>
+      </w:r>
+      <w:r>
+        <w:t xml:space="preserve"> </w:t>
+      </w:r>
+      <w:r>
+        <w:rPr>
+          <w:b/>
+        </w:rPr>
+        <w:t xml:space="preserve">area</w:t>
+      </w:r>
+      <w:r>
+        <w:t xml:space="preserve"> </w:t>
+      </w:r>
+      <w:r>
+        <w:t xml:space="preserve">were captured for only ~256 / ~824 of 4,368 parcels (~25%); the</w:t>
+      </w:r>
+      <w:r>
+        <w:t xml:space="preserve"> </w:t>
+      </w:r>
+      <w:r>
+        <w:t xml:space="preserve">tenure-system item likewise (~932). Certificate (</w:t>
+      </w:r>
+      <w:r>
+        <w:rPr>
+          <w:rStyle w:val="VerbatimChar"/>
+        </w:rPr>
+        <w:t xml:space="preserve">s2aq23</w:t>
+      </w:r>
+      <w:r>
+        <w:t xml:space="preserve">), ownership flag, documents,</w:t>
+      </w:r>
+      <w:r>
+        <w:t xml:space="preserve"> </w:t>
+      </w:r>
+      <w:r>
+        <w:t xml:space="preserve">disputes and value WERE re-asked.</w:t>
+      </w:r>
+      <w:r>
+        <w:t xml:space="preserve"> </w:t>
+      </w:r>
+      <w:r>
+        <w:rPr>
+          <w:b/>
+        </w:rPr>
+        <w:t xml:space="preserve">Consequence:</w:t>
+      </w:r>
+      <w:r>
+        <w:t xml:space="preserve"> </w:t>
+      </w:r>
+      <w:r>
+        <w:t xml:space="preserve">2018 owned-parcel area and tenure-</w:t>
+      </w:r>
+      <w:r>
+        <w:t xml:space="preserve"> </w:t>
+      </w:r>
+      <w:r>
+        <w:t xml:space="preserve">system rest on a non-random ~25% (new / re-measured parcels), so treat the 2018 area mean</w:t>
+      </w:r>
+      <w:r>
+        <w:t xml:space="preserve"> </w:t>
+      </w:r>
+      <w:r>
+        <w:t xml:space="preserve">with caution; rented-in (from the separately-administered</w:t>
+      </w:r>
+      <w:r>
+        <w:t xml:space="preserve"> </w:t>
+      </w:r>
+      <w:r>
+        <w:rPr>
+          <w:rStyle w:val="VerbatimChar"/>
+        </w:rPr>
+        <w:t xml:space="preserve">AGSEC2B</w:t>
+      </w:r>
+      <w:r>
+        <w:t xml:space="preserve">), rented-out (primary</w:t>
+      </w:r>
+      <w:r>
+        <w:t xml:space="preserve"> </w:t>
+      </w:r>
+      <w:r>
+        <w:t xml:space="preserve">use) and certificate are well-populated. 2019 (UNPS8) is a full re-administration.</w:t>
       </w:r>
     </w:p>
     <w:p>

</xml_diff>